<commit_message>
fix(docs): tablas del Word con bordes, layout fijo y anchos de columna
Las tablas se renderizaban colapsadas (sin bordes y anchos en %). Ahora usan layout FIXED
con anchos en twips, bordes explícitos y encabezados/filas sombreados → se ven prolijas en Word.
</commit_message>
<xml_diff>
--- a/SysData-Documentacion.docx
+++ b/SysData-Documentacion.docx
@@ -85,7 +85,7 @@
         <w:rPr>
           <w:color w:val="5B6B7F"/>
         </w:rPr>
-        <w:t xml:space="preserve">Versión 1.0 · 19 de junio de 2026</w:t>
+        <w:t xml:space="preserve">Versión 1.1 · 19 de junio de 2026</w:t>
       </w:r>
     </w:p>
     <w:p>
@@ -96,7 +96,7 @@
     <w:p>
       <w:pPr>
         <w:pStyle w:val="Heading1"/>
-        <w:spacing w:after="120" w:before="260"/>
+        <w:spacing w:after="120" w:before="280"/>
       </w:pPr>
       <w:r>
         <w:t xml:space="preserve">Contenido</w:t>
@@ -222,7 +222,7 @@
     <w:p>
       <w:pPr>
         <w:pStyle w:val="Heading1"/>
-        <w:spacing w:after="120" w:before="260"/>
+        <w:spacing w:after="120" w:before="280"/>
       </w:pPr>
       <w:r>
         <w:t xml:space="preserve">1. Resumen ejecutivo</w:t>
@@ -266,7 +266,7 @@
     <w:p>
       <w:pPr>
         <w:pStyle w:val="Heading1"/>
-        <w:spacing w:after="120" w:before="260"/>
+        <w:spacing w:after="120" w:before="280"/>
       </w:pPr>
       <w:r>
         <w:t xml:space="preserve">2. El problema: por qué existe SysData</w:t>
@@ -316,7 +316,7 @@
     <w:p>
       <w:pPr>
         <w:pStyle w:val="Heading1"/>
-        <w:spacing w:after="120" w:before="260"/>
+        <w:spacing w:after="120" w:before="280"/>
       </w:pPr>
       <w:r>
         <w:t xml:space="preserve">3. Qué es SysData (y qué no es)</w:t>
@@ -463,7 +463,7 @@
     <w:p>
       <w:pPr>
         <w:pStyle w:val="Heading1"/>
-        <w:spacing w:after="120" w:before="260"/>
+        <w:spacing w:after="120" w:before="280"/>
       </w:pPr>
       <w:r>
         <w:t xml:space="preserve">4. El objetivo</w:t>
@@ -581,7 +581,7 @@
     <w:p>
       <w:pPr>
         <w:pStyle w:val="Heading1"/>
-        <w:spacing w:after="120" w:before="260"/>
+        <w:spacing w:after="120" w:before="280"/>
       </w:pPr>
       <w:r>
         <w:t xml:space="preserve">5. Cómo se usa: el loop</w:t>
@@ -719,7 +719,7 @@
     <w:p>
       <w:pPr>
         <w:pStyle w:val="Heading1"/>
-        <w:spacing w:after="120" w:before="260"/>
+        <w:spacing w:after="120" w:before="280"/>
       </w:pPr>
       <w:r>
         <w:t xml:space="preserve">6. Cómo decide: la lógica</w:t>
@@ -792,13 +792,13 @@
         <w:jc w:val="both"/>
       </w:pPr>
       <w:r>
-        <w:t xml:space="preserve">Ejemplo real con los datos del cotizador: de ~41.500 visitas, ~36.300 se caen antes de avanzar. Si una mejora recupera ~25% de esa fuga (supuesto), son ~9.000 datos extra/mes; a una tasa dato→cápita de 6% (supuesto) y un LTV de contribución de ~$388.800, eso son del orden de $200M/mes en juego. Ese número —no el porcentaje de caída— es lo que pone a esa oportunidad arriba del ranking.</w:t>
+        <w:t xml:space="preserve">Ejemplo real con los datos del cotizador: de ~41.500 visitas, ~36.300 se caen antes de avanzar. Si una mejora recupera ~25% de esa fuga (supuesto), son ~9.000 datos extra por mes; a una tasa dato→cápita de 6% (supuesto) y un LTV de contribución de ~$388.800, eso son del orden de $200M por mes en juego. Ese número —no el porcentaje de caída— es lo que pone a esa oportunidad arriba del ranking.</w:t>
       </w:r>
     </w:p>
     <w:p>
       <w:pPr>
         <w:pStyle w:val="Heading1"/>
-        <w:spacing w:after="120" w:before="260"/>
+        <w:spacing w:after="120" w:before="280"/>
       </w:pPr>
       <w:r>
         <w:t xml:space="preserve">7. Decisiones de producto y su porqué</w:t>
@@ -815,41 +815,49 @@
     </w:p>
     <w:tbl>
       <w:tblPr>
-        <w:tblW w:type="pct" w:w="100%"/>
+        <w:tblW w:type="dxa" w:w="9300"/>
         <w:tblBorders>
-          <w:top w:val="single" w:color="auto" w:sz="4"/>
-          <w:left w:val="single" w:color="auto" w:sz="4"/>
-          <w:bottom w:val="single" w:color="auto" w:sz="4"/>
-          <w:right w:val="single" w:color="auto" w:sz="4"/>
-          <w:insideH w:val="single" w:color="auto" w:sz="4"/>
-          <w:insideV w:val="single" w:color="auto" w:sz="4"/>
+          <w:top w:val="single" w:color="BFC9D4" w:sz="4"/>
+          <w:left w:val="single" w:color="BFC9D4" w:sz="4"/>
+          <w:bottom w:val="single" w:color="BFC9D4" w:sz="4"/>
+          <w:right w:val="single" w:color="BFC9D4" w:sz="4"/>
+          <w:insideH w:val="single" w:color="BFC9D4" w:sz="4"/>
+          <w:insideV w:val="single" w:color="BFC9D4" w:sz="4"/>
         </w:tblBorders>
+        <w:tblLayout w:type="fixed"/>
       </w:tblPr>
       <w:tblGrid>
-        <w:gridCol w:w="100"/>
-        <w:gridCol w:w="100"/>
+        <w:gridCol w:w="3069"/>
+        <w:gridCol w:w="6231"/>
       </w:tblGrid>
       <w:tr>
         <w:trPr>
+          <w:cantSplit/>
           <w:tblHeader/>
         </w:trPr>
         <w:tc>
           <w:tcPr>
-            <w:tcW w:type="pct" w:w="34%"/>
-            <w:shd w:fill="0E2E52" w:color="0E2E52" w:val="solid"/>
-            <w:tcMar>
-              <w:top w:type="dxa" w:w="60"/>
-              <w:left w:type="dxa" w:w="100"/>
-              <w:bottom w:type="dxa" w:w="60"/>
-              <w:right w:type="dxa" w:w="100"/>
-            </w:tcMar>
-          </w:tcPr>
-          <w:p>
+            <w:tcW w:type="dxa" w:w="3069"/>
+            <w:shd w:fill="0E2E52" w:color="auto" w:val="clear"/>
+            <w:tcMar>
+              <w:top w:type="dxa" w:w="80"/>
+              <w:left w:type="dxa" w:w="130"/>
+              <w:bottom w:type="dxa" w:w="80"/>
+              <w:right w:type="dxa" w:w="130"/>
+            </w:tcMar>
+            <w:vAlign w:val="center"/>
+          </w:tcPr>
+          <w:p>
+            <w:pPr>
+              <w:spacing w:after="0"/>
+            </w:pPr>
             <w:r>
               <w:rPr>
                 <w:b/>
                 <w:bCs/>
                 <w:color w:val="FFFFFF"/>
+                <w:sz w:val="20"/>
+                <w:szCs w:val="20"/>
               </w:rPr>
               <w:t xml:space="preserve">Decisión</w:t>
             </w:r>
@@ -857,21 +865,27 @@
         </w:tc>
         <w:tc>
           <w:tcPr>
-            <w:tcW w:type="pct" w:w="66%"/>
-            <w:shd w:fill="0E2E52" w:color="0E2E52" w:val="solid"/>
-            <w:tcMar>
-              <w:top w:type="dxa" w:w="60"/>
-              <w:left w:type="dxa" w:w="100"/>
-              <w:bottom w:type="dxa" w:w="60"/>
-              <w:right w:type="dxa" w:w="100"/>
-            </w:tcMar>
-          </w:tcPr>
-          <w:p>
+            <w:tcW w:type="dxa" w:w="6231"/>
+            <w:shd w:fill="0E2E52" w:color="auto" w:val="clear"/>
+            <w:tcMar>
+              <w:top w:type="dxa" w:w="80"/>
+              <w:left w:type="dxa" w:w="130"/>
+              <w:bottom w:type="dxa" w:w="80"/>
+              <w:right w:type="dxa" w:w="130"/>
+            </w:tcMar>
+            <w:vAlign w:val="center"/>
+          </w:tcPr>
+          <w:p>
+            <w:pPr>
+              <w:spacing w:after="0"/>
+            </w:pPr>
             <w:r>
               <w:rPr>
                 <w:b/>
                 <w:bCs/>
                 <w:color w:val="FFFFFF"/>
+                <w:sz w:val="20"/>
+                <w:szCs w:val="20"/>
               </w:rPr>
               <w:t xml:space="preserve">Por qué</w:t>
             </w:r>
@@ -879,21 +893,30 @@
         </w:tc>
       </w:tr>
       <w:tr>
-        <w:tc>
-          <w:tcPr>
-            <w:tcW w:type="pct" w:w="34%"/>
-            <w:tcMar>
-              <w:top w:type="dxa" w:w="60"/>
-              <w:left w:type="dxa" w:w="100"/>
-              <w:bottom w:type="dxa" w:w="60"/>
-              <w:right w:type="dxa" w:w="100"/>
-            </w:tcMar>
-          </w:tcPr>
-          <w:p>
+        <w:trPr>
+          <w:cantSplit/>
+        </w:trPr>
+        <w:tc>
+          <w:tcPr>
+            <w:tcW w:type="dxa" w:w="3069"/>
+            <w:tcMar>
+              <w:top w:type="dxa" w:w="80"/>
+              <w:left w:type="dxa" w:w="130"/>
+              <w:bottom w:type="dxa" w:w="80"/>
+              <w:right w:type="dxa" w:w="130"/>
+            </w:tcMar>
+            <w:vAlign w:val="center"/>
+          </w:tcPr>
+          <w:p>
+            <w:pPr>
+              <w:spacing w:after="0"/>
+            </w:pPr>
             <w:r>
               <w:rPr>
                 <w:b/>
                 <w:bCs/>
+                <w:sz w:val="20"/>
+                <w:szCs w:val="20"/>
               </w:rPr>
               <w:t xml:space="preserve">Priorizar por plata, no por % de fuga</w:t>
             </w:r>
@@ -901,19 +924,25 @@
         </w:tc>
         <w:tc>
           <w:tcPr>
-            <w:tcW w:type="pct" w:w="66%"/>
-            <w:tcMar>
-              <w:top w:type="dxa" w:w="60"/>
-              <w:left w:type="dxa" w:w="100"/>
-              <w:bottom w:type="dxa" w:w="60"/>
-              <w:right w:type="dxa" w:w="100"/>
-            </w:tcMar>
-          </w:tcPr>
-          <w:p>
+            <w:tcW w:type="dxa" w:w="6231"/>
+            <w:tcMar>
+              <w:top w:type="dxa" w:w="80"/>
+              <w:left w:type="dxa" w:w="130"/>
+              <w:bottom w:type="dxa" w:w="80"/>
+              <w:right w:type="dxa" w:w="130"/>
+            </w:tcMar>
+            <w:vAlign w:val="center"/>
+          </w:tcPr>
+          <w:p>
+            <w:pPr>
+              <w:spacing w:after="0"/>
+            </w:pPr>
             <w:r>
               <w:rPr>
                 <w:b w:val="false"/>
                 <w:bCs w:val="false"/>
+                <w:sz w:val="20"/>
+                <w:szCs w:val="20"/>
               </w:rPr>
               <w:t xml:space="preserve">La fuga más grande no siempre es la más valiosa: una caída enorme sobre tráfico que no convierte vale poco. Ordenar por margen evita gastar esfuerzo donde no mueve el negocio.</w:t>
             </w:r>
@@ -921,41 +950,58 @@
         </w:tc>
       </w:tr>
       <w:tr>
-        <w:tc>
-          <w:tcPr>
-            <w:tcW w:type="pct" w:w="34%"/>
-            <w:tcMar>
-              <w:top w:type="dxa" w:w="60"/>
-              <w:left w:type="dxa" w:w="100"/>
-              <w:bottom w:type="dxa" w:w="60"/>
-              <w:right w:type="dxa" w:w="100"/>
-            </w:tcMar>
-          </w:tcPr>
-          <w:p>
+        <w:trPr>
+          <w:cantSplit/>
+        </w:trPr>
+        <w:tc>
+          <w:tcPr>
+            <w:tcW w:type="dxa" w:w="3069"/>
+            <w:shd w:fill="F2F5F8" w:color="auto" w:val="clear"/>
+            <w:tcMar>
+              <w:top w:type="dxa" w:w="80"/>
+              <w:left w:type="dxa" w:w="130"/>
+              <w:bottom w:type="dxa" w:w="80"/>
+              <w:right w:type="dxa" w:w="130"/>
+            </w:tcMar>
+            <w:vAlign w:val="center"/>
+          </w:tcPr>
+          <w:p>
+            <w:pPr>
+              <w:spacing w:after="0"/>
+            </w:pPr>
             <w:r>
               <w:rPr>
                 <w:b/>
                 <w:bCs/>
-              </w:rPr>
-              <w:t xml:space="preserve">Honestidad radical: medido vs supuesto</w:t>
-            </w:r>
-          </w:p>
-        </w:tc>
-        <w:tc>
-          <w:tcPr>
-            <w:tcW w:type="pct" w:w="66%"/>
-            <w:tcMar>
-              <w:top w:type="dxa" w:w="60"/>
-              <w:left w:type="dxa" w:w="100"/>
-              <w:bottom w:type="dxa" w:w="60"/>
-              <w:right w:type="dxa" w:w="100"/>
-            </w:tcMar>
-          </w:tcPr>
-          <w:p>
+                <w:sz w:val="20"/>
+                <w:szCs w:val="20"/>
+              </w:rPr>
+              <w:t xml:space="preserve">Honestidad: medido vs supuesto</w:t>
+            </w:r>
+          </w:p>
+        </w:tc>
+        <w:tc>
+          <w:tcPr>
+            <w:tcW w:type="dxa" w:w="6231"/>
+            <w:shd w:fill="F2F5F8" w:color="auto" w:val="clear"/>
+            <w:tcMar>
+              <w:top w:type="dxa" w:w="80"/>
+              <w:left w:type="dxa" w:w="130"/>
+              <w:bottom w:type="dxa" w:w="80"/>
+              <w:right w:type="dxa" w:w="130"/>
+            </w:tcMar>
+            <w:vAlign w:val="center"/>
+          </w:tcPr>
+          <w:p>
+            <w:pPr>
+              <w:spacing w:after="0"/>
+            </w:pPr>
             <w:r>
               <w:rPr>
                 <w:b w:val="false"/>
                 <w:bCs w:val="false"/>
+                <w:sz w:val="20"/>
+                <w:szCs w:val="20"/>
               </w:rPr>
               <w:t xml:space="preserve">Si el motor disfraza supuestos de datos, el equipo deja de confiar la primera vez que falla. Cada número muestra su origen y marca explícitamente lo que es estimación.</w:t>
             </w:r>
@@ -963,21 +1009,30 @@
         </w:tc>
       </w:tr>
       <w:tr>
-        <w:tc>
-          <w:tcPr>
-            <w:tcW w:type="pct" w:w="34%"/>
-            <w:tcMar>
-              <w:top w:type="dxa" w:w="60"/>
-              <w:left w:type="dxa" w:w="100"/>
-              <w:bottom w:type="dxa" w:w="60"/>
-              <w:right w:type="dxa" w:w="100"/>
-            </w:tcMar>
-          </w:tcPr>
-          <w:p>
+        <w:trPr>
+          <w:cantSplit/>
+        </w:trPr>
+        <w:tc>
+          <w:tcPr>
+            <w:tcW w:type="dxa" w:w="3069"/>
+            <w:tcMar>
+              <w:top w:type="dxa" w:w="80"/>
+              <w:left w:type="dxa" w:w="130"/>
+              <w:bottom w:type="dxa" w:w="80"/>
+              <w:right w:type="dxa" w:w="130"/>
+            </w:tcMar>
+            <w:vAlign w:val="center"/>
+          </w:tcPr>
+          <w:p>
+            <w:pPr>
+              <w:spacing w:after="0"/>
+            </w:pPr>
             <w:r>
               <w:rPr>
                 <w:b/>
                 <w:bCs/>
+                <w:sz w:val="20"/>
+                <w:szCs w:val="20"/>
               </w:rPr>
               <w:t xml:space="preserve">Ser la capa de decisión, no otro dashboard</w:t>
             </w:r>
@@ -985,41 +1040,57 @@
         </w:tc>
         <w:tc>
           <w:tcPr>
-            <w:tcW w:type="pct" w:w="66%"/>
-            <w:tcMar>
-              <w:top w:type="dxa" w:w="60"/>
-              <w:left w:type="dxa" w:w="100"/>
-              <w:bottom w:type="dxa" w:w="60"/>
-              <w:right w:type="dxa" w:w="100"/>
-            </w:tcMar>
-          </w:tcPr>
-          <w:p>
+            <w:tcW w:type="dxa" w:w="6231"/>
+            <w:tcMar>
+              <w:top w:type="dxa" w:w="80"/>
+              <w:left w:type="dxa" w:w="130"/>
+              <w:bottom w:type="dxa" w:w="80"/>
+              <w:right w:type="dxa" w:w="130"/>
+            </w:tcMar>
+            <w:vAlign w:val="center"/>
+          </w:tcPr>
+          <w:p>
+            <w:pPr>
+              <w:spacing w:after="0"/>
+            </w:pPr>
             <w:r>
               <w:rPr>
                 <w:b w:val="false"/>
                 <w:bCs w:val="false"/>
-              </w:rPr>
-              <w:t xml:space="preserve">Ya hay dashboards (Mixpanel, Metabase). El valor que faltaba no era “ver datos”, era “decidir qué hacer con ellos”, cruzando las tres fuentes.</w:t>
+                <w:sz w:val="20"/>
+                <w:szCs w:val="20"/>
+              </w:rPr>
+              <w:t xml:space="preserve">Ya hay dashboards (Mixpanel, Metabase). Lo que faltaba no era “ver datos”, sino “decidir qué hacer con ellos”, cruzando las tres fuentes.</w:t>
             </w:r>
           </w:p>
         </w:tc>
       </w:tr>
       <w:tr>
-        <w:tc>
-          <w:tcPr>
-            <w:tcW w:type="pct" w:w="34%"/>
-            <w:tcMar>
-              <w:top w:type="dxa" w:w="60"/>
-              <w:left w:type="dxa" w:w="100"/>
-              <w:bottom w:type="dxa" w:w="60"/>
-              <w:right w:type="dxa" w:w="100"/>
-            </w:tcMar>
-          </w:tcPr>
-          <w:p>
+        <w:trPr>
+          <w:cantSplit/>
+        </w:trPr>
+        <w:tc>
+          <w:tcPr>
+            <w:tcW w:type="dxa" w:w="3069"/>
+            <w:shd w:fill="F2F5F8" w:color="auto" w:val="clear"/>
+            <w:tcMar>
+              <w:top w:type="dxa" w:w="80"/>
+              <w:left w:type="dxa" w:w="130"/>
+              <w:bottom w:type="dxa" w:w="80"/>
+              <w:right w:type="dxa" w:w="130"/>
+            </w:tcMar>
+            <w:vAlign w:val="center"/>
+          </w:tcPr>
+          <w:p>
+            <w:pPr>
+              <w:spacing w:after="0"/>
+            </w:pPr>
             <w:r>
               <w:rPr>
                 <w:b/>
                 <w:bCs/>
+                <w:sz w:val="20"/>
+                <w:szCs w:val="20"/>
               </w:rPr>
               <w:t xml:space="preserve">Solo lectura sobre Mixpanel y HubSpot</w:t>
             </w:r>
@@ -1027,83 +1098,115 @@
         </w:tc>
         <w:tc>
           <w:tcPr>
-            <w:tcW w:type="pct" w:w="66%"/>
-            <w:tcMar>
-              <w:top w:type="dxa" w:w="60"/>
-              <w:left w:type="dxa" w:w="100"/>
-              <w:bottom w:type="dxa" w:w="60"/>
-              <w:right w:type="dxa" w:w="100"/>
-            </w:tcMar>
-          </w:tcPr>
-          <w:p>
+            <w:tcW w:type="dxa" w:w="6231"/>
+            <w:shd w:fill="F2F5F8" w:color="auto" w:val="clear"/>
+            <w:tcMar>
+              <w:top w:type="dxa" w:w="80"/>
+              <w:left w:type="dxa" w:w="130"/>
+              <w:bottom w:type="dxa" w:w="80"/>
+              <w:right w:type="dxa" w:w="130"/>
+            </w:tcMar>
+            <w:vAlign w:val="center"/>
+          </w:tcPr>
+          <w:p>
+            <w:pPr>
+              <w:spacing w:after="0"/>
+            </w:pPr>
             <w:r>
               <w:rPr>
                 <w:b w:val="false"/>
                 <w:bCs w:val="false"/>
-              </w:rPr>
-              <w:t xml:space="preserve">Son sistemas productivos. El riesgo de escribir (romper eventos, deals, propiedades) es inaceptable frente al beneficio. SysData nunca escribe ahí.</w:t>
+                <w:sz w:val="20"/>
+                <w:szCs w:val="20"/>
+              </w:rPr>
+              <w:t xml:space="preserve">Son sistemas productivos. El riesgo de escribir (romper eventos, deals, propiedades) es inaceptable. SysData nunca escribe ahí.</w:t>
             </w:r>
           </w:p>
         </w:tc>
       </w:tr>
       <w:tr>
-        <w:tc>
-          <w:tcPr>
-            <w:tcW w:type="pct" w:w="34%"/>
-            <w:tcMar>
-              <w:top w:type="dxa" w:w="60"/>
-              <w:left w:type="dxa" w:w="100"/>
-              <w:bottom w:type="dxa" w:w="60"/>
-              <w:right w:type="dxa" w:w="100"/>
-            </w:tcMar>
-          </w:tcPr>
-          <w:p>
+        <w:trPr>
+          <w:cantSplit/>
+        </w:trPr>
+        <w:tc>
+          <w:tcPr>
+            <w:tcW w:type="dxa" w:w="3069"/>
+            <w:tcMar>
+              <w:top w:type="dxa" w:w="80"/>
+              <w:left w:type="dxa" w:w="130"/>
+              <w:bottom w:type="dxa" w:w="80"/>
+              <w:right w:type="dxa" w:w="130"/>
+            </w:tcMar>
+            <w:vAlign w:val="center"/>
+          </w:tcPr>
+          <w:p>
+            <w:pPr>
+              <w:spacing w:after="0"/>
+            </w:pPr>
             <w:r>
               <w:rPr>
                 <w:b/>
                 <w:bCs/>
-              </w:rPr>
-              <w:t xml:space="preserve">Motor determinista + aprendizaje, no “IA caja negra”</w:t>
-            </w:r>
-          </w:p>
-        </w:tc>
-        <w:tc>
-          <w:tcPr>
-            <w:tcW w:type="pct" w:w="66%"/>
-            <w:tcMar>
-              <w:top w:type="dxa" w:w="60"/>
-              <w:left w:type="dxa" w:w="100"/>
-              <w:bottom w:type="dxa" w:w="60"/>
-              <w:right w:type="dxa" w:w="100"/>
-            </w:tcMar>
-          </w:tcPr>
-          <w:p>
+                <w:sz w:val="20"/>
+                <w:szCs w:val="20"/>
+              </w:rPr>
+              <w:t xml:space="preserve">Motor determinista + aprendizaje, no IA caja negra</w:t>
+            </w:r>
+          </w:p>
+        </w:tc>
+        <w:tc>
+          <w:tcPr>
+            <w:tcW w:type="dxa" w:w="6231"/>
+            <w:tcMar>
+              <w:top w:type="dxa" w:w="80"/>
+              <w:left w:type="dxa" w:w="130"/>
+              <w:bottom w:type="dxa" w:w="80"/>
+              <w:right w:type="dxa" w:w="130"/>
+            </w:tcMar>
+            <w:vAlign w:val="center"/>
+          </w:tcPr>
+          <w:p>
+            <w:pPr>
+              <w:spacing w:after="0"/>
+            </w:pPr>
             <w:r>
               <w:rPr>
                 <w:b w:val="false"/>
                 <w:bCs w:val="false"/>
-              </w:rPr>
-              <w:t xml:space="preserve">A la escala de armatuplan, el rigor estadístico y reglas transparentes le ganan a un modelo opaco. La IA se reserva para redactar y agrupar, nunca para inventar números.</w:t>
+                <w:sz w:val="20"/>
+                <w:szCs w:val="20"/>
+              </w:rPr>
+              <w:t xml:space="preserve">A nuestra escala, el rigor estadístico y las reglas transparentes le ganan a un modelo opaco. La IA se reserva para redactar y agrupar, nunca para inventar números.</w:t>
             </w:r>
           </w:p>
         </w:tc>
       </w:tr>
       <w:tr>
-        <w:tc>
-          <w:tcPr>
-            <w:tcW w:type="pct" w:w="34%"/>
-            <w:tcMar>
-              <w:top w:type="dxa" w:w="60"/>
-              <w:left w:type="dxa" w:w="100"/>
-              <w:bottom w:type="dxa" w:w="60"/>
-              <w:right w:type="dxa" w:w="100"/>
-            </w:tcMar>
-          </w:tcPr>
-          <w:p>
+        <w:trPr>
+          <w:cantSplit/>
+        </w:trPr>
+        <w:tc>
+          <w:tcPr>
+            <w:tcW w:type="dxa" w:w="3069"/>
+            <w:shd w:fill="F2F5F8" w:color="auto" w:val="clear"/>
+            <w:tcMar>
+              <w:top w:type="dxa" w:w="80"/>
+              <w:left w:type="dxa" w:w="130"/>
+              <w:bottom w:type="dxa" w:w="80"/>
+              <w:right w:type="dxa" w:w="130"/>
+            </w:tcMar>
+            <w:vAlign w:val="center"/>
+          </w:tcPr>
+          <w:p>
+            <w:pPr>
+              <w:spacing w:after="0"/>
+            </w:pPr>
             <w:r>
               <w:rPr>
                 <w:b/>
                 <w:bCs/>
+                <w:sz w:val="20"/>
+                <w:szCs w:val="20"/>
               </w:rPr>
               <w:t xml:space="preserve">Estado compartido (Supabase), no Excel personal</w:t>
             </w:r>
@@ -1111,19 +1214,26 @@
         </w:tc>
         <w:tc>
           <w:tcPr>
-            <w:tcW w:type="pct" w:w="66%"/>
-            <w:tcMar>
-              <w:top w:type="dxa" w:w="60"/>
-              <w:left w:type="dxa" w:w="100"/>
-              <w:bottom w:type="dxa" w:w="60"/>
-              <w:right w:type="dxa" w:w="100"/>
-            </w:tcMar>
-          </w:tcPr>
-          <w:p>
+            <w:tcW w:type="dxa" w:w="6231"/>
+            <w:shd w:fill="F2F5F8" w:color="auto" w:val="clear"/>
+            <w:tcMar>
+              <w:top w:type="dxa" w:w="80"/>
+              <w:left w:type="dxa" w:w="130"/>
+              <w:bottom w:type="dxa" w:w="80"/>
+              <w:right w:type="dxa" w:w="130"/>
+            </w:tcMar>
+            <w:vAlign w:val="center"/>
+          </w:tcPr>
+          <w:p>
+            <w:pPr>
+              <w:spacing w:after="0"/>
+            </w:pPr>
             <w:r>
               <w:rPr>
                 <w:b w:val="false"/>
                 <w:bCs w:val="false"/>
+                <w:sz w:val="20"/>
+                <w:szCs w:val="20"/>
               </w:rPr>
               <w:t xml:space="preserve">Para que sea una herramienta de equipo, los experimentos, estados y aprendizajes tienen que ser de todos y persistentes, no de un navegador.</w:t>
             </w:r>
@@ -1131,21 +1241,30 @@
         </w:tc>
       </w:tr>
       <w:tr>
-        <w:tc>
-          <w:tcPr>
-            <w:tcW w:type="pct" w:w="34%"/>
-            <w:tcMar>
-              <w:top w:type="dxa" w:w="60"/>
-              <w:left w:type="dxa" w:w="100"/>
-              <w:bottom w:type="dxa" w:w="60"/>
-              <w:right w:type="dxa" w:w="100"/>
-            </w:tcMar>
-          </w:tcPr>
-          <w:p>
+        <w:trPr>
+          <w:cantSplit/>
+        </w:trPr>
+        <w:tc>
+          <w:tcPr>
+            <w:tcW w:type="dxa" w:w="3069"/>
+            <w:tcMar>
+              <w:top w:type="dxa" w:w="80"/>
+              <w:left w:type="dxa" w:w="130"/>
+              <w:bottom w:type="dxa" w:w="80"/>
+              <w:right w:type="dxa" w:w="130"/>
+            </w:tcMar>
+            <w:vAlign w:val="center"/>
+          </w:tcPr>
+          <w:p>
+            <w:pPr>
+              <w:spacing w:after="0"/>
+            </w:pPr>
             <w:r>
               <w:rPr>
                 <w:b/>
                 <w:bCs/>
+                <w:sz w:val="20"/>
+                <w:szCs w:val="20"/>
               </w:rPr>
               <w:t xml:space="preserve">Experimentos con significancia + guardrails</w:t>
             </w:r>
@@ -1153,41 +1272,57 @@
         </w:tc>
         <w:tc>
           <w:tcPr>
-            <w:tcW w:type="pct" w:w="66%"/>
-            <w:tcMar>
-              <w:top w:type="dxa" w:w="60"/>
-              <w:left w:type="dxa" w:w="100"/>
-              <w:bottom w:type="dxa" w:w="60"/>
-              <w:right w:type="dxa" w:w="100"/>
-            </w:tcMar>
-          </w:tcPr>
-          <w:p>
+            <w:tcW w:type="dxa" w:w="6231"/>
+            <w:tcMar>
+              <w:top w:type="dxa" w:w="80"/>
+              <w:left w:type="dxa" w:w="130"/>
+              <w:bottom w:type="dxa" w:w="80"/>
+              <w:right w:type="dxa" w:w="130"/>
+            </w:tcMar>
+            <w:vAlign w:val="center"/>
+          </w:tcPr>
+          <w:p>
+            <w:pPr>
+              <w:spacing w:after="0"/>
+            </w:pPr>
             <w:r>
               <w:rPr>
                 <w:b w:val="false"/>
                 <w:bCs w:val="false"/>
-              </w:rPr>
-              <w:t xml:space="preserve">Un “subió 5%” sin significancia es ruido. Y una mejora que rompe un paso de más abajo no es una victoria. El motor exige las dos cosas antes de cantar un resultado.</w:t>
+                <w:sz w:val="20"/>
+                <w:szCs w:val="20"/>
+              </w:rPr>
+              <w:t xml:space="preserve">Un “subió 5%” sin significancia es ruido. Y una mejora que rompe un paso de más abajo no es victoria. El motor exige las dos cosas antes de cantar un resultado.</w:t>
             </w:r>
           </w:p>
         </w:tc>
       </w:tr>
       <w:tr>
-        <w:tc>
-          <w:tcPr>
-            <w:tcW w:type="pct" w:w="34%"/>
-            <w:tcMar>
-              <w:top w:type="dxa" w:w="60"/>
-              <w:left w:type="dxa" w:w="100"/>
-              <w:bottom w:type="dxa" w:w="60"/>
-              <w:right w:type="dxa" w:w="100"/>
-            </w:tcMar>
-          </w:tcPr>
-          <w:p>
+        <w:trPr>
+          <w:cantSplit/>
+        </w:trPr>
+        <w:tc>
+          <w:tcPr>
+            <w:tcW w:type="dxa" w:w="3069"/>
+            <w:shd w:fill="F2F5F8" w:color="auto" w:val="clear"/>
+            <w:tcMar>
+              <w:top w:type="dxa" w:w="80"/>
+              <w:left w:type="dxa" w:w="130"/>
+              <w:bottom w:type="dxa" w:w="80"/>
+              <w:right w:type="dxa" w:w="130"/>
+            </w:tcMar>
+            <w:vAlign w:val="center"/>
+          </w:tcPr>
+          <w:p>
+            <w:pPr>
+              <w:spacing w:after="0"/>
+            </w:pPr>
             <w:r>
               <w:rPr>
                 <w:b/>
                 <w:bCs/>
+                <w:sz w:val="20"/>
+                <w:szCs w:val="20"/>
               </w:rPr>
               <w:t xml:space="preserve">Score como rango (P10–P90), no número puntual</w:t>
             </w:r>
@@ -1195,19 +1330,26 @@
         </w:tc>
         <w:tc>
           <w:tcPr>
-            <w:tcW w:type="pct" w:w="66%"/>
-            <w:tcMar>
-              <w:top w:type="dxa" w:w="60"/>
-              <w:left w:type="dxa" w:w="100"/>
-              <w:bottom w:type="dxa" w:w="60"/>
-              <w:right w:type="dxa" w:w="100"/>
-            </w:tcMar>
-          </w:tcPr>
-          <w:p>
+            <w:tcW w:type="dxa" w:w="6231"/>
+            <w:shd w:fill="F2F5F8" w:color="auto" w:val="clear"/>
+            <w:tcMar>
+              <w:top w:type="dxa" w:w="80"/>
+              <w:left w:type="dxa" w:w="130"/>
+              <w:bottom w:type="dxa" w:w="80"/>
+              <w:right w:type="dxa" w:w="130"/>
+            </w:tcMar>
+            <w:vAlign w:val="center"/>
+          </w:tcPr>
+          <w:p>
+            <w:pPr>
+              <w:spacing w:after="0"/>
+            </w:pPr>
             <w:r>
               <w:rPr>
                 <w:b w:val="false"/>
                 <w:bCs w:val="false"/>
+                <w:sz w:val="20"/>
+                <w:szCs w:val="20"/>
               </w:rPr>
               <w:t xml:space="preserve">Como varios inputs son supuestos, mostrar una cifra exacta es falsa precisión. El rango comunica la incertidumbre y de qué supuesto depende.</w:t>
             </w:r>
@@ -1217,8 +1359,13 @@
     </w:tbl>
     <w:p>
       <w:pPr>
+        <w:spacing w:after="80"/>
+      </w:pPr>
+    </w:p>
+    <w:p>
+      <w:pPr>
         <w:pStyle w:val="Heading1"/>
-        <w:spacing w:after="120" w:before="260"/>
+        <w:spacing w:after="120" w:before="280"/>
       </w:pPr>
       <w:r>
         <w:t xml:space="preserve">8. Arquitectura del motor: las 4 capas</w:t>
@@ -1230,47 +1377,55 @@
         <w:jc w:val="both"/>
       </w:pPr>
       <w:r>
-        <w:t xml:space="preserve">El “cerebro” de SysData está organizado en cuatro capas que se encadenan: la memoria habilita la detección, la detección y la economía alimentan la decisión, y los resultados de los experimentos vuelven como aprendizaje que afina todo.</w:t>
+        <w:t xml:space="preserve">El “cerebro” de SysData está organizado en cuatro capas encadenadas: la memoria habilita la detección; la detección y la economía alimentan la decisión; y los resultados de los experimentos vuelven como aprendizaje que afina todo.</w:t>
       </w:r>
     </w:p>
     <w:tbl>
       <w:tblPr>
-        <w:tblW w:type="pct" w:w="100%"/>
+        <w:tblW w:type="dxa" w:w="9300"/>
         <w:tblBorders>
-          <w:top w:val="single" w:color="auto" w:sz="4"/>
-          <w:left w:val="single" w:color="auto" w:sz="4"/>
-          <w:bottom w:val="single" w:color="auto" w:sz="4"/>
-          <w:right w:val="single" w:color="auto" w:sz="4"/>
-          <w:insideH w:val="single" w:color="auto" w:sz="4"/>
-          <w:insideV w:val="single" w:color="auto" w:sz="4"/>
+          <w:top w:val="single" w:color="BFC9D4" w:sz="4"/>
+          <w:left w:val="single" w:color="BFC9D4" w:sz="4"/>
+          <w:bottom w:val="single" w:color="BFC9D4" w:sz="4"/>
+          <w:right w:val="single" w:color="BFC9D4" w:sz="4"/>
+          <w:insideH w:val="single" w:color="BFC9D4" w:sz="4"/>
+          <w:insideV w:val="single" w:color="BFC9D4" w:sz="4"/>
         </w:tblBorders>
+        <w:tblLayout w:type="fixed"/>
       </w:tblPr>
       <w:tblGrid>
-        <w:gridCol w:w="100"/>
-        <w:gridCol w:w="100"/>
-        <w:gridCol w:w="100"/>
+        <w:gridCol w:w="1674"/>
+        <w:gridCol w:w="3813"/>
+        <w:gridCol w:w="3813"/>
       </w:tblGrid>
       <w:tr>
         <w:trPr>
+          <w:cantSplit/>
           <w:tblHeader/>
         </w:trPr>
         <w:tc>
           <w:tcPr>
-            <w:tcW w:type="pct" w:w="20%"/>
-            <w:shd w:fill="0E2E52" w:color="0E2E52" w:val="solid"/>
-            <w:tcMar>
-              <w:top w:type="dxa" w:w="60"/>
-              <w:left w:type="dxa" w:w="100"/>
-              <w:bottom w:type="dxa" w:w="60"/>
-              <w:right w:type="dxa" w:w="100"/>
-            </w:tcMar>
-          </w:tcPr>
-          <w:p>
+            <w:tcW w:type="dxa" w:w="1674"/>
+            <w:shd w:fill="0E2E52" w:color="auto" w:val="clear"/>
+            <w:tcMar>
+              <w:top w:type="dxa" w:w="80"/>
+              <w:left w:type="dxa" w:w="130"/>
+              <w:bottom w:type="dxa" w:w="80"/>
+              <w:right w:type="dxa" w:w="130"/>
+            </w:tcMar>
+            <w:vAlign w:val="center"/>
+          </w:tcPr>
+          <w:p>
+            <w:pPr>
+              <w:spacing w:after="0"/>
+            </w:pPr>
             <w:r>
               <w:rPr>
                 <w:b/>
                 <w:bCs/>
                 <w:color w:val="FFFFFF"/>
+                <w:sz w:val="20"/>
+                <w:szCs w:val="20"/>
               </w:rPr>
               <w:t xml:space="preserve">Capa</w:t>
             </w:r>
@@ -1278,21 +1433,27 @@
         </w:tc>
         <w:tc>
           <w:tcPr>
-            <w:tcW w:type="pct" w:w="40%"/>
-            <w:shd w:fill="0E2E52" w:color="0E2E52" w:val="solid"/>
-            <w:tcMar>
-              <w:top w:type="dxa" w:w="60"/>
-              <w:left w:type="dxa" w:w="100"/>
-              <w:bottom w:type="dxa" w:w="60"/>
-              <w:right w:type="dxa" w:w="100"/>
-            </w:tcMar>
-          </w:tcPr>
-          <w:p>
+            <w:tcW w:type="dxa" w:w="3813"/>
+            <w:shd w:fill="0E2E52" w:color="auto" w:val="clear"/>
+            <w:tcMar>
+              <w:top w:type="dxa" w:w="80"/>
+              <w:left w:type="dxa" w:w="130"/>
+              <w:bottom w:type="dxa" w:w="80"/>
+              <w:right w:type="dxa" w:w="130"/>
+            </w:tcMar>
+            <w:vAlign w:val="center"/>
+          </w:tcPr>
+          <w:p>
+            <w:pPr>
+              <w:spacing w:after="0"/>
+            </w:pPr>
             <w:r>
               <w:rPr>
                 <w:b/>
                 <w:bCs/>
                 <w:color w:val="FFFFFF"/>
+                <w:sz w:val="20"/>
+                <w:szCs w:val="20"/>
               </w:rPr>
               <w:t xml:space="preserve">Qué hace</w:t>
             </w:r>
@@ -1300,21 +1461,27 @@
         </w:tc>
         <w:tc>
           <w:tcPr>
-            <w:tcW w:type="pct" w:w="40%"/>
-            <w:shd w:fill="0E2E52" w:color="0E2E52" w:val="solid"/>
-            <w:tcMar>
-              <w:top w:type="dxa" w:w="60"/>
-              <w:left w:type="dxa" w:w="100"/>
-              <w:bottom w:type="dxa" w:w="60"/>
-              <w:right w:type="dxa" w:w="100"/>
-            </w:tcMar>
-          </w:tcPr>
-          <w:p>
+            <w:tcW w:type="dxa" w:w="3813"/>
+            <w:shd w:fill="0E2E52" w:color="auto" w:val="clear"/>
+            <w:tcMar>
+              <w:top w:type="dxa" w:w="80"/>
+              <w:left w:type="dxa" w:w="130"/>
+              <w:bottom w:type="dxa" w:w="80"/>
+              <w:right w:type="dxa" w:w="130"/>
+            </w:tcMar>
+            <w:vAlign w:val="center"/>
+          </w:tcPr>
+          <w:p>
+            <w:pPr>
+              <w:spacing w:after="0"/>
+            </w:pPr>
             <w:r>
               <w:rPr>
                 <w:b/>
                 <w:bCs/>
                 <w:color w:val="FFFFFF"/>
+                <w:sz w:val="20"/>
+                <w:szCs w:val="20"/>
               </w:rPr>
               <w:t xml:space="preserve">Por qué importa</w:t>
             </w:r>
@@ -1322,21 +1489,30 @@
         </w:tc>
       </w:tr>
       <w:tr>
-        <w:tc>
-          <w:tcPr>
-            <w:tcW w:type="pct" w:w="20%"/>
-            <w:tcMar>
-              <w:top w:type="dxa" w:w="60"/>
-              <w:left w:type="dxa" w:w="100"/>
-              <w:bottom w:type="dxa" w:w="60"/>
-              <w:right w:type="dxa" w:w="100"/>
-            </w:tcMar>
-          </w:tcPr>
-          <w:p>
+        <w:trPr>
+          <w:cantSplit/>
+        </w:trPr>
+        <w:tc>
+          <w:tcPr>
+            <w:tcW w:type="dxa" w:w="1674"/>
+            <w:tcMar>
+              <w:top w:type="dxa" w:w="80"/>
+              <w:left w:type="dxa" w:w="130"/>
+              <w:bottom w:type="dxa" w:w="80"/>
+              <w:right w:type="dxa" w:w="130"/>
+            </w:tcMar>
+            <w:vAlign w:val="center"/>
+          </w:tcPr>
+          <w:p>
+            <w:pPr>
+              <w:spacing w:after="0"/>
+            </w:pPr>
             <w:r>
               <w:rPr>
                 <w:b/>
                 <w:bCs/>
+                <w:sz w:val="20"/>
+                <w:szCs w:val="20"/>
               </w:rPr>
               <w:t xml:space="preserve">1 · Memoria</w:t>
             </w:r>
@@ -1344,19 +1520,25 @@
         </w:tc>
         <w:tc>
           <w:tcPr>
-            <w:tcW w:type="pct" w:w="40%"/>
-            <w:tcMar>
-              <w:top w:type="dxa" w:w="60"/>
-              <w:left w:type="dxa" w:w="100"/>
-              <w:bottom w:type="dxa" w:w="60"/>
-              <w:right w:type="dxa" w:w="100"/>
-            </w:tcMar>
-          </w:tcPr>
-          <w:p>
+            <w:tcW w:type="dxa" w:w="3813"/>
+            <w:tcMar>
+              <w:top w:type="dxa" w:w="80"/>
+              <w:left w:type="dxa" w:w="130"/>
+              <w:bottom w:type="dxa" w:w="80"/>
+              <w:right w:type="dxa" w:w="130"/>
+            </w:tcMar>
+            <w:vAlign w:val="center"/>
+          </w:tcPr>
+          <w:p>
+            <w:pPr>
+              <w:spacing w:after="0"/>
+            </w:pPr>
             <w:r>
               <w:rPr>
                 <w:b w:val="false"/>
                 <w:bCs w:val="false"/>
+                <w:sz w:val="20"/>
+                <w:szCs w:val="20"/>
               </w:rPr>
               <w:t xml:space="preserve">Un proceso diario (cron) barre los datos y guarda la foto del día.</w:t>
             </w:r>
@@ -1364,19 +1546,25 @@
         </w:tc>
         <w:tc>
           <w:tcPr>
-            <w:tcW w:type="pct" w:w="40%"/>
-            <w:tcMar>
-              <w:top w:type="dxa" w:w="60"/>
-              <w:left w:type="dxa" w:w="100"/>
-              <w:bottom w:type="dxa" w:w="60"/>
-              <w:right w:type="dxa" w:w="100"/>
-            </w:tcMar>
-          </w:tcPr>
-          <w:p>
+            <w:tcW w:type="dxa" w:w="3813"/>
+            <w:tcMar>
+              <w:top w:type="dxa" w:w="80"/>
+              <w:left w:type="dxa" w:w="130"/>
+              <w:bottom w:type="dxa" w:w="80"/>
+              <w:right w:type="dxa" w:w="130"/>
+            </w:tcMar>
+            <w:vAlign w:val="center"/>
+          </w:tcPr>
+          <w:p>
+            <w:pPr>
+              <w:spacing w:after="0"/>
+            </w:pPr>
             <w:r>
               <w:rPr>
                 <w:b w:val="false"/>
                 <w:bCs w:val="false"/>
+                <w:sz w:val="20"/>
+                <w:szCs w:val="20"/>
               </w:rPr>
               <w:t xml:space="preserve">Sin serie histórica propia no hay detección, ni forecast, ni aprendizaje. La historia consultable es nuestra o no existe.</w:t>
             </w:r>
@@ -1384,21 +1572,31 @@
         </w:tc>
       </w:tr>
       <w:tr>
-        <w:tc>
-          <w:tcPr>
-            <w:tcW w:type="pct" w:w="20%"/>
-            <w:tcMar>
-              <w:top w:type="dxa" w:w="60"/>
-              <w:left w:type="dxa" w:w="100"/>
-              <w:bottom w:type="dxa" w:w="60"/>
-              <w:right w:type="dxa" w:w="100"/>
-            </w:tcMar>
-          </w:tcPr>
-          <w:p>
+        <w:trPr>
+          <w:cantSplit/>
+        </w:trPr>
+        <w:tc>
+          <w:tcPr>
+            <w:tcW w:type="dxa" w:w="1674"/>
+            <w:shd w:fill="F2F5F8" w:color="auto" w:val="clear"/>
+            <w:tcMar>
+              <w:top w:type="dxa" w:w="80"/>
+              <w:left w:type="dxa" w:w="130"/>
+              <w:bottom w:type="dxa" w:w="80"/>
+              <w:right w:type="dxa" w:w="130"/>
+            </w:tcMar>
+            <w:vAlign w:val="center"/>
+          </w:tcPr>
+          <w:p>
+            <w:pPr>
+              <w:spacing w:after="0"/>
+            </w:pPr>
             <w:r>
               <w:rPr>
                 <w:b/>
                 <w:bCs/>
+                <w:sz w:val="20"/>
+                <w:szCs w:val="20"/>
               </w:rPr>
               <w:t xml:space="preserve">2 · Detección</w:t>
             </w:r>
@@ -1406,61 +1604,84 @@
         </w:tc>
         <w:tc>
           <w:tcPr>
-            <w:tcW w:type="pct" w:w="40%"/>
-            <w:tcMar>
-              <w:top w:type="dxa" w:w="60"/>
-              <w:left w:type="dxa" w:w="100"/>
-              <w:bottom w:type="dxa" w:w="60"/>
-              <w:right w:type="dxa" w:w="100"/>
-            </w:tcMar>
-          </w:tcPr>
-          <w:p>
+            <w:tcW w:type="dxa" w:w="3813"/>
+            <w:shd w:fill="F2F5F8" w:color="auto" w:val="clear"/>
+            <w:tcMar>
+              <w:top w:type="dxa" w:w="80"/>
+              <w:left w:type="dxa" w:w="130"/>
+              <w:bottom w:type="dxa" w:w="80"/>
+              <w:right w:type="dxa" w:w="130"/>
+            </w:tcMar>
+            <w:vAlign w:val="center"/>
+          </w:tcPr>
+          <w:p>
+            <w:pPr>
+              <w:spacing w:after="0"/>
+            </w:pPr>
             <w:r>
               <w:rPr>
                 <w:b w:val="false"/>
                 <w:bCs w:val="false"/>
-              </w:rPr>
-              <w:t xml:space="preserve">Sobre esa serie, distingue un quiebre real del ruido y proyecta si llegamos a la meta.</w:t>
-            </w:r>
-          </w:p>
-        </w:tc>
-        <w:tc>
-          <w:tcPr>
-            <w:tcW w:type="pct" w:w="40%"/>
-            <w:tcMar>
-              <w:top w:type="dxa" w:w="60"/>
-              <w:left w:type="dxa" w:w="100"/>
-              <w:bottom w:type="dxa" w:w="60"/>
-              <w:right w:type="dxa" w:w="100"/>
-            </w:tcMar>
-          </w:tcPr>
-          <w:p>
+                <w:sz w:val="20"/>
+                <w:szCs w:val="20"/>
+              </w:rPr>
+              <w:t xml:space="preserve">Distingue un quiebre real del ruido y proyecta si llegamos a la meta.</w:t>
+            </w:r>
+          </w:p>
+        </w:tc>
+        <w:tc>
+          <w:tcPr>
+            <w:tcW w:type="dxa" w:w="3813"/>
+            <w:shd w:fill="F2F5F8" w:color="auto" w:val="clear"/>
+            <w:tcMar>
+              <w:top w:type="dxa" w:w="80"/>
+              <w:left w:type="dxa" w:w="130"/>
+              <w:bottom w:type="dxa" w:w="80"/>
+              <w:right w:type="dxa" w:w="130"/>
+            </w:tcMar>
+            <w:vAlign w:val="center"/>
+          </w:tcPr>
+          <w:p>
+            <w:pPr>
+              <w:spacing w:after="0"/>
+            </w:pPr>
             <w:r>
               <w:rPr>
                 <w:b w:val="false"/>
                 <w:bCs w:val="false"/>
-              </w:rPr>
-              <w:t xml:space="preserve">Responde el “dónde y cuándo” solo: avisa cuando algo se rompió, antes de que alguien lo note a mano.</w:t>
+                <w:sz w:val="20"/>
+                <w:szCs w:val="20"/>
+              </w:rPr>
+              <w:t xml:space="preserve">Responde el “dónde y cuándo” solo: avisa cuando algo se rompió, antes de notarlo a mano.</w:t>
             </w:r>
           </w:p>
         </w:tc>
       </w:tr>
       <w:tr>
-        <w:tc>
-          <w:tcPr>
-            <w:tcW w:type="pct" w:w="20%"/>
-            <w:tcMar>
-              <w:top w:type="dxa" w:w="60"/>
-              <w:left w:type="dxa" w:w="100"/>
-              <w:bottom w:type="dxa" w:w="60"/>
-              <w:right w:type="dxa" w:w="100"/>
-            </w:tcMar>
-          </w:tcPr>
-          <w:p>
+        <w:trPr>
+          <w:cantSplit/>
+        </w:trPr>
+        <w:tc>
+          <w:tcPr>
+            <w:tcW w:type="dxa" w:w="1674"/>
+            <w:tcMar>
+              <w:top w:type="dxa" w:w="80"/>
+              <w:left w:type="dxa" w:w="130"/>
+              <w:bottom w:type="dxa" w:w="80"/>
+              <w:right w:type="dxa" w:w="130"/>
+            </w:tcMar>
+            <w:vAlign w:val="center"/>
+          </w:tcPr>
+          <w:p>
+            <w:pPr>
+              <w:spacing w:after="0"/>
+            </w:pPr>
             <w:r>
               <w:rPr>
                 <w:b/>
                 <w:bCs/>
+                <w:sz w:val="20"/>
+                <w:szCs w:val="20"/>
               </w:rPr>
               <w:t xml:space="preserve">3 · Decisión</w:t>
             </w:r>
@@ -1468,19 +1689,25 @@
         </w:tc>
         <w:tc>
           <w:tcPr>
-            <w:tcW w:type="pct" w:w="40%"/>
-            <w:tcMar>
-              <w:top w:type="dxa" w:w="60"/>
-              <w:left w:type="dxa" w:w="100"/>
-              <w:bottom w:type="dxa" w:w="60"/>
-              <w:right w:type="dxa" w:w="100"/>
-            </w:tcMar>
-          </w:tcPr>
-          <w:p>
+            <w:tcW w:type="dxa" w:w="3813"/>
+            <w:tcMar>
+              <w:top w:type="dxa" w:w="80"/>
+              <w:left w:type="dxa" w:w="130"/>
+              <w:bottom w:type="dxa" w:w="80"/>
+              <w:right w:type="dxa" w:w="130"/>
+            </w:tcMar>
+            <w:vAlign w:val="center"/>
+          </w:tcPr>
+          <w:p>
+            <w:pPr>
+              <w:spacing w:after="0"/>
+            </w:pPr>
             <w:r>
               <w:rPr>
                 <w:b w:val="false"/>
                 <w:bCs w:val="false"/>
+                <w:sz w:val="20"/>
+                <w:szCs w:val="20"/>
               </w:rPr>
               <w:t xml:space="preserve">Puntúa cada oportunidad por plata y la muestra como un rango (conservador → optimista).</w:t>
             </w:r>
@@ -1488,19 +1715,25 @@
         </w:tc>
         <w:tc>
           <w:tcPr>
-            <w:tcW w:type="pct" w:w="40%"/>
-            <w:tcMar>
-              <w:top w:type="dxa" w:w="60"/>
-              <w:left w:type="dxa" w:w="100"/>
-              <w:bottom w:type="dxa" w:w="60"/>
-              <w:right w:type="dxa" w:w="100"/>
-            </w:tcMar>
-          </w:tcPr>
-          <w:p>
+            <w:tcW w:type="dxa" w:w="3813"/>
+            <w:tcMar>
+              <w:top w:type="dxa" w:w="80"/>
+              <w:left w:type="dxa" w:w="130"/>
+              <w:bottom w:type="dxa" w:w="80"/>
+              <w:right w:type="dxa" w:w="130"/>
+            </w:tcMar>
+            <w:vAlign w:val="center"/>
+          </w:tcPr>
+          <w:p>
+            <w:pPr>
+              <w:spacing w:after="0"/>
+            </w:pPr>
             <w:r>
               <w:rPr>
                 <w:b w:val="false"/>
                 <w:bCs w:val="false"/>
+                <w:sz w:val="20"/>
+                <w:szCs w:val="20"/>
               </w:rPr>
               <w:t xml:space="preserve">Convierte la incertidumbre en una apuesta cuantificada, en vez de un número falso-exacto.</w:t>
             </w:r>
@@ -1508,21 +1741,31 @@
         </w:tc>
       </w:tr>
       <w:tr>
-        <w:tc>
-          <w:tcPr>
-            <w:tcW w:type="pct" w:w="20%"/>
-            <w:tcMar>
-              <w:top w:type="dxa" w:w="60"/>
-              <w:left w:type="dxa" w:w="100"/>
-              <w:bottom w:type="dxa" w:w="60"/>
-              <w:right w:type="dxa" w:w="100"/>
-            </w:tcMar>
-          </w:tcPr>
-          <w:p>
+        <w:trPr>
+          <w:cantSplit/>
+        </w:trPr>
+        <w:tc>
+          <w:tcPr>
+            <w:tcW w:type="dxa" w:w="1674"/>
+            <w:shd w:fill="F2F5F8" w:color="auto" w:val="clear"/>
+            <w:tcMar>
+              <w:top w:type="dxa" w:w="80"/>
+              <w:left w:type="dxa" w:w="130"/>
+              <w:bottom w:type="dxa" w:w="80"/>
+              <w:right w:type="dxa" w:w="130"/>
+            </w:tcMar>
+            <w:vAlign w:val="center"/>
+          </w:tcPr>
+          <w:p>
+            <w:pPr>
+              <w:spacing w:after="0"/>
+            </w:pPr>
             <w:r>
               <w:rPr>
                 <w:b/>
                 <w:bCs/>
+                <w:sz w:val="20"/>
+                <w:szCs w:val="20"/>
               </w:rPr>
               <w:t xml:space="preserve">4 · Aprendizaje</w:t>
             </w:r>
@@ -1530,41 +1773,55 @@
         </w:tc>
         <w:tc>
           <w:tcPr>
-            <w:tcW w:type="pct" w:w="40%"/>
-            <w:tcMar>
-              <w:top w:type="dxa" w:w="60"/>
-              <w:left w:type="dxa" w:w="100"/>
-              <w:bottom w:type="dxa" w:w="60"/>
-              <w:right w:type="dxa" w:w="100"/>
-            </w:tcMar>
-          </w:tcPr>
-          <w:p>
+            <w:tcW w:type="dxa" w:w="3813"/>
+            <w:shd w:fill="F2F5F8" w:color="auto" w:val="clear"/>
+            <w:tcMar>
+              <w:top w:type="dxa" w:w="80"/>
+              <w:left w:type="dxa" w:w="130"/>
+              <w:bottom w:type="dxa" w:w="80"/>
+              <w:right w:type="dxa" w:w="130"/>
+            </w:tcMar>
+            <w:vAlign w:val="center"/>
+          </w:tcPr>
+          <w:p>
+            <w:pPr>
+              <w:spacing w:after="0"/>
+            </w:pPr>
             <w:r>
               <w:rPr>
                 <w:b w:val="false"/>
                 <w:bCs w:val="false"/>
-              </w:rPr>
-              <w:t xml:space="preserve">Los resultados de los experimentos se vuelven parámetros numéricos que afinan el motor.</w:t>
-            </w:r>
-          </w:p>
-        </w:tc>
-        <w:tc>
-          <w:tcPr>
-            <w:tcW w:type="pct" w:w="40%"/>
-            <w:tcMar>
-              <w:top w:type="dxa" w:w="60"/>
-              <w:left w:type="dxa" w:w="100"/>
-              <w:bottom w:type="dxa" w:w="60"/>
-              <w:right w:type="dxa" w:w="100"/>
-            </w:tcMar>
-          </w:tcPr>
-          <w:p>
+                <w:sz w:val="20"/>
+                <w:szCs w:val="20"/>
+              </w:rPr>
+              <w:t xml:space="preserve">Los resultados de los experimentos se vuelven parámetros que afinan el motor.</w:t>
+            </w:r>
+          </w:p>
+        </w:tc>
+        <w:tc>
+          <w:tcPr>
+            <w:tcW w:type="dxa" w:w="3813"/>
+            <w:shd w:fill="F2F5F8" w:color="auto" w:val="clear"/>
+            <w:tcMar>
+              <w:top w:type="dxa" w:w="80"/>
+              <w:left w:type="dxa" w:w="130"/>
+              <w:bottom w:type="dxa" w:w="80"/>
+              <w:right w:type="dxa" w:w="130"/>
+            </w:tcMar>
+            <w:vAlign w:val="center"/>
+          </w:tcPr>
+          <w:p>
+            <w:pPr>
+              <w:spacing w:after="0"/>
+            </w:pPr>
             <w:r>
               <w:rPr>
                 <w:b w:val="false"/>
                 <w:bCs w:val="false"/>
-              </w:rPr>
-              <w:t xml:space="preserve">Es lo que hace al motor “cada vez más inteligente”: aprende la realidad de nuestro producto, no supuestos genéricos.</w:t>
+                <w:sz w:val="20"/>
+                <w:szCs w:val="20"/>
+              </w:rPr>
+              <w:t xml:space="preserve">Es lo que lo hace “cada vez más inteligente”: aprende la realidad de nuestro producto, no supuestos genéricos.</w:t>
             </w:r>
           </w:p>
         </w:tc>
@@ -1572,8 +1829,13 @@
     </w:tbl>
     <w:p>
       <w:pPr>
+        <w:spacing w:after="80"/>
+      </w:pPr>
+    </w:p>
+    <w:p>
+      <w:pPr>
         <w:pStyle w:val="Heading1"/>
-        <w:spacing w:after="120" w:before="260"/>
+        <w:spacing w:after="120" w:before="280"/>
       </w:pPr>
       <w:r>
         <w:t xml:space="preserve">9. Rigor de medición de experimentos</w:t>
@@ -1665,13 +1927,13 @@
         <w:t xml:space="preserve">Confounds declarados</w:t>
       </w:r>
       <w:r>
-        <w:t xml:space="preserve"> — el motor dice qué no controla (es antes/después, no A/B; campañas, estacionalidad), para que el resultado se lea con la cautela justa.</w:t>
+        <w:t xml:space="preserve"> — el motor dice qué no controla (es antes/después, no A/B; campañas, estacionalidad), para leer el resultado con la cautela justa.</w:t>
       </w:r>
     </w:p>
     <w:p>
       <w:pPr>
         <w:pStyle w:val="Heading1"/>
-        <w:spacing w:after="120" w:before="260"/>
+        <w:spacing w:after="120" w:before="280"/>
       </w:pPr>
       <w:r>
         <w:t xml:space="preserve">10. Stack técnico</w:t>
@@ -1800,7 +2062,7 @@
     <w:p>
       <w:pPr>
         <w:pStyle w:val="Heading1"/>
-        <w:spacing w:after="120" w:before="260"/>
+        <w:spacing w:after="120" w:before="280"/>
       </w:pPr>
       <w:r>
         <w:t xml:space="preserve">11. La dependencia clave: el cruce visita → cápita</w:t>
@@ -1860,7 +2122,7 @@
         <w:t xml:space="preserve">De quién depende: </w:t>
       </w:r>
       <w:r>
-        <w:t xml:space="preserve">NO es trabajo de SysData. Es instrumentación upstream (Data / Dev). Hay tres caminos, complementarios: (A) estampar el prospecto_id en el alta de socio; (B) cruzar en el data warehouse; (C) en HubSpot, asociar el deal ganado al contacto de origen.</w:t>
+        <w:t xml:space="preserve">NO es trabajo de SysData. Es instrumentación upstream (Data / Dev). Hay tres caminos complementarios: (A) estampar el prospecto_id en el alta de socio; (B) cruzar en el data warehouse; (C) en HubSpot, asociar el deal ganado al contacto de origen.</w:t>
       </w:r>
     </w:p>
     <w:p>
@@ -1882,7 +2144,7 @@
     <w:p>
       <w:pPr>
         <w:pStyle w:val="Heading1"/>
-        <w:spacing w:after="120" w:before="260"/>
+        <w:spacing w:after="120" w:before="280"/>
       </w:pPr>
       <w:r>
         <w:t xml:space="preserve">12. Estado actual y roadmap</w:t>
@@ -2009,7 +2271,7 @@
     <w:p>
       <w:pPr>
         <w:pStyle w:val="Heading1"/>
-        <w:spacing w:after="120" w:before="260"/>
+        <w:spacing w:after="120" w:before="280"/>
       </w:pPr>
       <w:r>
         <w:t xml:space="preserve">13. Principios, seguridad y restricciones</w:t>
@@ -2098,7 +2360,7 @@
     <w:p>
       <w:pPr>
         <w:pStyle w:val="Heading1"/>
-        <w:spacing w:after="120" w:before="260"/>
+        <w:spacing w:after="120" w:before="280"/>
       </w:pPr>
       <w:r>
         <w:t xml:space="preserve">14. Glosario</w:t>
@@ -2106,41 +2368,49 @@
     </w:p>
     <w:tbl>
       <w:tblPr>
-        <w:tblW w:type="pct" w:w="100%"/>
+        <w:tblW w:type="dxa" w:w="9300"/>
         <w:tblBorders>
-          <w:top w:val="single" w:color="auto" w:sz="4"/>
-          <w:left w:val="single" w:color="auto" w:sz="4"/>
-          <w:bottom w:val="single" w:color="auto" w:sz="4"/>
-          <w:right w:val="single" w:color="auto" w:sz="4"/>
-          <w:insideH w:val="single" w:color="auto" w:sz="4"/>
-          <w:insideV w:val="single" w:color="auto" w:sz="4"/>
+          <w:top w:val="single" w:color="BFC9D4" w:sz="4"/>
+          <w:left w:val="single" w:color="BFC9D4" w:sz="4"/>
+          <w:bottom w:val="single" w:color="BFC9D4" w:sz="4"/>
+          <w:right w:val="single" w:color="BFC9D4" w:sz="4"/>
+          <w:insideH w:val="single" w:color="BFC9D4" w:sz="4"/>
+          <w:insideV w:val="single" w:color="BFC9D4" w:sz="4"/>
         </w:tblBorders>
+        <w:tblLayout w:type="fixed"/>
       </w:tblPr>
       <w:tblGrid>
-        <w:gridCol w:w="100"/>
-        <w:gridCol w:w="100"/>
+        <w:gridCol w:w="2232"/>
+        <w:gridCol w:w="7068"/>
       </w:tblGrid>
       <w:tr>
         <w:trPr>
+          <w:cantSplit/>
           <w:tblHeader/>
         </w:trPr>
         <w:tc>
           <w:tcPr>
-            <w:tcW w:type="pct" w:w="24%"/>
-            <w:shd w:fill="0E2E52" w:color="0E2E52" w:val="solid"/>
-            <w:tcMar>
-              <w:top w:type="dxa" w:w="60"/>
-              <w:left w:type="dxa" w:w="100"/>
-              <w:bottom w:type="dxa" w:w="60"/>
-              <w:right w:type="dxa" w:w="100"/>
-            </w:tcMar>
-          </w:tcPr>
-          <w:p>
+            <w:tcW w:type="dxa" w:w="2232"/>
+            <w:shd w:fill="0E2E52" w:color="auto" w:val="clear"/>
+            <w:tcMar>
+              <w:top w:type="dxa" w:w="80"/>
+              <w:left w:type="dxa" w:w="130"/>
+              <w:bottom w:type="dxa" w:w="80"/>
+              <w:right w:type="dxa" w:w="130"/>
+            </w:tcMar>
+            <w:vAlign w:val="center"/>
+          </w:tcPr>
+          <w:p>
+            <w:pPr>
+              <w:spacing w:after="0"/>
+            </w:pPr>
             <w:r>
               <w:rPr>
                 <w:b/>
                 <w:bCs/>
                 <w:color w:val="FFFFFF"/>
+                <w:sz w:val="20"/>
+                <w:szCs w:val="20"/>
               </w:rPr>
               <w:t xml:space="preserve">Término</w:t>
             </w:r>
@@ -2148,21 +2418,27 @@
         </w:tc>
         <w:tc>
           <w:tcPr>
-            <w:tcW w:type="pct" w:w="76%"/>
-            <w:shd w:fill="0E2E52" w:color="0E2E52" w:val="solid"/>
-            <w:tcMar>
-              <w:top w:type="dxa" w:w="60"/>
-              <w:left w:type="dxa" w:w="100"/>
-              <w:bottom w:type="dxa" w:w="60"/>
-              <w:right w:type="dxa" w:w="100"/>
-            </w:tcMar>
-          </w:tcPr>
-          <w:p>
+            <w:tcW w:type="dxa" w:w="7068"/>
+            <w:shd w:fill="0E2E52" w:color="auto" w:val="clear"/>
+            <w:tcMar>
+              <w:top w:type="dxa" w:w="80"/>
+              <w:left w:type="dxa" w:w="130"/>
+              <w:bottom w:type="dxa" w:w="80"/>
+              <w:right w:type="dxa" w:w="130"/>
+            </w:tcMar>
+            <w:vAlign w:val="center"/>
+          </w:tcPr>
+          <w:p>
+            <w:pPr>
+              <w:spacing w:after="0"/>
+            </w:pPr>
             <w:r>
               <w:rPr>
                 <w:b/>
                 <w:bCs/>
                 <w:color w:val="FFFFFF"/>
+                <w:sz w:val="20"/>
+                <w:szCs w:val="20"/>
               </w:rPr>
               <w:t xml:space="preserve">Qué significa</w:t>
             </w:r>
@@ -2170,21 +2446,30 @@
         </w:tc>
       </w:tr>
       <w:tr>
-        <w:tc>
-          <w:tcPr>
-            <w:tcW w:type="pct" w:w="24%"/>
-            <w:tcMar>
-              <w:top w:type="dxa" w:w="60"/>
-              <w:left w:type="dxa" w:w="100"/>
-              <w:bottom w:type="dxa" w:w="60"/>
-              <w:right w:type="dxa" w:w="100"/>
-            </w:tcMar>
-          </w:tcPr>
-          <w:p>
+        <w:trPr>
+          <w:cantSplit/>
+        </w:trPr>
+        <w:tc>
+          <w:tcPr>
+            <w:tcW w:type="dxa" w:w="2232"/>
+            <w:tcMar>
+              <w:top w:type="dxa" w:w="80"/>
+              <w:left w:type="dxa" w:w="130"/>
+              <w:bottom w:type="dxa" w:w="80"/>
+              <w:right w:type="dxa" w:w="130"/>
+            </w:tcMar>
+            <w:vAlign w:val="center"/>
+          </w:tcPr>
+          <w:p>
+            <w:pPr>
+              <w:spacing w:after="0"/>
+            </w:pPr>
             <w:r>
               <w:rPr>
                 <w:b/>
                 <w:bCs/>
+                <w:sz w:val="20"/>
+                <w:szCs w:val="20"/>
               </w:rPr>
               <w:t xml:space="preserve">Cápita</w:t>
             </w:r>
@@ -2192,19 +2477,25 @@
         </w:tc>
         <w:tc>
           <w:tcPr>
-            <w:tcW w:type="pct" w:w="76%"/>
-            <w:tcMar>
-              <w:top w:type="dxa" w:w="60"/>
-              <w:left w:type="dxa" w:w="100"/>
-              <w:bottom w:type="dxa" w:w="60"/>
-              <w:right w:type="dxa" w:w="100"/>
-            </w:tcMar>
-          </w:tcPr>
-          <w:p>
+            <w:tcW w:type="dxa" w:w="7068"/>
+            <w:tcMar>
+              <w:top w:type="dxa" w:w="80"/>
+              <w:left w:type="dxa" w:w="130"/>
+              <w:bottom w:type="dxa" w:w="80"/>
+              <w:right w:type="dxa" w:w="130"/>
+            </w:tcMar>
+            <w:vAlign w:val="center"/>
+          </w:tcPr>
+          <w:p>
+            <w:pPr>
+              <w:spacing w:after="0"/>
+            </w:pPr>
             <w:r>
               <w:rPr>
                 <w:b w:val="false"/>
                 <w:bCs w:val="false"/>
+                <w:sz w:val="20"/>
+                <w:szCs w:val="20"/>
               </w:rPr>
               <w:t xml:space="preserve">Un socio activo. Es el resultado final del negocio que SysData busca aumentar.</w:t>
             </w:r>
@@ -2212,21 +2503,31 @@
         </w:tc>
       </w:tr>
       <w:tr>
-        <w:tc>
-          <w:tcPr>
-            <w:tcW w:type="pct" w:w="24%"/>
-            <w:tcMar>
-              <w:top w:type="dxa" w:w="60"/>
-              <w:left w:type="dxa" w:w="100"/>
-              <w:bottom w:type="dxa" w:w="60"/>
-              <w:right w:type="dxa" w:w="100"/>
-            </w:tcMar>
-          </w:tcPr>
-          <w:p>
+        <w:trPr>
+          <w:cantSplit/>
+        </w:trPr>
+        <w:tc>
+          <w:tcPr>
+            <w:tcW w:type="dxa" w:w="2232"/>
+            <w:shd w:fill="F2F5F8" w:color="auto" w:val="clear"/>
+            <w:tcMar>
+              <w:top w:type="dxa" w:w="80"/>
+              <w:left w:type="dxa" w:w="130"/>
+              <w:bottom w:type="dxa" w:w="80"/>
+              <w:right w:type="dxa" w:w="130"/>
+            </w:tcMar>
+            <w:vAlign w:val="center"/>
+          </w:tcPr>
+          <w:p>
+            <w:pPr>
+              <w:spacing w:after="0"/>
+            </w:pPr>
             <w:r>
               <w:rPr>
                 <w:b/>
                 <w:bCs/>
+                <w:sz w:val="20"/>
+                <w:szCs w:val="20"/>
               </w:rPr>
               <w:t xml:space="preserve">Dato</w:t>
             </w:r>
@@ -2234,19 +2535,26 @@
         </w:tc>
         <w:tc>
           <w:tcPr>
-            <w:tcW w:type="pct" w:w="76%"/>
-            <w:tcMar>
-              <w:top w:type="dxa" w:w="60"/>
-              <w:left w:type="dxa" w:w="100"/>
-              <w:bottom w:type="dxa" w:w="60"/>
-              <w:right w:type="dxa" w:w="100"/>
-            </w:tcMar>
-          </w:tcPr>
-          <w:p>
+            <w:tcW w:type="dxa" w:w="7068"/>
+            <w:shd w:fill="F2F5F8" w:color="auto" w:val="clear"/>
+            <w:tcMar>
+              <w:top w:type="dxa" w:w="80"/>
+              <w:left w:type="dxa" w:w="130"/>
+              <w:bottom w:type="dxa" w:w="80"/>
+              <w:right w:type="dxa" w:w="130"/>
+            </w:tcMar>
+            <w:vAlign w:val="center"/>
+          </w:tcPr>
+          <w:p>
+            <w:pPr>
+              <w:spacing w:after="0"/>
+            </w:pPr>
             <w:r>
               <w:rPr>
                 <w:b w:val="false"/>
                 <w:bCs w:val="false"/>
+                <w:sz w:val="20"/>
+                <w:szCs w:val="20"/>
               </w:rPr>
               <w:t xml:space="preserve">Un lead que dejó sus datos en el cotizador (paso clave del funnel de adquisición).</w:t>
             </w:r>
@@ -2254,21 +2562,30 @@
         </w:tc>
       </w:tr>
       <w:tr>
-        <w:tc>
-          <w:tcPr>
-            <w:tcW w:type="pct" w:w="24%"/>
-            <w:tcMar>
-              <w:top w:type="dxa" w:w="60"/>
-              <w:left w:type="dxa" w:w="100"/>
-              <w:bottom w:type="dxa" w:w="60"/>
-              <w:right w:type="dxa" w:w="100"/>
-            </w:tcMar>
-          </w:tcPr>
-          <w:p>
+        <w:trPr>
+          <w:cantSplit/>
+        </w:trPr>
+        <w:tc>
+          <w:tcPr>
+            <w:tcW w:type="dxa" w:w="2232"/>
+            <w:tcMar>
+              <w:top w:type="dxa" w:w="80"/>
+              <w:left w:type="dxa" w:w="130"/>
+              <w:bottom w:type="dxa" w:w="80"/>
+              <w:right w:type="dxa" w:w="130"/>
+            </w:tcMar>
+            <w:vAlign w:val="center"/>
+          </w:tcPr>
+          <w:p>
+            <w:pPr>
+              <w:spacing w:after="0"/>
+            </w:pPr>
             <w:r>
               <w:rPr>
                 <w:b/>
                 <w:bCs/>
+                <w:sz w:val="20"/>
+                <w:szCs w:val="20"/>
               </w:rPr>
               <w:t xml:space="preserve">Funnel / embudo</w:t>
             </w:r>
@@ -2276,41 +2593,57 @@
         </w:tc>
         <w:tc>
           <w:tcPr>
-            <w:tcW w:type="pct" w:w="76%"/>
-            <w:tcMar>
-              <w:top w:type="dxa" w:w="60"/>
-              <w:left w:type="dxa" w:w="100"/>
-              <w:bottom w:type="dxa" w:w="60"/>
-              <w:right w:type="dxa" w:w="100"/>
-            </w:tcMar>
-          </w:tcPr>
-          <w:p>
+            <w:tcW w:type="dxa" w:w="7068"/>
+            <w:tcMar>
+              <w:top w:type="dxa" w:w="80"/>
+              <w:left w:type="dxa" w:w="130"/>
+              <w:bottom w:type="dxa" w:w="80"/>
+              <w:right w:type="dxa" w:w="130"/>
+            </w:tcMar>
+            <w:vAlign w:val="center"/>
+          </w:tcPr>
+          <w:p>
+            <w:pPr>
+              <w:spacing w:after="0"/>
+            </w:pPr>
             <w:r>
               <w:rPr>
                 <w:b w:val="false"/>
                 <w:bCs w:val="false"/>
-              </w:rPr>
-              <w:t xml:space="preserve">La secuencia de pasos que recorre un usuario (ej. visita → datos → cotización → alta).</w:t>
+                <w:sz w:val="20"/>
+                <w:szCs w:val="20"/>
+              </w:rPr>
+              <w:t xml:space="preserve">La secuencia de pasos que recorre un usuario (visita → datos → cotización → alta).</w:t>
             </w:r>
           </w:p>
         </w:tc>
       </w:tr>
       <w:tr>
-        <w:tc>
-          <w:tcPr>
-            <w:tcW w:type="pct" w:w="24%"/>
-            <w:tcMar>
-              <w:top w:type="dxa" w:w="60"/>
-              <w:left w:type="dxa" w:w="100"/>
-              <w:bottom w:type="dxa" w:w="60"/>
-              <w:right w:type="dxa" w:w="100"/>
-            </w:tcMar>
-          </w:tcPr>
-          <w:p>
+        <w:trPr>
+          <w:cantSplit/>
+        </w:trPr>
+        <w:tc>
+          <w:tcPr>
+            <w:tcW w:type="dxa" w:w="2232"/>
+            <w:shd w:fill="F2F5F8" w:color="auto" w:val="clear"/>
+            <w:tcMar>
+              <w:top w:type="dxa" w:w="80"/>
+              <w:left w:type="dxa" w:w="130"/>
+              <w:bottom w:type="dxa" w:w="80"/>
+              <w:right w:type="dxa" w:w="130"/>
+            </w:tcMar>
+            <w:vAlign w:val="center"/>
+          </w:tcPr>
+          <w:p>
+            <w:pPr>
+              <w:spacing w:after="0"/>
+            </w:pPr>
             <w:r>
               <w:rPr>
                 <w:b/>
                 <w:bCs/>
+                <w:sz w:val="20"/>
+                <w:szCs w:val="20"/>
               </w:rPr>
               <w:t xml:space="preserve">Fuga (leak)</w:t>
             </w:r>
@@ -2318,19 +2651,26 @@
         </w:tc>
         <w:tc>
           <w:tcPr>
-            <w:tcW w:type="pct" w:w="76%"/>
-            <w:tcMar>
-              <w:top w:type="dxa" w:w="60"/>
-              <w:left w:type="dxa" w:w="100"/>
-              <w:bottom w:type="dxa" w:w="60"/>
-              <w:right w:type="dxa" w:w="100"/>
-            </w:tcMar>
-          </w:tcPr>
-          <w:p>
+            <w:tcW w:type="dxa" w:w="7068"/>
+            <w:shd w:fill="F2F5F8" w:color="auto" w:val="clear"/>
+            <w:tcMar>
+              <w:top w:type="dxa" w:w="80"/>
+              <w:left w:type="dxa" w:w="130"/>
+              <w:bottom w:type="dxa" w:w="80"/>
+              <w:right w:type="dxa" w:w="130"/>
+            </w:tcMar>
+            <w:vAlign w:val="center"/>
+          </w:tcPr>
+          <w:p>
+            <w:pPr>
+              <w:spacing w:after="0"/>
+            </w:pPr>
             <w:r>
               <w:rPr>
                 <w:b w:val="false"/>
                 <w:bCs w:val="false"/>
+                <w:sz w:val="20"/>
+                <w:szCs w:val="20"/>
               </w:rPr>
               <w:t xml:space="preserve">El paso donde más gente se cae. SysData la mide en personas y en plata.</w:t>
             </w:r>
@@ -2338,21 +2678,30 @@
         </w:tc>
       </w:tr>
       <w:tr>
-        <w:tc>
-          <w:tcPr>
-            <w:tcW w:type="pct" w:w="24%"/>
-            <w:tcMar>
-              <w:top w:type="dxa" w:w="60"/>
-              <w:left w:type="dxa" w:w="100"/>
-              <w:bottom w:type="dxa" w:w="60"/>
-              <w:right w:type="dxa" w:w="100"/>
-            </w:tcMar>
-          </w:tcPr>
-          <w:p>
+        <w:trPr>
+          <w:cantSplit/>
+        </w:trPr>
+        <w:tc>
+          <w:tcPr>
+            <w:tcW w:type="dxa" w:w="2232"/>
+            <w:tcMar>
+              <w:top w:type="dxa" w:w="80"/>
+              <w:left w:type="dxa" w:w="130"/>
+              <w:bottom w:type="dxa" w:w="80"/>
+              <w:right w:type="dxa" w:w="130"/>
+            </w:tcMar>
+            <w:vAlign w:val="center"/>
+          </w:tcPr>
+          <w:p>
+            <w:pPr>
+              <w:spacing w:after="0"/>
+            </w:pPr>
             <w:r>
               <w:rPr>
                 <w:b/>
                 <w:bCs/>
+                <w:sz w:val="20"/>
+                <w:szCs w:val="20"/>
               </w:rPr>
               <w:t xml:space="preserve">Win rate</w:t>
             </w:r>
@@ -2360,19 +2709,25 @@
         </w:tc>
         <w:tc>
           <w:tcPr>
-            <w:tcW w:type="pct" w:w="76%"/>
-            <w:tcMar>
-              <w:top w:type="dxa" w:w="60"/>
-              <w:left w:type="dxa" w:w="100"/>
-              <w:bottom w:type="dxa" w:w="60"/>
-              <w:right w:type="dxa" w:w="100"/>
-            </w:tcMar>
-          </w:tcPr>
-          <w:p>
+            <w:tcW w:type="dxa" w:w="7068"/>
+            <w:tcMar>
+              <w:top w:type="dxa" w:w="80"/>
+              <w:left w:type="dxa" w:w="130"/>
+              <w:bottom w:type="dxa" w:w="80"/>
+              <w:right w:type="dxa" w:w="130"/>
+            </w:tcMar>
+            <w:vAlign w:val="center"/>
+          </w:tcPr>
+          <w:p>
+            <w:pPr>
+              <w:spacing w:after="0"/>
+            </w:pPr>
             <w:r>
               <w:rPr>
                 <w:b w:val="false"/>
                 <w:bCs w:val="false"/>
+                <w:sz w:val="20"/>
+                <w:szCs w:val="20"/>
               </w:rPr>
               <w:t xml:space="preserve">Porcentaje de deals comerciales que se cierran (ganados / decididos), en HubSpot.</w:t>
             </w:r>
@@ -2380,21 +2735,31 @@
         </w:tc>
       </w:tr>
       <w:tr>
-        <w:tc>
-          <w:tcPr>
-            <w:tcW w:type="pct" w:w="24%"/>
-            <w:tcMar>
-              <w:top w:type="dxa" w:w="60"/>
-              <w:left w:type="dxa" w:w="100"/>
-              <w:bottom w:type="dxa" w:w="60"/>
-              <w:right w:type="dxa" w:w="100"/>
-            </w:tcMar>
-          </w:tcPr>
-          <w:p>
+        <w:trPr>
+          <w:cantSplit/>
+        </w:trPr>
+        <w:tc>
+          <w:tcPr>
+            <w:tcW w:type="dxa" w:w="2232"/>
+            <w:shd w:fill="F2F5F8" w:color="auto" w:val="clear"/>
+            <w:tcMar>
+              <w:top w:type="dxa" w:w="80"/>
+              <w:left w:type="dxa" w:w="130"/>
+              <w:bottom w:type="dxa" w:w="80"/>
+              <w:right w:type="dxa" w:w="130"/>
+            </w:tcMar>
+            <w:vAlign w:val="center"/>
+          </w:tcPr>
+          <w:p>
+            <w:pPr>
+              <w:spacing w:after="0"/>
+            </w:pPr>
             <w:r>
               <w:rPr>
                 <w:b/>
                 <w:bCs/>
+                <w:sz w:val="20"/>
+                <w:szCs w:val="20"/>
               </w:rPr>
               <w:t xml:space="preserve">LTV</w:t>
             </w:r>
@@ -2402,19 +2767,26 @@
         </w:tc>
         <w:tc>
           <w:tcPr>
-            <w:tcW w:type="pct" w:w="76%"/>
-            <w:tcMar>
-              <w:top w:type="dxa" w:w="60"/>
-              <w:left w:type="dxa" w:w="100"/>
-              <w:bottom w:type="dxa" w:w="60"/>
-              <w:right w:type="dxa" w:w="100"/>
-            </w:tcMar>
-          </w:tcPr>
-          <w:p>
+            <w:tcW w:type="dxa" w:w="7068"/>
+            <w:shd w:fill="F2F5F8" w:color="auto" w:val="clear"/>
+            <w:tcMar>
+              <w:top w:type="dxa" w:w="80"/>
+              <w:left w:type="dxa" w:w="130"/>
+              <w:bottom w:type="dxa" w:w="80"/>
+              <w:right w:type="dxa" w:w="130"/>
+            </w:tcMar>
+            <w:vAlign w:val="center"/>
+          </w:tcPr>
+          <w:p>
+            <w:pPr>
+              <w:spacing w:after="0"/>
+            </w:pPr>
             <w:r>
               <w:rPr>
                 <w:b w:val="false"/>
                 <w:bCs w:val="false"/>
+                <w:sz w:val="20"/>
+                <w:szCs w:val="20"/>
               </w:rPr>
               <w:t xml:space="preserve">Valor de contribución de una cápita a lo largo de su permanencia (ARPU × meses × margen).</w:t>
             </w:r>
@@ -2422,21 +2794,30 @@
         </w:tc>
       </w:tr>
       <w:tr>
-        <w:tc>
-          <w:tcPr>
-            <w:tcW w:type="pct" w:w="24%"/>
-            <w:tcMar>
-              <w:top w:type="dxa" w:w="60"/>
-              <w:left w:type="dxa" w:w="100"/>
-              <w:bottom w:type="dxa" w:w="60"/>
-              <w:right w:type="dxa" w:w="100"/>
-            </w:tcMar>
-          </w:tcPr>
-          <w:p>
+        <w:trPr>
+          <w:cantSplit/>
+        </w:trPr>
+        <w:tc>
+          <w:tcPr>
+            <w:tcW w:type="dxa" w:w="2232"/>
+            <w:tcMar>
+              <w:top w:type="dxa" w:w="80"/>
+              <w:left w:type="dxa" w:w="130"/>
+              <w:bottom w:type="dxa" w:w="80"/>
+              <w:right w:type="dxa" w:w="130"/>
+            </w:tcMar>
+            <w:vAlign w:val="center"/>
+          </w:tcPr>
+          <w:p>
+            <w:pPr>
+              <w:spacing w:after="0"/>
+            </w:pPr>
             <w:r>
               <w:rPr>
                 <w:b/>
                 <w:bCs/>
+                <w:sz w:val="20"/>
+                <w:szCs w:val="20"/>
               </w:rPr>
               <w:t xml:space="preserve">CAC</w:t>
             </w:r>
@@ -2444,19 +2825,25 @@
         </w:tc>
         <w:tc>
           <w:tcPr>
-            <w:tcW w:type="pct" w:w="76%"/>
-            <w:tcMar>
-              <w:top w:type="dxa" w:w="60"/>
-              <w:left w:type="dxa" w:w="100"/>
-              <w:bottom w:type="dxa" w:w="60"/>
-              <w:right w:type="dxa" w:w="100"/>
-            </w:tcMar>
-          </w:tcPr>
-          <w:p>
+            <w:tcW w:type="dxa" w:w="7068"/>
+            <w:tcMar>
+              <w:top w:type="dxa" w:w="80"/>
+              <w:left w:type="dxa" w:w="130"/>
+              <w:bottom w:type="dxa" w:w="80"/>
+              <w:right w:type="dxa" w:w="130"/>
+            </w:tcMar>
+            <w:vAlign w:val="center"/>
+          </w:tcPr>
+          <w:p>
+            <w:pPr>
+              <w:spacing w:after="0"/>
+            </w:pPr>
             <w:r>
               <w:rPr>
                 <w:b w:val="false"/>
                 <w:bCs w:val="false"/>
+                <w:sz w:val="20"/>
+                <w:szCs w:val="20"/>
               </w:rPr>
               <w:t xml:space="preserve">Costo de adquirir una cápita.</w:t>
             </w:r>
@@ -2464,21 +2851,31 @@
         </w:tc>
       </w:tr>
       <w:tr>
-        <w:tc>
-          <w:tcPr>
-            <w:tcW w:type="pct" w:w="24%"/>
-            <w:tcMar>
-              <w:top w:type="dxa" w:w="60"/>
-              <w:left w:type="dxa" w:w="100"/>
-              <w:bottom w:type="dxa" w:w="60"/>
-              <w:right w:type="dxa" w:w="100"/>
-            </w:tcMar>
-          </w:tcPr>
-          <w:p>
+        <w:trPr>
+          <w:cantSplit/>
+        </w:trPr>
+        <w:tc>
+          <w:tcPr>
+            <w:tcW w:type="dxa" w:w="2232"/>
+            <w:shd w:fill="F2F5F8" w:color="auto" w:val="clear"/>
+            <w:tcMar>
+              <w:top w:type="dxa" w:w="80"/>
+              <w:left w:type="dxa" w:w="130"/>
+              <w:bottom w:type="dxa" w:w="80"/>
+              <w:right w:type="dxa" w:w="130"/>
+            </w:tcMar>
+            <w:vAlign w:val="center"/>
+          </w:tcPr>
+          <w:p>
+            <w:pPr>
+              <w:spacing w:after="0"/>
+            </w:pPr>
             <w:r>
               <w:rPr>
                 <w:b/>
                 <w:bCs/>
+                <w:sz w:val="20"/>
+                <w:szCs w:val="20"/>
               </w:rPr>
               <w:t xml:space="preserve">ARPU</w:t>
             </w:r>
@@ -2486,19 +2883,26 @@
         </w:tc>
         <w:tc>
           <w:tcPr>
-            <w:tcW w:type="pct" w:w="76%"/>
-            <w:tcMar>
-              <w:top w:type="dxa" w:w="60"/>
-              <w:left w:type="dxa" w:w="100"/>
-              <w:bottom w:type="dxa" w:w="60"/>
-              <w:right w:type="dxa" w:w="100"/>
-            </w:tcMar>
-          </w:tcPr>
-          <w:p>
+            <w:tcW w:type="dxa" w:w="7068"/>
+            <w:shd w:fill="F2F5F8" w:color="auto" w:val="clear"/>
+            <w:tcMar>
+              <w:top w:type="dxa" w:w="80"/>
+              <w:left w:type="dxa" w:w="130"/>
+              <w:bottom w:type="dxa" w:w="80"/>
+              <w:right w:type="dxa" w:w="130"/>
+            </w:tcMar>
+            <w:vAlign w:val="center"/>
+          </w:tcPr>
+          <w:p>
+            <w:pPr>
+              <w:spacing w:after="0"/>
+            </w:pPr>
             <w:r>
               <w:rPr>
                 <w:b w:val="false"/>
                 <w:bCs w:val="false"/>
+                <w:sz w:val="20"/>
+                <w:szCs w:val="20"/>
               </w:rPr>
               <w:t xml:space="preserve">Ingreso promedio mensual por socio.</w:t>
             </w:r>
@@ -2506,21 +2910,30 @@
         </w:tc>
       </w:tr>
       <w:tr>
-        <w:tc>
-          <w:tcPr>
-            <w:tcW w:type="pct" w:w="24%"/>
-            <w:tcMar>
-              <w:top w:type="dxa" w:w="60"/>
-              <w:left w:type="dxa" w:w="100"/>
-              <w:bottom w:type="dxa" w:w="60"/>
-              <w:right w:type="dxa" w:w="100"/>
-            </w:tcMar>
-          </w:tcPr>
-          <w:p>
+        <w:trPr>
+          <w:cantSplit/>
+        </w:trPr>
+        <w:tc>
+          <w:tcPr>
+            <w:tcW w:type="dxa" w:w="2232"/>
+            <w:tcMar>
+              <w:top w:type="dxa" w:w="80"/>
+              <w:left w:type="dxa" w:w="130"/>
+              <w:bottom w:type="dxa" w:w="80"/>
+              <w:right w:type="dxa" w:w="130"/>
+            </w:tcMar>
+            <w:vAlign w:val="center"/>
+          </w:tcPr>
+          <w:p>
+            <w:pPr>
+              <w:spacing w:after="0"/>
+            </w:pPr>
             <w:r>
               <w:rPr>
                 <w:b/>
                 <w:bCs/>
+                <w:sz w:val="20"/>
+                <w:szCs w:val="20"/>
               </w:rPr>
               <w:t xml:space="preserve">prospecto_id</w:t>
             </w:r>
@@ -2528,19 +2941,25 @@
         </w:tc>
         <w:tc>
           <w:tcPr>
-            <w:tcW w:type="pct" w:w="76%"/>
-            <w:tcMar>
-              <w:top w:type="dxa" w:w="60"/>
-              <w:left w:type="dxa" w:w="100"/>
-              <w:bottom w:type="dxa" w:w="60"/>
-              <w:right w:type="dxa" w:w="100"/>
-            </w:tcMar>
-          </w:tcPr>
-          <w:p>
+            <w:tcW w:type="dxa" w:w="7068"/>
+            <w:tcMar>
+              <w:top w:type="dxa" w:w="80"/>
+              <w:left w:type="dxa" w:w="130"/>
+              <w:bottom w:type="dxa" w:w="80"/>
+              <w:right w:type="dxa" w:w="130"/>
+            </w:tcMar>
+            <w:vAlign w:val="center"/>
+          </w:tcPr>
+          <w:p>
+            <w:pPr>
+              <w:spacing w:after="0"/>
+            </w:pPr>
             <w:r>
               <w:rPr>
                 <w:b w:val="false"/>
                 <w:bCs w:val="false"/>
+                <w:sz w:val="20"/>
+                <w:szCs w:val="20"/>
               </w:rPr>
               <w:t xml:space="preserve">El identificador que permitiría unir el comportamiento (Mixpanel) con la cápita (HubSpot).</w:t>
             </w:r>
@@ -2548,21 +2967,31 @@
         </w:tc>
       </w:tr>
       <w:tr>
-        <w:tc>
-          <w:tcPr>
-            <w:tcW w:type="pct" w:w="24%"/>
-            <w:tcMar>
-              <w:top w:type="dxa" w:w="60"/>
-              <w:left w:type="dxa" w:w="100"/>
-              <w:bottom w:type="dxa" w:w="60"/>
-              <w:right w:type="dxa" w:w="100"/>
-            </w:tcMar>
-          </w:tcPr>
-          <w:p>
+        <w:trPr>
+          <w:cantSplit/>
+        </w:trPr>
+        <w:tc>
+          <w:tcPr>
+            <w:tcW w:type="dxa" w:w="2232"/>
+            <w:shd w:fill="F2F5F8" w:color="auto" w:val="clear"/>
+            <w:tcMar>
+              <w:top w:type="dxa" w:w="80"/>
+              <w:left w:type="dxa" w:w="130"/>
+              <w:bottom w:type="dxa" w:w="80"/>
+              <w:right w:type="dxa" w:w="130"/>
+            </w:tcMar>
+            <w:vAlign w:val="center"/>
+          </w:tcPr>
+          <w:p>
+            <w:pPr>
+              <w:spacing w:after="0"/>
+            </w:pPr>
             <w:r>
               <w:rPr>
                 <w:b/>
                 <w:bCs/>
+                <w:sz w:val="20"/>
+                <w:szCs w:val="20"/>
               </w:rPr>
               <w:t xml:space="preserve">Prior</w:t>
             </w:r>
@@ -2570,41 +2999,57 @@
         </w:tc>
         <w:tc>
           <w:tcPr>
-            <w:tcW w:type="pct" w:w="76%"/>
-            <w:tcMar>
-              <w:top w:type="dxa" w:w="60"/>
-              <w:left w:type="dxa" w:w="100"/>
-              <w:bottom w:type="dxa" w:w="60"/>
-              <w:right w:type="dxa" w:w="100"/>
-            </w:tcMar>
-          </w:tcPr>
-          <w:p>
+            <w:tcW w:type="dxa" w:w="7068"/>
+            <w:shd w:fill="F2F5F8" w:color="auto" w:val="clear"/>
+            <w:tcMar>
+              <w:top w:type="dxa" w:w="80"/>
+              <w:left w:type="dxa" w:w="130"/>
+              <w:bottom w:type="dxa" w:w="80"/>
+              <w:right w:type="dxa" w:w="130"/>
+            </w:tcMar>
+            <w:vAlign w:val="center"/>
+          </w:tcPr>
+          <w:p>
+            <w:pPr>
+              <w:spacing w:after="0"/>
+            </w:pPr>
             <w:r>
               <w:rPr>
                 <w:b w:val="false"/>
                 <w:bCs w:val="false"/>
-              </w:rPr>
-              <w:t xml:space="preserve">Lo aprendido de experimentos pasados, que el motor usa para estimar mejor (ej. cuánto de una fuga se recupera de verdad).</w:t>
+                <w:sz w:val="20"/>
+                <w:szCs w:val="20"/>
+              </w:rPr>
+              <w:t xml:space="preserve">Lo aprendido de experimentos pasados; el motor lo usa para estimar mejor (ej. cuánto de una fuga se recupera de verdad).</w:t>
             </w:r>
           </w:p>
         </w:tc>
       </w:tr>
       <w:tr>
-        <w:tc>
-          <w:tcPr>
-            <w:tcW w:type="pct" w:w="24%"/>
-            <w:tcMar>
-              <w:top w:type="dxa" w:w="60"/>
-              <w:left w:type="dxa" w:w="100"/>
-              <w:bottom w:type="dxa" w:w="60"/>
-              <w:right w:type="dxa" w:w="100"/>
-            </w:tcMar>
-          </w:tcPr>
-          <w:p>
+        <w:trPr>
+          <w:cantSplit/>
+        </w:trPr>
+        <w:tc>
+          <w:tcPr>
+            <w:tcW w:type="dxa" w:w="2232"/>
+            <w:tcMar>
+              <w:top w:type="dxa" w:w="80"/>
+              <w:left w:type="dxa" w:w="130"/>
+              <w:bottom w:type="dxa" w:w="80"/>
+              <w:right w:type="dxa" w:w="130"/>
+            </w:tcMar>
+            <w:vAlign w:val="center"/>
+          </w:tcPr>
+          <w:p>
+            <w:pPr>
+              <w:spacing w:after="0"/>
+            </w:pPr>
             <w:r>
               <w:rPr>
                 <w:b/>
                 <w:bCs/>
+                <w:sz w:val="20"/>
+                <w:szCs w:val="20"/>
               </w:rPr>
               <w:t xml:space="preserve">Snapshot</w:t>
             </w:r>
@@ -2612,19 +3057,25 @@
         </w:tc>
         <w:tc>
           <w:tcPr>
-            <w:tcW w:type="pct" w:w="76%"/>
-            <w:tcMar>
-              <w:top w:type="dxa" w:w="60"/>
-              <w:left w:type="dxa" w:w="100"/>
-              <w:bottom w:type="dxa" w:w="60"/>
-              <w:right w:type="dxa" w:w="100"/>
-            </w:tcMar>
-          </w:tcPr>
-          <w:p>
+            <w:tcW w:type="dxa" w:w="7068"/>
+            <w:tcMar>
+              <w:top w:type="dxa" w:w="80"/>
+              <w:left w:type="dxa" w:w="130"/>
+              <w:bottom w:type="dxa" w:w="80"/>
+              <w:right w:type="dxa" w:w="130"/>
+            </w:tcMar>
+            <w:vAlign w:val="center"/>
+          </w:tcPr>
+          <w:p>
+            <w:pPr>
+              <w:spacing w:after="0"/>
+            </w:pPr>
             <w:r>
               <w:rPr>
                 <w:b w:val="false"/>
                 <w:bCs w:val="false"/>
+                <w:sz w:val="20"/>
+                <w:szCs w:val="20"/>
               </w:rPr>
               <w:t xml:space="preserve">La foto diaria de los datos que guarda la capa de Memoria.</w:t>
             </w:r>
@@ -2632,21 +3083,31 @@
         </w:tc>
       </w:tr>
       <w:tr>
-        <w:tc>
-          <w:tcPr>
-            <w:tcW w:type="pct" w:w="24%"/>
-            <w:tcMar>
-              <w:top w:type="dxa" w:w="60"/>
-              <w:left w:type="dxa" w:w="100"/>
-              <w:bottom w:type="dxa" w:w="60"/>
-              <w:right w:type="dxa" w:w="100"/>
-            </w:tcMar>
-          </w:tcPr>
-          <w:p>
+        <w:trPr>
+          <w:cantSplit/>
+        </w:trPr>
+        <w:tc>
+          <w:tcPr>
+            <w:tcW w:type="dxa" w:w="2232"/>
+            <w:shd w:fill="F2F5F8" w:color="auto" w:val="clear"/>
+            <w:tcMar>
+              <w:top w:type="dxa" w:w="80"/>
+              <w:left w:type="dxa" w:w="130"/>
+              <w:bottom w:type="dxa" w:w="80"/>
+              <w:right w:type="dxa" w:w="130"/>
+            </w:tcMar>
+            <w:vAlign w:val="center"/>
+          </w:tcPr>
+          <w:p>
+            <w:pPr>
+              <w:spacing w:after="0"/>
+            </w:pPr>
             <w:r>
               <w:rPr>
                 <w:b/>
                 <w:bCs/>
+                <w:sz w:val="20"/>
+                <w:szCs w:val="20"/>
               </w:rPr>
               <w:t xml:space="preserve">Guardrail</w:t>
             </w:r>
@@ -2654,19 +3115,26 @@
         </w:tc>
         <w:tc>
           <w:tcPr>
-            <w:tcW w:type="pct" w:w="76%"/>
-            <w:tcMar>
-              <w:top w:type="dxa" w:w="60"/>
-              <w:left w:type="dxa" w:w="100"/>
-              <w:bottom w:type="dxa" w:w="60"/>
-              <w:right w:type="dxa" w:w="100"/>
-            </w:tcMar>
-          </w:tcPr>
-          <w:p>
+            <w:tcW w:type="dxa" w:w="7068"/>
+            <w:shd w:fill="F2F5F8" w:color="auto" w:val="clear"/>
+            <w:tcMar>
+              <w:top w:type="dxa" w:w="80"/>
+              <w:left w:type="dxa" w:w="130"/>
+              <w:bottom w:type="dxa" w:w="80"/>
+              <w:right w:type="dxa" w:w="130"/>
+            </w:tcMar>
+            <w:vAlign w:val="center"/>
+          </w:tcPr>
+          <w:p>
+            <w:pPr>
+              <w:spacing w:after="0"/>
+            </w:pPr>
             <w:r>
               <w:rPr>
                 <w:b w:val="false"/>
                 <w:bCs w:val="false"/>
+                <w:sz w:val="20"/>
+                <w:szCs w:val="20"/>
               </w:rPr>
               <w:t xml:space="preserve">Un chequeo de seguridad: que una mejora no rompa otra métrica.</w:t>
             </w:r>
@@ -2674,21 +3142,30 @@
         </w:tc>
       </w:tr>
       <w:tr>
-        <w:tc>
-          <w:tcPr>
-            <w:tcW w:type="pct" w:w="24%"/>
-            <w:tcMar>
-              <w:top w:type="dxa" w:w="60"/>
-              <w:left w:type="dxa" w:w="100"/>
-              <w:bottom w:type="dxa" w:w="60"/>
-              <w:right w:type="dxa" w:w="100"/>
-            </w:tcMar>
-          </w:tcPr>
-          <w:p>
+        <w:trPr>
+          <w:cantSplit/>
+        </w:trPr>
+        <w:tc>
+          <w:tcPr>
+            <w:tcW w:type="dxa" w:w="2232"/>
+            <w:tcMar>
+              <w:top w:type="dxa" w:w="80"/>
+              <w:left w:type="dxa" w:w="130"/>
+              <w:bottom w:type="dxa" w:w="80"/>
+              <w:right w:type="dxa" w:w="130"/>
+            </w:tcMar>
+            <w:vAlign w:val="center"/>
+          </w:tcPr>
+          <w:p>
+            <w:pPr>
+              <w:spacing w:after="0"/>
+            </w:pPr>
             <w:r>
               <w:rPr>
                 <w:b/>
                 <w:bCs/>
+                <w:sz w:val="20"/>
+                <w:szCs w:val="20"/>
               </w:rPr>
               <w:t xml:space="preserve">Significancia</w:t>
             </w:r>
@@ -2696,19 +3173,25 @@
         </w:tc>
         <w:tc>
           <w:tcPr>
-            <w:tcW w:type="pct" w:w="76%"/>
-            <w:tcMar>
-              <w:top w:type="dxa" w:w="60"/>
-              <w:left w:type="dxa" w:w="100"/>
-              <w:bottom w:type="dxa" w:w="60"/>
-              <w:right w:type="dxa" w:w="100"/>
-            </w:tcMar>
-          </w:tcPr>
-          <w:p>
+            <w:tcW w:type="dxa" w:w="7068"/>
+            <w:tcMar>
+              <w:top w:type="dxa" w:w="80"/>
+              <w:left w:type="dxa" w:w="130"/>
+              <w:bottom w:type="dxa" w:w="80"/>
+              <w:right w:type="dxa" w:w="130"/>
+            </w:tcMar>
+            <w:vAlign w:val="center"/>
+          </w:tcPr>
+          <w:p>
+            <w:pPr>
+              <w:spacing w:after="0"/>
+            </w:pPr>
             <w:r>
               <w:rPr>
                 <w:b w:val="false"/>
                 <w:bCs w:val="false"/>
+                <w:sz w:val="20"/>
+                <w:szCs w:val="20"/>
               </w:rPr>
               <w:t xml:space="preserve">Que un resultado supere el ruido estadístico; sin ella, no es un resultado.</w:t>
             </w:r>
@@ -2717,7 +3200,7 @@
       </w:tr>
     </w:tbl>
     <w:sectPr>
-      <w:pgSz w:w="11906" w:h="16838" w:orient="portrait"/>
+      <w:pgSz w:w="12240" w:h="15840" w:orient="portrait"/>
       <w:pgMar w:top="1440" w:right="1440" w:bottom="1440" w:left="1440" w:header="708" w:footer="708" w:gutter="0"/>
       <w:pgNumType/>
       <w:docGrid w:linePitch="360"/>

</xml_diff>

<commit_message>
docs: integrar Binary (base de socios) en el doc + corregir unit economics
- Nueva sección 'Las fuentes de datos (y cómo entra Binary)': tabla de las 4 fuentes
  (Mixpanel, HubSpot, PELG, Binary) + cómo usaría SysData a Binary.
- Unit economics: el LTV/permanencia/ARPU reales salen de Binary (no del PELG, que aporta
  CAC/inversión). Aclarado en 'Cómo decide', stack, cruce, roadmap, principios y glosario.
- Binary entra también como fuente para cerrar el cruce visita->cápita (Opción B, warehouse).
</commit_message>
<xml_diff>
--- a/SysData-Documentacion.docx
+++ b/SysData-Documentacion.docx
@@ -85,7 +85,7 @@
         <w:rPr>
           <w:color w:val="5B6B7F"/>
         </w:rPr>
-        <w:t xml:space="preserve">Versión 1.1 · 19 de junio de 2026</w:t>
+        <w:t xml:space="preserve">Versión 1.2 · 19 de junio de 2026</w:t>
       </w:r>
     </w:p>
     <w:p>
@@ -147,7 +147,7 @@
         <w:spacing w:after="40"/>
       </w:pPr>
       <w:r>
-        <w:t xml:space="preserve">6. Cómo decide: la lógica</w:t>
+        <w:t xml:space="preserve">6. Las fuentes de datos (y cómo entra Binary)</w:t>
       </w:r>
     </w:p>
     <w:p>
@@ -155,7 +155,7 @@
         <w:spacing w:after="40"/>
       </w:pPr>
       <w:r>
-        <w:t xml:space="preserve">7. Decisiones de producto y su porqué</w:t>
+        <w:t xml:space="preserve">7. Cómo decide: la lógica</w:t>
       </w:r>
     </w:p>
     <w:p>
@@ -163,7 +163,7 @@
         <w:spacing w:after="40"/>
       </w:pPr>
       <w:r>
-        <w:t xml:space="preserve">8. Arquitectura del motor: las 4 capas</w:t>
+        <w:t xml:space="preserve">8. Decisiones de producto y su porqué</w:t>
       </w:r>
     </w:p>
     <w:p>
@@ -171,7 +171,7 @@
         <w:spacing w:after="40"/>
       </w:pPr>
       <w:r>
-        <w:t xml:space="preserve">9. Rigor de medición de experimentos</w:t>
+        <w:t xml:space="preserve">9. Arquitectura del motor: las 4 capas</w:t>
       </w:r>
     </w:p>
     <w:p>
@@ -179,7 +179,7 @@
         <w:spacing w:after="40"/>
       </w:pPr>
       <w:r>
-        <w:t xml:space="preserve">10. Stack técnico</w:t>
+        <w:t xml:space="preserve">10. Rigor de medición de experimentos</w:t>
       </w:r>
     </w:p>
     <w:p>
@@ -187,7 +187,7 @@
         <w:spacing w:after="40"/>
       </w:pPr>
       <w:r>
-        <w:t xml:space="preserve">11. La dependencia clave: el cruce visita → cápita</w:t>
+        <w:t xml:space="preserve">11. Stack técnico</w:t>
       </w:r>
     </w:p>
     <w:p>
@@ -195,7 +195,7 @@
         <w:spacing w:after="40"/>
       </w:pPr>
       <w:r>
-        <w:t xml:space="preserve">12. Estado actual y roadmap</w:t>
+        <w:t xml:space="preserve">12. La dependencia clave: el cruce visita → cápita</w:t>
       </w:r>
     </w:p>
     <w:p>
@@ -203,7 +203,7 @@
         <w:spacing w:after="40"/>
       </w:pPr>
       <w:r>
-        <w:t xml:space="preserve">13. Principios, seguridad y restricciones</w:t>
+        <w:t xml:space="preserve">13. Estado actual y roadmap</w:t>
       </w:r>
     </w:p>
     <w:p>
@@ -211,7 +211,15 @@
         <w:spacing w:after="40"/>
       </w:pPr>
       <w:r>
-        <w:t xml:space="preserve">14. Glosario</w:t>
+        <w:t xml:space="preserve">14. Principios, seguridad y restricciones</w:t>
+      </w:r>
+    </w:p>
+    <w:p>
+      <w:pPr>
+        <w:spacing w:after="40"/>
+      </w:pPr>
+      <w:r>
+        <w:t xml:space="preserve">15. Glosario</w:t>
       </w:r>
     </w:p>
     <w:p>
@@ -234,7 +242,7 @@
         <w:jc w:val="both"/>
       </w:pPr>
       <w:r>
-        <w:t xml:space="preserve">SysData es una herramienta interna de growth: la capa de decisión que se para arriba de los datos que Medicus ya tiene —comportamiento (Mixpanel), comercial (HubSpot) y unit economics (PELG)— y los cruza para responder una sola pregunta: qué conviene mejorar, dónde, cuándo, y cuánta plata hay en juego.</w:t>
+        <w:t xml:space="preserve">SysData es una herramienta interna de growth: la capa de decisión que se para arriba de los datos que Medicus ya tiene —comportamiento (Mixpanel), comercial (HubSpot), inversión y costos (PELG) y la base de socios (Binary)— y los cruza para responder una sola pregunta: qué conviene mejorar, dónde, cuándo, y cuánta plata hay en juego.</w:t>
       </w:r>
     </w:p>
     <w:p>
@@ -243,7 +251,7 @@
         <w:jc w:val="both"/>
       </w:pPr>
       <w:r>
-        <w:t xml:space="preserve">No reemplaza a Mixpanel, HubSpot ni Metabase. Los une y los traduce en decisiones priorizadas por impacto en el negocio (cápitas y margen), separando siempre lo que es dato medido de lo que es supuesto. Cada experimento que el equipo cierra alimenta al motor y lo vuelve más certero: es un sistema de mejora continua, no un dashboard estático.</w:t>
+        <w:t xml:space="preserve">No reemplaza a Mixpanel, HubSpot, Binary ni Metabase. Los une y los traduce en decisiones priorizadas por impacto en el negocio (cápitas y margen), separando siempre lo que es dato medido de lo que es supuesto. Cada experimento que el equipo cierra alimenta al motor y lo vuelve más certero: es un sistema de mejora continua, no un dashboard estático.</w:t>
       </w:r>
     </w:p>
     <w:p>
@@ -278,7 +286,7 @@
         <w:jc w:val="both"/>
       </w:pPr>
       <w:r>
-        <w:t xml:space="preserve">Hoy los datos que importan para crecer viven en tres sistemas que no se hablan entre sí: el comportamiento del usuario en Mixpanel, el pipeline comercial en HubSpot, y los unit economics (CAC, LTV, margen) en el PELG. Cada uno, mirado por separado, cuenta solo una parte de la historia.</w:t>
+        <w:t xml:space="preserve">Hoy los datos que importan para crecer viven en sistemas que no se hablan entre sí: el comportamiento del usuario en Mixpanel, el pipeline comercial en HubSpot, la inversión y los costos por canal en el PELG, y la base de socios —asociados, medicards, planes, vigencias y bajas— en Binary. Cada uno, mirado por separado, cuenta solo una parte de la historia.</w:t>
       </w:r>
     </w:p>
     <w:p>
@@ -310,7 +318,7 @@
         <w:t xml:space="preserve">Lo que faltaba: </w:t>
       </w:r>
       <w:r>
-        <w:t xml:space="preserve">una capa que junte las tres fuentes y diga, con un número de plata atrás, qué mover para subir la conversión y las cápitas — y que sea honesta sobre qué tan sólido es ese número.</w:t>
+        <w:t xml:space="preserve">una capa que junte las fuentes y diga, con un número de plata atrás, qué mover para subir la conversión y las cápitas — y que sea honesta sobre qué tan sólido es ese número.</w:t>
       </w:r>
     </w:p>
     <w:p>
@@ -368,7 +376,7 @@
         <w:t xml:space="preserve">Un traductor</w:t>
       </w:r>
       <w:r>
-        <w:t xml:space="preserve"> de comportamiento + comercial + economía a oportunidades priorizadas por margen.</w:t>
+        <w:t xml:space="preserve"> de comportamiento + comercial + economía + base de socios a oportunidades priorizadas por margen.</w:t>
       </w:r>
     </w:p>
     <w:p>
@@ -434,10 +442,10 @@
           <w:b/>
           <w:bCs/>
         </w:rPr>
-        <w:t xml:space="preserve">No reemplaza a Mixpanel ni a Metabase</w:t>
-      </w:r>
-      <w:r>
-        <w:t xml:space="preserve">: no es la fuente de los datos, es la capa que los interpreta.</w:t>
+        <w:t xml:space="preserve">No es la base de datos</w:t>
+      </w:r>
+      <w:r>
+        <w:t xml:space="preserve">: no reemplaza a Binary ni a Metabase; es la capa que los interpreta.</w:t>
       </w:r>
     </w:p>
     <w:p>
@@ -457,7 +465,7 @@
         <w:t xml:space="preserve">No escribe en los sistemas productivos</w:t>
       </w:r>
       <w:r>
-        <w:t xml:space="preserve">: es estrictamente solo lectura sobre Mixpanel y HubSpot.</w:t>
+        <w:t xml:space="preserve">: es estrictamente solo lectura sobre Mixpanel, HubSpot y Binary.</w:t>
       </w:r>
     </w:p>
     <w:p>
@@ -722,7 +730,586 @@
         <w:spacing w:after="120" w:before="280"/>
       </w:pPr>
       <w:r>
-        <w:t xml:space="preserve">6. Cómo decide: la lógica</w:t>
+        <w:t xml:space="preserve">6. Las fuentes de datos (y cómo entra Binary)</w:t>
+      </w:r>
+    </w:p>
+    <w:p>
+      <w:pPr>
+        <w:spacing w:after="120"/>
+        <w:jc w:val="both"/>
+      </w:pPr>
+      <w:r>
+        <w:t xml:space="preserve">SysData no genera datos: orquesta cuatro fuentes que ya existen en Medicus, todas en solo lectura. Binary —nuestra base de socios— es la pieza que vuelve “reales” a los unit economics y la que ayuda a cerrar el cruce de punta a punta.</w:t>
+      </w:r>
+    </w:p>
+    <w:tbl>
+      <w:tblPr>
+        <w:tblW w:type="dxa" w:w="9300"/>
+        <w:tblBorders>
+          <w:top w:val="single" w:color="BFC9D4" w:sz="4"/>
+          <w:left w:val="single" w:color="BFC9D4" w:sz="4"/>
+          <w:bottom w:val="single" w:color="BFC9D4" w:sz="4"/>
+          <w:right w:val="single" w:color="BFC9D4" w:sz="4"/>
+          <w:insideH w:val="single" w:color="BFC9D4" w:sz="4"/>
+          <w:insideV w:val="single" w:color="BFC9D4" w:sz="4"/>
+        </w:tblBorders>
+        <w:tblLayout w:type="fixed"/>
+      </w:tblPr>
+      <w:tblGrid>
+        <w:gridCol w:w="1488"/>
+        <w:gridCol w:w="3906"/>
+        <w:gridCol w:w="3906"/>
+      </w:tblGrid>
+      <w:tr>
+        <w:trPr>
+          <w:cantSplit/>
+          <w:tblHeader/>
+        </w:trPr>
+        <w:tc>
+          <w:tcPr>
+            <w:tcW w:type="dxa" w:w="1488"/>
+            <w:shd w:fill="0E2E52" w:color="auto" w:val="clear"/>
+            <w:tcMar>
+              <w:top w:type="dxa" w:w="80"/>
+              <w:left w:type="dxa" w:w="130"/>
+              <w:bottom w:type="dxa" w:w="80"/>
+              <w:right w:type="dxa" w:w="130"/>
+            </w:tcMar>
+            <w:vAlign w:val="center"/>
+          </w:tcPr>
+          <w:p>
+            <w:pPr>
+              <w:spacing w:after="0"/>
+            </w:pPr>
+            <w:r>
+              <w:rPr>
+                <w:b/>
+                <w:bCs/>
+                <w:color w:val="FFFFFF"/>
+                <w:sz w:val="20"/>
+                <w:szCs w:val="20"/>
+              </w:rPr>
+              <w:t xml:space="preserve">Fuente</w:t>
+            </w:r>
+          </w:p>
+        </w:tc>
+        <w:tc>
+          <w:tcPr>
+            <w:tcW w:type="dxa" w:w="3906"/>
+            <w:shd w:fill="0E2E52" w:color="auto" w:val="clear"/>
+            <w:tcMar>
+              <w:top w:type="dxa" w:w="80"/>
+              <w:left w:type="dxa" w:w="130"/>
+              <w:bottom w:type="dxa" w:w="80"/>
+              <w:right w:type="dxa" w:w="130"/>
+            </w:tcMar>
+            <w:vAlign w:val="center"/>
+          </w:tcPr>
+          <w:p>
+            <w:pPr>
+              <w:spacing w:after="0"/>
+            </w:pPr>
+            <w:r>
+              <w:rPr>
+                <w:b/>
+                <w:bCs/>
+                <w:color w:val="FFFFFF"/>
+                <w:sz w:val="20"/>
+                <w:szCs w:val="20"/>
+              </w:rPr>
+              <w:t xml:space="preserve">Qué aporta</w:t>
+            </w:r>
+          </w:p>
+        </w:tc>
+        <w:tc>
+          <w:tcPr>
+            <w:tcW w:type="dxa" w:w="3906"/>
+            <w:shd w:fill="0E2E52" w:color="auto" w:val="clear"/>
+            <w:tcMar>
+              <w:top w:type="dxa" w:w="80"/>
+              <w:left w:type="dxa" w:w="130"/>
+              <w:bottom w:type="dxa" w:w="80"/>
+              <w:right w:type="dxa" w:w="130"/>
+            </w:tcMar>
+            <w:vAlign w:val="center"/>
+          </w:tcPr>
+          <w:p>
+            <w:pPr>
+              <w:spacing w:after="0"/>
+            </w:pPr>
+            <w:r>
+              <w:rPr>
+                <w:b/>
+                <w:bCs/>
+                <w:color w:val="FFFFFF"/>
+                <w:sz w:val="20"/>
+                <w:szCs w:val="20"/>
+              </w:rPr>
+              <w:t xml:space="preserve">Cómo lo usa SysData</w:t>
+            </w:r>
+          </w:p>
+        </w:tc>
+      </w:tr>
+      <w:tr>
+        <w:trPr>
+          <w:cantSplit/>
+        </w:trPr>
+        <w:tc>
+          <w:tcPr>
+            <w:tcW w:type="dxa" w:w="1488"/>
+            <w:tcMar>
+              <w:top w:type="dxa" w:w="80"/>
+              <w:left w:type="dxa" w:w="130"/>
+              <w:bottom w:type="dxa" w:w="80"/>
+              <w:right w:type="dxa" w:w="130"/>
+            </w:tcMar>
+            <w:vAlign w:val="center"/>
+          </w:tcPr>
+          <w:p>
+            <w:pPr>
+              <w:spacing w:after="0"/>
+            </w:pPr>
+            <w:r>
+              <w:rPr>
+                <w:b/>
+                <w:bCs/>
+                <w:sz w:val="20"/>
+                <w:szCs w:val="20"/>
+              </w:rPr>
+              <w:t xml:space="preserve">Mixpanel</w:t>
+            </w:r>
+          </w:p>
+        </w:tc>
+        <w:tc>
+          <w:tcPr>
+            <w:tcW w:type="dxa" w:w="3906"/>
+            <w:tcMar>
+              <w:top w:type="dxa" w:w="80"/>
+              <w:left w:type="dxa" w:w="130"/>
+              <w:bottom w:type="dxa" w:w="80"/>
+              <w:right w:type="dxa" w:w="130"/>
+            </w:tcMar>
+            <w:vAlign w:val="center"/>
+          </w:tcPr>
+          <w:p>
+            <w:pPr>
+              <w:spacing w:after="0"/>
+            </w:pPr>
+            <w:r>
+              <w:rPr>
+                <w:b w:val="false"/>
+                <w:bCs w:val="false"/>
+                <w:sz w:val="20"/>
+                <w:szCs w:val="20"/>
+              </w:rPr>
+              <w:t xml:space="preserve">Comportamiento: funnels, eventos, pasos del cotizador y del alta.</w:t>
+            </w:r>
+          </w:p>
+        </w:tc>
+        <w:tc>
+          <w:tcPr>
+            <w:tcW w:type="dxa" w:w="3906"/>
+            <w:tcMar>
+              <w:top w:type="dxa" w:w="80"/>
+              <w:left w:type="dxa" w:w="130"/>
+              <w:bottom w:type="dxa" w:w="80"/>
+              <w:right w:type="dxa" w:w="130"/>
+            </w:tcMar>
+            <w:vAlign w:val="center"/>
+          </w:tcPr>
+          <w:p>
+            <w:pPr>
+              <w:spacing w:after="0"/>
+            </w:pPr>
+            <w:r>
+              <w:rPr>
+                <w:b w:val="false"/>
+                <w:bCs w:val="false"/>
+                <w:sz w:val="20"/>
+                <w:szCs w:val="20"/>
+              </w:rPr>
+              <w:t xml:space="preserve">Mide dónde se cae la gente y dimensiona la fuga (volumen recuperable).</w:t>
+            </w:r>
+          </w:p>
+        </w:tc>
+      </w:tr>
+      <w:tr>
+        <w:trPr>
+          <w:cantSplit/>
+        </w:trPr>
+        <w:tc>
+          <w:tcPr>
+            <w:tcW w:type="dxa" w:w="1488"/>
+            <w:shd w:fill="F2F5F8" w:color="auto" w:val="clear"/>
+            <w:tcMar>
+              <w:top w:type="dxa" w:w="80"/>
+              <w:left w:type="dxa" w:w="130"/>
+              <w:bottom w:type="dxa" w:w="80"/>
+              <w:right w:type="dxa" w:w="130"/>
+            </w:tcMar>
+            <w:vAlign w:val="center"/>
+          </w:tcPr>
+          <w:p>
+            <w:pPr>
+              <w:spacing w:after="0"/>
+            </w:pPr>
+            <w:r>
+              <w:rPr>
+                <w:b/>
+                <w:bCs/>
+                <w:sz w:val="20"/>
+                <w:szCs w:val="20"/>
+              </w:rPr>
+              <w:t xml:space="preserve">HubSpot</w:t>
+            </w:r>
+          </w:p>
+        </w:tc>
+        <w:tc>
+          <w:tcPr>
+            <w:tcW w:type="dxa" w:w="3906"/>
+            <w:shd w:fill="F2F5F8" w:color="auto" w:val="clear"/>
+            <w:tcMar>
+              <w:top w:type="dxa" w:w="80"/>
+              <w:left w:type="dxa" w:w="130"/>
+              <w:bottom w:type="dxa" w:w="80"/>
+              <w:right w:type="dxa" w:w="130"/>
+            </w:tcMar>
+            <w:vAlign w:val="center"/>
+          </w:tcPr>
+          <w:p>
+            <w:pPr>
+              <w:spacing w:after="0"/>
+            </w:pPr>
+            <w:r>
+              <w:rPr>
+                <w:b w:val="false"/>
+                <w:bCs w:val="false"/>
+                <w:sz w:val="20"/>
+                <w:szCs w:val="20"/>
+              </w:rPr>
+              <w:t xml:space="preserve">Comercial: deals, etapas, win rate, contactos y voz del cliente (NPS).</w:t>
+            </w:r>
+          </w:p>
+        </w:tc>
+        <w:tc>
+          <w:tcPr>
+            <w:tcW w:type="dxa" w:w="3906"/>
+            <w:shd w:fill="F2F5F8" w:color="auto" w:val="clear"/>
+            <w:tcMar>
+              <w:top w:type="dxa" w:w="80"/>
+              <w:left w:type="dxa" w:w="130"/>
+              <w:bottom w:type="dxa" w:w="80"/>
+              <w:right w:type="dxa" w:w="130"/>
+            </w:tcMar>
+            <w:vAlign w:val="center"/>
+          </w:tcPr>
+          <w:p>
+            <w:pPr>
+              <w:spacing w:after="0"/>
+            </w:pPr>
+            <w:r>
+              <w:rPr>
+                <w:b w:val="false"/>
+                <w:bCs w:val="false"/>
+                <w:sz w:val="20"/>
+                <w:szCs w:val="20"/>
+              </w:rPr>
+              <w:t xml:space="preserve">Mide el lado comercial (win rate, stock atascado) y la reputación (verbatims).</w:t>
+            </w:r>
+          </w:p>
+        </w:tc>
+      </w:tr>
+      <w:tr>
+        <w:trPr>
+          <w:cantSplit/>
+        </w:trPr>
+        <w:tc>
+          <w:tcPr>
+            <w:tcW w:type="dxa" w:w="1488"/>
+            <w:tcMar>
+              <w:top w:type="dxa" w:w="80"/>
+              <w:left w:type="dxa" w:w="130"/>
+              <w:bottom w:type="dxa" w:w="80"/>
+              <w:right w:type="dxa" w:w="130"/>
+            </w:tcMar>
+            <w:vAlign w:val="center"/>
+          </w:tcPr>
+          <w:p>
+            <w:pPr>
+              <w:spacing w:after="0"/>
+            </w:pPr>
+            <w:r>
+              <w:rPr>
+                <w:b/>
+                <w:bCs/>
+                <w:sz w:val="20"/>
+                <w:szCs w:val="20"/>
+              </w:rPr>
+              <w:t xml:space="preserve">PELG</w:t>
+            </w:r>
+          </w:p>
+        </w:tc>
+        <w:tc>
+          <w:tcPr>
+            <w:tcW w:type="dxa" w:w="3906"/>
+            <w:tcMar>
+              <w:top w:type="dxa" w:w="80"/>
+              <w:left w:type="dxa" w:w="130"/>
+              <w:bottom w:type="dxa" w:w="80"/>
+              <w:right w:type="dxa" w:w="130"/>
+            </w:tcMar>
+            <w:vAlign w:val="center"/>
+          </w:tcPr>
+          <w:p>
+            <w:pPr>
+              <w:spacing w:after="0"/>
+            </w:pPr>
+            <w:r>
+              <w:rPr>
+                <w:b w:val="false"/>
+                <w:bCs w:val="false"/>
+                <w:sz w:val="20"/>
+                <w:szCs w:val="20"/>
+              </w:rPr>
+              <w:t xml:space="preserve">Inversión y costos: gasto por canal, CAC, leads.</w:t>
+            </w:r>
+          </w:p>
+        </w:tc>
+        <w:tc>
+          <w:tcPr>
+            <w:tcW w:type="dxa" w:w="3906"/>
+            <w:tcMar>
+              <w:top w:type="dxa" w:w="80"/>
+              <w:left w:type="dxa" w:w="130"/>
+              <w:bottom w:type="dxa" w:w="80"/>
+              <w:right w:type="dxa" w:w="130"/>
+            </w:tcMar>
+            <w:vAlign w:val="center"/>
+          </w:tcPr>
+          <w:p>
+            <w:pPr>
+              <w:spacing w:after="0"/>
+            </w:pPr>
+            <w:r>
+              <w:rPr>
+                <w:b w:val="false"/>
+                <w:bCs w:val="false"/>
+                <w:sz w:val="20"/>
+                <w:szCs w:val="20"/>
+              </w:rPr>
+              <w:t xml:space="preserve">Aporta el CAC y la inversión para evaluar la rentabilidad de cada canal.</w:t>
+            </w:r>
+          </w:p>
+        </w:tc>
+      </w:tr>
+      <w:tr>
+        <w:trPr>
+          <w:cantSplit/>
+        </w:trPr>
+        <w:tc>
+          <w:tcPr>
+            <w:tcW w:type="dxa" w:w="1488"/>
+            <w:shd w:fill="F2F5F8" w:color="auto" w:val="clear"/>
+            <w:tcMar>
+              <w:top w:type="dxa" w:w="80"/>
+              <w:left w:type="dxa" w:w="130"/>
+              <w:bottom w:type="dxa" w:w="80"/>
+              <w:right w:type="dxa" w:w="130"/>
+            </w:tcMar>
+            <w:vAlign w:val="center"/>
+          </w:tcPr>
+          <w:p>
+            <w:pPr>
+              <w:spacing w:after="0"/>
+            </w:pPr>
+            <w:r>
+              <w:rPr>
+                <w:b/>
+                <w:bCs/>
+                <w:sz w:val="20"/>
+                <w:szCs w:val="20"/>
+              </w:rPr>
+              <w:t xml:space="preserve">Binary</w:t>
+            </w:r>
+          </w:p>
+        </w:tc>
+        <w:tc>
+          <w:tcPr>
+            <w:tcW w:type="dxa" w:w="3906"/>
+            <w:shd w:fill="F2F5F8" w:color="auto" w:val="clear"/>
+            <w:tcMar>
+              <w:top w:type="dxa" w:w="80"/>
+              <w:left w:type="dxa" w:w="130"/>
+              <w:bottom w:type="dxa" w:w="80"/>
+              <w:right w:type="dxa" w:w="130"/>
+            </w:tcMar>
+            <w:vAlign w:val="center"/>
+          </w:tcPr>
+          <w:p>
+            <w:pPr>
+              <w:spacing w:after="0"/>
+            </w:pPr>
+            <w:r>
+              <w:rPr>
+                <w:b w:val="false"/>
+                <w:bCs w:val="false"/>
+                <w:sz w:val="20"/>
+                <w:szCs w:val="20"/>
+              </w:rPr>
+              <w:t xml:space="preserve">La base de socios (fuente de verdad): asociados, medicards, planes, coberturas, vigencias y bajas.</w:t>
+            </w:r>
+          </w:p>
+        </w:tc>
+        <w:tc>
+          <w:tcPr>
+            <w:tcW w:type="dxa" w:w="3906"/>
+            <w:shd w:fill="F2F5F8" w:color="auto" w:val="clear"/>
+            <w:tcMar>
+              <w:top w:type="dxa" w:w="80"/>
+              <w:left w:type="dxa" w:w="130"/>
+              <w:bottom w:type="dxa" w:w="80"/>
+              <w:right w:type="dxa" w:w="130"/>
+            </w:tcMar>
+            <w:vAlign w:val="center"/>
+          </w:tcPr>
+          <w:p>
+            <w:pPr>
+              <w:spacing w:after="0"/>
+            </w:pPr>
+            <w:r>
+              <w:rPr>
+                <w:b w:val="false"/>
+                <w:bCs w:val="false"/>
+                <w:sz w:val="20"/>
+                <w:szCs w:val="20"/>
+              </w:rPr>
+              <w:t xml:space="preserve">Aporta los unit economics REALES —LTV, permanencia/churn y ARPU por plan— y la cápita confirmada para cerrar el cruce visita→cápita.</w:t>
+            </w:r>
+          </w:p>
+        </w:tc>
+      </w:tr>
+    </w:tbl>
+    <w:p>
+      <w:pPr>
+        <w:spacing w:after="80"/>
+      </w:pPr>
+    </w:p>
+    <w:p>
+      <w:pPr>
+        <w:pStyle w:val="Heading2"/>
+        <w:spacing w:after="80" w:before="180"/>
+      </w:pPr>
+      <w:r>
+        <w:t xml:space="preserve">Cómo usaríamos Binary dentro de SysData</w:t>
+      </w:r>
+    </w:p>
+    <w:p>
+      <w:pPr>
+        <w:pStyle w:val="ListParagraph"/>
+        <w:numPr>
+          <w:ilvl w:val="0"/>
+          <w:numId w:val="1"/>
+        </w:numPr>
+        <w:spacing w:after="60"/>
+      </w:pPr>
+      <w:r>
+        <w:rPr>
+          <w:b/>
+          <w:bCs/>
+        </w:rPr>
+        <w:t xml:space="preserve">Unit economics reales (el cambio más importante)</w:t>
+      </w:r>
+      <w:r>
+        <w:t xml:space="preserve">: hoy el LTV se arma con supuestos (permanencia 24 meses, margen 18%). Con Binary, la permanencia/churn y el ARPU por plan salen de datos reales de socios → el LTV deja de ser supuesto y pasa a medido. Como TODO el ranking de oportunidades se mide en plata (y la plata depende del LTV), esto recalibra el motor entero.</w:t>
+      </w:r>
+    </w:p>
+    <w:p>
+      <w:pPr>
+        <w:pStyle w:val="ListParagraph"/>
+        <w:numPr>
+          <w:ilvl w:val="0"/>
+          <w:numId w:val="1"/>
+        </w:numPr>
+        <w:spacing w:after="60"/>
+      </w:pPr>
+      <w:r>
+        <w:rPr>
+          <w:b/>
+          <w:bCs/>
+        </w:rPr>
+        <w:t xml:space="preserve">Cerrar el cruce visita → cápita</w:t>
+      </w:r>
+      <w:r>
+        <w:t xml:space="preserve">: Binary tiene el socio real con su identificador de alta. Es el candidato natural para unir, en el data warehouse, el comportamiento (Mixpanel) y el comercial (HubSpot) con la cápita confirmada (Binary) — la “Opción B” del cruce. Cuando esté, la conversión a socio pasa de supuesta a medida.</w:t>
+      </w:r>
+    </w:p>
+    <w:p>
+      <w:pPr>
+        <w:pStyle w:val="ListParagraph"/>
+        <w:numPr>
+          <w:ilvl w:val="0"/>
+          <w:numId w:val="1"/>
+        </w:numPr>
+        <w:spacing w:after="60"/>
+      </w:pPr>
+      <w:r>
+        <w:rPr>
+          <w:b/>
+          <w:bCs/>
+        </w:rPr>
+        <w:t xml:space="preserve">Segmentación real</w:t>
+      </w:r>
+      <w:r>
+        <w:t xml:space="preserve">: cortar por plan, tipo de medicard, cobertura y antigüedad reales (no solo por los campos de HubSpot), para ver qué segmentos retienen y rinden más.</w:t>
+      </w:r>
+    </w:p>
+    <w:p>
+      <w:pPr>
+        <w:pStyle w:val="ListParagraph"/>
+        <w:numPr>
+          <w:ilvl w:val="0"/>
+          <w:numId w:val="1"/>
+        </w:numPr>
+        <w:spacing w:after="60"/>
+      </w:pPr>
+      <w:r>
+        <w:rPr>
+          <w:b/>
+          <w:bCs/>
+        </w:rPr>
+        <w:t xml:space="preserve">Retención / churn</w:t>
+      </w:r>
+      <w:r>
+        <w:t xml:space="preserve">: medir bajas reales por cohorte → alimenta el LTV y habilita a futuro un área de retención dentro del loop.</w:t>
+      </w:r>
+    </w:p>
+    <w:p>
+      <w:pPr>
+        <w:pStyle w:val="ListParagraph"/>
+        <w:numPr>
+          <w:ilvl w:val="0"/>
+          <w:numId w:val="1"/>
+        </w:numPr>
+        <w:spacing w:after="60"/>
+      </w:pPr>
+      <w:r>
+        <w:rPr>
+          <w:b/>
+          <w:bCs/>
+        </w:rPr>
+        <w:t xml:space="preserve">Solo lectura</w:t>
+      </w:r>
+      <w:r>
+        <w:t xml:space="preserve">: igual que el resto de las fuentes, SysData lee de Binary; nunca escribe.</w:t>
+      </w:r>
+    </w:p>
+    <w:p>
+      <w:pPr>
+        <w:pStyle w:val="Heading1"/>
+        <w:spacing w:after="120" w:before="280"/>
+      </w:pPr>
+      <w:r>
+        <w:t xml:space="preserve">7. Cómo decide: la lógica</w:t>
       </w:r>
     </w:p>
     <w:p>
@@ -797,11 +1384,27 @@
     </w:p>
     <w:p>
       <w:pPr>
+        <w:spacing w:after="120"/>
+        <w:jc w:val="both"/>
+      </w:pPr>
+      <w:r>
+        <w:rPr>
+          <w:b/>
+          <w:bCs/>
+        </w:rPr>
+        <w:t xml:space="preserve">De dónde sale el LTV (importante): </w:t>
+      </w:r>
+      <w:r>
+        <w:t xml:space="preserve">hoy el LTV y la permanencia son supuestos. Al integrar Binary pasan a ser datos reales (permanencia/churn y ARPU por plan), y todo el ranking se recalibra solo. Es decir: Binary no es un “nice to have”, es lo que vuelve confiables los números de plata que ya usa el motor.</w:t>
+      </w:r>
+    </w:p>
+    <w:p>
+      <w:pPr>
         <w:pStyle w:val="Heading1"/>
         <w:spacing w:after="120" w:before="280"/>
       </w:pPr>
       <w:r>
-        <w:t xml:space="preserve">7. Decisiones de producto y su porqué</w:t>
+        <w:t xml:space="preserve">8. Decisiones de producto y su porqué</w:t>
       </w:r>
     </w:p>
     <w:p>
@@ -1060,7 +1663,7 @@
                 <w:sz w:val="20"/>
                 <w:szCs w:val="20"/>
               </w:rPr>
-              <w:t xml:space="preserve">Ya hay dashboards (Mixpanel, Metabase). Lo que faltaba no era “ver datos”, sino “decidir qué hacer con ellos”, cruzando las tres fuentes.</w:t>
+              <w:t xml:space="preserve">Ya hay dashboards (Mixpanel, Metabase). Lo que faltaba no era “ver datos”, sino “decidir qué hacer con ellos”, cruzando las fuentes.</w:t>
             </w:r>
           </w:p>
         </w:tc>
@@ -1092,7 +1695,7 @@
                 <w:sz w:val="20"/>
                 <w:szCs w:val="20"/>
               </w:rPr>
-              <w:t xml:space="preserve">Solo lectura sobre Mixpanel y HubSpot</w:t>
+              <w:t xml:space="preserve">Solo lectura sobre los sistemas productivos</w:t>
             </w:r>
           </w:p>
         </w:tc>
@@ -1119,7 +1722,7 @@
                 <w:sz w:val="20"/>
                 <w:szCs w:val="20"/>
               </w:rPr>
-              <w:t xml:space="preserve">Son sistemas productivos. El riesgo de escribir (romper eventos, deals, propiedades) es inaceptable. SysData nunca escribe ahí.</w:t>
+              <w:t xml:space="preserve">Mixpanel, HubSpot y Binary son productivos. El riesgo de escribir (romper eventos, deals, registros de socios) es inaceptable. SysData nunca escribe ahí.</w:t>
             </w:r>
           </w:p>
         </w:tc>
@@ -1368,7 +1971,7 @@
         <w:spacing w:after="120" w:before="280"/>
       </w:pPr>
       <w:r>
-        <w:t xml:space="preserve">8. Arquitectura del motor: las 4 capas</w:t>
+        <w:t xml:space="preserve">9. Arquitectura del motor: las 4 capas</w:t>
       </w:r>
     </w:p>
     <w:p>
@@ -1838,7 +2441,7 @@
         <w:spacing w:after="120" w:before="280"/>
       </w:pPr>
       <w:r>
-        <w:t xml:space="preserve">9. Rigor de medición de experimentos</w:t>
+        <w:t xml:space="preserve">10. Rigor de medición de experimentos</w:t>
       </w:r>
     </w:p>
     <w:p>
@@ -1936,7 +2539,7 @@
         <w:spacing w:after="120" w:before="280"/>
       </w:pPr>
       <w:r>
-        <w:t xml:space="preserve">10. Stack técnico</w:t>
+        <w:t xml:space="preserve">11. Stack técnico</w:t>
       </w:r>
     </w:p>
     <w:p>
@@ -2016,7 +2619,7 @@
         <w:t xml:space="preserve">Fuentes (solo lectura)</w:t>
       </w:r>
       <w:r>
-        <w:t xml:space="preserve">: Mixpanel (Query/Engage API) para comportamiento; HubSpot (CRM v3) para comercial y voz del cliente (NPS); PELG para unit economics.</w:t>
+        <w:t xml:space="preserve">: Mixpanel (Query/Engage API) para comportamiento; HubSpot (CRM v3) para comercial y NPS; PELG para inversión/CAC; y Binary (base de socios) para unit economics reales —LTV, churn, ARPU por plan— y la cápita confirmada.</w:t>
       </w:r>
     </w:p>
     <w:p>
@@ -2065,7 +2668,7 @@
         <w:spacing w:after="120" w:before="280"/>
       </w:pPr>
       <w:r>
-        <w:t xml:space="preserve">11. La dependencia clave: el cruce visita → cápita</w:t>
+        <w:t xml:space="preserve">12. La dependencia clave: el cruce visita → cápita</w:t>
       </w:r>
     </w:p>
     <w:p>
@@ -2122,7 +2725,7 @@
         <w:t xml:space="preserve">De quién depende: </w:t>
       </w:r>
       <w:r>
-        <w:t xml:space="preserve">NO es trabajo de SysData. Es instrumentación upstream (Data / Dev). Hay tres caminos complementarios: (A) estampar el prospecto_id en el alta de socio; (B) cruzar en el data warehouse; (C) en HubSpot, asociar el deal ganado al contacto de origen.</w:t>
+        <w:t xml:space="preserve">NO es trabajo de SysData. Es instrumentación upstream (Data / Dev). Hay tres caminos complementarios: (A) estampar el prospecto_id en el alta de socio; (B) cruzar en el data warehouse, uniendo el comportamiento con la base de socios de Binary (que tiene la cápita confirmada); (C) en HubSpot, asociar el deal ganado al contacto de origen.</w:t>
       </w:r>
     </w:p>
     <w:p>
@@ -2147,7 +2750,7 @@
         <w:spacing w:after="120" w:before="280"/>
       </w:pPr>
       <w:r>
-        <w:t xml:space="preserve">12. Estado actual y roadmap</w:t>
+        <w:t xml:space="preserve">13. Estado actual y roadmap</w:t>
       </w:r>
     </w:p>
     <w:p>
@@ -2204,6 +2807,19 @@
         <w:spacing w:after="60"/>
       </w:pPr>
       <w:r>
+        <w:t xml:space="preserve">Integrar Binary (base de socios) para unit economics reales —LTV, churn, ARPU por plan— y como fuente de la cápita confirmada para cerrar el cruce.</w:t>
+      </w:r>
+    </w:p>
+    <w:p>
+      <w:pPr>
+        <w:pStyle w:val="ListParagraph"/>
+        <w:numPr>
+          <w:ilvl w:val="0"/>
+          <w:numId w:val="1"/>
+        </w:numPr>
+        <w:spacing w:after="60"/>
+      </w:pPr>
+      <w:r>
         <w:t xml:space="preserve">Encender el proceso diario en producción (variables de entorno en Vercel + correr la migración en Supabase).</w:t>
       </w:r>
     </w:p>
@@ -2274,7 +2890,7 @@
         <w:spacing w:after="120" w:before="280"/>
       </w:pPr>
       <w:r>
-        <w:t xml:space="preserve">13. Principios, seguridad y restricciones</w:t>
+        <w:t xml:space="preserve">14. Principios, seguridad y restricciones</w:t>
       </w:r>
     </w:p>
     <w:p>
@@ -2294,7 +2910,7 @@
         <w:t xml:space="preserve">Solo lectura</w:t>
       </w:r>
       <w:r>
-        <w:t xml:space="preserve"> sobre sistemas productivos (Mixpanel / HubSpot). Nunca crear, editar ni borrar nada.</w:t>
+        <w:t xml:space="preserve"> sobre sistemas productivos (Mixpanel, HubSpot, Binary). Nunca crear, editar ni borrar nada.</w:t>
       </w:r>
     </w:p>
     <w:p>
@@ -2363,7 +2979,7 @@
         <w:spacing w:after="120" w:before="280"/>
       </w:pPr>
       <w:r>
-        <w:t xml:space="preserve">14. Glosario</w:t>
+        <w:t xml:space="preserve">15. Glosario</w:t>
       </w:r>
     </w:p>
     <w:tbl>
@@ -2380,8 +2996,8 @@
         <w:tblLayout w:type="fixed"/>
       </w:tblPr>
       <w:tblGrid>
-        <w:gridCol w:w="2232"/>
-        <w:gridCol w:w="7068"/>
+        <w:gridCol w:w="2046"/>
+        <w:gridCol w:w="7254"/>
       </w:tblGrid>
       <w:tr>
         <w:trPr>
@@ -2390,7 +3006,7 @@
         </w:trPr>
         <w:tc>
           <w:tcPr>
-            <w:tcW w:type="dxa" w:w="2232"/>
+            <w:tcW w:type="dxa" w:w="2046"/>
             <w:shd w:fill="0E2E52" w:color="auto" w:val="clear"/>
             <w:tcMar>
               <w:top w:type="dxa" w:w="80"/>
@@ -2418,7 +3034,7 @@
         </w:tc>
         <w:tc>
           <w:tcPr>
-            <w:tcW w:type="dxa" w:w="7068"/>
+            <w:tcW w:type="dxa" w:w="7254"/>
             <w:shd w:fill="0E2E52" w:color="auto" w:val="clear"/>
             <w:tcMar>
               <w:top w:type="dxa" w:w="80"/>
@@ -2451,7 +3067,7 @@
         </w:trPr>
         <w:tc>
           <w:tcPr>
-            <w:tcW w:type="dxa" w:w="2232"/>
+            <w:tcW w:type="dxa" w:w="2046"/>
             <w:tcMar>
               <w:top w:type="dxa" w:w="80"/>
               <w:left w:type="dxa" w:w="130"/>
@@ -2471,13 +3087,13 @@
                 <w:sz w:val="20"/>
                 <w:szCs w:val="20"/>
               </w:rPr>
-              <w:t xml:space="preserve">Cápita</w:t>
-            </w:r>
-          </w:p>
-        </w:tc>
-        <w:tc>
-          <w:tcPr>
-            <w:tcW w:type="dxa" w:w="7068"/>
+              <w:t xml:space="preserve">Binary</w:t>
+            </w:r>
+          </w:p>
+        </w:tc>
+        <w:tc>
+          <w:tcPr>
+            <w:tcW w:type="dxa" w:w="7254"/>
             <w:tcMar>
               <w:top w:type="dxa" w:w="80"/>
               <w:left w:type="dxa" w:w="130"/>
@@ -2497,7 +3113,7 @@
                 <w:sz w:val="20"/>
                 <w:szCs w:val="20"/>
               </w:rPr>
-              <w:t xml:space="preserve">Un socio activo. Es el resultado final del negocio que SysData busca aumentar.</w:t>
+              <w:t xml:space="preserve">La base de datos de socios de Medicus (asociados, medicards, planes, coberturas, vigencias y bajas). Fuente de verdad de los unit economics reales y de la cápita confirmada.</w:t>
             </w:r>
           </w:p>
         </w:tc>
@@ -2508,7 +3124,7 @@
         </w:trPr>
         <w:tc>
           <w:tcPr>
-            <w:tcW w:type="dxa" w:w="2232"/>
+            <w:tcW w:type="dxa" w:w="2046"/>
             <w:shd w:fill="F2F5F8" w:color="auto" w:val="clear"/>
             <w:tcMar>
               <w:top w:type="dxa" w:w="80"/>
@@ -2529,13 +3145,13 @@
                 <w:sz w:val="20"/>
                 <w:szCs w:val="20"/>
               </w:rPr>
-              <w:t xml:space="preserve">Dato</w:t>
-            </w:r>
-          </w:p>
-        </w:tc>
-        <w:tc>
-          <w:tcPr>
-            <w:tcW w:type="dxa" w:w="7068"/>
+              <w:t xml:space="preserve">Cápita</w:t>
+            </w:r>
+          </w:p>
+        </w:tc>
+        <w:tc>
+          <w:tcPr>
+            <w:tcW w:type="dxa" w:w="7254"/>
             <w:shd w:fill="F2F5F8" w:color="auto" w:val="clear"/>
             <w:tcMar>
               <w:top w:type="dxa" w:w="80"/>
@@ -2556,7 +3172,7 @@
                 <w:sz w:val="20"/>
                 <w:szCs w:val="20"/>
               </w:rPr>
-              <w:t xml:space="preserve">Un lead que dejó sus datos en el cotizador (paso clave del funnel de adquisición).</w:t>
+              <w:t xml:space="preserve">Un socio activo. Es el resultado final del negocio que SysData busca aumentar.</w:t>
             </w:r>
           </w:p>
         </w:tc>
@@ -2567,7 +3183,7 @@
         </w:trPr>
         <w:tc>
           <w:tcPr>
-            <w:tcW w:type="dxa" w:w="2232"/>
+            <w:tcW w:type="dxa" w:w="2046"/>
             <w:tcMar>
               <w:top w:type="dxa" w:w="80"/>
               <w:left w:type="dxa" w:w="130"/>
@@ -2587,13 +3203,13 @@
                 <w:sz w:val="20"/>
                 <w:szCs w:val="20"/>
               </w:rPr>
-              <w:t xml:space="preserve">Funnel / embudo</w:t>
-            </w:r>
-          </w:p>
-        </w:tc>
-        <w:tc>
-          <w:tcPr>
-            <w:tcW w:type="dxa" w:w="7068"/>
+              <w:t xml:space="preserve">Dato</w:t>
+            </w:r>
+          </w:p>
+        </w:tc>
+        <w:tc>
+          <w:tcPr>
+            <w:tcW w:type="dxa" w:w="7254"/>
             <w:tcMar>
               <w:top w:type="dxa" w:w="80"/>
               <w:left w:type="dxa" w:w="130"/>
@@ -2613,7 +3229,7 @@
                 <w:sz w:val="20"/>
                 <w:szCs w:val="20"/>
               </w:rPr>
-              <w:t xml:space="preserve">La secuencia de pasos que recorre un usuario (visita → datos → cotización → alta).</w:t>
+              <w:t xml:space="preserve">Un lead que dejó sus datos en el cotizador (paso clave del funnel de adquisición).</w:t>
             </w:r>
           </w:p>
         </w:tc>
@@ -2624,7 +3240,7 @@
         </w:trPr>
         <w:tc>
           <w:tcPr>
-            <w:tcW w:type="dxa" w:w="2232"/>
+            <w:tcW w:type="dxa" w:w="2046"/>
             <w:shd w:fill="F2F5F8" w:color="auto" w:val="clear"/>
             <w:tcMar>
               <w:top w:type="dxa" w:w="80"/>
@@ -2645,13 +3261,13 @@
                 <w:sz w:val="20"/>
                 <w:szCs w:val="20"/>
               </w:rPr>
-              <w:t xml:space="preserve">Fuga (leak)</w:t>
-            </w:r>
-          </w:p>
-        </w:tc>
-        <w:tc>
-          <w:tcPr>
-            <w:tcW w:type="dxa" w:w="7068"/>
+              <w:t xml:space="preserve">Funnel / embudo</w:t>
+            </w:r>
+          </w:p>
+        </w:tc>
+        <w:tc>
+          <w:tcPr>
+            <w:tcW w:type="dxa" w:w="7254"/>
             <w:shd w:fill="F2F5F8" w:color="auto" w:val="clear"/>
             <w:tcMar>
               <w:top w:type="dxa" w:w="80"/>
@@ -2672,7 +3288,7 @@
                 <w:sz w:val="20"/>
                 <w:szCs w:val="20"/>
               </w:rPr>
-              <w:t xml:space="preserve">El paso donde más gente se cae. SysData la mide en personas y en plata.</w:t>
+              <w:t xml:space="preserve">La secuencia de pasos que recorre un usuario (visita → datos → cotización → alta).</w:t>
             </w:r>
           </w:p>
         </w:tc>
@@ -2683,7 +3299,7 @@
         </w:trPr>
         <w:tc>
           <w:tcPr>
-            <w:tcW w:type="dxa" w:w="2232"/>
+            <w:tcW w:type="dxa" w:w="2046"/>
             <w:tcMar>
               <w:top w:type="dxa" w:w="80"/>
               <w:left w:type="dxa" w:w="130"/>
@@ -2703,13 +3319,13 @@
                 <w:sz w:val="20"/>
                 <w:szCs w:val="20"/>
               </w:rPr>
-              <w:t xml:space="preserve">Win rate</w:t>
-            </w:r>
-          </w:p>
-        </w:tc>
-        <w:tc>
-          <w:tcPr>
-            <w:tcW w:type="dxa" w:w="7068"/>
+              <w:t xml:space="preserve">Fuga (leak)</w:t>
+            </w:r>
+          </w:p>
+        </w:tc>
+        <w:tc>
+          <w:tcPr>
+            <w:tcW w:type="dxa" w:w="7254"/>
             <w:tcMar>
               <w:top w:type="dxa" w:w="80"/>
               <w:left w:type="dxa" w:w="130"/>
@@ -2729,7 +3345,7 @@
                 <w:sz w:val="20"/>
                 <w:szCs w:val="20"/>
               </w:rPr>
-              <w:t xml:space="preserve">Porcentaje de deals comerciales que se cierran (ganados / decididos), en HubSpot.</w:t>
+              <w:t xml:space="preserve">El paso donde más gente se cae. SysData la mide en personas y en plata.</w:t>
             </w:r>
           </w:p>
         </w:tc>
@@ -2740,7 +3356,7 @@
         </w:trPr>
         <w:tc>
           <w:tcPr>
-            <w:tcW w:type="dxa" w:w="2232"/>
+            <w:tcW w:type="dxa" w:w="2046"/>
             <w:shd w:fill="F2F5F8" w:color="auto" w:val="clear"/>
             <w:tcMar>
               <w:top w:type="dxa" w:w="80"/>
@@ -2761,13 +3377,13 @@
                 <w:sz w:val="20"/>
                 <w:szCs w:val="20"/>
               </w:rPr>
-              <w:t xml:space="preserve">LTV</w:t>
-            </w:r>
-          </w:p>
-        </w:tc>
-        <w:tc>
-          <w:tcPr>
-            <w:tcW w:type="dxa" w:w="7068"/>
+              <w:t xml:space="preserve">Win rate</w:t>
+            </w:r>
+          </w:p>
+        </w:tc>
+        <w:tc>
+          <w:tcPr>
+            <w:tcW w:type="dxa" w:w="7254"/>
             <w:shd w:fill="F2F5F8" w:color="auto" w:val="clear"/>
             <w:tcMar>
               <w:top w:type="dxa" w:w="80"/>
@@ -2788,7 +3404,7 @@
                 <w:sz w:val="20"/>
                 <w:szCs w:val="20"/>
               </w:rPr>
-              <w:t xml:space="preserve">Valor de contribución de una cápita a lo largo de su permanencia (ARPU × meses × margen).</w:t>
+              <w:t xml:space="preserve">Porcentaje de deals comerciales que se cierran (ganados / decididos), en HubSpot.</w:t>
             </w:r>
           </w:p>
         </w:tc>
@@ -2799,7 +3415,7 @@
         </w:trPr>
         <w:tc>
           <w:tcPr>
-            <w:tcW w:type="dxa" w:w="2232"/>
+            <w:tcW w:type="dxa" w:w="2046"/>
             <w:tcMar>
               <w:top w:type="dxa" w:w="80"/>
               <w:left w:type="dxa" w:w="130"/>
@@ -2819,13 +3435,13 @@
                 <w:sz w:val="20"/>
                 <w:szCs w:val="20"/>
               </w:rPr>
-              <w:t xml:space="preserve">CAC</w:t>
-            </w:r>
-          </w:p>
-        </w:tc>
-        <w:tc>
-          <w:tcPr>
-            <w:tcW w:type="dxa" w:w="7068"/>
+              <w:t xml:space="preserve">LTV</w:t>
+            </w:r>
+          </w:p>
+        </w:tc>
+        <w:tc>
+          <w:tcPr>
+            <w:tcW w:type="dxa" w:w="7254"/>
             <w:tcMar>
               <w:top w:type="dxa" w:w="80"/>
               <w:left w:type="dxa" w:w="130"/>
@@ -2845,7 +3461,7 @@
                 <w:sz w:val="20"/>
                 <w:szCs w:val="20"/>
               </w:rPr>
-              <w:t xml:space="preserve">Costo de adquirir una cápita.</w:t>
+              <w:t xml:space="preserve">Valor de contribución de una cápita a lo largo de su permanencia (ARPU × meses × margen). Hoy estimado con supuestos; con Binary, medido con permanencia y ARPU reales.</w:t>
             </w:r>
           </w:p>
         </w:tc>
@@ -2856,7 +3472,7 @@
         </w:trPr>
         <w:tc>
           <w:tcPr>
-            <w:tcW w:type="dxa" w:w="2232"/>
+            <w:tcW w:type="dxa" w:w="2046"/>
             <w:shd w:fill="F2F5F8" w:color="auto" w:val="clear"/>
             <w:tcMar>
               <w:top w:type="dxa" w:w="80"/>
@@ -2877,13 +3493,13 @@
                 <w:sz w:val="20"/>
                 <w:szCs w:val="20"/>
               </w:rPr>
-              <w:t xml:space="preserve">ARPU</w:t>
-            </w:r>
-          </w:p>
-        </w:tc>
-        <w:tc>
-          <w:tcPr>
-            <w:tcW w:type="dxa" w:w="7068"/>
+              <w:t xml:space="preserve">CAC</w:t>
+            </w:r>
+          </w:p>
+        </w:tc>
+        <w:tc>
+          <w:tcPr>
+            <w:tcW w:type="dxa" w:w="7254"/>
             <w:shd w:fill="F2F5F8" w:color="auto" w:val="clear"/>
             <w:tcMar>
               <w:top w:type="dxa" w:w="80"/>
@@ -2904,7 +3520,7 @@
                 <w:sz w:val="20"/>
                 <w:szCs w:val="20"/>
               </w:rPr>
-              <w:t xml:space="preserve">Ingreso promedio mensual por socio.</w:t>
+              <w:t xml:space="preserve">Costo de adquirir una cápita (del PELG).</w:t>
             </w:r>
           </w:p>
         </w:tc>
@@ -2915,7 +3531,7 @@
         </w:trPr>
         <w:tc>
           <w:tcPr>
-            <w:tcW w:type="dxa" w:w="2232"/>
+            <w:tcW w:type="dxa" w:w="2046"/>
             <w:tcMar>
               <w:top w:type="dxa" w:w="80"/>
               <w:left w:type="dxa" w:w="130"/>
@@ -2935,13 +3551,13 @@
                 <w:sz w:val="20"/>
                 <w:szCs w:val="20"/>
               </w:rPr>
-              <w:t xml:space="preserve">prospecto_id</w:t>
-            </w:r>
-          </w:p>
-        </w:tc>
-        <w:tc>
-          <w:tcPr>
-            <w:tcW w:type="dxa" w:w="7068"/>
+              <w:t xml:space="preserve">ARPU</w:t>
+            </w:r>
+          </w:p>
+        </w:tc>
+        <w:tc>
+          <w:tcPr>
+            <w:tcW w:type="dxa" w:w="7254"/>
             <w:tcMar>
               <w:top w:type="dxa" w:w="80"/>
               <w:left w:type="dxa" w:w="130"/>
@@ -2961,7 +3577,7 @@
                 <w:sz w:val="20"/>
                 <w:szCs w:val="20"/>
               </w:rPr>
-              <w:t xml:space="preserve">El identificador que permitiría unir el comportamiento (Mixpanel) con la cápita (HubSpot).</w:t>
+              <w:t xml:space="preserve">Ingreso promedio mensual por socio (real, por plan, desde Binary).</w:t>
             </w:r>
           </w:p>
         </w:tc>
@@ -2972,7 +3588,7 @@
         </w:trPr>
         <w:tc>
           <w:tcPr>
-            <w:tcW w:type="dxa" w:w="2232"/>
+            <w:tcW w:type="dxa" w:w="2046"/>
             <w:shd w:fill="F2F5F8" w:color="auto" w:val="clear"/>
             <w:tcMar>
               <w:top w:type="dxa" w:w="80"/>
@@ -2993,13 +3609,13 @@
                 <w:sz w:val="20"/>
                 <w:szCs w:val="20"/>
               </w:rPr>
-              <w:t xml:space="preserve">Prior</w:t>
-            </w:r>
-          </w:p>
-        </w:tc>
-        <w:tc>
-          <w:tcPr>
-            <w:tcW w:type="dxa" w:w="7068"/>
+              <w:t xml:space="preserve">prospecto_id</w:t>
+            </w:r>
+          </w:p>
+        </w:tc>
+        <w:tc>
+          <w:tcPr>
+            <w:tcW w:type="dxa" w:w="7254"/>
             <w:shd w:fill="F2F5F8" w:color="auto" w:val="clear"/>
             <w:tcMar>
               <w:top w:type="dxa" w:w="80"/>
@@ -3020,7 +3636,7 @@
                 <w:sz w:val="20"/>
                 <w:szCs w:val="20"/>
               </w:rPr>
-              <w:t xml:space="preserve">Lo aprendido de experimentos pasados; el motor lo usa para estimar mejor (ej. cuánto de una fuga se recupera de verdad).</w:t>
+              <w:t xml:space="preserve">El identificador que permitiría unir el comportamiento (Mixpanel) con la cápita (HubSpot / Binary).</w:t>
             </w:r>
           </w:p>
         </w:tc>
@@ -3031,7 +3647,7 @@
         </w:trPr>
         <w:tc>
           <w:tcPr>
-            <w:tcW w:type="dxa" w:w="2232"/>
+            <w:tcW w:type="dxa" w:w="2046"/>
             <w:tcMar>
               <w:top w:type="dxa" w:w="80"/>
               <w:left w:type="dxa" w:w="130"/>
@@ -3051,13 +3667,13 @@
                 <w:sz w:val="20"/>
                 <w:szCs w:val="20"/>
               </w:rPr>
-              <w:t xml:space="preserve">Snapshot</w:t>
-            </w:r>
-          </w:p>
-        </w:tc>
-        <w:tc>
-          <w:tcPr>
-            <w:tcW w:type="dxa" w:w="7068"/>
+              <w:t xml:space="preserve">Prior</w:t>
+            </w:r>
+          </w:p>
+        </w:tc>
+        <w:tc>
+          <w:tcPr>
+            <w:tcW w:type="dxa" w:w="7254"/>
             <w:tcMar>
               <w:top w:type="dxa" w:w="80"/>
               <w:left w:type="dxa" w:w="130"/>
@@ -3077,7 +3693,7 @@
                 <w:sz w:val="20"/>
                 <w:szCs w:val="20"/>
               </w:rPr>
-              <w:t xml:space="preserve">La foto diaria de los datos que guarda la capa de Memoria.</w:t>
+              <w:t xml:space="preserve">Lo aprendido de experimentos pasados; el motor lo usa para estimar mejor (ej. cuánto de una fuga se recupera de verdad).</w:t>
             </w:r>
           </w:p>
         </w:tc>
@@ -3088,7 +3704,7 @@
         </w:trPr>
         <w:tc>
           <w:tcPr>
-            <w:tcW w:type="dxa" w:w="2232"/>
+            <w:tcW w:type="dxa" w:w="2046"/>
             <w:shd w:fill="F2F5F8" w:color="auto" w:val="clear"/>
             <w:tcMar>
               <w:top w:type="dxa" w:w="80"/>
@@ -3109,13 +3725,13 @@
                 <w:sz w:val="20"/>
                 <w:szCs w:val="20"/>
               </w:rPr>
-              <w:t xml:space="preserve">Guardrail</w:t>
-            </w:r>
-          </w:p>
-        </w:tc>
-        <w:tc>
-          <w:tcPr>
-            <w:tcW w:type="dxa" w:w="7068"/>
+              <w:t xml:space="preserve">Snapshot</w:t>
+            </w:r>
+          </w:p>
+        </w:tc>
+        <w:tc>
+          <w:tcPr>
+            <w:tcW w:type="dxa" w:w="7254"/>
             <w:shd w:fill="F2F5F8" w:color="auto" w:val="clear"/>
             <w:tcMar>
               <w:top w:type="dxa" w:w="80"/>
@@ -3136,7 +3752,7 @@
                 <w:sz w:val="20"/>
                 <w:szCs w:val="20"/>
               </w:rPr>
-              <w:t xml:space="preserve">Un chequeo de seguridad: que una mejora no rompa otra métrica.</w:t>
+              <w:t xml:space="preserve">La foto diaria de los datos que guarda la capa de Memoria.</w:t>
             </w:r>
           </w:p>
         </w:tc>
@@ -3147,7 +3763,7 @@
         </w:trPr>
         <w:tc>
           <w:tcPr>
-            <w:tcW w:type="dxa" w:w="2232"/>
+            <w:tcW w:type="dxa" w:w="2046"/>
             <w:tcMar>
               <w:top w:type="dxa" w:w="80"/>
               <w:left w:type="dxa" w:w="130"/>
@@ -3167,13 +3783,72 @@
                 <w:sz w:val="20"/>
                 <w:szCs w:val="20"/>
               </w:rPr>
+              <w:t xml:space="preserve">Guardrail</w:t>
+            </w:r>
+          </w:p>
+        </w:tc>
+        <w:tc>
+          <w:tcPr>
+            <w:tcW w:type="dxa" w:w="7254"/>
+            <w:tcMar>
+              <w:top w:type="dxa" w:w="80"/>
+              <w:left w:type="dxa" w:w="130"/>
+              <w:bottom w:type="dxa" w:w="80"/>
+              <w:right w:type="dxa" w:w="130"/>
+            </w:tcMar>
+            <w:vAlign w:val="center"/>
+          </w:tcPr>
+          <w:p>
+            <w:pPr>
+              <w:spacing w:after="0"/>
+            </w:pPr>
+            <w:r>
+              <w:rPr>
+                <w:b w:val="false"/>
+                <w:bCs w:val="false"/>
+                <w:sz w:val="20"/>
+                <w:szCs w:val="20"/>
+              </w:rPr>
+              <w:t xml:space="preserve">Un chequeo de seguridad: que una mejora no rompa otra métrica.</w:t>
+            </w:r>
+          </w:p>
+        </w:tc>
+      </w:tr>
+      <w:tr>
+        <w:trPr>
+          <w:cantSplit/>
+        </w:trPr>
+        <w:tc>
+          <w:tcPr>
+            <w:tcW w:type="dxa" w:w="2046"/>
+            <w:shd w:fill="F2F5F8" w:color="auto" w:val="clear"/>
+            <w:tcMar>
+              <w:top w:type="dxa" w:w="80"/>
+              <w:left w:type="dxa" w:w="130"/>
+              <w:bottom w:type="dxa" w:w="80"/>
+              <w:right w:type="dxa" w:w="130"/>
+            </w:tcMar>
+            <w:vAlign w:val="center"/>
+          </w:tcPr>
+          <w:p>
+            <w:pPr>
+              <w:spacing w:after="0"/>
+            </w:pPr>
+            <w:r>
+              <w:rPr>
+                <w:b/>
+                <w:bCs/>
+                <w:sz w:val="20"/>
+                <w:szCs w:val="20"/>
+              </w:rPr>
               <w:t xml:space="preserve">Significancia</w:t>
             </w:r>
           </w:p>
         </w:tc>
         <w:tc>
           <w:tcPr>
-            <w:tcW w:type="dxa" w:w="7068"/>
+            <w:tcW w:type="dxa" w:w="7254"/>
+            <w:shd w:fill="F2F5F8" w:color="auto" w:val="clear"/>
             <w:tcMar>
               <w:top w:type="dxa" w:w="80"/>
               <w:left w:type="dxa" w:w="130"/>

</xml_diff>

<commit_message>
docs(v2): workflow con capturas reales, puntos de dolor, ecuaciones y aclaración DWH
- Flujo de trabajo de la webapp explicado paso a paso (Detectar->Priorizar->Probar->Aprender)
  con 5 capturas REALES del producto embebidas (factibilidad técnica).
- Nueva sección 'Qué puntos de dolor resolvemos' (tabla), con trazabilidad constante al frente.
- 'Cómo decide' reescrito con las ecuaciones explícitas (fuga, LTV, score, P10-P90, significancia).
- Aclaración: SysData NO es un data warehouse (guarda métricas derivadas; consumiría un DWH).
- Más conciso: se fusionaron problema/objetivo/loop; prosa recortada. Capturas en docs/screenshots/.
</commit_message>
<xml_diff>
--- a/SysData-Documentacion.docx
+++ b/SysData-Documentacion.docx
@@ -48,7 +48,7 @@
     </w:p>
     <w:p>
       <w:pPr>
-        <w:spacing w:before="500"/>
+        <w:spacing w:before="460"/>
       </w:pPr>
     </w:p>
     <w:p>
@@ -85,7 +85,7 @@
         <w:rPr>
           <w:color w:val="5B6B7F"/>
         </w:rPr>
-        <w:t xml:space="preserve">Versión 1.2 · 19 de junio de 2026</w:t>
+        <w:t xml:space="preserve">Versión 2.0 · 22 de junio de 2026</w:t>
       </w:r>
     </w:p>
     <w:p>
@@ -104,7 +104,7 @@
     </w:p>
     <w:p>
       <w:pPr>
-        <w:spacing w:after="40"/>
+        <w:spacing w:after="36"/>
       </w:pPr>
       <w:r>
         <w:t xml:space="preserve">1. Resumen ejecutivo</w:t>
@@ -112,15 +112,15 @@
     </w:p>
     <w:p>
       <w:pPr>
-        <w:spacing w:after="40"/>
-      </w:pPr>
-      <w:r>
-        <w:t xml:space="preserve">2. El problema: por qué existe SysData</w:t>
-      </w:r>
-    </w:p>
-    <w:p>
-      <w:pPr>
-        <w:spacing w:after="40"/>
+        <w:spacing w:after="36"/>
+      </w:pPr>
+      <w:r>
+        <w:t xml:space="preserve">2. Qué puntos de dolor resolvemos</w:t>
+      </w:r>
+    </w:p>
+    <w:p>
+      <w:pPr>
+        <w:spacing w:after="36"/>
       </w:pPr>
       <w:r>
         <w:t xml:space="preserve">3. Qué es SysData (y qué no es)</w:t>
@@ -128,98 +128,90 @@
     </w:p>
     <w:p>
       <w:pPr>
-        <w:spacing w:after="40"/>
-      </w:pPr>
-      <w:r>
-        <w:t xml:space="preserve">4. El objetivo</w:t>
-      </w:r>
-    </w:p>
-    <w:p>
-      <w:pPr>
-        <w:spacing w:after="40"/>
-      </w:pPr>
-      <w:r>
-        <w:t xml:space="preserve">5. Cómo se usa: el loop</w:t>
-      </w:r>
-    </w:p>
-    <w:p>
-      <w:pPr>
-        <w:spacing w:after="40"/>
-      </w:pPr>
-      <w:r>
-        <w:t xml:space="preserve">6. Las fuentes de datos (y cómo entra Binary)</w:t>
-      </w:r>
-    </w:p>
-    <w:p>
-      <w:pPr>
-        <w:spacing w:after="40"/>
-      </w:pPr>
-      <w:r>
-        <w:t xml:space="preserve">7. Cómo decide: la lógica</w:t>
-      </w:r>
-    </w:p>
-    <w:p>
-      <w:pPr>
-        <w:spacing w:after="40"/>
-      </w:pPr>
-      <w:r>
-        <w:t xml:space="preserve">8. Decisiones de producto y su porqué</w:t>
-      </w:r>
-    </w:p>
-    <w:p>
-      <w:pPr>
-        <w:spacing w:after="40"/>
-      </w:pPr>
-      <w:r>
-        <w:t xml:space="preserve">9. Arquitectura del motor: las 4 capas</w:t>
-      </w:r>
-    </w:p>
-    <w:p>
-      <w:pPr>
-        <w:spacing w:after="40"/>
-      </w:pPr>
-      <w:r>
-        <w:t xml:space="preserve">10. Rigor de medición de experimentos</w:t>
-      </w:r>
-    </w:p>
-    <w:p>
-      <w:pPr>
-        <w:spacing w:after="40"/>
-      </w:pPr>
-      <w:r>
-        <w:t xml:space="preserve">11. Stack técnico</w:t>
-      </w:r>
-    </w:p>
-    <w:p>
-      <w:pPr>
-        <w:spacing w:after="40"/>
-      </w:pPr>
-      <w:r>
-        <w:t xml:space="preserve">12. La dependencia clave: el cruce visita → cápita</w:t>
-      </w:r>
-    </w:p>
-    <w:p>
-      <w:pPr>
-        <w:spacing w:after="40"/>
-      </w:pPr>
-      <w:r>
-        <w:t xml:space="preserve">13. Estado actual y roadmap</w:t>
-      </w:r>
-    </w:p>
-    <w:p>
-      <w:pPr>
-        <w:spacing w:after="40"/>
-      </w:pPr>
-      <w:r>
-        <w:t xml:space="preserve">14. Principios, seguridad y restricciones</w:t>
-      </w:r>
-    </w:p>
-    <w:p>
-      <w:pPr>
-        <w:spacing w:after="40"/>
-      </w:pPr>
-      <w:r>
-        <w:t xml:space="preserve">15. Glosario</w:t>
+        <w:spacing w:after="36"/>
+      </w:pPr>
+      <w:r>
+        <w:t xml:space="preserve">4. El flujo de trabajo en la webapp</w:t>
+      </w:r>
+    </w:p>
+    <w:p>
+      <w:pPr>
+        <w:spacing w:after="36"/>
+      </w:pPr>
+      <w:r>
+        <w:t xml:space="preserve">5. Las fuentes de datos (y cómo entra Binary)</w:t>
+      </w:r>
+    </w:p>
+    <w:p>
+      <w:pPr>
+        <w:spacing w:after="36"/>
+      </w:pPr>
+      <w:r>
+        <w:t xml:space="preserve">6. Cómo decide: ecuaciones y lógica</w:t>
+      </w:r>
+    </w:p>
+    <w:p>
+      <w:pPr>
+        <w:spacing w:after="36"/>
+      </w:pPr>
+      <w:r>
+        <w:t xml:space="preserve">7. Decisiones de producto y su porqué</w:t>
+      </w:r>
+    </w:p>
+    <w:p>
+      <w:pPr>
+        <w:spacing w:after="36"/>
+      </w:pPr>
+      <w:r>
+        <w:t xml:space="preserve">8. Arquitectura del motor: las 4 capas</w:t>
+      </w:r>
+    </w:p>
+    <w:p>
+      <w:pPr>
+        <w:spacing w:after="36"/>
+      </w:pPr>
+      <w:r>
+        <w:t xml:space="preserve">9. Rigor de medición de experimentos</w:t>
+      </w:r>
+    </w:p>
+    <w:p>
+      <w:pPr>
+        <w:spacing w:after="36"/>
+      </w:pPr>
+      <w:r>
+        <w:t xml:space="preserve">10. Stack técnico</w:t>
+      </w:r>
+    </w:p>
+    <w:p>
+      <w:pPr>
+        <w:spacing w:after="36"/>
+      </w:pPr>
+      <w:r>
+        <w:t xml:space="preserve">11. La dependencia clave: el cruce visita → cápita</w:t>
+      </w:r>
+    </w:p>
+    <w:p>
+      <w:pPr>
+        <w:spacing w:after="36"/>
+      </w:pPr>
+      <w:r>
+        <w:t xml:space="preserve">12. Estado actual y roadmap</w:t>
+      </w:r>
+    </w:p>
+    <w:p>
+      <w:pPr>
+        <w:spacing w:after="36"/>
+      </w:pPr>
+      <w:r>
+        <w:t xml:space="preserve">13. Principios, seguridad y restricciones</w:t>
+      </w:r>
+    </w:p>
+    <w:p>
+      <w:pPr>
+        <w:spacing w:after="36"/>
+      </w:pPr>
+      <w:r>
+        <w:t xml:space="preserve">14. Glosario</w:t>
       </w:r>
     </w:p>
     <w:p>
@@ -238,20 +230,20 @@
     </w:p>
     <w:p>
       <w:pPr>
-        <w:spacing w:after="120"/>
+        <w:spacing w:after="110"/>
         <w:jc w:val="both"/>
       </w:pPr>
       <w:r>
-        <w:t xml:space="preserve">SysData es una herramienta interna de growth: la capa de decisión que se para arriba de los datos que Medicus ya tiene —comportamiento (Mixpanel), comercial (HubSpot), inversión y costos (PELG) y la base de socios (Binary)— y los cruza para responder una sola pregunta: qué conviene mejorar, dónde, cuándo, y cuánta plata hay en juego.</w:t>
-      </w:r>
-    </w:p>
-    <w:p>
-      <w:pPr>
-        <w:spacing w:after="120"/>
+        <w:t xml:space="preserve">SysData es la capa de decisión de growth. Lee las fuentes que Medicus ya tiene —comportamiento (Mixpanel), comercial (HubSpot), inversión/costos (PELG) y la base de socios (Binary)— y las cruza para responder, con un número de plata atrás, qué conviene mejorar, dónde, cuándo y por qué.</w:t>
+      </w:r>
+    </w:p>
+    <w:p>
+      <w:pPr>
+        <w:spacing w:after="110"/>
         <w:jc w:val="both"/>
       </w:pPr>
       <w:r>
-        <w:t xml:space="preserve">No reemplaza a Mixpanel, HubSpot, Binary ni Metabase. Los une y los traduce en decisiones priorizadas por impacto en el negocio (cápitas y margen), separando siempre lo que es dato medido de lo que es supuesto. Cada experimento que el equipo cierra alimenta al motor y lo vuelve más certero: es un sistema de mejora continua, no un dashboard estático.</w:t>
+        <w:t xml:space="preserve">El objetivo, en concreto: que el equipo sepa en minutos qué está mal, qué mejorar primero (priorizado por plata, no por intuición), por qué lo dice (con la evidencia y los supuestos a la vista) y si lo que probó funcionó (con rigor estadístico). Cada experimento que se cierra queda registrado y vuelve al motor como aprendizaje: es mejora continua, no un dashboard estático.</w:t>
       </w:r>
     </w:p>
     <w:p>
@@ -259,8 +251,8 @@
         <w:pBdr>
           <w:left w:val="single" w:color="1689C4" w:sz="18" w:space="12"/>
         </w:pBdr>
-        <w:spacing w:after="160" w:before="80"/>
-        <w:ind w:left="360"/>
+        <w:spacing w:after="140" w:before="60"/>
+        <w:ind w:left="320"/>
       </w:pPr>
       <w:r>
         <w:rPr>
@@ -268,7 +260,7 @@
           <w:iCs/>
           <w:color w:val="0E2E52"/>
         </w:rPr>
-        <w:t xml:space="preserve">En una línea: convertir datos dispersos en decisiones de growth priorizadas por plata, con la evidencia y la honestidad a la vista.</w:t>
+        <w:t xml:space="preserve">En una línea: convierte datos dispersos en decisiones de growth priorizadas por plata, con la evidencia, la trazabilidad y la honestidad a la vista.</w:t>
       </w:r>
     </w:p>
     <w:p>
@@ -277,49 +269,450 @@
         <w:spacing w:after="120" w:before="280"/>
       </w:pPr>
       <w:r>
-        <w:t xml:space="preserve">2. El problema: por qué existe SysData</w:t>
-      </w:r>
-    </w:p>
-    <w:p>
-      <w:pPr>
-        <w:spacing w:after="120"/>
+        <w:t xml:space="preserve">2. Qué puntos de dolor resolvemos</w:t>
+      </w:r>
+    </w:p>
+    <w:p>
+      <w:pPr>
+        <w:spacing w:after="110"/>
         <w:jc w:val="both"/>
       </w:pPr>
       <w:r>
-        <w:t xml:space="preserve">Hoy los datos que importan para crecer viven en sistemas que no se hablan entre sí: el comportamiento del usuario en Mixpanel, el pipeline comercial en HubSpot, la inversión y los costos por canal en el PELG, y la base de socios —asociados, medicards, planes, vigencias y bajas— en Binary. Cada uno, mirado por separado, cuenta solo una parte de la historia.</w:t>
-      </w:r>
-    </w:p>
-    <w:p>
-      <w:pPr>
-        <w:spacing w:after="120"/>
-        <w:jc w:val="both"/>
-      </w:pPr>
-      <w:r>
-        <w:rPr>
-          <w:b/>
-          <w:bCs/>
-        </w:rPr>
-        <w:t xml:space="preserve">La consecuencia: </w:t>
-      </w:r>
-      <w:r>
-        <w:t xml:space="preserve">se prioriza por opinión y por urgencia del momento, no por impacto. Se discute “qué fuga arreglar” mirando porcentajes, sin saber cuál mueve la aguja del negocio. Y cuando algo se prueba, muchas veces no se puede afirmar si funcionó de verdad o fue ruido.</w:t>
-      </w:r>
-    </w:p>
-    <w:p>
-      <w:pPr>
-        <w:spacing w:after="120"/>
-        <w:jc w:val="both"/>
-      </w:pPr>
-      <w:r>
-        <w:rPr>
-          <w:b/>
-          <w:bCs/>
-        </w:rPr>
-        <w:t xml:space="preserve">Lo que faltaba: </w:t>
-      </w:r>
-      <w:r>
-        <w:t xml:space="preserve">una capa que junte las fuentes y diga, con un número de plata atrás, qué mover para subir la conversión y las cápitas — y que sea honesta sobre qué tan sólido es ese número.</w:t>
-      </w:r>
+        <w:t xml:space="preserve">Hoy los datos que importan para crecer viven en sistemas que no se hablan entre sí, y las decisiones se toman por opinión y sin registro. SysData ataca eso de frente:</w:t>
+      </w:r>
+    </w:p>
+    <w:tbl>
+      <w:tblPr>
+        <w:tblW w:type="dxa" w:w="9300"/>
+        <w:tblBorders>
+          <w:top w:val="single" w:color="BFC9D4" w:sz="4"/>
+          <w:left w:val="single" w:color="BFC9D4" w:sz="4"/>
+          <w:bottom w:val="single" w:color="BFC9D4" w:sz="4"/>
+          <w:right w:val="single" w:color="BFC9D4" w:sz="4"/>
+          <w:insideH w:val="single" w:color="BFC9D4" w:sz="4"/>
+          <w:insideV w:val="single" w:color="BFC9D4" w:sz="4"/>
+        </w:tblBorders>
+        <w:tblLayout w:type="fixed"/>
+      </w:tblPr>
+      <w:tblGrid>
+        <w:gridCol w:w="3720"/>
+        <w:gridCol w:w="5580"/>
+      </w:tblGrid>
+      <w:tr>
+        <w:trPr>
+          <w:cantSplit/>
+          <w:tblHeader/>
+        </w:trPr>
+        <w:tc>
+          <w:tcPr>
+            <w:tcW w:type="dxa" w:w="3720"/>
+            <w:shd w:fill="0E2E52" w:color="auto" w:val="clear"/>
+            <w:tcMar>
+              <w:top w:type="dxa" w:w="70"/>
+              <w:left w:type="dxa" w:w="130"/>
+              <w:bottom w:type="dxa" w:w="70"/>
+              <w:right w:type="dxa" w:w="130"/>
+            </w:tcMar>
+            <w:vAlign w:val="center"/>
+          </w:tcPr>
+          <w:p>
+            <w:pPr>
+              <w:spacing w:after="0"/>
+            </w:pPr>
+            <w:r>
+              <w:rPr>
+                <w:b/>
+                <w:bCs/>
+                <w:color w:val="FFFFFF"/>
+                <w:sz w:val="20"/>
+                <w:szCs w:val="20"/>
+              </w:rPr>
+              <w:t xml:space="preserve">Dolor de hoy</w:t>
+            </w:r>
+          </w:p>
+        </w:tc>
+        <w:tc>
+          <w:tcPr>
+            <w:tcW w:type="dxa" w:w="5580"/>
+            <w:shd w:fill="0E2E52" w:color="auto" w:val="clear"/>
+            <w:tcMar>
+              <w:top w:type="dxa" w:w="70"/>
+              <w:left w:type="dxa" w:w="130"/>
+              <w:bottom w:type="dxa" w:w="70"/>
+              <w:right w:type="dxa" w:w="130"/>
+            </w:tcMar>
+            <w:vAlign w:val="center"/>
+          </w:tcPr>
+          <w:p>
+            <w:pPr>
+              <w:spacing w:after="0"/>
+            </w:pPr>
+            <w:r>
+              <w:rPr>
+                <w:b/>
+                <w:bCs/>
+                <w:color w:val="FFFFFF"/>
+                <w:sz w:val="20"/>
+                <w:szCs w:val="20"/>
+              </w:rPr>
+              <w:t xml:space="preserve">Cómo lo resuelve SysData</w:t>
+            </w:r>
+          </w:p>
+        </w:tc>
+      </w:tr>
+      <w:tr>
+        <w:trPr>
+          <w:cantSplit/>
+        </w:trPr>
+        <w:tc>
+          <w:tcPr>
+            <w:tcW w:type="dxa" w:w="3720"/>
+            <w:tcMar>
+              <w:top w:type="dxa" w:w="70"/>
+              <w:left w:type="dxa" w:w="130"/>
+              <w:bottom w:type="dxa" w:w="70"/>
+              <w:right w:type="dxa" w:w="130"/>
+            </w:tcMar>
+            <w:vAlign w:val="center"/>
+          </w:tcPr>
+          <w:p>
+            <w:pPr>
+              <w:spacing w:after="0"/>
+            </w:pPr>
+            <w:r>
+              <w:rPr>
+                <w:b/>
+                <w:bCs/>
+                <w:sz w:val="20"/>
+                <w:szCs w:val="20"/>
+              </w:rPr>
+              <w:t xml:space="preserve">Datos en silos (Mixpanel, HubSpot, PELG, Binary no se cruzan)</w:t>
+            </w:r>
+          </w:p>
+        </w:tc>
+        <w:tc>
+          <w:tcPr>
+            <w:tcW w:type="dxa" w:w="5580"/>
+            <w:tcMar>
+              <w:top w:type="dxa" w:w="70"/>
+              <w:left w:type="dxa" w:w="130"/>
+              <w:bottom w:type="dxa" w:w="70"/>
+              <w:right w:type="dxa" w:w="130"/>
+            </w:tcMar>
+            <w:vAlign w:val="center"/>
+          </w:tcPr>
+          <w:p>
+            <w:pPr>
+              <w:spacing w:after="0"/>
+            </w:pPr>
+            <w:r>
+              <w:rPr>
+                <w:b w:val="false"/>
+                <w:bCs w:val="false"/>
+                <w:sz w:val="20"/>
+                <w:szCs w:val="20"/>
+              </w:rPr>
+              <w:t xml:space="preserve">Una sola capa que los une y los traduce en decisiones; nadie tiene que abrir cuatro herramientas y reconciliarlas a mano.</w:t>
+            </w:r>
+          </w:p>
+        </w:tc>
+      </w:tr>
+      <w:tr>
+        <w:trPr>
+          <w:cantSplit/>
+        </w:trPr>
+        <w:tc>
+          <w:tcPr>
+            <w:tcW w:type="dxa" w:w="3720"/>
+            <w:shd w:fill="F2F5F8" w:color="auto" w:val="clear"/>
+            <w:tcMar>
+              <w:top w:type="dxa" w:w="70"/>
+              <w:left w:type="dxa" w:w="130"/>
+              <w:bottom w:type="dxa" w:w="70"/>
+              <w:right w:type="dxa" w:w="130"/>
+            </w:tcMar>
+            <w:vAlign w:val="center"/>
+          </w:tcPr>
+          <w:p>
+            <w:pPr>
+              <w:spacing w:after="0"/>
+            </w:pPr>
+            <w:r>
+              <w:rPr>
+                <w:b/>
+                <w:bCs/>
+                <w:sz w:val="20"/>
+                <w:szCs w:val="20"/>
+              </w:rPr>
+              <w:t xml:space="preserve">Se prioriza por opinión o por el % de fuga más grande</w:t>
+            </w:r>
+          </w:p>
+        </w:tc>
+        <w:tc>
+          <w:tcPr>
+            <w:tcW w:type="dxa" w:w="5580"/>
+            <w:shd w:fill="F2F5F8" w:color="auto" w:val="clear"/>
+            <w:tcMar>
+              <w:top w:type="dxa" w:w="70"/>
+              <w:left w:type="dxa" w:w="130"/>
+              <w:bottom w:type="dxa" w:w="70"/>
+              <w:right w:type="dxa" w:w="130"/>
+            </w:tcMar>
+            <w:vAlign w:val="center"/>
+          </w:tcPr>
+          <w:p>
+            <w:pPr>
+              <w:spacing w:after="0"/>
+            </w:pPr>
+            <w:r>
+              <w:rPr>
+                <w:b w:val="false"/>
+                <w:bCs w:val="false"/>
+                <w:sz w:val="20"/>
+                <w:szCs w:val="20"/>
+              </w:rPr>
+              <w:t xml:space="preserve">Ranking por plata en juego (margen), no por intuición ni por porcentaje: lo primero es lo que más mueve el negocio.</w:t>
+            </w:r>
+          </w:p>
+        </w:tc>
+      </w:tr>
+      <w:tr>
+        <w:trPr>
+          <w:cantSplit/>
+        </w:trPr>
+        <w:tc>
+          <w:tcPr>
+            <w:tcW w:type="dxa" w:w="3720"/>
+            <w:tcMar>
+              <w:top w:type="dxa" w:w="70"/>
+              <w:left w:type="dxa" w:w="130"/>
+              <w:bottom w:type="dxa" w:w="70"/>
+              <w:right w:type="dxa" w:w="130"/>
+            </w:tcMar>
+            <w:vAlign w:val="center"/>
+          </w:tcPr>
+          <w:p>
+            <w:pPr>
+              <w:spacing w:after="0"/>
+            </w:pPr>
+            <w:r>
+              <w:rPr>
+                <w:b/>
+                <w:bCs/>
+                <w:sz w:val="20"/>
+                <w:szCs w:val="20"/>
+              </w:rPr>
+              <w:t xml:space="preserve">Falta de trazabilidad: las decisiones y pruebas no quedan registradas</w:t>
+            </w:r>
+          </w:p>
+        </w:tc>
+        <w:tc>
+          <w:tcPr>
+            <w:tcW w:type="dxa" w:w="5580"/>
+            <w:tcMar>
+              <w:top w:type="dxa" w:w="70"/>
+              <w:left w:type="dxa" w:w="130"/>
+              <w:bottom w:type="dxa" w:w="70"/>
+              <w:right w:type="dxa" w:w="130"/>
+            </w:tcMar>
+            <w:vAlign w:val="center"/>
+          </w:tcPr>
+          <w:p>
+            <w:pPr>
+              <w:spacing w:after="0"/>
+            </w:pPr>
+            <w:r>
+              <w:rPr>
+                <w:b w:val="false"/>
+                <w:bCs w:val="false"/>
+                <w:sz w:val="20"/>
+                <w:szCs w:val="20"/>
+              </w:rPr>
+              <w:t xml:space="preserve">Trazabilidad constante: cada oportunidad → experimento → medición → aprendizaje queda enlazada y auditable. Nada se pierde, todo se puede reconstruir.</w:t>
+            </w:r>
+          </w:p>
+        </w:tc>
+      </w:tr>
+      <w:tr>
+        <w:trPr>
+          <w:cantSplit/>
+        </w:trPr>
+        <w:tc>
+          <w:tcPr>
+            <w:tcW w:type="dxa" w:w="3720"/>
+            <w:shd w:fill="F2F5F8" w:color="auto" w:val="clear"/>
+            <w:tcMar>
+              <w:top w:type="dxa" w:w="70"/>
+              <w:left w:type="dxa" w:w="130"/>
+              <w:bottom w:type="dxa" w:w="70"/>
+              <w:right w:type="dxa" w:w="130"/>
+            </w:tcMar>
+            <w:vAlign w:val="center"/>
+          </w:tcPr>
+          <w:p>
+            <w:pPr>
+              <w:spacing w:after="0"/>
+            </w:pPr>
+            <w:r>
+              <w:rPr>
+                <w:b/>
+                <w:bCs/>
+                <w:sz w:val="20"/>
+                <w:szCs w:val="20"/>
+              </w:rPr>
+              <w:t xml:space="preserve">No se sabe si una mejora funcionó (o fue casualidad)</w:t>
+            </w:r>
+          </w:p>
+        </w:tc>
+        <w:tc>
+          <w:tcPr>
+            <w:tcW w:type="dxa" w:w="5580"/>
+            <w:shd w:fill="F2F5F8" w:color="auto" w:val="clear"/>
+            <w:tcMar>
+              <w:top w:type="dxa" w:w="70"/>
+              <w:left w:type="dxa" w:w="130"/>
+              <w:bottom w:type="dxa" w:w="70"/>
+              <w:right w:type="dxa" w:w="130"/>
+            </w:tcMar>
+            <w:vAlign w:val="center"/>
+          </w:tcPr>
+          <w:p>
+            <w:pPr>
+              <w:spacing w:after="0"/>
+            </w:pPr>
+            <w:r>
+              <w:rPr>
+                <w:b w:val="false"/>
+                <w:bCs w:val="false"/>
+                <w:sz w:val="20"/>
+                <w:szCs w:val="20"/>
+              </w:rPr>
+              <w:t xml:space="preserve">Medición con significancia estadística (señal vs ruido) + guardrails (que no rompa otra cosa).</w:t>
+            </w:r>
+          </w:p>
+        </w:tc>
+      </w:tr>
+      <w:tr>
+        <w:trPr>
+          <w:cantSplit/>
+        </w:trPr>
+        <w:tc>
+          <w:tcPr>
+            <w:tcW w:type="dxa" w:w="3720"/>
+            <w:tcMar>
+              <w:top w:type="dxa" w:w="70"/>
+              <w:left w:type="dxa" w:w="130"/>
+              <w:bottom w:type="dxa" w:w="70"/>
+              <w:right w:type="dxa" w:w="130"/>
+            </w:tcMar>
+            <w:vAlign w:val="center"/>
+          </w:tcPr>
+          <w:p>
+            <w:pPr>
+              <w:spacing w:after="0"/>
+            </w:pPr>
+            <w:r>
+              <w:rPr>
+                <w:b/>
+                <w:bCs/>
+                <w:sz w:val="20"/>
+                <w:szCs w:val="20"/>
+              </w:rPr>
+              <w:t xml:space="preserve">Números sin respaldo, imposibles de discutir</w:t>
+            </w:r>
+          </w:p>
+        </w:tc>
+        <w:tc>
+          <w:tcPr>
+            <w:tcW w:type="dxa" w:w="5580"/>
+            <w:tcMar>
+              <w:top w:type="dxa" w:w="70"/>
+              <w:left w:type="dxa" w:w="130"/>
+              <w:bottom w:type="dxa" w:w="70"/>
+              <w:right w:type="dxa" w:w="130"/>
+            </w:tcMar>
+            <w:vAlign w:val="center"/>
+          </w:tcPr>
+          <w:p>
+            <w:pPr>
+              <w:spacing w:after="0"/>
+            </w:pPr>
+            <w:r>
+              <w:rPr>
+                <w:b w:val="false"/>
+                <w:bCs w:val="false"/>
+                <w:sz w:val="20"/>
+                <w:szCs w:val="20"/>
+              </w:rPr>
+              <w:t xml:space="preserve">Honestidad: cada cifra muestra su fuente y marca explícitamente lo que es supuesto.</w:t>
+            </w:r>
+          </w:p>
+        </w:tc>
+      </w:tr>
+      <w:tr>
+        <w:trPr>
+          <w:cantSplit/>
+        </w:trPr>
+        <w:tc>
+          <w:tcPr>
+            <w:tcW w:type="dxa" w:w="3720"/>
+            <w:shd w:fill="F2F5F8" w:color="auto" w:val="clear"/>
+            <w:tcMar>
+              <w:top w:type="dxa" w:w="70"/>
+              <w:left w:type="dxa" w:w="130"/>
+              <w:bottom w:type="dxa" w:w="70"/>
+              <w:right w:type="dxa" w:w="130"/>
+            </w:tcMar>
+            <w:vAlign w:val="center"/>
+          </w:tcPr>
+          <w:p>
+            <w:pPr>
+              <w:spacing w:after="0"/>
+            </w:pPr>
+            <w:r>
+              <w:rPr>
+                <w:b/>
+                <w:bCs/>
+                <w:sz w:val="20"/>
+                <w:szCs w:val="20"/>
+              </w:rPr>
+              <w:t xml:space="preserve">La memoria del equipo se pierde con la rotación</w:t>
+            </w:r>
+          </w:p>
+        </w:tc>
+        <w:tc>
+          <w:tcPr>
+            <w:tcW w:type="dxa" w:w="5580"/>
+            <w:shd w:fill="F2F5F8" w:color="auto" w:val="clear"/>
+            <w:tcMar>
+              <w:top w:type="dxa" w:w="70"/>
+              <w:left w:type="dxa" w:w="130"/>
+              <w:bottom w:type="dxa" w:w="70"/>
+              <w:right w:type="dxa" w:w="130"/>
+            </w:tcMar>
+            <w:vAlign w:val="center"/>
+          </w:tcPr>
+          <w:p>
+            <w:pPr>
+              <w:spacing w:after="0"/>
+            </w:pPr>
+            <w:r>
+              <w:rPr>
+                <w:b w:val="false"/>
+                <w:bCs w:val="false"/>
+                <w:sz w:val="20"/>
+                <w:szCs w:val="20"/>
+              </w:rPr>
+              <w:t xml:space="preserve">El Playbook y los priors guardan lo aprendido y lo reusan: el motor mejora con cada experimento.</w:t>
+            </w:r>
+          </w:p>
+        </w:tc>
+      </w:tr>
+    </w:tbl>
+    <w:p>
+      <w:pPr>
+        <w:spacing w:after="70"/>
+      </w:pPr>
     </w:p>
     <w:p>
       <w:pPr>
@@ -328,15 +721,6 @@
       </w:pPr>
       <w:r>
         <w:t xml:space="preserve">3. Qué es SysData (y qué no es)</w:t>
-      </w:r>
-    </w:p>
-    <w:p>
-      <w:pPr>
-        <w:pStyle w:val="Heading2"/>
-        <w:spacing w:after="80" w:before="180"/>
-      </w:pPr>
-      <w:r>
-        <w:t xml:space="preserve">Qué es</w:t>
       </w:r>
     </w:p>
     <w:p>
@@ -346,17 +730,17 @@
           <w:ilvl w:val="0"/>
           <w:numId w:val="1"/>
         </w:numPr>
-        <w:spacing w:after="60"/>
+        <w:spacing w:after="50"/>
       </w:pPr>
       <w:r>
         <w:rPr>
           <w:b/>
           <w:bCs/>
         </w:rPr>
-        <w:t xml:space="preserve">La capa de decisión</w:t>
-      </w:r>
-      <w:r>
-        <w:t xml:space="preserve"> del stack de growth: “¿qué hacemos al respecto?”, arriba de los datos.</w:t>
+        <w:t xml:space="preserve">Es la capa de decisión</w:t>
+      </w:r>
+      <w:r>
+        <w:t xml:space="preserve"> del stack de growth: “¿qué hacemos con los datos?”, no “¿dónde los miro?”.</w:t>
       </w:r>
     </w:p>
     <w:p>
@@ -366,17 +750,17 @@
           <w:ilvl w:val="0"/>
           <w:numId w:val="1"/>
         </w:numPr>
-        <w:spacing w:after="60"/>
+        <w:spacing w:after="50"/>
       </w:pPr>
       <w:r>
         <w:rPr>
           <w:b/>
           <w:bCs/>
         </w:rPr>
-        <w:t xml:space="preserve">Un traductor</w:t>
-      </w:r>
-      <w:r>
-        <w:t xml:space="preserve"> de comportamiento + comercial + economía + base de socios a oportunidades priorizadas por margen.</w:t>
+        <w:t xml:space="preserve">Es un traductor</w:t>
+      </w:r>
+      <w:r>
+        <w:t xml:space="preserve"> de comportamiento + comercial + economía + socios a oportunidades priorizadas por margen.</w:t>
       </w:r>
     </w:p>
     <w:p>
@@ -386,26 +770,17 @@
           <w:ilvl w:val="0"/>
           <w:numId w:val="1"/>
         </w:numPr>
-        <w:spacing w:after="60"/>
+        <w:spacing w:after="50"/>
       </w:pPr>
       <w:r>
         <w:rPr>
           <w:b/>
           <w:bCs/>
         </w:rPr>
-        <w:t xml:space="preserve">Un motor que aprende</w:t>
+        <w:t xml:space="preserve">Es un motor que aprende</w:t>
       </w:r>
       <w:r>
         <w:t xml:space="preserve">: cada experimento ajusta sus parámetros y mejora la próxima recomendación.</w:t>
-      </w:r>
-    </w:p>
-    <w:p>
-      <w:pPr>
-        <w:pStyle w:val="Heading2"/>
-        <w:spacing w:after="80" w:before="180"/>
-      </w:pPr>
-      <w:r>
-        <w:t xml:space="preserve">Qué NO es</w:t>
       </w:r>
     </w:p>
     <w:p>
@@ -415,17 +790,17 @@
           <w:ilvl w:val="0"/>
           <w:numId w:val="1"/>
         </w:numPr>
-        <w:spacing w:after="60"/>
+        <w:spacing w:after="50"/>
       </w:pPr>
       <w:r>
         <w:rPr>
           <w:b/>
           <w:bCs/>
         </w:rPr>
-        <w:t xml:space="preserve">No es un CRM</w:t>
-      </w:r>
-      <w:r>
-        <w:t xml:space="preserve"> ni reemplaza a HubSpot.</w:t>
+        <w:t xml:space="preserve">NO es un CRM ni una base de datos</w:t>
+      </w:r>
+      <w:r>
+        <w:t xml:space="preserve">: no reemplaza a HubSpot, Binary ni Metabase; los interpreta.</w:t>
       </w:r>
     </w:p>
     <w:p>
@@ -435,37 +810,363 @@
           <w:ilvl w:val="0"/>
           <w:numId w:val="1"/>
         </w:numPr>
-        <w:spacing w:after="60"/>
+        <w:spacing w:after="50"/>
       </w:pPr>
       <w:r>
         <w:rPr>
           <w:b/>
           <w:bCs/>
         </w:rPr>
-        <w:t xml:space="preserve">No es la base de datos</w:t>
-      </w:r>
-      <w:r>
-        <w:t xml:space="preserve">: no reemplaza a Binary ni a Metabase; es la capa que los interpreta.</w:t>
-      </w:r>
-    </w:p>
-    <w:p>
-      <w:pPr>
-        <w:pStyle w:val="ListParagraph"/>
-        <w:numPr>
-          <w:ilvl w:val="0"/>
-          <w:numId w:val="1"/>
-        </w:numPr>
-        <w:spacing w:after="60"/>
+        <w:t xml:space="preserve">NO escribe en los sistemas productivos</w:t>
+      </w:r>
+      <w:r>
+        <w:t xml:space="preserve">: es estrictamente solo lectura sobre Mixpanel, HubSpot y Binary.</w:t>
+      </w:r>
+    </w:p>
+    <w:p>
+      <w:pPr>
+        <w:pStyle w:val="Heading1"/>
+        <w:spacing w:after="120" w:before="280"/>
+      </w:pPr>
+      <w:r>
+        <w:t xml:space="preserve">4. El flujo de trabajo en la webapp</w:t>
+      </w:r>
+    </w:p>
+    <w:p>
+      <w:pPr>
+        <w:spacing w:after="110"/>
+        <w:jc w:val="both"/>
+      </w:pPr>
+      <w:r>
+        <w:t xml:space="preserve">La app es un ciclo cerrado de cinco pasos. La clave: en cada paso la herramienta deja registro, así que el camino completo —de un problema a un aprendizaje— queda trazado de punta a punta.</w:t>
+      </w:r>
+    </w:p>
+    <w:p>
+      <w:pPr>
+        <w:spacing w:after="60" w:before="100"/>
       </w:pPr>
       <w:r>
         <w:rPr>
           <w:b/>
           <w:bCs/>
-        </w:rPr>
-        <w:t xml:space="preserve">No escribe en los sistemas productivos</w:t>
-      </w:r>
-      <w:r>
-        <w:t xml:space="preserve">: es estrictamente solo lectura sobre Mixpanel, HubSpot y Binary.</w:t>
+          <w:color w:val="0E2E52"/>
+        </w:rPr>
+        <w:t xml:space="preserve">Paso 1 · Detectar (Resumen). </w:t>
+      </w:r>
+      <w:r>
+        <w:t xml:space="preserve">De un vistazo: los KPIs norte, la salud por área (semáforos contra una meta), qué viene bien y qué mal, y las señales que el motor detecta solo (un quiebre que se sale de rango, o una métrica que a este ritmo no llega a la meta).</w:t>
+      </w:r>
+    </w:p>
+    <w:p>
+      <w:pPr>
+        <w:spacing w:after="16" w:before="70"/>
+        <w:jc w:val="center"/>
+      </w:pPr>
+      <w:r>
+        <w:drawing>
+          <wp:inline distT="0" distB="0" distL="0" distR="0">
+            <wp:extent cx="5715000" cy="3429000"/>
+            <wp:effectExtent t="0" r="0" b="0" l="0"/>
+            <wp:docPr id="1" name="" descr="" title=""/>
+            <wp:cNvGraphicFramePr>
+              <a:graphicFrameLocks xmlns:a="http://schemas.openxmlformats.org/drawingml/2006/main" noChangeAspect="1"/>
+            </wp:cNvGraphicFramePr>
+            <a:graphic xmlns:a="http://schemas.openxmlformats.org/drawingml/2006/main">
+              <a:graphicData uri="http://schemas.openxmlformats.org/drawingml/2006/picture">
+                <pic:pic xmlns:pic="http://schemas.openxmlformats.org/drawingml/2006/picture">
+                  <pic:nvPicPr>
+                    <pic:cNvPr id="0" name="" descr=""/>
+                    <pic:cNvPicPr>
+                      <a:picLocks noChangeAspect="1" noChangeArrowheads="1"/>
+                    </pic:cNvPicPr>
+                  </pic:nvPicPr>
+                  <pic:blipFill>
+                    <a:blip r:embed="rId7" cstate="none"/>
+                    <a:srcRect/>
+                    <a:stretch>
+                      <a:fillRect/>
+                    </a:stretch>
+                  </pic:blipFill>
+                  <pic:spPr bwMode="auto">
+                    <a:xfrm>
+                      <a:off x="0" y="0"/>
+                      <a:ext cx="5715000" cy="3429000"/>
+                    </a:xfrm>
+                    <a:prstGeom prst="rect">
+                      <a:avLst/>
+                    </a:prstGeom>
+                  </pic:spPr>
+                </pic:pic>
+              </a:graphicData>
+            </a:graphic>
+          </wp:inline>
+        </w:drawing>
+      </w:r>
+    </w:p>
+    <w:p>
+      <w:pPr>
+        <w:spacing w:after="180"/>
+        <w:jc w:val="center"/>
+      </w:pPr>
+      <w:r>
+        <w:rPr>
+          <w:i/>
+          <w:iCs/>
+          <w:color w:val="5B6B7F"/>
+          <w:sz w:val="18"/>
+          <w:szCs w:val="18"/>
+        </w:rPr>
+        <w:t xml:space="preserve">Resumen — salud por área, “yendo bien / yendo mal” y señales automáticas.</w:t>
+      </w:r>
+    </w:p>
+    <w:p>
+      <w:pPr>
+        <w:spacing w:after="60" w:before="100"/>
+      </w:pPr>
+      <w:r>
+        <w:rPr>
+          <w:b/>
+          <w:bCs/>
+          <w:color w:val="0E2E52"/>
+        </w:rPr>
+        <w:t xml:space="preserve">Paso 2 · Priorizar (Oportunidades). </w:t>
+      </w:r>
+      <w:r>
+        <w:t xml:space="preserve">Una lista ordenada por plata en juego, no por intuición. Cada tarjeta muestra el margen, su rango (escenario conservador → optimista) y de qué fuente sale. Se filtra por disciplina (diseño, producto, desarrollo, datos).</w:t>
+      </w:r>
+    </w:p>
+    <w:p>
+      <w:pPr>
+        <w:spacing w:after="16" w:before="70"/>
+        <w:jc w:val="center"/>
+      </w:pPr>
+      <w:r>
+        <w:drawing>
+          <wp:inline distT="0" distB="0" distL="0" distR="0">
+            <wp:extent cx="5715000" cy="3429000"/>
+            <wp:effectExtent t="0" r="0" b="0" l="0"/>
+            <wp:docPr id="1" name="" descr="" title=""/>
+            <wp:cNvGraphicFramePr>
+              <a:graphicFrameLocks xmlns:a="http://schemas.openxmlformats.org/drawingml/2006/main" noChangeAspect="1"/>
+            </wp:cNvGraphicFramePr>
+            <a:graphic xmlns:a="http://schemas.openxmlformats.org/drawingml/2006/main">
+              <a:graphicData uri="http://schemas.openxmlformats.org/drawingml/2006/picture">
+                <pic:pic xmlns:pic="http://schemas.openxmlformats.org/drawingml/2006/picture">
+                  <pic:nvPicPr>
+                    <pic:cNvPr id="0" name="" descr=""/>
+                    <pic:cNvPicPr>
+                      <a:picLocks noChangeAspect="1" noChangeArrowheads="1"/>
+                    </pic:cNvPicPr>
+                  </pic:nvPicPr>
+                  <pic:blipFill>
+                    <a:blip r:embed="rId8" cstate="none"/>
+                    <a:srcRect/>
+                    <a:stretch>
+                      <a:fillRect/>
+                    </a:stretch>
+                  </pic:blipFill>
+                  <pic:spPr bwMode="auto">
+                    <a:xfrm>
+                      <a:off x="0" y="0"/>
+                      <a:ext cx="5715000" cy="3429000"/>
+                    </a:xfrm>
+                    <a:prstGeom prst="rect">
+                      <a:avLst/>
+                    </a:prstGeom>
+                  </pic:spPr>
+                </pic:pic>
+              </a:graphicData>
+            </a:graphic>
+          </wp:inline>
+        </w:drawing>
+      </w:r>
+    </w:p>
+    <w:p>
+      <w:pPr>
+        <w:spacing w:after="180"/>
+        <w:jc w:val="center"/>
+      </w:pPr>
+      <w:r>
+        <w:rPr>
+          <w:i/>
+          <w:iCs/>
+          <w:color w:val="5B6B7F"/>
+          <w:sz w:val="18"/>
+          <w:szCs w:val="18"/>
+        </w:rPr>
+        <w:t xml:space="preserve">Oportunidades — priorizadas por margen, con el rango y la evidencia de cada una.</w:t>
+      </w:r>
+    </w:p>
+    <w:p>
+      <w:pPr>
+        <w:spacing w:after="60" w:before="100"/>
+      </w:pPr>
+      <w:r>
+        <w:rPr>
+          <w:b/>
+          <w:bCs/>
+          <w:color w:val="0E2E52"/>
+        </w:rPr>
+        <w:t xml:space="preserve">Paso 3 · Entender (el detalle de la oportunidad). </w:t>
+      </w:r>
+      <w:r>
+        <w:t xml:space="preserve">Con un clic se abre la lógica completa: la ecuación, el cálculo paso a paso, la fuente de cada número y los supuestos. Es la sección 6 de este documento.</w:t>
+      </w:r>
+    </w:p>
+    <w:p>
+      <w:pPr>
+        <w:spacing w:after="60" w:before="100"/>
+      </w:pPr>
+      <w:r>
+        <w:rPr>
+          <w:b/>
+          <w:bCs/>
+          <w:color w:val="0E2E52"/>
+        </w:rPr>
+        <w:t xml:space="preserve">Paso 4 · Probar (Experimentos). </w:t>
+      </w:r>
+      <w:r>
+        <w:t xml:space="preserve">Desde una oportunidad se crea un experimento con un clic: la app captura el baseline del funnel y lo deja enlazado a esa oportunidad. Cuando termina, se mide solo (antes vs después) y emite un veredicto.</w:t>
+      </w:r>
+    </w:p>
+    <w:p>
+      <w:pPr>
+        <w:spacing w:after="16" w:before="70"/>
+        <w:jc w:val="center"/>
+      </w:pPr>
+      <w:r>
+        <w:drawing>
+          <wp:inline distT="0" distB="0" distL="0" distR="0">
+            <wp:extent cx="5715000" cy="3429000"/>
+            <wp:effectExtent t="0" r="0" b="0" l="0"/>
+            <wp:docPr id="1" name="" descr="" title=""/>
+            <wp:cNvGraphicFramePr>
+              <a:graphicFrameLocks xmlns:a="http://schemas.openxmlformats.org/drawingml/2006/main" noChangeAspect="1"/>
+            </wp:cNvGraphicFramePr>
+            <a:graphic xmlns:a="http://schemas.openxmlformats.org/drawingml/2006/main">
+              <a:graphicData uri="http://schemas.openxmlformats.org/drawingml/2006/picture">
+                <pic:pic xmlns:pic="http://schemas.openxmlformats.org/drawingml/2006/picture">
+                  <pic:nvPicPr>
+                    <pic:cNvPr id="0" name="" descr=""/>
+                    <pic:cNvPicPr>
+                      <a:picLocks noChangeAspect="1" noChangeArrowheads="1"/>
+                    </pic:cNvPicPr>
+                  </pic:nvPicPr>
+                  <pic:blipFill>
+                    <a:blip r:embed="rId9" cstate="none"/>
+                    <a:srcRect/>
+                    <a:stretch>
+                      <a:fillRect/>
+                    </a:stretch>
+                  </pic:blipFill>
+                  <pic:spPr bwMode="auto">
+                    <a:xfrm>
+                      <a:off x="0" y="0"/>
+                      <a:ext cx="5715000" cy="3429000"/>
+                    </a:xfrm>
+                    <a:prstGeom prst="rect">
+                      <a:avLst/>
+                    </a:prstGeom>
+                  </pic:spPr>
+                </pic:pic>
+              </a:graphicData>
+            </a:graphic>
+          </wp:inline>
+        </w:drawing>
+      </w:r>
+    </w:p>
+    <w:p>
+      <w:pPr>
+        <w:spacing w:after="180"/>
+        <w:jc w:val="center"/>
+      </w:pPr>
+      <w:r>
+        <w:rPr>
+          <w:i/>
+          <w:iCs/>
+          <w:color w:val="5B6B7F"/>
+          <w:sz w:val="18"/>
+          <w:szCs w:val="18"/>
+        </w:rPr>
+        <w:t xml:space="preserve">Experimentos — del baseline al veredicto, cada uno enlazado a su oportunidad de origen.</w:t>
+      </w:r>
+    </w:p>
+    <w:p>
+      <w:pPr>
+        <w:spacing w:after="60" w:before="100"/>
+      </w:pPr>
+      <w:r>
+        <w:rPr>
+          <w:b/>
+          <w:bCs/>
+          <w:color w:val="0E2E52"/>
+        </w:rPr>
+        <w:t xml:space="preserve">Paso 5 · Aprender (Aprendizajes). </w:t>
+      </w:r>
+      <w:r>
+        <w:t xml:space="preserve">El resultado se vuelve una regla del Playbook y un “prior” numérico que afina el próximo ranking. El loop se cierra: lo aprendido hace más certera la siguiente recomendación.</w:t>
+      </w:r>
+    </w:p>
+    <w:p>
+      <w:pPr>
+        <w:spacing w:after="16" w:before="70"/>
+        <w:jc w:val="center"/>
+      </w:pPr>
+      <w:r>
+        <w:drawing>
+          <wp:inline distT="0" distB="0" distL="0" distR="0">
+            <wp:extent cx="5715000" cy="3429000"/>
+            <wp:effectExtent t="0" r="0" b="0" l="0"/>
+            <wp:docPr id="1" name="" descr="" title=""/>
+            <wp:cNvGraphicFramePr>
+              <a:graphicFrameLocks xmlns:a="http://schemas.openxmlformats.org/drawingml/2006/main" noChangeAspect="1"/>
+            </wp:cNvGraphicFramePr>
+            <a:graphic xmlns:a="http://schemas.openxmlformats.org/drawingml/2006/main">
+              <a:graphicData uri="http://schemas.openxmlformats.org/drawingml/2006/picture">
+                <pic:pic xmlns:pic="http://schemas.openxmlformats.org/drawingml/2006/picture">
+                  <pic:nvPicPr>
+                    <pic:cNvPr id="0" name="" descr=""/>
+                    <pic:cNvPicPr>
+                      <a:picLocks noChangeAspect="1" noChangeArrowheads="1"/>
+                    </pic:cNvPicPr>
+                  </pic:nvPicPr>
+                  <pic:blipFill>
+                    <a:blip r:embed="rId10" cstate="none"/>
+                    <a:srcRect/>
+                    <a:stretch>
+                      <a:fillRect/>
+                    </a:stretch>
+                  </pic:blipFill>
+                  <pic:spPr bwMode="auto">
+                    <a:xfrm>
+                      <a:off x="0" y="0"/>
+                      <a:ext cx="5715000" cy="3429000"/>
+                    </a:xfrm>
+                    <a:prstGeom prst="rect">
+                      <a:avLst/>
+                    </a:prstGeom>
+                  </pic:spPr>
+                </pic:pic>
+              </a:graphicData>
+            </a:graphic>
+          </wp:inline>
+        </w:drawing>
+      </w:r>
+    </w:p>
+    <w:p>
+      <w:pPr>
+        <w:spacing w:after="180"/>
+        <w:jc w:val="center"/>
+      </w:pPr>
+      <w:r>
+        <w:rPr>
+          <w:i/>
+          <w:iCs/>
+          <w:color w:val="5B6B7F"/>
+          <w:sz w:val="18"/>
+          <w:szCs w:val="18"/>
+        </w:rPr>
+        <w:t xml:space="preserve">Aprendizajes — el Playbook y los priors numéricos que el motor reutiliza.</w:t>
       </w:r>
     </w:p>
     <w:p>
@@ -474,272 +1175,16 @@
         <w:spacing w:after="120" w:before="280"/>
       </w:pPr>
       <w:r>
-        <w:t xml:space="preserve">4. El objetivo</w:t>
-      </w:r>
-    </w:p>
-    <w:p>
-      <w:pPr>
-        <w:spacing w:after="120"/>
+        <w:t xml:space="preserve">5. Las fuentes de datos (y cómo entra Binary)</w:t>
+      </w:r>
+    </w:p>
+    <w:p>
+      <w:pPr>
+        <w:spacing w:after="110"/>
         <w:jc w:val="both"/>
       </w:pPr>
       <w:r>
-        <w:t xml:space="preserve">Que el equipo abra SysData y en minutos sepa:</w:t>
-      </w:r>
-    </w:p>
-    <w:p>
-      <w:pPr>
-        <w:pStyle w:val="ListParagraph"/>
-        <w:numPr>
-          <w:ilvl w:val="0"/>
-          <w:numId w:val="1"/>
-        </w:numPr>
-        <w:spacing w:after="60"/>
-      </w:pPr>
-      <w:r>
-        <w:rPr>
-          <w:b/>
-          <w:bCs/>
-        </w:rPr>
-        <w:t xml:space="preserve">Qué está bien y qué está mal</w:t>
-      </w:r>
-      <w:r>
-        <w:t xml:space="preserve"> — la salud por área del negocio, de un vistazo.</w:t>
-      </w:r>
-    </w:p>
-    <w:p>
-      <w:pPr>
-        <w:pStyle w:val="ListParagraph"/>
-        <w:numPr>
-          <w:ilvl w:val="0"/>
-          <w:numId w:val="1"/>
-        </w:numPr>
-        <w:spacing w:after="60"/>
-      </w:pPr>
-      <w:r>
-        <w:rPr>
-          <w:b/>
-          <w:bCs/>
-        </w:rPr>
-        <w:t xml:space="preserve">Qué conviene mejorar primero</w:t>
-      </w:r>
-      <w:r>
-        <w:t xml:space="preserve"> — priorizado por plata en juego, no por el % de fuga más grande ni por intuición.</w:t>
-      </w:r>
-    </w:p>
-    <w:p>
-      <w:pPr>
-        <w:pStyle w:val="ListParagraph"/>
-        <w:numPr>
-          <w:ilvl w:val="0"/>
-          <w:numId w:val="1"/>
-        </w:numPr>
-        <w:spacing w:after="60"/>
-      </w:pPr>
-      <w:r>
-        <w:rPr>
-          <w:b/>
-          <w:bCs/>
-        </w:rPr>
-        <w:t xml:space="preserve">Por qué lo dice</w:t>
-      </w:r>
-      <w:r>
-        <w:t xml:space="preserve"> — la evidencia de cada fuente, y qué parte del número es dato medido vs supuesto.</w:t>
-      </w:r>
-    </w:p>
-    <w:p>
-      <w:pPr>
-        <w:pStyle w:val="ListParagraph"/>
-        <w:numPr>
-          <w:ilvl w:val="0"/>
-          <w:numId w:val="1"/>
-        </w:numPr>
-        <w:spacing w:after="60"/>
-      </w:pPr>
-      <w:r>
-        <w:rPr>
-          <w:b/>
-          <w:bCs/>
-        </w:rPr>
-        <w:t xml:space="preserve">Qué estamos probando y si funcionó</w:t>
-      </w:r>
-      <w:r>
-        <w:t xml:space="preserve"> — experimentos medidos con rigor estadístico.</w:t>
-      </w:r>
-    </w:p>
-    <w:p>
-      <w:pPr>
-        <w:pStyle w:val="ListParagraph"/>
-        <w:numPr>
-          <w:ilvl w:val="0"/>
-          <w:numId w:val="1"/>
-        </w:numPr>
-        <w:spacing w:after="60"/>
-      </w:pPr>
-      <w:r>
-        <w:rPr>
-          <w:b/>
-          <w:bCs/>
-        </w:rPr>
-        <w:t xml:space="preserve">Qué aprendimos</w:t>
-      </w:r>
-      <w:r>
-        <w:t xml:space="preserve"> — que queda como memoria del equipo y hace al motor más preciso con el tiempo.</w:t>
-      </w:r>
-    </w:p>
-    <w:p>
-      <w:pPr>
-        <w:pStyle w:val="Heading1"/>
-        <w:spacing w:after="120" w:before="280"/>
-      </w:pPr>
-      <w:r>
-        <w:t xml:space="preserve">5. Cómo se usa: el loop</w:t>
-      </w:r>
-    </w:p>
-    <w:p>
-      <w:pPr>
-        <w:spacing w:after="120"/>
-        <w:jc w:val="both"/>
-      </w:pPr>
-      <w:r>
-        <w:t xml:space="preserve">La navegación de SysData es un ciclo de mejora continua:</w:t>
-      </w:r>
-    </w:p>
-    <w:p>
-      <w:pPr>
-        <w:pStyle w:val="ListParagraph"/>
-        <w:numPr>
-          <w:ilvl w:val="0"/>
-          <w:numId w:val="1"/>
-        </w:numPr>
-        <w:spacing w:after="60"/>
-      </w:pPr>
-      <w:r>
-        <w:rPr>
-          <w:b/>
-          <w:bCs/>
-        </w:rPr>
-        <w:t xml:space="preserve">Resumen</w:t>
-      </w:r>
-      <w:r>
-        <w:t xml:space="preserve"> — cómo viene Medicus: qué está bien, qué está mal, y las señales que el motor detecta solo.</w:t>
-      </w:r>
-    </w:p>
-    <w:p>
-      <w:pPr>
-        <w:pStyle w:val="ListParagraph"/>
-        <w:numPr>
-          <w:ilvl w:val="0"/>
-          <w:numId w:val="1"/>
-        </w:numPr>
-        <w:spacing w:after="60"/>
-      </w:pPr>
-      <w:r>
-        <w:rPr>
-          <w:b/>
-          <w:bCs/>
-        </w:rPr>
-        <w:t xml:space="preserve">Oportunidades</w:t>
-      </w:r>
-      <w:r>
-        <w:t xml:space="preserve"> — qué mejorar, priorizado por plata, con la lógica y la evidencia detrás de cada una.</w:t>
-      </w:r>
-    </w:p>
-    <w:p>
-      <w:pPr>
-        <w:pStyle w:val="ListParagraph"/>
-        <w:numPr>
-          <w:ilvl w:val="0"/>
-          <w:numId w:val="1"/>
-        </w:numPr>
-        <w:spacing w:after="60"/>
-      </w:pPr>
-      <w:r>
-        <w:rPr>
-          <w:b/>
-          <w:bCs/>
-        </w:rPr>
-        <w:t xml:space="preserve">Experimentos</w:t>
-      </w:r>
-      <w:r>
-        <w:t xml:space="preserve"> — qué estamos probando, medido automáticamente (antes vs después) con significancia y guardrails.</w:t>
-      </w:r>
-    </w:p>
-    <w:p>
-      <w:pPr>
-        <w:pStyle w:val="ListParagraph"/>
-        <w:numPr>
-          <w:ilvl w:val="0"/>
-          <w:numId w:val="1"/>
-        </w:numPr>
-        <w:spacing w:after="60"/>
-      </w:pPr>
-      <w:r>
-        <w:rPr>
-          <w:b/>
-          <w:bCs/>
-        </w:rPr>
-        <w:t xml:space="preserve">Aprendizajes (Playbook)</w:t>
-      </w:r>
-      <w:r>
-        <w:t xml:space="preserve"> — qué validamos o refutamos; la memoria que el motor usa como prior.</w:t>
-      </w:r>
-    </w:p>
-    <w:p>
-      <w:pPr>
-        <w:pStyle w:val="ListParagraph"/>
-        <w:numPr>
-          <w:ilvl w:val="0"/>
-          <w:numId w:val="1"/>
-        </w:numPr>
-        <w:spacing w:after="60"/>
-      </w:pPr>
-      <w:r>
-        <w:rPr>
-          <w:b/>
-          <w:bCs/>
-        </w:rPr>
-        <w:t xml:space="preserve">Segmentos</w:t>
-      </w:r>
-      <w:r>
-        <w:t xml:space="preserve"> — discovery: entender al usuario cruzando lo cuanti y lo cuali.</w:t>
-      </w:r>
-    </w:p>
-    <w:p>
-      <w:pPr>
-        <w:pStyle w:val="ListParagraph"/>
-        <w:numPr>
-          <w:ilvl w:val="0"/>
-          <w:numId w:val="1"/>
-        </w:numPr>
-        <w:spacing w:after="60"/>
-      </w:pPr>
-      <w:r>
-        <w:rPr>
-          <w:b/>
-          <w:bCs/>
-        </w:rPr>
-        <w:t xml:space="preserve">Explorador</w:t>
-      </w:r>
-      <w:r>
-        <w:t xml:space="preserve"> — el detalle: funnels, CRM, economía y el estado del cruce de datos.</w:t>
-      </w:r>
-    </w:p>
-    <w:p>
-      <w:pPr>
-        <w:pStyle w:val="Heading1"/>
-        <w:spacing w:after="120" w:before="280"/>
-      </w:pPr>
-      <w:r>
-        <w:t xml:space="preserve">6. Las fuentes de datos (y cómo entra Binary)</w:t>
-      </w:r>
-    </w:p>
-    <w:p>
-      <w:pPr>
-        <w:spacing w:after="120"/>
-        <w:jc w:val="both"/>
-      </w:pPr>
-      <w:r>
-        <w:t xml:space="preserve">SysData no genera datos: orquesta cuatro fuentes que ya existen en Medicus, todas en solo lectura. Binary —nuestra base de socios— es la pieza que vuelve “reales” a los unit economics y la que ayuda a cerrar el cruce de punta a punta.</w:t>
+        <w:t xml:space="preserve">SysData no genera datos: orquesta cuatro fuentes que ya existen en Medicus, todas en solo lectura. Binary —la base de socios— es la pieza que vuelve “reales” a los unit economics y la que ayuda a cerrar el cruce de punta a punta.</w:t>
       </w:r>
     </w:p>
     <w:tbl>
@@ -770,9 +1215,9 @@
             <w:tcW w:type="dxa" w:w="1488"/>
             <w:shd w:fill="0E2E52" w:color="auto" w:val="clear"/>
             <w:tcMar>
-              <w:top w:type="dxa" w:w="80"/>
-              <w:left w:type="dxa" w:w="130"/>
-              <w:bottom w:type="dxa" w:w="80"/>
+              <w:top w:type="dxa" w:w="70"/>
+              <w:left w:type="dxa" w:w="130"/>
+              <w:bottom w:type="dxa" w:w="70"/>
               <w:right w:type="dxa" w:w="130"/>
             </w:tcMar>
             <w:vAlign w:val="center"/>
@@ -798,9 +1243,9 @@
             <w:tcW w:type="dxa" w:w="3906"/>
             <w:shd w:fill="0E2E52" w:color="auto" w:val="clear"/>
             <w:tcMar>
-              <w:top w:type="dxa" w:w="80"/>
-              <w:left w:type="dxa" w:w="130"/>
-              <w:bottom w:type="dxa" w:w="80"/>
+              <w:top w:type="dxa" w:w="70"/>
+              <w:left w:type="dxa" w:w="130"/>
+              <w:bottom w:type="dxa" w:w="70"/>
               <w:right w:type="dxa" w:w="130"/>
             </w:tcMar>
             <w:vAlign w:val="center"/>
@@ -826,9 +1271,9 @@
             <w:tcW w:type="dxa" w:w="3906"/>
             <w:shd w:fill="0E2E52" w:color="auto" w:val="clear"/>
             <w:tcMar>
-              <w:top w:type="dxa" w:w="80"/>
-              <w:left w:type="dxa" w:w="130"/>
-              <w:bottom w:type="dxa" w:w="80"/>
+              <w:top w:type="dxa" w:w="70"/>
+              <w:left w:type="dxa" w:w="130"/>
+              <w:bottom w:type="dxa" w:w="70"/>
               <w:right w:type="dxa" w:w="130"/>
             </w:tcMar>
             <w:vAlign w:val="center"/>
@@ -858,9 +1303,9 @@
           <w:tcPr>
             <w:tcW w:type="dxa" w:w="1488"/>
             <w:tcMar>
-              <w:top w:type="dxa" w:w="80"/>
-              <w:left w:type="dxa" w:w="130"/>
-              <w:bottom w:type="dxa" w:w="80"/>
+              <w:top w:type="dxa" w:w="70"/>
+              <w:left w:type="dxa" w:w="130"/>
+              <w:bottom w:type="dxa" w:w="70"/>
               <w:right w:type="dxa" w:w="130"/>
             </w:tcMar>
             <w:vAlign w:val="center"/>
@@ -884,9 +1329,9 @@
           <w:tcPr>
             <w:tcW w:type="dxa" w:w="3906"/>
             <w:tcMar>
-              <w:top w:type="dxa" w:w="80"/>
-              <w:left w:type="dxa" w:w="130"/>
-              <w:bottom w:type="dxa" w:w="80"/>
+              <w:top w:type="dxa" w:w="70"/>
+              <w:left w:type="dxa" w:w="130"/>
+              <w:bottom w:type="dxa" w:w="70"/>
               <w:right w:type="dxa" w:w="130"/>
             </w:tcMar>
             <w:vAlign w:val="center"/>
@@ -910,9 +1355,9 @@
           <w:tcPr>
             <w:tcW w:type="dxa" w:w="3906"/>
             <w:tcMar>
-              <w:top w:type="dxa" w:w="80"/>
-              <w:left w:type="dxa" w:w="130"/>
-              <w:bottom w:type="dxa" w:w="80"/>
+              <w:top w:type="dxa" w:w="70"/>
+              <w:left w:type="dxa" w:w="130"/>
+              <w:bottom w:type="dxa" w:w="70"/>
               <w:right w:type="dxa" w:w="130"/>
             </w:tcMar>
             <w:vAlign w:val="center"/>
@@ -942,9 +1387,9 @@
             <w:tcW w:type="dxa" w:w="1488"/>
             <w:shd w:fill="F2F5F8" w:color="auto" w:val="clear"/>
             <w:tcMar>
-              <w:top w:type="dxa" w:w="80"/>
-              <w:left w:type="dxa" w:w="130"/>
-              <w:bottom w:type="dxa" w:w="80"/>
+              <w:top w:type="dxa" w:w="70"/>
+              <w:left w:type="dxa" w:w="130"/>
+              <w:bottom w:type="dxa" w:w="70"/>
               <w:right w:type="dxa" w:w="130"/>
             </w:tcMar>
             <w:vAlign w:val="center"/>
@@ -969,9 +1414,9 @@
             <w:tcW w:type="dxa" w:w="3906"/>
             <w:shd w:fill="F2F5F8" w:color="auto" w:val="clear"/>
             <w:tcMar>
-              <w:top w:type="dxa" w:w="80"/>
-              <w:left w:type="dxa" w:w="130"/>
-              <w:bottom w:type="dxa" w:w="80"/>
+              <w:top w:type="dxa" w:w="70"/>
+              <w:left w:type="dxa" w:w="130"/>
+              <w:bottom w:type="dxa" w:w="70"/>
               <w:right w:type="dxa" w:w="130"/>
             </w:tcMar>
             <w:vAlign w:val="center"/>
@@ -996,9 +1441,9 @@
             <w:tcW w:type="dxa" w:w="3906"/>
             <w:shd w:fill="F2F5F8" w:color="auto" w:val="clear"/>
             <w:tcMar>
-              <w:top w:type="dxa" w:w="80"/>
-              <w:left w:type="dxa" w:w="130"/>
-              <w:bottom w:type="dxa" w:w="80"/>
+              <w:top w:type="dxa" w:w="70"/>
+              <w:left w:type="dxa" w:w="130"/>
+              <w:bottom w:type="dxa" w:w="70"/>
               <w:right w:type="dxa" w:w="130"/>
             </w:tcMar>
             <w:vAlign w:val="center"/>
@@ -1027,9 +1472,9 @@
           <w:tcPr>
             <w:tcW w:type="dxa" w:w="1488"/>
             <w:tcMar>
-              <w:top w:type="dxa" w:w="80"/>
-              <w:left w:type="dxa" w:w="130"/>
-              <w:bottom w:type="dxa" w:w="80"/>
+              <w:top w:type="dxa" w:w="70"/>
+              <w:left w:type="dxa" w:w="130"/>
+              <w:bottom w:type="dxa" w:w="70"/>
               <w:right w:type="dxa" w:w="130"/>
             </w:tcMar>
             <w:vAlign w:val="center"/>
@@ -1053,9 +1498,9 @@
           <w:tcPr>
             <w:tcW w:type="dxa" w:w="3906"/>
             <w:tcMar>
-              <w:top w:type="dxa" w:w="80"/>
-              <w:left w:type="dxa" w:w="130"/>
-              <w:bottom w:type="dxa" w:w="80"/>
+              <w:top w:type="dxa" w:w="70"/>
+              <w:left w:type="dxa" w:w="130"/>
+              <w:bottom w:type="dxa" w:w="70"/>
               <w:right w:type="dxa" w:w="130"/>
             </w:tcMar>
             <w:vAlign w:val="center"/>
@@ -1079,9 +1524,9 @@
           <w:tcPr>
             <w:tcW w:type="dxa" w:w="3906"/>
             <w:tcMar>
-              <w:top w:type="dxa" w:w="80"/>
-              <w:left w:type="dxa" w:w="130"/>
-              <w:bottom w:type="dxa" w:w="80"/>
+              <w:top w:type="dxa" w:w="70"/>
+              <w:left w:type="dxa" w:w="130"/>
+              <w:bottom w:type="dxa" w:w="70"/>
               <w:right w:type="dxa" w:w="130"/>
             </w:tcMar>
             <w:vAlign w:val="center"/>
@@ -1111,9 +1556,9 @@
             <w:tcW w:type="dxa" w:w="1488"/>
             <w:shd w:fill="F2F5F8" w:color="auto" w:val="clear"/>
             <w:tcMar>
-              <w:top w:type="dxa" w:w="80"/>
-              <w:left w:type="dxa" w:w="130"/>
-              <w:bottom w:type="dxa" w:w="80"/>
+              <w:top w:type="dxa" w:w="70"/>
+              <w:left w:type="dxa" w:w="130"/>
+              <w:bottom w:type="dxa" w:w="70"/>
               <w:right w:type="dxa" w:w="130"/>
             </w:tcMar>
             <w:vAlign w:val="center"/>
@@ -1138,9 +1583,9 @@
             <w:tcW w:type="dxa" w:w="3906"/>
             <w:shd w:fill="F2F5F8" w:color="auto" w:val="clear"/>
             <w:tcMar>
-              <w:top w:type="dxa" w:w="80"/>
-              <w:left w:type="dxa" w:w="130"/>
-              <w:bottom w:type="dxa" w:w="80"/>
+              <w:top w:type="dxa" w:w="70"/>
+              <w:left w:type="dxa" w:w="130"/>
+              <w:bottom w:type="dxa" w:w="70"/>
               <w:right w:type="dxa" w:w="130"/>
             </w:tcMar>
             <w:vAlign w:val="center"/>
@@ -1156,7 +1601,7 @@
                 <w:sz w:val="20"/>
                 <w:szCs w:val="20"/>
               </w:rPr>
-              <w:t xml:space="preserve">La base de socios (fuente de verdad): asociados, medicards, planes, coberturas, vigencias y bajas.</w:t>
+              <w:t xml:space="preserve">La base de socios (fuente de verdad): asociados, medicards, planes, vigencias y bajas.</w:t>
             </w:r>
           </w:p>
         </w:tc>
@@ -1165,9 +1610,9 @@
             <w:tcW w:type="dxa" w:w="3906"/>
             <w:shd w:fill="F2F5F8" w:color="auto" w:val="clear"/>
             <w:tcMar>
-              <w:top w:type="dxa" w:w="80"/>
-              <w:left w:type="dxa" w:w="130"/>
-              <w:bottom w:type="dxa" w:w="80"/>
+              <w:top w:type="dxa" w:w="70"/>
+              <w:left w:type="dxa" w:w="130"/>
+              <w:bottom w:type="dxa" w:w="70"/>
               <w:right w:type="dxa" w:w="130"/>
             </w:tcMar>
             <w:vAlign w:val="center"/>
@@ -1183,7 +1628,7 @@
                 <w:sz w:val="20"/>
                 <w:szCs w:val="20"/>
               </w:rPr>
-              <w:t xml:space="preserve">Aporta los unit economics REALES —LTV, permanencia/churn y ARPU por plan— y la cápita confirmada para cerrar el cruce visita→cápita.</w:t>
+              <w:t xml:space="preserve">Aporta los unit economics REALES (LTV, permanencia/churn, ARPU por plan) y la cápita confirmada para cerrar el cruce.</w:t>
             </w:r>
           </w:p>
         </w:tc>
@@ -1191,16 +1636,164 @@
     </w:tbl>
     <w:p>
       <w:pPr>
-        <w:spacing w:after="80"/>
-      </w:pPr>
+        <w:spacing w:after="70"/>
+      </w:pPr>
+    </w:p>
+    <w:p>
+      <w:pPr>
+        <w:spacing w:after="110"/>
+        <w:jc w:val="both"/>
+      </w:pPr>
+      <w:r>
+        <w:rPr>
+          <w:b/>
+          <w:bCs/>
+        </w:rPr>
+        <w:t xml:space="preserve">¿Esto es un data warehouse? No. </w:t>
+      </w:r>
+      <w:r>
+        <w:t xml:space="preserve">Un data warehouse (ej. BigQuery/Snowflake) copia y consolida datos crudos de muchas fuentes para análisis a escala. SysData solo guarda métricas derivadas (la foto diaria de KPIs y recos) como su memoria. Un DWH real —donde convivan Mixpanel, HubSpot y Binary— lo arma el equipo de Data, y SysData lo consumiría (es la base de la “Opción B” del cruce).</w:t>
+      </w:r>
+    </w:p>
+    <w:p>
+      <w:pPr>
+        <w:pStyle w:val="Heading1"/>
+        <w:spacing w:after="120" w:before="280"/>
+      </w:pPr>
+      <w:r>
+        <w:t xml:space="preserve">6. Cómo decide: ecuaciones y lógica</w:t>
+      </w:r>
+    </w:p>
+    <w:p>
+      <w:pPr>
+        <w:spacing w:after="110"/>
+        <w:jc w:val="both"/>
+      </w:pPr>
+      <w:r>
+        <w:t xml:space="preserve">Toda la priorización se ancla en una cadena causal, “la ecuación de la cápita”:</w:t>
+      </w:r>
+    </w:p>
+    <w:p>
+      <w:pPr>
+        <w:pBdr>
+          <w:left w:val="single" w:color="1689C4" w:sz="18" w:space="12"/>
+        </w:pBdr>
+        <w:spacing w:after="140" w:before="60"/>
+        <w:ind w:left="320"/>
+      </w:pPr>
+      <w:r>
+        <w:rPr>
+          <w:i/>
+          <w:iCs/>
+          <w:color w:val="0E2E52"/>
+        </w:rPr>
+        <w:t xml:space="preserve">visitas → conversión por paso → datos → (% que se vuelve socio) → cápitas → margen ($)</w:t>
+      </w:r>
+    </w:p>
+    <w:p>
+      <w:pPr>
+        <w:spacing w:after="110"/>
+        <w:jc w:val="both"/>
+      </w:pPr>
+      <w:r>
+        <w:t xml:space="preserve">A partir de esa cadena, el motor aplica cuatro cálculos encadenados. La idea es comparar peras con peras: una mejora chica en un paso de mucho volumen puede valer más que una grande en uno de poco.</w:t>
+      </w:r>
     </w:p>
     <w:p>
       <w:pPr>
         <w:pStyle w:val="Heading2"/>
-        <w:spacing w:after="80" w:before="180"/>
-      </w:pPr>
-      <w:r>
-        <w:t xml:space="preserve">Cómo usaríamos Binary dentro de SysData</w:t>
+        <w:spacing w:after="70" w:before="160"/>
+      </w:pPr>
+      <w:r>
+        <w:t xml:space="preserve">1) Dimensionar la fuga</w:t>
+      </w:r>
+    </w:p>
+    <w:p>
+      <w:pPr>
+        <w:pBdr>
+          <w:left w:val="single" w:color="1689C4" w:sz="18" w:space="12"/>
+        </w:pBdr>
+        <w:spacing w:after="140" w:before="60"/>
+        <w:ind w:left="320"/>
+      </w:pPr>
+      <w:r>
+        <w:rPr>
+          <w:i/>
+          <w:iCs/>
+          <w:color w:val="0E2E52"/>
+        </w:rPr>
+        <w:t xml:space="preserve">fuga del paso = personas que entran − personas que avanzan   (se elige la mayor caída en personas, no en %)</w:t>
+      </w:r>
+    </w:p>
+    <w:p>
+      <w:pPr>
+        <w:pStyle w:val="Heading2"/>
+        <w:spacing w:after="70" w:before="160"/>
+      </w:pPr>
+      <w:r>
+        <w:t xml:space="preserve">2) Traducir a plata</w:t>
+      </w:r>
+    </w:p>
+    <w:p>
+      <w:pPr>
+        <w:pBdr>
+          <w:left w:val="single" w:color="1689C4" w:sz="18" w:space="12"/>
+        </w:pBdr>
+        <w:spacing w:after="140" w:before="60"/>
+        <w:ind w:left="320"/>
+      </w:pPr>
+      <w:r>
+        <w:rPr>
+          <w:i/>
+          <w:iCs/>
+          <w:color w:val="0E2E52"/>
+        </w:rPr>
+        <w:t xml:space="preserve">LTV = ARPU × permanencia × margen de contribución
+plata en juego = fuga × recuperable × (dato → cápita) × LTV</w:t>
+      </w:r>
+    </w:p>
+    <w:p>
+      <w:pPr>
+        <w:spacing w:after="110"/>
+        <w:jc w:val="both"/>
+      </w:pPr>
+      <w:r>
+        <w:t xml:space="preserve">El LTV hoy se modela con supuestos (permanencia, margen); con Binary pasa a medirse con datos reales de socios, y todo el ranking se recalibra.</w:t>
+      </w:r>
+    </w:p>
+    <w:p>
+      <w:pPr>
+        <w:pStyle w:val="Heading2"/>
+        <w:spacing w:after="70" w:before="160"/>
+      </w:pPr>
+      <w:r>
+        <w:t xml:space="preserve">3) Ordenar (el score)</w:t>
+      </w:r>
+    </w:p>
+    <w:p>
+      <w:pPr>
+        <w:pBdr>
+          <w:left w:val="single" w:color="1689C4" w:sz="18" w:space="12"/>
+        </w:pBdr>
+        <w:spacing w:after="140" w:before="60"/>
+        <w:ind w:left="320"/>
+      </w:pPr>
+      <w:r>
+        <w:rPr>
+          <w:i/>
+          <w:iCs/>
+          <w:color w:val="0E2E52"/>
+        </w:rPr>
+        <w:t xml:space="preserve">score = plata en juego × confianza × urgencia ÷ esfuerzo   (lo acumulado se prorratea a mensual)</w:t>
+      </w:r>
+    </w:p>
+    <w:p>
+      <w:pPr>
+        <w:pStyle w:val="Heading2"/>
+        <w:spacing w:after="70" w:before="160"/>
+      </w:pPr>
+      <w:r>
+        <w:t xml:space="preserve">4) Mostrar la incertidumbre y validar</w:t>
       </w:r>
     </w:p>
     <w:p>
@@ -1210,17 +1803,17 @@
           <w:ilvl w:val="0"/>
           <w:numId w:val="1"/>
         </w:numPr>
-        <w:spacing w:after="60"/>
+        <w:spacing w:after="50"/>
       </w:pPr>
       <w:r>
         <w:rPr>
           <w:b/>
           <w:bCs/>
         </w:rPr>
-        <w:t xml:space="preserve">Unit economics reales (el cambio más importante)</w:t>
-      </w:r>
-      <w:r>
-        <w:t xml:space="preserve">: hoy el LTV se arma con supuestos (permanencia 24 meses, margen 18%). Con Binary, la permanencia/churn y el ARPU por plan salen de datos reales de socios → el LTV deja de ser supuesto y pasa a medido. Como TODO el ranking de oportunidades se mide en plata (y la plata depende del LTV), esto recalibra el motor entero.</w:t>
+        <w:t xml:space="preserve">Rango P10–P90</w:t>
+      </w:r>
+      <w:r>
+        <w:t xml:space="preserve">: como varios inputs son supuestos, el motor simula miles de escenarios (Monte Carlo) y muestra un rango, no un número falso-exacto.</w:t>
       </w:r>
     </w:p>
     <w:p>
@@ -1230,77 +1823,104 @@
           <w:ilvl w:val="0"/>
           <w:numId w:val="1"/>
         </w:numPr>
-        <w:spacing w:after="60"/>
+        <w:spacing w:after="50"/>
       </w:pPr>
       <w:r>
         <w:rPr>
           <w:b/>
           <w:bCs/>
         </w:rPr>
-        <w:t xml:space="preserve">Cerrar el cruce visita → cápita</w:t>
-      </w:r>
-      <w:r>
-        <w:t xml:space="preserve">: Binary tiene el socio real con su identificador de alta. Es el candidato natural para unir, en el data warehouse, el comportamiento (Mixpanel) y el comercial (HubSpot) con la cápita confirmada (Binary) — la “Opción B” del cruce. Cuando esté, la conversión a socio pasa de supuesta a medida.</w:t>
-      </w:r>
-    </w:p>
-    <w:p>
-      <w:pPr>
-        <w:pStyle w:val="ListParagraph"/>
-        <w:numPr>
-          <w:ilvl w:val="0"/>
-          <w:numId w:val="1"/>
-        </w:numPr>
-        <w:spacing w:after="60"/>
+        <w:t xml:space="preserve">¿Funcionó?</w:t>
+      </w:r>
+      <w:r>
+        <w:t xml:space="preserve">: un experimento se mide con un test de proporciones; si no supera el ruido (p &lt; 0,05), no es resultado.</w:t>
+      </w:r>
+    </w:p>
+    <w:p>
+      <w:pPr>
+        <w:spacing w:after="110"/>
+        <w:jc w:val="both"/>
+      </w:pPr>
+      <w:r>
+        <w:t xml:space="preserve">El detalle de cada oportunidad expone esta lógica completa: la fórmula, el cálculo paso a paso, la fuente de cada número (Mixpanel, HubSpot, PELG/Binary) y los supuestos detrás.</w:t>
+      </w:r>
+    </w:p>
+    <w:p>
+      <w:pPr>
+        <w:spacing w:after="16" w:before="70"/>
+        <w:jc w:val="center"/>
+      </w:pPr>
+      <w:r>
+        <w:drawing>
+          <wp:inline distT="0" distB="0" distL="0" distR="0">
+            <wp:extent cx="5715000" cy="3429000"/>
+            <wp:effectExtent t="0" r="0" b="0" l="0"/>
+            <wp:docPr id="1" name="" descr="" title=""/>
+            <wp:cNvGraphicFramePr>
+              <a:graphicFrameLocks xmlns:a="http://schemas.openxmlformats.org/drawingml/2006/main" noChangeAspect="1"/>
+            </wp:cNvGraphicFramePr>
+            <a:graphic xmlns:a="http://schemas.openxmlformats.org/drawingml/2006/main">
+              <a:graphicData uri="http://schemas.openxmlformats.org/drawingml/2006/picture">
+                <pic:pic xmlns:pic="http://schemas.openxmlformats.org/drawingml/2006/picture">
+                  <pic:nvPicPr>
+                    <pic:cNvPr id="0" name="" descr=""/>
+                    <pic:cNvPicPr>
+                      <a:picLocks noChangeAspect="1" noChangeArrowheads="1"/>
+                    </pic:cNvPicPr>
+                  </pic:nvPicPr>
+                  <pic:blipFill>
+                    <a:blip r:embed="rId11" cstate="none"/>
+                    <a:srcRect/>
+                    <a:stretch>
+                      <a:fillRect/>
+                    </a:stretch>
+                  </pic:blipFill>
+                  <pic:spPr bwMode="auto">
+                    <a:xfrm>
+                      <a:off x="0" y="0"/>
+                      <a:ext cx="5715000" cy="3429000"/>
+                    </a:xfrm>
+                    <a:prstGeom prst="rect">
+                      <a:avLst/>
+                    </a:prstGeom>
+                  </pic:spPr>
+                </pic:pic>
+              </a:graphicData>
+            </a:graphic>
+          </wp:inline>
+        </w:drawing>
+      </w:r>
+    </w:p>
+    <w:p>
+      <w:pPr>
+        <w:spacing w:after="180"/>
+        <w:jc w:val="center"/>
+      </w:pPr>
+      <w:r>
+        <w:rPr>
+          <w:i/>
+          <w:iCs/>
+          <w:color w:val="5B6B7F"/>
+          <w:sz w:val="18"/>
+          <w:szCs w:val="18"/>
+        </w:rPr>
+        <w:t xml:space="preserve">Detalle de una oportunidad — la ecuación paso a paso, con la fuente de cada número y los supuestos marcados.</w:t>
+      </w:r>
+    </w:p>
+    <w:p>
+      <w:pPr>
+        <w:spacing w:after="110"/>
+        <w:jc w:val="both"/>
       </w:pPr>
       <w:r>
         <w:rPr>
           <w:b/>
           <w:bCs/>
         </w:rPr>
-        <w:t xml:space="preserve">Segmentación real</w:t>
-      </w:r>
-      <w:r>
-        <w:t xml:space="preserve">: cortar por plan, tipo de medicard, cobertura y antigüedad reales (no solo por los campos de HubSpot), para ver qué segmentos retienen y rinden más.</w:t>
-      </w:r>
-    </w:p>
-    <w:p>
-      <w:pPr>
-        <w:pStyle w:val="ListParagraph"/>
-        <w:numPr>
-          <w:ilvl w:val="0"/>
-          <w:numId w:val="1"/>
-        </w:numPr>
-        <w:spacing w:after="60"/>
-      </w:pPr>
-      <w:r>
-        <w:rPr>
-          <w:b/>
-          <w:bCs/>
-        </w:rPr>
-        <w:t xml:space="preserve">Retención / churn</w:t>
-      </w:r>
-      <w:r>
-        <w:t xml:space="preserve">: medir bajas reales por cohorte → alimenta el LTV y habilita a futuro un área de retención dentro del loop.</w:t>
-      </w:r>
-    </w:p>
-    <w:p>
-      <w:pPr>
-        <w:pStyle w:val="ListParagraph"/>
-        <w:numPr>
-          <w:ilvl w:val="0"/>
-          <w:numId w:val="1"/>
-        </w:numPr>
-        <w:spacing w:after="60"/>
-      </w:pPr>
-      <w:r>
-        <w:rPr>
-          <w:b/>
-          <w:bCs/>
-        </w:rPr>
-        <w:t xml:space="preserve">Solo lectura</w:t>
-      </w:r>
-      <w:r>
-        <w:t xml:space="preserve">: igual que el resto de las fuentes, SysData lee de Binary; nunca escribe.</w:t>
+        <w:t xml:space="preserve">Ejemplo (cotizador): </w:t>
+      </w:r>
+      <w:r>
+        <w:t xml:space="preserve">de ~41.500 visitas, ~36.300 se caen en el primer paso. Recuperando ~25% (supuesto), son ~9.000 datos/mes; a 6% dato→cápita (supuesto) y LTV ~$388.800, da del orden de $200M/mes en juego. Ese número —no el % de caída— la pone arriba del ranking.</w:t>
       </w:r>
     </w:p>
     <w:p>
@@ -1309,111 +1929,7 @@
         <w:spacing w:after="120" w:before="280"/>
       </w:pPr>
       <w:r>
-        <w:t xml:space="preserve">7. Cómo decide: la lógica</w:t>
-      </w:r>
-    </w:p>
-    <w:p>
-      <w:pPr>
-        <w:spacing w:after="120"/>
-        <w:jc w:val="both"/>
-      </w:pPr>
-      <w:r>
-        <w:t xml:space="preserve">Toda la priorización se ancla en una cadena simple, “la ecuación de la cápita”:</w:t>
-      </w:r>
-    </w:p>
-    <w:p>
-      <w:pPr>
-        <w:pBdr>
-          <w:left w:val="single" w:color="1689C4" w:sz="18" w:space="12"/>
-        </w:pBdr>
-        <w:spacing w:after="160" w:before="80"/>
-        <w:ind w:left="360"/>
-      </w:pPr>
-      <w:r>
-        <w:rPr>
-          <w:i/>
-          <w:iCs/>
-          <w:color w:val="0E2E52"/>
-        </w:rPr>
-        <w:t xml:space="preserve">visitas → conversión por paso → datos → (% que se vuelve socio) → cápitas → margen ($)   ·   (y por el lado comercial: deals → win rate → cápitas)</w:t>
-      </w:r>
-    </w:p>
-    <w:p>
-      <w:pPr>
-        <w:spacing w:after="120"/>
-        <w:jc w:val="both"/>
-      </w:pPr>
-      <w:r>
-        <w:t xml:space="preserve">Cada recomendación es, en el fondo, una frase: “acá hay un eslabón de esta cadena dejando plata sobre la mesa, y esto es cuánto”. Esto permite comparar peras con peras: una mejora chica en un paso de mucho volumen puede valer más que una grande en uno de poco.</w:t>
-      </w:r>
-    </w:p>
-    <w:p>
-      <w:pPr>
-        <w:pStyle w:val="Heading2"/>
-        <w:spacing w:after="80" w:before="180"/>
-      </w:pPr>
-      <w:r>
-        <w:t xml:space="preserve">El score (cómo se ordenan las oportunidades)</w:t>
-      </w:r>
-    </w:p>
-    <w:p>
-      <w:pPr>
-        <w:pBdr>
-          <w:left w:val="single" w:color="1689C4" w:sz="18" w:space="12"/>
-        </w:pBdr>
-        <w:spacing w:after="160" w:before="80"/>
-        <w:ind w:left="360"/>
-      </w:pPr>
-      <w:r>
-        <w:rPr>
-          <w:i/>
-          <w:iCs/>
-          <w:color w:val="0E2E52"/>
-        </w:rPr>
-        <w:t xml:space="preserve">score = margen en juego × confianza × urgencia ÷ esfuerzo   (lo acumulado se prorratea a mensual)</w:t>
-      </w:r>
-    </w:p>
-    <w:p>
-      <w:pPr>
-        <w:spacing w:after="120"/>
-        <w:jc w:val="both"/>
-      </w:pPr>
-      <w:r>
-        <w:t xml:space="preserve">Ejemplo real con los datos del cotizador: de ~41.500 visitas, ~36.300 se caen antes de avanzar. Si una mejora recupera ~25% de esa fuga (supuesto), son ~9.000 datos extra por mes; a una tasa dato→cápita de 6% (supuesto) y un LTV de contribución de ~$388.800, eso son del orden de $200M por mes en juego. Ese número —no el porcentaje de caída— es lo que pone a esa oportunidad arriba del ranking.</w:t>
-      </w:r>
-    </w:p>
-    <w:p>
-      <w:pPr>
-        <w:spacing w:after="120"/>
-        <w:jc w:val="both"/>
-      </w:pPr>
-      <w:r>
-        <w:rPr>
-          <w:b/>
-          <w:bCs/>
-        </w:rPr>
-        <w:t xml:space="preserve">De dónde sale el LTV (importante): </w:t>
-      </w:r>
-      <w:r>
-        <w:t xml:space="preserve">hoy el LTV y la permanencia son supuestos. Al integrar Binary pasan a ser datos reales (permanencia/churn y ARPU por plan), y todo el ranking se recalibra solo. Es decir: Binary no es un “nice to have”, es lo que vuelve confiables los números de plata que ya usa el motor.</w:t>
-      </w:r>
-    </w:p>
-    <w:p>
-      <w:pPr>
-        <w:pStyle w:val="Heading1"/>
-        <w:spacing w:after="120" w:before="280"/>
-      </w:pPr>
-      <w:r>
-        <w:t xml:space="preserve">8. Decisiones de producto y su porqué</w:t>
-      </w:r>
-    </w:p>
-    <w:p>
-      <w:pPr>
-        <w:spacing w:after="120"/>
-        <w:jc w:val="both"/>
-      </w:pPr>
-      <w:r>
-        <w:t xml:space="preserve">SysData está lleno de decisiones deliberadas. Las principales, con su fundamento:</w:t>
+        <w:t xml:space="preserve">7. Decisiones de producto y su porqué</w:t>
       </w:r>
     </w:p>
     <w:tbl>
@@ -1443,9 +1959,9 @@
             <w:tcW w:type="dxa" w:w="3069"/>
             <w:shd w:fill="0E2E52" w:color="auto" w:val="clear"/>
             <w:tcMar>
-              <w:top w:type="dxa" w:w="80"/>
-              <w:left w:type="dxa" w:w="130"/>
-              <w:bottom w:type="dxa" w:w="80"/>
+              <w:top w:type="dxa" w:w="70"/>
+              <w:left w:type="dxa" w:w="130"/>
+              <w:bottom w:type="dxa" w:w="70"/>
               <w:right w:type="dxa" w:w="130"/>
             </w:tcMar>
             <w:vAlign w:val="center"/>
@@ -1471,9 +1987,9 @@
             <w:tcW w:type="dxa" w:w="6231"/>
             <w:shd w:fill="0E2E52" w:color="auto" w:val="clear"/>
             <w:tcMar>
-              <w:top w:type="dxa" w:w="80"/>
-              <w:left w:type="dxa" w:w="130"/>
-              <w:bottom w:type="dxa" w:w="80"/>
+              <w:top w:type="dxa" w:w="70"/>
+              <w:left w:type="dxa" w:w="130"/>
+              <w:bottom w:type="dxa" w:w="70"/>
               <w:right w:type="dxa" w:w="130"/>
             </w:tcMar>
             <w:vAlign w:val="center"/>
@@ -1503,9 +2019,9 @@
           <w:tcPr>
             <w:tcW w:type="dxa" w:w="3069"/>
             <w:tcMar>
-              <w:top w:type="dxa" w:w="80"/>
-              <w:left w:type="dxa" w:w="130"/>
-              <w:bottom w:type="dxa" w:w="80"/>
+              <w:top w:type="dxa" w:w="70"/>
+              <w:left w:type="dxa" w:w="130"/>
+              <w:bottom w:type="dxa" w:w="70"/>
               <w:right w:type="dxa" w:w="130"/>
             </w:tcMar>
             <w:vAlign w:val="center"/>
@@ -1529,9 +2045,9 @@
           <w:tcPr>
             <w:tcW w:type="dxa" w:w="6231"/>
             <w:tcMar>
-              <w:top w:type="dxa" w:w="80"/>
-              <w:left w:type="dxa" w:w="130"/>
-              <w:bottom w:type="dxa" w:w="80"/>
+              <w:top w:type="dxa" w:w="70"/>
+              <w:left w:type="dxa" w:w="130"/>
+              <w:bottom w:type="dxa" w:w="70"/>
               <w:right w:type="dxa" w:w="130"/>
             </w:tcMar>
             <w:vAlign w:val="center"/>
@@ -1547,7 +2063,7 @@
                 <w:sz w:val="20"/>
                 <w:szCs w:val="20"/>
               </w:rPr>
-              <w:t xml:space="preserve">La fuga más grande no siempre es la más valiosa: una caída enorme sobre tráfico que no convierte vale poco. Ordenar por margen evita gastar esfuerzo donde no mueve el negocio.</w:t>
+              <w:t xml:space="preserve">La fuga más grande no siempre es la más valiosa: una caída enorme sobre tráfico que no convierte vale poco.</w:t>
             </w:r>
           </w:p>
         </w:tc>
@@ -1561,9 +2077,9 @@
             <w:tcW w:type="dxa" w:w="3069"/>
             <w:shd w:fill="F2F5F8" w:color="auto" w:val="clear"/>
             <w:tcMar>
-              <w:top w:type="dxa" w:w="80"/>
-              <w:left w:type="dxa" w:w="130"/>
-              <w:bottom w:type="dxa" w:w="80"/>
+              <w:top w:type="dxa" w:w="70"/>
+              <w:left w:type="dxa" w:w="130"/>
+              <w:bottom w:type="dxa" w:w="70"/>
               <w:right w:type="dxa" w:w="130"/>
             </w:tcMar>
             <w:vAlign w:val="center"/>
@@ -1588,9 +2104,9 @@
             <w:tcW w:type="dxa" w:w="6231"/>
             <w:shd w:fill="F2F5F8" w:color="auto" w:val="clear"/>
             <w:tcMar>
-              <w:top w:type="dxa" w:w="80"/>
-              <w:left w:type="dxa" w:w="130"/>
-              <w:bottom w:type="dxa" w:w="80"/>
+              <w:top w:type="dxa" w:w="70"/>
+              <w:left w:type="dxa" w:w="130"/>
+              <w:bottom w:type="dxa" w:w="70"/>
               <w:right w:type="dxa" w:w="130"/>
             </w:tcMar>
             <w:vAlign w:val="center"/>
@@ -1606,7 +2122,7 @@
                 <w:sz w:val="20"/>
                 <w:szCs w:val="20"/>
               </w:rPr>
-              <w:t xml:space="preserve">Si el motor disfraza supuestos de datos, el equipo deja de confiar la primera vez que falla. Cada número muestra su origen y marca explícitamente lo que es estimación.</w:t>
+              <w:t xml:space="preserve">Si el motor disfraza supuestos de datos, el equipo deja de confiar la primera vez que falla. Cada número muestra su origen.</w:t>
             </w:r>
           </w:p>
         </w:tc>
@@ -1619,9 +2135,9 @@
           <w:tcPr>
             <w:tcW w:type="dxa" w:w="3069"/>
             <w:tcMar>
-              <w:top w:type="dxa" w:w="80"/>
-              <w:left w:type="dxa" w:w="130"/>
-              <w:bottom w:type="dxa" w:w="80"/>
+              <w:top w:type="dxa" w:w="70"/>
+              <w:left w:type="dxa" w:w="130"/>
+              <w:bottom w:type="dxa" w:w="70"/>
               <w:right w:type="dxa" w:w="130"/>
             </w:tcMar>
             <w:vAlign w:val="center"/>
@@ -1645,9 +2161,9 @@
           <w:tcPr>
             <w:tcW w:type="dxa" w:w="6231"/>
             <w:tcMar>
-              <w:top w:type="dxa" w:w="80"/>
-              <w:left w:type="dxa" w:w="130"/>
-              <w:bottom w:type="dxa" w:w="80"/>
+              <w:top w:type="dxa" w:w="70"/>
+              <w:left w:type="dxa" w:w="130"/>
+              <w:bottom w:type="dxa" w:w="70"/>
               <w:right w:type="dxa" w:w="130"/>
             </w:tcMar>
             <w:vAlign w:val="center"/>
@@ -1663,7 +2179,7 @@
                 <w:sz w:val="20"/>
                 <w:szCs w:val="20"/>
               </w:rPr>
-              <w:t xml:space="preserve">Ya hay dashboards (Mixpanel, Metabase). Lo que faltaba no era “ver datos”, sino “decidir qué hacer con ellos”, cruzando las fuentes.</w:t>
+              <w:t xml:space="preserve">Ya hay dashboards. Lo que faltaba era decidir qué hacer con los datos, cruzando las fuentes.</w:t>
             </w:r>
           </w:p>
         </w:tc>
@@ -1677,9 +2193,9 @@
             <w:tcW w:type="dxa" w:w="3069"/>
             <w:shd w:fill="F2F5F8" w:color="auto" w:val="clear"/>
             <w:tcMar>
-              <w:top w:type="dxa" w:w="80"/>
-              <w:left w:type="dxa" w:w="130"/>
-              <w:bottom w:type="dxa" w:w="80"/>
+              <w:top w:type="dxa" w:w="70"/>
+              <w:left w:type="dxa" w:w="130"/>
+              <w:bottom w:type="dxa" w:w="70"/>
               <w:right w:type="dxa" w:w="130"/>
             </w:tcMar>
             <w:vAlign w:val="center"/>
@@ -1704,9 +2220,9 @@
             <w:tcW w:type="dxa" w:w="6231"/>
             <w:shd w:fill="F2F5F8" w:color="auto" w:val="clear"/>
             <w:tcMar>
-              <w:top w:type="dxa" w:w="80"/>
-              <w:left w:type="dxa" w:w="130"/>
-              <w:bottom w:type="dxa" w:w="80"/>
+              <w:top w:type="dxa" w:w="70"/>
+              <w:left w:type="dxa" w:w="130"/>
+              <w:bottom w:type="dxa" w:w="70"/>
               <w:right w:type="dxa" w:w="130"/>
             </w:tcMar>
             <w:vAlign w:val="center"/>
@@ -1722,7 +2238,7 @@
                 <w:sz w:val="20"/>
                 <w:szCs w:val="20"/>
               </w:rPr>
-              <w:t xml:space="preserve">Mixpanel, HubSpot y Binary son productivos. El riesgo de escribir (romper eventos, deals, registros de socios) es inaceptable. SysData nunca escribe ahí.</w:t>
+              <w:t xml:space="preserve">Mixpanel, HubSpot y Binary son productivos. El riesgo de escribir (romper eventos, deals, registros de socios) es inaceptable.</w:t>
             </w:r>
           </w:p>
         </w:tc>
@@ -1735,9 +2251,9 @@
           <w:tcPr>
             <w:tcW w:type="dxa" w:w="3069"/>
             <w:tcMar>
-              <w:top w:type="dxa" w:w="80"/>
-              <w:left w:type="dxa" w:w="130"/>
-              <w:bottom w:type="dxa" w:w="80"/>
+              <w:top w:type="dxa" w:w="70"/>
+              <w:left w:type="dxa" w:w="130"/>
+              <w:bottom w:type="dxa" w:w="70"/>
               <w:right w:type="dxa" w:w="130"/>
             </w:tcMar>
             <w:vAlign w:val="center"/>
@@ -1761,9 +2277,9 @@
           <w:tcPr>
             <w:tcW w:type="dxa" w:w="6231"/>
             <w:tcMar>
-              <w:top w:type="dxa" w:w="80"/>
-              <w:left w:type="dxa" w:w="130"/>
-              <w:bottom w:type="dxa" w:w="80"/>
+              <w:top w:type="dxa" w:w="70"/>
+              <w:left w:type="dxa" w:w="130"/>
+              <w:bottom w:type="dxa" w:w="70"/>
               <w:right w:type="dxa" w:w="130"/>
             </w:tcMar>
             <w:vAlign w:val="center"/>
@@ -1779,7 +2295,7 @@
                 <w:sz w:val="20"/>
                 <w:szCs w:val="20"/>
               </w:rPr>
-              <w:t xml:space="preserve">A nuestra escala, el rigor estadístico y las reglas transparentes le ganan a un modelo opaco. La IA se reserva para redactar y agrupar, nunca para inventar números.</w:t>
+              <w:t xml:space="preserve">A nuestra escala, el rigor estadístico y las reglas transparentes le ganan a un modelo opaco. La IA solo redacta y agrupa, no inventa números.</w:t>
             </w:r>
           </w:p>
         </w:tc>
@@ -1793,9 +2309,9 @@
             <w:tcW w:type="dxa" w:w="3069"/>
             <w:shd w:fill="F2F5F8" w:color="auto" w:val="clear"/>
             <w:tcMar>
-              <w:top w:type="dxa" w:w="80"/>
-              <w:left w:type="dxa" w:w="130"/>
-              <w:bottom w:type="dxa" w:w="80"/>
+              <w:top w:type="dxa" w:w="70"/>
+              <w:left w:type="dxa" w:w="130"/>
+              <w:bottom w:type="dxa" w:w="70"/>
               <w:right w:type="dxa" w:w="130"/>
             </w:tcMar>
             <w:vAlign w:val="center"/>
@@ -1820,9 +2336,9 @@
             <w:tcW w:type="dxa" w:w="6231"/>
             <w:shd w:fill="F2F5F8" w:color="auto" w:val="clear"/>
             <w:tcMar>
-              <w:top w:type="dxa" w:w="80"/>
-              <w:left w:type="dxa" w:w="130"/>
-              <w:bottom w:type="dxa" w:w="80"/>
+              <w:top w:type="dxa" w:w="70"/>
+              <w:left w:type="dxa" w:w="130"/>
+              <w:bottom w:type="dxa" w:w="70"/>
               <w:right w:type="dxa" w:w="130"/>
             </w:tcMar>
             <w:vAlign w:val="center"/>
@@ -1838,7 +2354,7 @@
                 <w:sz w:val="20"/>
                 <w:szCs w:val="20"/>
               </w:rPr>
-              <w:t xml:space="preserve">Para que sea una herramienta de equipo, los experimentos, estados y aprendizajes tienen que ser de todos y persistentes, no de un navegador.</w:t>
+              <w:t xml:space="preserve">Para ser una herramienta de equipo, todo (experimentos, estados, aprendizajes) tiene que ser compartido y persistente.</w:t>
             </w:r>
           </w:p>
         </w:tc>
@@ -1851,9 +2367,9 @@
           <w:tcPr>
             <w:tcW w:type="dxa" w:w="3069"/>
             <w:tcMar>
-              <w:top w:type="dxa" w:w="80"/>
-              <w:left w:type="dxa" w:w="130"/>
-              <w:bottom w:type="dxa" w:w="80"/>
+              <w:top w:type="dxa" w:w="70"/>
+              <w:left w:type="dxa" w:w="130"/>
+              <w:bottom w:type="dxa" w:w="70"/>
               <w:right w:type="dxa" w:w="130"/>
             </w:tcMar>
             <w:vAlign w:val="center"/>
@@ -1877,9 +2393,9 @@
           <w:tcPr>
             <w:tcW w:type="dxa" w:w="6231"/>
             <w:tcMar>
-              <w:top w:type="dxa" w:w="80"/>
-              <w:left w:type="dxa" w:w="130"/>
-              <w:bottom w:type="dxa" w:w="80"/>
+              <w:top w:type="dxa" w:w="70"/>
+              <w:left w:type="dxa" w:w="130"/>
+              <w:bottom w:type="dxa" w:w="70"/>
               <w:right w:type="dxa" w:w="130"/>
             </w:tcMar>
             <w:vAlign w:val="center"/>
@@ -1895,7 +2411,7 @@
                 <w:sz w:val="20"/>
                 <w:szCs w:val="20"/>
               </w:rPr>
-              <w:t xml:space="preserve">Un “subió 5%” sin significancia es ruido. Y una mejora que rompe un paso de más abajo no es victoria. El motor exige las dos cosas antes de cantar un resultado.</w:t>
+              <w:t xml:space="preserve">Un “subió 5%” sin significancia es ruido; y una mejora que rompe un paso de abajo no es victoria.</w:t>
             </w:r>
           </w:p>
         </w:tc>
@@ -1909,9 +2425,9 @@
             <w:tcW w:type="dxa" w:w="3069"/>
             <w:shd w:fill="F2F5F8" w:color="auto" w:val="clear"/>
             <w:tcMar>
-              <w:top w:type="dxa" w:w="80"/>
-              <w:left w:type="dxa" w:w="130"/>
-              <w:bottom w:type="dxa" w:w="80"/>
+              <w:top w:type="dxa" w:w="70"/>
+              <w:left w:type="dxa" w:w="130"/>
+              <w:bottom w:type="dxa" w:w="70"/>
               <w:right w:type="dxa" w:w="130"/>
             </w:tcMar>
             <w:vAlign w:val="center"/>
@@ -1936,9 +2452,9 @@
             <w:tcW w:type="dxa" w:w="6231"/>
             <w:shd w:fill="F2F5F8" w:color="auto" w:val="clear"/>
             <w:tcMar>
-              <w:top w:type="dxa" w:w="80"/>
-              <w:left w:type="dxa" w:w="130"/>
-              <w:bottom w:type="dxa" w:w="80"/>
+              <w:top w:type="dxa" w:w="70"/>
+              <w:left w:type="dxa" w:w="130"/>
+              <w:bottom w:type="dxa" w:w="70"/>
               <w:right w:type="dxa" w:w="130"/>
             </w:tcMar>
             <w:vAlign w:val="center"/>
@@ -1954,7 +2470,7 @@
                 <w:sz w:val="20"/>
                 <w:szCs w:val="20"/>
               </w:rPr>
-              <w:t xml:space="preserve">Como varios inputs son supuestos, mostrar una cifra exacta es falsa precisión. El rango comunica la incertidumbre y de qué supuesto depende.</w:t>
+              <w:t xml:space="preserve">Como hay supuestos, una cifra exacta es falsa precisión. El rango comunica la incertidumbre.</w:t>
             </w:r>
           </w:p>
         </w:tc>
@@ -1962,7 +2478,7 @@
     </w:tbl>
     <w:p>
       <w:pPr>
-        <w:spacing w:after="80"/>
+        <w:spacing w:after="70"/>
       </w:pPr>
     </w:p>
     <w:p>
@@ -1971,16 +2487,16 @@
         <w:spacing w:after="120" w:before="280"/>
       </w:pPr>
       <w:r>
-        <w:t xml:space="preserve">9. Arquitectura del motor: las 4 capas</w:t>
-      </w:r>
-    </w:p>
-    <w:p>
-      <w:pPr>
-        <w:spacing w:after="120"/>
+        <w:t xml:space="preserve">8. Arquitectura del motor: las 4 capas</w:t>
+      </w:r>
+    </w:p>
+    <w:p>
+      <w:pPr>
+        <w:spacing w:after="110"/>
         <w:jc w:val="both"/>
       </w:pPr>
       <w:r>
-        <w:t xml:space="preserve">El “cerebro” de SysData está organizado en cuatro capas encadenadas: la memoria habilita la detección; la detección y la economía alimentan la decisión; y los resultados de los experimentos vuelven como aprendizaje que afina todo.</w:t>
+        <w:t xml:space="preserve">El “cerebro” se organiza en cuatro capas encadenadas: la memoria habilita la detección; la detección y la economía alimentan la decisión; los experimentos vuelven como aprendizaje que afina todo.</w:t>
       </w:r>
     </w:p>
     <w:tbl>
@@ -2011,9 +2527,9 @@
             <w:tcW w:type="dxa" w:w="1674"/>
             <w:shd w:fill="0E2E52" w:color="auto" w:val="clear"/>
             <w:tcMar>
-              <w:top w:type="dxa" w:w="80"/>
-              <w:left w:type="dxa" w:w="130"/>
-              <w:bottom w:type="dxa" w:w="80"/>
+              <w:top w:type="dxa" w:w="70"/>
+              <w:left w:type="dxa" w:w="130"/>
+              <w:bottom w:type="dxa" w:w="70"/>
               <w:right w:type="dxa" w:w="130"/>
             </w:tcMar>
             <w:vAlign w:val="center"/>
@@ -2039,9 +2555,9 @@
             <w:tcW w:type="dxa" w:w="3813"/>
             <w:shd w:fill="0E2E52" w:color="auto" w:val="clear"/>
             <w:tcMar>
-              <w:top w:type="dxa" w:w="80"/>
-              <w:left w:type="dxa" w:w="130"/>
-              <w:bottom w:type="dxa" w:w="80"/>
+              <w:top w:type="dxa" w:w="70"/>
+              <w:left w:type="dxa" w:w="130"/>
+              <w:bottom w:type="dxa" w:w="70"/>
               <w:right w:type="dxa" w:w="130"/>
             </w:tcMar>
             <w:vAlign w:val="center"/>
@@ -2067,9 +2583,9 @@
             <w:tcW w:type="dxa" w:w="3813"/>
             <w:shd w:fill="0E2E52" w:color="auto" w:val="clear"/>
             <w:tcMar>
-              <w:top w:type="dxa" w:w="80"/>
-              <w:left w:type="dxa" w:w="130"/>
-              <w:bottom w:type="dxa" w:w="80"/>
+              <w:top w:type="dxa" w:w="70"/>
+              <w:left w:type="dxa" w:w="130"/>
+              <w:bottom w:type="dxa" w:w="70"/>
               <w:right w:type="dxa" w:w="130"/>
             </w:tcMar>
             <w:vAlign w:val="center"/>
@@ -2099,9 +2615,9 @@
           <w:tcPr>
             <w:tcW w:type="dxa" w:w="1674"/>
             <w:tcMar>
-              <w:top w:type="dxa" w:w="80"/>
-              <w:left w:type="dxa" w:w="130"/>
-              <w:bottom w:type="dxa" w:w="80"/>
+              <w:top w:type="dxa" w:w="70"/>
+              <w:left w:type="dxa" w:w="130"/>
+              <w:bottom w:type="dxa" w:w="70"/>
               <w:right w:type="dxa" w:w="130"/>
             </w:tcMar>
             <w:vAlign w:val="center"/>
@@ -2125,9 +2641,9 @@
           <w:tcPr>
             <w:tcW w:type="dxa" w:w="3813"/>
             <w:tcMar>
-              <w:top w:type="dxa" w:w="80"/>
-              <w:left w:type="dxa" w:w="130"/>
-              <w:bottom w:type="dxa" w:w="80"/>
+              <w:top w:type="dxa" w:w="70"/>
+              <w:left w:type="dxa" w:w="130"/>
+              <w:bottom w:type="dxa" w:w="70"/>
               <w:right w:type="dxa" w:w="130"/>
             </w:tcMar>
             <w:vAlign w:val="center"/>
@@ -2151,9 +2667,9 @@
           <w:tcPr>
             <w:tcW w:type="dxa" w:w="3813"/>
             <w:tcMar>
-              <w:top w:type="dxa" w:w="80"/>
-              <w:left w:type="dxa" w:w="130"/>
-              <w:bottom w:type="dxa" w:w="80"/>
+              <w:top w:type="dxa" w:w="70"/>
+              <w:left w:type="dxa" w:w="130"/>
+              <w:bottom w:type="dxa" w:w="70"/>
               <w:right w:type="dxa" w:w="130"/>
             </w:tcMar>
             <w:vAlign w:val="center"/>
@@ -2169,7 +2685,7 @@
                 <w:sz w:val="20"/>
                 <w:szCs w:val="20"/>
               </w:rPr>
-              <w:t xml:space="preserve">Sin serie histórica propia no hay detección, ni forecast, ni aprendizaje. La historia consultable es nuestra o no existe.</w:t>
+              <w:t xml:space="preserve">Sin serie histórica propia no hay detección, forecast ni aprendizaje.</w:t>
             </w:r>
           </w:p>
         </w:tc>
@@ -2183,9 +2699,9 @@
             <w:tcW w:type="dxa" w:w="1674"/>
             <w:shd w:fill="F2F5F8" w:color="auto" w:val="clear"/>
             <w:tcMar>
-              <w:top w:type="dxa" w:w="80"/>
-              <w:left w:type="dxa" w:w="130"/>
-              <w:bottom w:type="dxa" w:w="80"/>
+              <w:top w:type="dxa" w:w="70"/>
+              <w:left w:type="dxa" w:w="130"/>
+              <w:bottom w:type="dxa" w:w="70"/>
               <w:right w:type="dxa" w:w="130"/>
             </w:tcMar>
             <w:vAlign w:val="center"/>
@@ -2210,9 +2726,9 @@
             <w:tcW w:type="dxa" w:w="3813"/>
             <w:shd w:fill="F2F5F8" w:color="auto" w:val="clear"/>
             <w:tcMar>
-              <w:top w:type="dxa" w:w="80"/>
-              <w:left w:type="dxa" w:w="130"/>
-              <w:bottom w:type="dxa" w:w="80"/>
+              <w:top w:type="dxa" w:w="70"/>
+              <w:left w:type="dxa" w:w="130"/>
+              <w:bottom w:type="dxa" w:w="70"/>
               <w:right w:type="dxa" w:w="130"/>
             </w:tcMar>
             <w:vAlign w:val="center"/>
@@ -2237,9 +2753,9 @@
             <w:tcW w:type="dxa" w:w="3813"/>
             <w:shd w:fill="F2F5F8" w:color="auto" w:val="clear"/>
             <w:tcMar>
-              <w:top w:type="dxa" w:w="80"/>
-              <w:left w:type="dxa" w:w="130"/>
-              <w:bottom w:type="dxa" w:w="80"/>
+              <w:top w:type="dxa" w:w="70"/>
+              <w:left w:type="dxa" w:w="130"/>
+              <w:bottom w:type="dxa" w:w="70"/>
               <w:right w:type="dxa" w:w="130"/>
             </w:tcMar>
             <w:vAlign w:val="center"/>
@@ -2255,7 +2771,7 @@
                 <w:sz w:val="20"/>
                 <w:szCs w:val="20"/>
               </w:rPr>
-              <w:t xml:space="preserve">Responde el “dónde y cuándo” solo: avisa cuando algo se rompió, antes de notarlo a mano.</w:t>
+              <w:t xml:space="preserve">Avisa cuando algo se rompió, antes de notarlo a mano.</w:t>
             </w:r>
           </w:p>
         </w:tc>
@@ -2268,9 +2784,9 @@
           <w:tcPr>
             <w:tcW w:type="dxa" w:w="1674"/>
             <w:tcMar>
-              <w:top w:type="dxa" w:w="80"/>
-              <w:left w:type="dxa" w:w="130"/>
-              <w:bottom w:type="dxa" w:w="80"/>
+              <w:top w:type="dxa" w:w="70"/>
+              <w:left w:type="dxa" w:w="130"/>
+              <w:bottom w:type="dxa" w:w="70"/>
               <w:right w:type="dxa" w:w="130"/>
             </w:tcMar>
             <w:vAlign w:val="center"/>
@@ -2294,9 +2810,9 @@
           <w:tcPr>
             <w:tcW w:type="dxa" w:w="3813"/>
             <w:tcMar>
-              <w:top w:type="dxa" w:w="80"/>
-              <w:left w:type="dxa" w:w="130"/>
-              <w:bottom w:type="dxa" w:w="80"/>
+              <w:top w:type="dxa" w:w="70"/>
+              <w:left w:type="dxa" w:w="130"/>
+              <w:bottom w:type="dxa" w:w="70"/>
               <w:right w:type="dxa" w:w="130"/>
             </w:tcMar>
             <w:vAlign w:val="center"/>
@@ -2312,7 +2828,7 @@
                 <w:sz w:val="20"/>
                 <w:szCs w:val="20"/>
               </w:rPr>
-              <w:t xml:space="preserve">Puntúa cada oportunidad por plata y la muestra como un rango (conservador → optimista).</w:t>
+              <w:t xml:space="preserve">Puntúa por plata y muestra un rango (conservador → optimista).</w:t>
             </w:r>
           </w:p>
         </w:tc>
@@ -2320,9 +2836,9 @@
           <w:tcPr>
             <w:tcW w:type="dxa" w:w="3813"/>
             <w:tcMar>
-              <w:top w:type="dxa" w:w="80"/>
-              <w:left w:type="dxa" w:w="130"/>
-              <w:bottom w:type="dxa" w:w="80"/>
+              <w:top w:type="dxa" w:w="70"/>
+              <w:left w:type="dxa" w:w="130"/>
+              <w:bottom w:type="dxa" w:w="70"/>
               <w:right w:type="dxa" w:w="130"/>
             </w:tcMar>
             <w:vAlign w:val="center"/>
@@ -2338,7 +2854,7 @@
                 <w:sz w:val="20"/>
                 <w:szCs w:val="20"/>
               </w:rPr>
-              <w:t xml:space="preserve">Convierte la incertidumbre en una apuesta cuantificada, en vez de un número falso-exacto.</w:t>
+              <w:t xml:space="preserve">Convierte la incertidumbre en una apuesta cuantificada.</w:t>
             </w:r>
           </w:p>
         </w:tc>
@@ -2352,9 +2868,9 @@
             <w:tcW w:type="dxa" w:w="1674"/>
             <w:shd w:fill="F2F5F8" w:color="auto" w:val="clear"/>
             <w:tcMar>
-              <w:top w:type="dxa" w:w="80"/>
-              <w:left w:type="dxa" w:w="130"/>
-              <w:bottom w:type="dxa" w:w="80"/>
+              <w:top w:type="dxa" w:w="70"/>
+              <w:left w:type="dxa" w:w="130"/>
+              <w:bottom w:type="dxa" w:w="70"/>
               <w:right w:type="dxa" w:w="130"/>
             </w:tcMar>
             <w:vAlign w:val="center"/>
@@ -2379,9 +2895,9 @@
             <w:tcW w:type="dxa" w:w="3813"/>
             <w:shd w:fill="F2F5F8" w:color="auto" w:val="clear"/>
             <w:tcMar>
-              <w:top w:type="dxa" w:w="80"/>
-              <w:left w:type="dxa" w:w="130"/>
-              <w:bottom w:type="dxa" w:w="80"/>
+              <w:top w:type="dxa" w:w="70"/>
+              <w:left w:type="dxa" w:w="130"/>
+              <w:bottom w:type="dxa" w:w="70"/>
               <w:right w:type="dxa" w:w="130"/>
             </w:tcMar>
             <w:vAlign w:val="center"/>
@@ -2397,7 +2913,7 @@
                 <w:sz w:val="20"/>
                 <w:szCs w:val="20"/>
               </w:rPr>
-              <w:t xml:space="preserve">Los resultados de los experimentos se vuelven parámetros que afinan el motor.</w:t>
+              <w:t xml:space="preserve">Los resultados de los experimentos afinan los parámetros del motor.</w:t>
             </w:r>
           </w:p>
         </w:tc>
@@ -2406,9 +2922,9 @@
             <w:tcW w:type="dxa" w:w="3813"/>
             <w:shd w:fill="F2F5F8" w:color="auto" w:val="clear"/>
             <w:tcMar>
-              <w:top w:type="dxa" w:w="80"/>
-              <w:left w:type="dxa" w:w="130"/>
-              <w:bottom w:type="dxa" w:w="80"/>
+              <w:top w:type="dxa" w:w="70"/>
+              <w:left w:type="dxa" w:w="130"/>
+              <w:bottom w:type="dxa" w:w="70"/>
               <w:right w:type="dxa" w:w="130"/>
             </w:tcMar>
             <w:vAlign w:val="center"/>
@@ -2424,7 +2940,7 @@
                 <w:sz w:val="20"/>
                 <w:szCs w:val="20"/>
               </w:rPr>
-              <w:t xml:space="preserve">Es lo que lo hace “cada vez más inteligente”: aprende la realidad de nuestro producto, no supuestos genéricos.</w:t>
+              <w:t xml:space="preserve">Lo hace “cada vez más inteligente”: aprende la realidad de nuestro producto.</w:t>
             </w:r>
           </w:p>
         </w:tc>
@@ -2432,7 +2948,7 @@
     </w:tbl>
     <w:p>
       <w:pPr>
-        <w:spacing w:after="80"/>
+        <w:spacing w:after="70"/>
       </w:pPr>
     </w:p>
     <w:p>
@@ -2441,16 +2957,16 @@
         <w:spacing w:after="120" w:before="280"/>
       </w:pPr>
       <w:r>
-        <w:t xml:space="preserve">10. Rigor de medición de experimentos</w:t>
-      </w:r>
-    </w:p>
-    <w:p>
-      <w:pPr>
-        <w:spacing w:after="120"/>
+        <w:t xml:space="preserve">9. Rigor de medición de experimentos</w:t>
+      </w:r>
+    </w:p>
+    <w:p>
+      <w:pPr>
+        <w:spacing w:after="110"/>
         <w:jc w:val="both"/>
       </w:pPr>
       <w:r>
-        <w:t xml:space="preserve">Cuando se cierra un experimento, el motor lo mide de forma triangulada y honesta:</w:t>
+        <w:t xml:space="preserve">Al cerrar un experimento, el motor lo mide de forma triangulada y honesta:</w:t>
       </w:r>
     </w:p>
     <w:p>
@@ -2460,17 +2976,17 @@
           <w:ilvl w:val="0"/>
           <w:numId w:val="1"/>
         </w:numPr>
-        <w:spacing w:after="60"/>
+        <w:spacing w:after="50"/>
       </w:pPr>
       <w:r>
         <w:rPr>
           <w:b/>
           <w:bCs/>
         </w:rPr>
-        <w:t xml:space="preserve">Significancia estadística</w:t>
-      </w:r>
-      <w:r>
-        <w:t xml:space="preserve"> — test de dos proporciones (antes vs después). Si el movimiento no supera el ruido (p &lt; 0,05), no se declara resultado: es “inconcluso”.</w:t>
+        <w:t xml:space="preserve">Significancia</w:t>
+      </w:r>
+      <w:r>
+        <w:t xml:space="preserve"> — test de dos proporciones (antes vs después). Si p ≥ 0,05, es “inconcluso”, no resultado.</w:t>
       </w:r>
     </w:p>
     <w:p>
@@ -2480,7 +2996,7 @@
           <w:ilvl w:val="0"/>
           <w:numId w:val="1"/>
         </w:numPr>
-        <w:spacing w:after="60"/>
+        <w:spacing w:after="50"/>
       </w:pPr>
       <w:r>
         <w:rPr>
@@ -2490,7 +3006,7 @@
         <w:t xml:space="preserve">Guardrails</w:t>
       </w:r>
       <w:r>
-        <w:t xml:space="preserve"> — chequea que la mejora no haya roto un paso de más abajo (comportamiento), ni el win rate (comercial), ni el margen (económico).</w:t>
+        <w:t xml:space="preserve"> — que la mejora no haya roto un paso de abajo, ni el win rate, ni el margen.</w:t>
       </w:r>
     </w:p>
     <w:p>
@@ -2500,7 +3016,7 @@
           <w:ilvl w:val="0"/>
           <w:numId w:val="1"/>
         </w:numPr>
-        <w:spacing w:after="60"/>
+        <w:spacing w:after="50"/>
       </w:pPr>
       <w:r>
         <w:rPr>
@@ -2510,7 +3026,7 @@
         <w:t xml:space="preserve">Ripple</w:t>
       </w:r>
       <w:r>
-        <w:t xml:space="preserve"> — verifica si el efecto se propagó aguas abajo o se quedó en un paso intermedio (un lift que no llega a socio cerrado es hueco).</w:t>
+        <w:t xml:space="preserve"> — si el efecto se propagó aguas abajo o se quedó en un paso intermedio.</w:t>
       </w:r>
     </w:p>
     <w:p>
@@ -2520,7 +3036,7 @@
           <w:ilvl w:val="0"/>
           <w:numId w:val="1"/>
         </w:numPr>
-        <w:spacing w:after="60"/>
+        <w:spacing w:after="50"/>
       </w:pPr>
       <w:r>
         <w:rPr>
@@ -2530,7 +3046,7 @@
         <w:t xml:space="preserve">Confounds declarados</w:t>
       </w:r>
       <w:r>
-        <w:t xml:space="preserve"> — el motor dice qué no controla (es antes/después, no A/B; campañas, estacionalidad), para leer el resultado con la cautela justa.</w:t>
+        <w:t xml:space="preserve"> — qué no se controla (antes/después, no A/B), para leer el resultado con cautela.</w:t>
       </w:r>
     </w:p>
     <w:p>
@@ -2539,7 +3055,7 @@
         <w:spacing w:after="120" w:before="280"/>
       </w:pPr>
       <w:r>
-        <w:t xml:space="preserve">11. Stack técnico</w:t>
+        <w:t xml:space="preserve">10. Stack técnico</w:t>
       </w:r>
     </w:p>
     <w:p>
@@ -2549,17 +3065,17 @@
           <w:ilvl w:val="0"/>
           <w:numId w:val="1"/>
         </w:numPr>
-        <w:spacing w:after="60"/>
+        <w:spacing w:after="50"/>
       </w:pPr>
       <w:r>
         <w:rPr>
           <w:b/>
           <w:bCs/>
         </w:rPr>
-        <w:t xml:space="preserve">Frontend / app</w:t>
-      </w:r>
-      <w:r>
-        <w:t xml:space="preserve">: Next.js 16 (App Router) + React 19 + TypeScript + CSS Modules.</w:t>
+        <w:t xml:space="preserve">App</w:t>
+      </w:r>
+      <w:r>
+        <w:t xml:space="preserve">: Next.js 16 + React 19 + TypeScript.</w:t>
       </w:r>
     </w:p>
     <w:p>
@@ -2569,17 +3085,17 @@
           <w:ilvl w:val="0"/>
           <w:numId w:val="1"/>
         </w:numPr>
-        <w:spacing w:after="60"/>
+        <w:spacing w:after="50"/>
       </w:pPr>
       <w:r>
         <w:rPr>
           <w:b/>
           <w:bCs/>
         </w:rPr>
-        <w:t xml:space="preserve">Datos del equipo</w:t>
-      </w:r>
-      <w:r>
-        <w:t xml:space="preserve">: Supabase (login + estado compartido: experimentos, estados, aprendizajes, snapshots, priors), con Row Level Security.</w:t>
+        <w:t xml:space="preserve">Estado del equipo</w:t>
+      </w:r>
+      <w:r>
+        <w:t xml:space="preserve">: Supabase (login + datos compartidos: experimentos, estados, aprendizajes, snapshots, priors) con Row Level Security.</w:t>
       </w:r>
     </w:p>
     <w:p>
@@ -2589,7 +3105,7 @@
           <w:ilvl w:val="0"/>
           <w:numId w:val="1"/>
         </w:numPr>
-        <w:spacing w:after="60"/>
+        <w:spacing w:after="50"/>
       </w:pPr>
       <w:r>
         <w:rPr>
@@ -2599,7 +3115,7 @@
         <w:t xml:space="preserve">Hosting</w:t>
       </w:r>
       <w:r>
-        <w:t xml:space="preserve">: Vercel. El barrido diario corre como Vercel Cron.</w:t>
+        <w:t xml:space="preserve">: Vercel; el barrido diario corre como Vercel Cron.</w:t>
       </w:r>
     </w:p>
     <w:p>
@@ -2609,7 +3125,7 @@
           <w:ilvl w:val="0"/>
           <w:numId w:val="1"/>
         </w:numPr>
-        <w:spacing w:after="60"/>
+        <w:spacing w:after="50"/>
       </w:pPr>
       <w:r>
         <w:rPr>
@@ -2619,7 +3135,7 @@
         <w:t xml:space="preserve">Fuentes (solo lectura)</w:t>
       </w:r>
       <w:r>
-        <w:t xml:space="preserve">: Mixpanel (Query/Engage API) para comportamiento; HubSpot (CRM v3) para comercial y NPS; PELG para inversión/CAC; y Binary (base de socios) para unit economics reales —LTV, churn, ARPU por plan— y la cápita confirmada.</w:t>
+        <w:t xml:space="preserve">: Mixpanel y HubSpot (APIs), PELG (inversión/CAC) y Binary (unit economics reales + cápita confirmada).</w:t>
       </w:r>
     </w:p>
     <w:p>
@@ -2629,17 +3145,17 @@
           <w:ilvl w:val="0"/>
           <w:numId w:val="1"/>
         </w:numPr>
-        <w:spacing w:after="60"/>
+        <w:spacing w:after="50"/>
       </w:pPr>
       <w:r>
         <w:rPr>
           <w:b/>
           <w:bCs/>
         </w:rPr>
-        <w:t xml:space="preserve">IA (acotada)</w:t>
-      </w:r>
-      <w:r>
-        <w:t xml:space="preserve">: Gemini, reservada para tareas de lenguaje (redactar, agrupar), nunca para producir números.</w:t>
+        <w:t xml:space="preserve">IA acotada</w:t>
+      </w:r>
+      <w:r>
+        <w:t xml:space="preserve">: Gemini, solo para lenguaje (redactar, agrupar), nunca para producir números.</w:t>
       </w:r>
     </w:p>
     <w:p>
@@ -2649,7 +3165,7 @@
           <w:ilvl w:val="0"/>
           <w:numId w:val="1"/>
         </w:numPr>
-        <w:spacing w:after="60"/>
+        <w:spacing w:after="50"/>
       </w:pPr>
       <w:r>
         <w:rPr>
@@ -2659,7 +3175,7 @@
         <w:t xml:space="preserve">Seguridad</w:t>
       </w:r>
       <w:r>
-        <w:t xml:space="preserve">: los tokens van server-side (nunca expuestos al cliente); las rutas /api están detrás de login (dominio @medicus.com.ar).</w:t>
+        <w:t xml:space="preserve">: tokens server-side; rutas protegidas por login de dominio @medicus.com.ar.</w:t>
       </w:r>
     </w:p>
     <w:p>
@@ -2668,21 +3184,21 @@
         <w:spacing w:after="120" w:before="280"/>
       </w:pPr>
       <w:r>
-        <w:t xml:space="preserve">12. La dependencia clave: el cruce visita → cápita</w:t>
-      </w:r>
-    </w:p>
-    <w:p>
-      <w:pPr>
-        <w:spacing w:after="120"/>
+        <w:t xml:space="preserve">11. La dependencia clave: el cruce visita → cápita</w:t>
+      </w:r>
+    </w:p>
+    <w:p>
+      <w:pPr>
+        <w:spacing w:after="110"/>
         <w:jc w:val="both"/>
       </w:pPr>
       <w:r>
-        <w:t xml:space="preserve">Para medir de punta a punta “qué visita termina siendo socio” falta un dato de plomería: estampar el mismo identificador (prospecto_id) en el momento del alta de socio.</w:t>
-      </w:r>
-    </w:p>
-    <w:p>
-      <w:pPr>
-        <w:spacing w:after="120"/>
+        <w:t xml:space="preserve">Para medir de punta a punta “qué visita termina siendo socio” falta estampar el mismo identificador (prospecto_id) en el alta de socio. Hoy el lead (Mixpanel/HubSpot) y el socio (Binary) son registros separados que no se pueden unir.</w:t>
+      </w:r>
+    </w:p>
+    <w:p>
+      <w:pPr>
+        <w:spacing w:after="110"/>
         <w:jc w:val="both"/>
       </w:pPr>
       <w:r>
@@ -2690,15 +3206,15 @@
           <w:b/>
           <w:bCs/>
         </w:rPr>
-        <w:t xml:space="preserve">La evidencia (medida en solo lectura): </w:t>
-      </w:r>
-      <w:r>
-        <w:t xml:space="preserve">en Mixpanel, los perfiles de lead (que traen hubspot_id, edad, etc.) y los de socio (que traen la vigencia) son hoy conjuntos disjuntos — no comparten ningún id en común. Las llaves para unirlos existen, pero no quedan estampadas en el registro del resultado.</w:t>
-      </w:r>
-    </w:p>
-    <w:p>
-      <w:pPr>
-        <w:spacing w:after="120"/>
+        <w:t xml:space="preserve">Qué significa: </w:t>
+      </w:r>
+      <w:r>
+        <w:t xml:space="preserve">mientras no se cierre, la conversión visita→cápita es supuesta (hoy 6%), no medida. Por eso el motor la marca como supuesto.</w:t>
+      </w:r>
+    </w:p>
+    <w:p>
+      <w:pPr>
+        <w:spacing w:after="110"/>
         <w:jc w:val="both"/>
       </w:pPr>
       <w:r>
@@ -2706,15 +3222,15 @@
           <w:b/>
           <w:bCs/>
         </w:rPr>
-        <w:t xml:space="preserve">Qué significa para el negocio: </w:t>
-      </w:r>
-      <w:r>
-        <w:t xml:space="preserve">mientras esto no se cierre, la conversión visita→cápita es modelada (supuesta, hoy 6%), no medida. Por eso el motor lo declara como supuesto y no publica una tasa que sería engañosa.</w:t>
-      </w:r>
-    </w:p>
-    <w:p>
-      <w:pPr>
-        <w:spacing w:after="120"/>
+        <w:t xml:space="preserve">De quién depende: </w:t>
+      </w:r>
+      <w:r>
+        <w:t xml:space="preserve">NO es trabajo de SysData, sino instrumentación upstream (Data/Dev). Caminos: (A) estampar el prospecto_id en el alta; (B) cruzar en el data warehouse uniendo comportamiento con la base de socios de Binary; (C) en HubSpot, asociar el deal ganado al contacto de origen.</w:t>
+      </w:r>
+    </w:p>
+    <w:p>
+      <w:pPr>
+        <w:spacing w:after="110"/>
         <w:jc w:val="both"/>
       </w:pPr>
       <w:r>
@@ -2722,26 +3238,10 @@
           <w:b/>
           <w:bCs/>
         </w:rPr>
-        <w:t xml:space="preserve">De quién depende: </w:t>
-      </w:r>
-      <w:r>
-        <w:t xml:space="preserve">NO es trabajo de SysData. Es instrumentación upstream (Data / Dev). Hay tres caminos complementarios: (A) estampar el prospecto_id en el alta de socio; (B) cruzar en el data warehouse, uniendo el comportamiento con la base de socios de Binary (que tiene la cápita confirmada); (C) en HubSpot, asociar el deal ganado al contacto de origen.</w:t>
-      </w:r>
-    </w:p>
-    <w:p>
-      <w:pPr>
-        <w:spacing w:after="120"/>
-        <w:jc w:val="both"/>
-      </w:pPr>
-      <w:r>
-        <w:rPr>
-          <w:b/>
-          <w:bCs/>
-        </w:rPr>
-        <w:t xml:space="preserve">El payoff de cerrarlo: </w:t>
-      </w:r>
-      <w:r>
-        <w:t xml:space="preserve">tasa lead→cápita real por canal y segmento, ripple a cápita medido en cada experimento, y priorización por margen real en vez de estimado. SysData ya detecta solo cuándo queda resuelto.</w:t>
+        <w:t xml:space="preserve">El payoff: </w:t>
+      </w:r>
+      <w:r>
+        <w:t xml:space="preserve">tasa lead→cápita real por canal y segmento, ripple a cápita medido, y priorización por margen real. SysData ya detecta solo cuándo queda resuelto.</w:t>
       </w:r>
     </w:p>
     <w:p>
@@ -2750,13 +3250,13 @@
         <w:spacing w:after="120" w:before="280"/>
       </w:pPr>
       <w:r>
-        <w:t xml:space="preserve">13. Estado actual y roadmap</w:t>
+        <w:t xml:space="preserve">12. Estado actual y roadmap</w:t>
       </w:r>
     </w:p>
     <w:p>
       <w:pPr>
         <w:pStyle w:val="Heading2"/>
-        <w:spacing w:after="80" w:before="180"/>
+        <w:spacing w:after="70" w:before="160"/>
       </w:pPr>
       <w:r>
         <w:t xml:space="preserve">Funcionando hoy</w:t>
@@ -2769,10 +3269,10 @@
           <w:ilvl w:val="0"/>
           <w:numId w:val="1"/>
         </w:numPr>
-        <w:spacing w:after="60"/>
-      </w:pPr>
-      <w:r>
-        <w:t xml:space="preserve">El loop completo (Resumen, Oportunidades priorizadas, Experimentos medidos, Aprendizajes) con datos en vivo de Mixpanel + HubSpot.</w:t>
+        <w:spacing w:after="50"/>
+      </w:pPr>
+      <w:r>
+        <w:t xml:space="preserve">El loop completo (Resumen, Oportunidades, Experimentos, Aprendizajes) con datos en vivo de Mixpanel + HubSpot.</w:t>
       </w:r>
     </w:p>
     <w:p>
@@ -2782,19 +3282,19 @@
           <w:ilvl w:val="0"/>
           <w:numId w:val="1"/>
         </w:numPr>
-        <w:spacing w:after="60"/>
-      </w:pPr>
-      <w:r>
-        <w:t xml:space="preserve">Las 4 capas del motor: memoria diaria, detección de quiebres + pace vs meta, score con rango (Monte Carlo) y priors que se afinan con cada experimento.</w:t>
+        <w:spacing w:after="50"/>
+      </w:pPr>
+      <w:r>
+        <w:t xml:space="preserve">Las 4 capas del motor: memoria diaria, detección, score con rango y priors que se afinan con cada experimento.</w:t>
       </w:r>
     </w:p>
     <w:p>
       <w:pPr>
         <w:pStyle w:val="Heading2"/>
-        <w:spacing w:after="80" w:before="180"/>
-      </w:pPr>
-      <w:r>
-        <w:t xml:space="preserve">Pendiente de activación</w:t>
+        <w:spacing w:after="70" w:before="160"/>
+      </w:pPr>
+      <w:r>
+        <w:t xml:space="preserve">Pendiente</w:t>
       </w:r>
     </w:p>
     <w:p>
@@ -2804,10 +3304,10 @@
           <w:ilvl w:val="0"/>
           <w:numId w:val="1"/>
         </w:numPr>
-        <w:spacing w:after="60"/>
-      </w:pPr>
-      <w:r>
-        <w:t xml:space="preserve">Integrar Binary (base de socios) para unit economics reales —LTV, churn, ARPU por plan— y como fuente de la cápita confirmada para cerrar el cruce.</w:t>
+        <w:spacing w:after="50"/>
+      </w:pPr>
+      <w:r>
+        <w:t xml:space="preserve">Integrar Binary para unit economics reales (LTV/churn) y como fuente de la cápita confirmada.</w:t>
       </w:r>
     </w:p>
     <w:p>
@@ -2817,10 +3317,19 @@
           <w:ilvl w:val="0"/>
           <w:numId w:val="1"/>
         </w:numPr>
-        <w:spacing w:after="60"/>
-      </w:pPr>
-      <w:r>
-        <w:t xml:space="preserve">Encender el proceso diario en producción (variables de entorno en Vercel + correr la migración en Supabase).</w:t>
+        <w:spacing w:after="50"/>
+      </w:pPr>
+      <w:r>
+        <w:t xml:space="preserve">Encender el proceso diario en producción y cerrar el cruce prospecto_id (upstream).</w:t>
+      </w:r>
+    </w:p>
+    <w:p>
+      <w:pPr>
+        <w:pStyle w:val="Heading2"/>
+        <w:spacing w:after="70" w:before="160"/>
+      </w:pPr>
+      <w:r>
+        <w:t xml:space="preserve">Próximo (ideas)</w:t>
       </w:r>
     </w:p>
     <w:p>
@@ -2830,19 +3339,19 @@
           <w:ilvl w:val="0"/>
           <w:numId w:val="1"/>
         </w:numPr>
-        <w:spacing w:after="60"/>
-      </w:pPr>
-      <w:r>
-        <w:t xml:space="preserve">Cerrar el cruce prospecto_id (trabajo upstream de Data / Dev).</w:t>
-      </w:r>
-    </w:p>
-    <w:p>
-      <w:pPr>
-        <w:pStyle w:val="Heading2"/>
-        <w:spacing w:after="80" w:before="180"/>
-      </w:pPr>
-      <w:r>
-        <w:t xml:space="preserve">Próximos incrementos (ideas)</w:t>
+        <w:spacing w:after="50"/>
+      </w:pPr>
+      <w:r>
+        <w:t xml:space="preserve">Brief automático del “Lunes de growth”; “Value of Information” (cuánto vale en pesos cerrar cada supuesto); tarjeta de impacto multi-moneda.</w:t>
+      </w:r>
+    </w:p>
+    <w:p>
+      <w:pPr>
+        <w:pStyle w:val="Heading1"/>
+        <w:spacing w:after="120" w:before="280"/>
+      </w:pPr>
+      <w:r>
+        <w:t xml:space="preserve">13. Principios, seguridad y restricciones</w:t>
       </w:r>
     </w:p>
     <w:p>
@@ -2852,10 +3361,17 @@
           <w:ilvl w:val="0"/>
           <w:numId w:val="1"/>
         </w:numPr>
-        <w:spacing w:after="60"/>
-      </w:pPr>
-      <w:r>
-        <w:t xml:space="preserve">Brief automático del “Lunes de growth” (resumen redactado y enviado solo).</w:t>
+        <w:spacing w:after="50"/>
+      </w:pPr>
+      <w:r>
+        <w:rPr>
+          <w:b/>
+          <w:bCs/>
+        </w:rPr>
+        <w:t xml:space="preserve">Solo lectura</w:t>
+      </w:r>
+      <w:r>
+        <w:t xml:space="preserve"> sobre sistemas productivos (Mixpanel, HubSpot, Binary).</w:t>
       </w:r>
     </w:p>
     <w:p>
@@ -2865,10 +3381,17 @@
           <w:ilvl w:val="0"/>
           <w:numId w:val="1"/>
         </w:numPr>
-        <w:spacing w:after="60"/>
-      </w:pPr>
-      <w:r>
-        <w:t xml:space="preserve">“Value of Information”: ponerle precio en pesos a cerrar cada supuesto (ej. cuánto vale cerrar el cruce).</w:t>
+        <w:spacing w:after="50"/>
+      </w:pPr>
+      <w:r>
+        <w:rPr>
+          <w:b/>
+          <w:bCs/>
+        </w:rPr>
+        <w:t xml:space="preserve">Honestidad</w:t>
+      </w:r>
+      <w:r>
+        <w:t xml:space="preserve">: medido vs supuesto siempre explícito.</w:t>
       </w:r>
     </w:p>
     <w:p>
@@ -2878,19 +3401,17 @@
           <w:ilvl w:val="0"/>
           <w:numId w:val="1"/>
         </w:numPr>
-        <w:spacing w:after="60"/>
-      </w:pPr>
-      <w:r>
-        <w:t xml:space="preserve">Tarjeta de impacto multi-moneda (plata, tiempo, confianza, reputación) y optimizador de sprint.</w:t>
-      </w:r>
-    </w:p>
-    <w:p>
-      <w:pPr>
-        <w:pStyle w:val="Heading1"/>
-        <w:spacing w:after="120" w:before="280"/>
-      </w:pPr>
-      <w:r>
-        <w:t xml:space="preserve">14. Principios, seguridad y restricciones</w:t>
+        <w:spacing w:after="50"/>
+      </w:pPr>
+      <w:r>
+        <w:rPr>
+          <w:b/>
+          <w:bCs/>
+        </w:rPr>
+        <w:t xml:space="preserve">Herramienta de equipo</w:t>
+      </w:r>
+      <w:r>
+        <w:t xml:space="preserve">: estado compartido y persistente.</w:t>
       </w:r>
     </w:p>
     <w:p>
@@ -2900,77 +3421,17 @@
           <w:ilvl w:val="0"/>
           <w:numId w:val="1"/>
         </w:numPr>
-        <w:spacing w:after="60"/>
+        <w:spacing w:after="50"/>
       </w:pPr>
       <w:r>
         <w:rPr>
           <w:b/>
           <w:bCs/>
         </w:rPr>
-        <w:t xml:space="preserve">Solo lectura</w:t>
-      </w:r>
-      <w:r>
-        <w:t xml:space="preserve"> sobre sistemas productivos (Mixpanel, HubSpot, Binary). Nunca crear, editar ni borrar nada.</w:t>
-      </w:r>
-    </w:p>
-    <w:p>
-      <w:pPr>
-        <w:pStyle w:val="ListParagraph"/>
-        <w:numPr>
-          <w:ilvl w:val="0"/>
-          <w:numId w:val="1"/>
-        </w:numPr>
-        <w:spacing w:after="60"/>
-      </w:pPr>
-      <w:r>
-        <w:rPr>
-          <w:b/>
-          <w:bCs/>
-        </w:rPr>
-        <w:t xml:space="preserve">Honestidad</w:t>
-      </w:r>
-      <w:r>
-        <w:t xml:space="preserve">: medido vs supuesto siempre explícito; cada número muestra su fuente.</w:t>
-      </w:r>
-    </w:p>
-    <w:p>
-      <w:pPr>
-        <w:pStyle w:val="ListParagraph"/>
-        <w:numPr>
-          <w:ilvl w:val="0"/>
-          <w:numId w:val="1"/>
-        </w:numPr>
-        <w:spacing w:after="60"/>
-      </w:pPr>
-      <w:r>
-        <w:rPr>
-          <w:b/>
-          <w:bCs/>
-        </w:rPr>
-        <w:t xml:space="preserve">Herramienta de equipo</w:t>
-      </w:r>
-      <w:r>
-        <w:t xml:space="preserve">: estado compartido y persistente, no un archivo personal.</w:t>
-      </w:r>
-    </w:p>
-    <w:p>
-      <w:pPr>
-        <w:pStyle w:val="ListParagraph"/>
-        <w:numPr>
-          <w:ilvl w:val="0"/>
-          <w:numId w:val="1"/>
-        </w:numPr>
-        <w:spacing w:after="60"/>
-      </w:pPr>
-      <w:r>
-        <w:rPr>
-          <w:b/>
-          <w:bCs/>
-        </w:rPr>
         <w:t xml:space="preserve">Seguridad</w:t>
       </w:r>
       <w:r>
-        <w:t xml:space="preserve">: tokens server-side, acceso por login de dominio Medicus, secretos fuera del repositorio.</w:t>
+        <w:t xml:space="preserve">: tokens server-side, acceso por login de dominio Medicus.</w:t>
       </w:r>
     </w:p>
     <w:p>
@@ -2979,7 +3440,7 @@
         <w:spacing w:after="120" w:before="280"/>
       </w:pPr>
       <w:r>
-        <w:t xml:space="preserve">15. Glosario</w:t>
+        <w:t xml:space="preserve">14. Glosario</w:t>
       </w:r>
     </w:p>
     <w:tbl>
@@ -3009,9 +3470,9 @@
             <w:tcW w:type="dxa" w:w="2046"/>
             <w:shd w:fill="0E2E52" w:color="auto" w:val="clear"/>
             <w:tcMar>
-              <w:top w:type="dxa" w:w="80"/>
-              <w:left w:type="dxa" w:w="130"/>
-              <w:bottom w:type="dxa" w:w="80"/>
+              <w:top w:type="dxa" w:w="70"/>
+              <w:left w:type="dxa" w:w="130"/>
+              <w:bottom w:type="dxa" w:w="70"/>
               <w:right w:type="dxa" w:w="130"/>
             </w:tcMar>
             <w:vAlign w:val="center"/>
@@ -3037,9 +3498,9 @@
             <w:tcW w:type="dxa" w:w="7254"/>
             <w:shd w:fill="0E2E52" w:color="auto" w:val="clear"/>
             <w:tcMar>
-              <w:top w:type="dxa" w:w="80"/>
-              <w:left w:type="dxa" w:w="130"/>
-              <w:bottom w:type="dxa" w:w="80"/>
+              <w:top w:type="dxa" w:w="70"/>
+              <w:left w:type="dxa" w:w="130"/>
+              <w:bottom w:type="dxa" w:w="70"/>
               <w:right w:type="dxa" w:w="130"/>
             </w:tcMar>
             <w:vAlign w:val="center"/>
@@ -3069,9 +3530,9 @@
           <w:tcPr>
             <w:tcW w:type="dxa" w:w="2046"/>
             <w:tcMar>
-              <w:top w:type="dxa" w:w="80"/>
-              <w:left w:type="dxa" w:w="130"/>
-              <w:bottom w:type="dxa" w:w="80"/>
+              <w:top w:type="dxa" w:w="70"/>
+              <w:left w:type="dxa" w:w="130"/>
+              <w:bottom w:type="dxa" w:w="70"/>
               <w:right w:type="dxa" w:w="130"/>
             </w:tcMar>
             <w:vAlign w:val="center"/>
@@ -3095,9 +3556,9 @@
           <w:tcPr>
             <w:tcW w:type="dxa" w:w="7254"/>
             <w:tcMar>
-              <w:top w:type="dxa" w:w="80"/>
-              <w:left w:type="dxa" w:w="130"/>
-              <w:bottom w:type="dxa" w:w="80"/>
+              <w:top w:type="dxa" w:w="70"/>
+              <w:left w:type="dxa" w:w="130"/>
+              <w:bottom w:type="dxa" w:w="70"/>
               <w:right w:type="dxa" w:w="130"/>
             </w:tcMar>
             <w:vAlign w:val="center"/>
@@ -3113,7 +3574,7 @@
                 <w:sz w:val="20"/>
                 <w:szCs w:val="20"/>
               </w:rPr>
-              <w:t xml:space="preserve">La base de datos de socios de Medicus (asociados, medicards, planes, coberturas, vigencias y bajas). Fuente de verdad de los unit economics reales y de la cápita confirmada.</w:t>
+              <w:t xml:space="preserve">La base de socios de Medicus (asociados, medicards, planes, vigencias, bajas). Fuente de verdad de los unit economics reales.</w:t>
             </w:r>
           </w:p>
         </w:tc>
@@ -3127,9 +3588,9 @@
             <w:tcW w:type="dxa" w:w="2046"/>
             <w:shd w:fill="F2F5F8" w:color="auto" w:val="clear"/>
             <w:tcMar>
-              <w:top w:type="dxa" w:w="80"/>
-              <w:left w:type="dxa" w:w="130"/>
-              <w:bottom w:type="dxa" w:w="80"/>
+              <w:top w:type="dxa" w:w="70"/>
+              <w:left w:type="dxa" w:w="130"/>
+              <w:bottom w:type="dxa" w:w="70"/>
               <w:right w:type="dxa" w:w="130"/>
             </w:tcMar>
             <w:vAlign w:val="center"/>
@@ -3154,9 +3615,9 @@
             <w:tcW w:type="dxa" w:w="7254"/>
             <w:shd w:fill="F2F5F8" w:color="auto" w:val="clear"/>
             <w:tcMar>
-              <w:top w:type="dxa" w:w="80"/>
-              <w:left w:type="dxa" w:w="130"/>
-              <w:bottom w:type="dxa" w:w="80"/>
+              <w:top w:type="dxa" w:w="70"/>
+              <w:left w:type="dxa" w:w="130"/>
+              <w:bottom w:type="dxa" w:w="70"/>
               <w:right w:type="dxa" w:w="130"/>
             </w:tcMar>
             <w:vAlign w:val="center"/>
@@ -3172,7 +3633,7 @@
                 <w:sz w:val="20"/>
                 <w:szCs w:val="20"/>
               </w:rPr>
-              <w:t xml:space="preserve">Un socio activo. Es el resultado final del negocio que SysData busca aumentar.</w:t>
+              <w:t xml:space="preserve">Un socio activo. El resultado de negocio que SysData busca aumentar.</w:t>
             </w:r>
           </w:p>
         </w:tc>
@@ -3185,9 +3646,9 @@
           <w:tcPr>
             <w:tcW w:type="dxa" w:w="2046"/>
             <w:tcMar>
-              <w:top w:type="dxa" w:w="80"/>
-              <w:left w:type="dxa" w:w="130"/>
-              <w:bottom w:type="dxa" w:w="80"/>
+              <w:top w:type="dxa" w:w="70"/>
+              <w:left w:type="dxa" w:w="130"/>
+              <w:bottom w:type="dxa" w:w="70"/>
               <w:right w:type="dxa" w:w="130"/>
             </w:tcMar>
             <w:vAlign w:val="center"/>
@@ -3211,9 +3672,9 @@
           <w:tcPr>
             <w:tcW w:type="dxa" w:w="7254"/>
             <w:tcMar>
-              <w:top w:type="dxa" w:w="80"/>
-              <w:left w:type="dxa" w:w="130"/>
-              <w:bottom w:type="dxa" w:w="80"/>
+              <w:top w:type="dxa" w:w="70"/>
+              <w:left w:type="dxa" w:w="130"/>
+              <w:bottom w:type="dxa" w:w="70"/>
               <w:right w:type="dxa" w:w="130"/>
             </w:tcMar>
             <w:vAlign w:val="center"/>
@@ -3229,7 +3690,7 @@
                 <w:sz w:val="20"/>
                 <w:szCs w:val="20"/>
               </w:rPr>
-              <w:t xml:space="preserve">Un lead que dejó sus datos en el cotizador (paso clave del funnel de adquisición).</w:t>
+              <w:t xml:space="preserve">Un lead que dejó sus datos en el cotizador.</w:t>
             </w:r>
           </w:p>
         </w:tc>
@@ -3243,9 +3704,9 @@
             <w:tcW w:type="dxa" w:w="2046"/>
             <w:shd w:fill="F2F5F8" w:color="auto" w:val="clear"/>
             <w:tcMar>
-              <w:top w:type="dxa" w:w="80"/>
-              <w:left w:type="dxa" w:w="130"/>
-              <w:bottom w:type="dxa" w:w="80"/>
+              <w:top w:type="dxa" w:w="70"/>
+              <w:left w:type="dxa" w:w="130"/>
+              <w:bottom w:type="dxa" w:w="70"/>
               <w:right w:type="dxa" w:w="130"/>
             </w:tcMar>
             <w:vAlign w:val="center"/>
@@ -3261,7 +3722,7 @@
                 <w:sz w:val="20"/>
                 <w:szCs w:val="20"/>
               </w:rPr>
-              <w:t xml:space="preserve">Funnel / embudo</w:t>
+              <w:t xml:space="preserve">Fuga (leak)</w:t>
             </w:r>
           </w:p>
         </w:tc>
@@ -3270,9 +3731,9 @@
             <w:tcW w:type="dxa" w:w="7254"/>
             <w:shd w:fill="F2F5F8" w:color="auto" w:val="clear"/>
             <w:tcMar>
-              <w:top w:type="dxa" w:w="80"/>
-              <w:left w:type="dxa" w:w="130"/>
-              <w:bottom w:type="dxa" w:w="80"/>
+              <w:top w:type="dxa" w:w="70"/>
+              <w:left w:type="dxa" w:w="130"/>
+              <w:bottom w:type="dxa" w:w="70"/>
               <w:right w:type="dxa" w:w="130"/>
             </w:tcMar>
             <w:vAlign w:val="center"/>
@@ -3288,7 +3749,7 @@
                 <w:sz w:val="20"/>
                 <w:szCs w:val="20"/>
               </w:rPr>
-              <w:t xml:space="preserve">La secuencia de pasos que recorre un usuario (visita → datos → cotización → alta).</w:t>
+              <w:t xml:space="preserve">El paso donde más gente se cae; SysData la mide en personas y en plata.</w:t>
             </w:r>
           </w:p>
         </w:tc>
@@ -3301,9 +3762,9 @@
           <w:tcPr>
             <w:tcW w:type="dxa" w:w="2046"/>
             <w:tcMar>
-              <w:top w:type="dxa" w:w="80"/>
-              <w:left w:type="dxa" w:w="130"/>
-              <w:bottom w:type="dxa" w:w="80"/>
+              <w:top w:type="dxa" w:w="70"/>
+              <w:left w:type="dxa" w:w="130"/>
+              <w:bottom w:type="dxa" w:w="70"/>
               <w:right w:type="dxa" w:w="130"/>
             </w:tcMar>
             <w:vAlign w:val="center"/>
@@ -3319,7 +3780,7 @@
                 <w:sz w:val="20"/>
                 <w:szCs w:val="20"/>
               </w:rPr>
-              <w:t xml:space="preserve">Fuga (leak)</w:t>
+              <w:t xml:space="preserve">Trazabilidad</w:t>
             </w:r>
           </w:p>
         </w:tc>
@@ -3327,9 +3788,9 @@
           <w:tcPr>
             <w:tcW w:type="dxa" w:w="7254"/>
             <w:tcMar>
-              <w:top w:type="dxa" w:w="80"/>
-              <w:left w:type="dxa" w:w="130"/>
-              <w:bottom w:type="dxa" w:w="80"/>
+              <w:top w:type="dxa" w:w="70"/>
+              <w:left w:type="dxa" w:w="130"/>
+              <w:bottom w:type="dxa" w:w="70"/>
               <w:right w:type="dxa" w:w="130"/>
             </w:tcMar>
             <w:vAlign w:val="center"/>
@@ -3345,7 +3806,7 @@
                 <w:sz w:val="20"/>
                 <w:szCs w:val="20"/>
               </w:rPr>
-              <w:t xml:space="preserve">El paso donde más gente se cae. SysData la mide en personas y en plata.</w:t>
+              <w:t xml:space="preserve">Que cada decisión quede enlazada de punta a punta: oportunidad → experimento → medición → aprendizaje.</w:t>
             </w:r>
           </w:p>
         </w:tc>
@@ -3359,9 +3820,9 @@
             <w:tcW w:type="dxa" w:w="2046"/>
             <w:shd w:fill="F2F5F8" w:color="auto" w:val="clear"/>
             <w:tcMar>
-              <w:top w:type="dxa" w:w="80"/>
-              <w:left w:type="dxa" w:w="130"/>
-              <w:bottom w:type="dxa" w:w="80"/>
+              <w:top w:type="dxa" w:w="70"/>
+              <w:left w:type="dxa" w:w="130"/>
+              <w:bottom w:type="dxa" w:w="70"/>
               <w:right w:type="dxa" w:w="130"/>
             </w:tcMar>
             <w:vAlign w:val="center"/>
@@ -3386,9 +3847,9 @@
             <w:tcW w:type="dxa" w:w="7254"/>
             <w:shd w:fill="F2F5F8" w:color="auto" w:val="clear"/>
             <w:tcMar>
-              <w:top w:type="dxa" w:w="80"/>
-              <w:left w:type="dxa" w:w="130"/>
-              <w:bottom w:type="dxa" w:w="80"/>
+              <w:top w:type="dxa" w:w="70"/>
+              <w:left w:type="dxa" w:w="130"/>
+              <w:bottom w:type="dxa" w:w="70"/>
               <w:right w:type="dxa" w:w="130"/>
             </w:tcMar>
             <w:vAlign w:val="center"/>
@@ -3404,7 +3865,7 @@
                 <w:sz w:val="20"/>
                 <w:szCs w:val="20"/>
               </w:rPr>
-              <w:t xml:space="preserve">Porcentaje de deals comerciales que se cierran (ganados / decididos), en HubSpot.</w:t>
+              <w:t xml:space="preserve">Porcentaje de deals comerciales que se cierran (en HubSpot).</w:t>
             </w:r>
           </w:p>
         </w:tc>
@@ -3417,9 +3878,9 @@
           <w:tcPr>
             <w:tcW w:type="dxa" w:w="2046"/>
             <w:tcMar>
-              <w:top w:type="dxa" w:w="80"/>
-              <w:left w:type="dxa" w:w="130"/>
-              <w:bottom w:type="dxa" w:w="80"/>
+              <w:top w:type="dxa" w:w="70"/>
+              <w:left w:type="dxa" w:w="130"/>
+              <w:bottom w:type="dxa" w:w="70"/>
               <w:right w:type="dxa" w:w="130"/>
             </w:tcMar>
             <w:vAlign w:val="center"/>
@@ -3443,9 +3904,9 @@
           <w:tcPr>
             <w:tcW w:type="dxa" w:w="7254"/>
             <w:tcMar>
-              <w:top w:type="dxa" w:w="80"/>
-              <w:left w:type="dxa" w:w="130"/>
-              <w:bottom w:type="dxa" w:w="80"/>
+              <w:top w:type="dxa" w:w="70"/>
+              <w:left w:type="dxa" w:w="130"/>
+              <w:bottom w:type="dxa" w:w="70"/>
               <w:right w:type="dxa" w:w="130"/>
             </w:tcMar>
             <w:vAlign w:val="center"/>
@@ -3461,7 +3922,7 @@
                 <w:sz w:val="20"/>
                 <w:szCs w:val="20"/>
               </w:rPr>
-              <w:t xml:space="preserve">Valor de contribución de una cápita a lo largo de su permanencia (ARPU × meses × margen). Hoy estimado con supuestos; con Binary, medido con permanencia y ARPU reales.</w:t>
+              <w:t xml:space="preserve">Valor de contribución de una cápita en su permanencia (ARPU × meses × margen). Hoy supuesto; con Binary, real.</w:t>
             </w:r>
           </w:p>
         </w:tc>
@@ -3475,9 +3936,9 @@
             <w:tcW w:type="dxa" w:w="2046"/>
             <w:shd w:fill="F2F5F8" w:color="auto" w:val="clear"/>
             <w:tcMar>
-              <w:top w:type="dxa" w:w="80"/>
-              <w:left w:type="dxa" w:w="130"/>
-              <w:bottom w:type="dxa" w:w="80"/>
+              <w:top w:type="dxa" w:w="70"/>
+              <w:left w:type="dxa" w:w="130"/>
+              <w:bottom w:type="dxa" w:w="70"/>
               <w:right w:type="dxa" w:w="130"/>
             </w:tcMar>
             <w:vAlign w:val="center"/>
@@ -3502,9 +3963,9 @@
             <w:tcW w:type="dxa" w:w="7254"/>
             <w:shd w:fill="F2F5F8" w:color="auto" w:val="clear"/>
             <w:tcMar>
-              <w:top w:type="dxa" w:w="80"/>
-              <w:left w:type="dxa" w:w="130"/>
-              <w:bottom w:type="dxa" w:w="80"/>
+              <w:top w:type="dxa" w:w="70"/>
+              <w:left w:type="dxa" w:w="130"/>
+              <w:bottom w:type="dxa" w:w="70"/>
               <w:right w:type="dxa" w:w="130"/>
             </w:tcMar>
             <w:vAlign w:val="center"/>
@@ -3533,9 +3994,9 @@
           <w:tcPr>
             <w:tcW w:type="dxa" w:w="2046"/>
             <w:tcMar>
-              <w:top w:type="dxa" w:w="80"/>
-              <w:left w:type="dxa" w:w="130"/>
-              <w:bottom w:type="dxa" w:w="80"/>
+              <w:top w:type="dxa" w:w="70"/>
+              <w:left w:type="dxa" w:w="130"/>
+              <w:bottom w:type="dxa" w:w="70"/>
               <w:right w:type="dxa" w:w="130"/>
             </w:tcMar>
             <w:vAlign w:val="center"/>
@@ -3551,7 +4012,7 @@
                 <w:sz w:val="20"/>
                 <w:szCs w:val="20"/>
               </w:rPr>
-              <w:t xml:space="preserve">ARPU</w:t>
+              <w:t xml:space="preserve">prospecto_id</w:t>
             </w:r>
           </w:p>
         </w:tc>
@@ -3559,9 +4020,9 @@
           <w:tcPr>
             <w:tcW w:type="dxa" w:w="7254"/>
             <w:tcMar>
-              <w:top w:type="dxa" w:w="80"/>
-              <w:left w:type="dxa" w:w="130"/>
-              <w:bottom w:type="dxa" w:w="80"/>
+              <w:top w:type="dxa" w:w="70"/>
+              <w:left w:type="dxa" w:w="130"/>
+              <w:bottom w:type="dxa" w:w="70"/>
               <w:right w:type="dxa" w:w="130"/>
             </w:tcMar>
             <w:vAlign w:val="center"/>
@@ -3577,7 +4038,7 @@
                 <w:sz w:val="20"/>
                 <w:szCs w:val="20"/>
               </w:rPr>
-              <w:t xml:space="preserve">Ingreso promedio mensual por socio (real, por plan, desde Binary).</w:t>
+              <w:t xml:space="preserve">El identificador que uniría el comportamiento (Mixpanel) con la cápita (HubSpot/Binary).</w:t>
             </w:r>
           </w:p>
         </w:tc>
@@ -3591,9 +4052,9 @@
             <w:tcW w:type="dxa" w:w="2046"/>
             <w:shd w:fill="F2F5F8" w:color="auto" w:val="clear"/>
             <w:tcMar>
-              <w:top w:type="dxa" w:w="80"/>
-              <w:left w:type="dxa" w:w="130"/>
-              <w:bottom w:type="dxa" w:w="80"/>
+              <w:top w:type="dxa" w:w="70"/>
+              <w:left w:type="dxa" w:w="130"/>
+              <w:bottom w:type="dxa" w:w="70"/>
               <w:right w:type="dxa" w:w="130"/>
             </w:tcMar>
             <w:vAlign w:val="center"/>
@@ -3609,7 +4070,7 @@
                 <w:sz w:val="20"/>
                 <w:szCs w:val="20"/>
               </w:rPr>
-              <w:t xml:space="preserve">prospecto_id</w:t>
+              <w:t xml:space="preserve">Prior</w:t>
             </w:r>
           </w:p>
         </w:tc>
@@ -3618,9 +4079,9 @@
             <w:tcW w:type="dxa" w:w="7254"/>
             <w:shd w:fill="F2F5F8" w:color="auto" w:val="clear"/>
             <w:tcMar>
-              <w:top w:type="dxa" w:w="80"/>
-              <w:left w:type="dxa" w:w="130"/>
-              <w:bottom w:type="dxa" w:w="80"/>
+              <w:top w:type="dxa" w:w="70"/>
+              <w:left w:type="dxa" w:w="130"/>
+              <w:bottom w:type="dxa" w:w="70"/>
               <w:right w:type="dxa" w:w="130"/>
             </w:tcMar>
             <w:vAlign w:val="center"/>
@@ -3636,7 +4097,7 @@
                 <w:sz w:val="20"/>
                 <w:szCs w:val="20"/>
               </w:rPr>
-              <w:t xml:space="preserve">El identificador que permitiría unir el comportamiento (Mixpanel) con la cápita (HubSpot / Binary).</w:t>
+              <w:t xml:space="preserve">Lo aprendido de experimentos pasados; el motor lo usa para estimar mejor.</w:t>
             </w:r>
           </w:p>
         </w:tc>
@@ -3649,9 +4110,9 @@
           <w:tcPr>
             <w:tcW w:type="dxa" w:w="2046"/>
             <w:tcMar>
-              <w:top w:type="dxa" w:w="80"/>
-              <w:left w:type="dxa" w:w="130"/>
-              <w:bottom w:type="dxa" w:w="80"/>
+              <w:top w:type="dxa" w:w="70"/>
+              <w:left w:type="dxa" w:w="130"/>
+              <w:bottom w:type="dxa" w:w="70"/>
               <w:right w:type="dxa" w:w="130"/>
             </w:tcMar>
             <w:vAlign w:val="center"/>
@@ -3667,7 +4128,7 @@
                 <w:sz w:val="20"/>
                 <w:szCs w:val="20"/>
               </w:rPr>
-              <w:t xml:space="preserve">Prior</w:t>
+              <w:t xml:space="preserve">Significancia</w:t>
             </w:r>
           </w:p>
         </w:tc>
@@ -3675,9 +4136,9 @@
           <w:tcPr>
             <w:tcW w:type="dxa" w:w="7254"/>
             <w:tcMar>
-              <w:top w:type="dxa" w:w="80"/>
-              <w:left w:type="dxa" w:w="130"/>
-              <w:bottom w:type="dxa" w:w="80"/>
+              <w:top w:type="dxa" w:w="70"/>
+              <w:left w:type="dxa" w:w="130"/>
+              <w:bottom w:type="dxa" w:w="70"/>
               <w:right w:type="dxa" w:w="130"/>
             </w:tcMar>
             <w:vAlign w:val="center"/>
@@ -3693,7 +4154,7 @@
                 <w:sz w:val="20"/>
                 <w:szCs w:val="20"/>
               </w:rPr>
-              <w:t xml:space="preserve">Lo aprendido de experimentos pasados; el motor lo usa para estimar mejor (ej. cuánto de una fuga se recupera de verdad).</w:t>
+              <w:t xml:space="preserve">Que un resultado supere el ruido estadístico; sin ella, no es resultado.</w:t>
             </w:r>
           </w:p>
         </w:tc>
@@ -3707,9 +4168,9 @@
             <w:tcW w:type="dxa" w:w="2046"/>
             <w:shd w:fill="F2F5F8" w:color="auto" w:val="clear"/>
             <w:tcMar>
-              <w:top w:type="dxa" w:w="80"/>
-              <w:left w:type="dxa" w:w="130"/>
-              <w:bottom w:type="dxa" w:w="80"/>
+              <w:top w:type="dxa" w:w="70"/>
+              <w:left w:type="dxa" w:w="130"/>
+              <w:bottom w:type="dxa" w:w="70"/>
               <w:right w:type="dxa" w:w="130"/>
             </w:tcMar>
             <w:vAlign w:val="center"/>
@@ -3725,7 +4186,7 @@
                 <w:sz w:val="20"/>
                 <w:szCs w:val="20"/>
               </w:rPr>
-              <w:t xml:space="preserve">Snapshot</w:t>
+              <w:t xml:space="preserve">Data warehouse</w:t>
             </w:r>
           </w:p>
         </w:tc>
@@ -3734,9 +4195,9 @@
             <w:tcW w:type="dxa" w:w="7254"/>
             <w:shd w:fill="F2F5F8" w:color="auto" w:val="clear"/>
             <w:tcMar>
-              <w:top w:type="dxa" w:w="80"/>
-              <w:left w:type="dxa" w:w="130"/>
-              <w:bottom w:type="dxa" w:w="80"/>
+              <w:top w:type="dxa" w:w="70"/>
+              <w:left w:type="dxa" w:w="130"/>
+              <w:bottom w:type="dxa" w:w="70"/>
               <w:right w:type="dxa" w:w="130"/>
             </w:tcMar>
             <w:vAlign w:val="center"/>
@@ -3752,123 +4213,7 @@
                 <w:sz w:val="20"/>
                 <w:szCs w:val="20"/>
               </w:rPr>
-              <w:t xml:space="preserve">La foto diaria de los datos que guarda la capa de Memoria.</w:t>
-            </w:r>
-          </w:p>
-        </w:tc>
-      </w:tr>
-      <w:tr>
-        <w:trPr>
-          <w:cantSplit/>
-        </w:trPr>
-        <w:tc>
-          <w:tcPr>
-            <w:tcW w:type="dxa" w:w="2046"/>
-            <w:tcMar>
-              <w:top w:type="dxa" w:w="80"/>
-              <w:left w:type="dxa" w:w="130"/>
-              <w:bottom w:type="dxa" w:w="80"/>
-              <w:right w:type="dxa" w:w="130"/>
-            </w:tcMar>
-            <w:vAlign w:val="center"/>
-          </w:tcPr>
-          <w:p>
-            <w:pPr>
-              <w:spacing w:after="0"/>
-            </w:pPr>
-            <w:r>
-              <w:rPr>
-                <w:b/>
-                <w:bCs/>
-                <w:sz w:val="20"/>
-                <w:szCs w:val="20"/>
-              </w:rPr>
-              <w:t xml:space="preserve">Guardrail</w:t>
-            </w:r>
-          </w:p>
-        </w:tc>
-        <w:tc>
-          <w:tcPr>
-            <w:tcW w:type="dxa" w:w="7254"/>
-            <w:tcMar>
-              <w:top w:type="dxa" w:w="80"/>
-              <w:left w:type="dxa" w:w="130"/>
-              <w:bottom w:type="dxa" w:w="80"/>
-              <w:right w:type="dxa" w:w="130"/>
-            </w:tcMar>
-            <w:vAlign w:val="center"/>
-          </w:tcPr>
-          <w:p>
-            <w:pPr>
-              <w:spacing w:after="0"/>
-            </w:pPr>
-            <w:r>
-              <w:rPr>
-                <w:b w:val="false"/>
-                <w:bCs w:val="false"/>
-                <w:sz w:val="20"/>
-                <w:szCs w:val="20"/>
-              </w:rPr>
-              <w:t xml:space="preserve">Un chequeo de seguridad: que una mejora no rompa otra métrica.</w:t>
-            </w:r>
-          </w:p>
-        </w:tc>
-      </w:tr>
-      <w:tr>
-        <w:trPr>
-          <w:cantSplit/>
-        </w:trPr>
-        <w:tc>
-          <w:tcPr>
-            <w:tcW w:type="dxa" w:w="2046"/>
-            <w:shd w:fill="F2F5F8" w:color="auto" w:val="clear"/>
-            <w:tcMar>
-              <w:top w:type="dxa" w:w="80"/>
-              <w:left w:type="dxa" w:w="130"/>
-              <w:bottom w:type="dxa" w:w="80"/>
-              <w:right w:type="dxa" w:w="130"/>
-            </w:tcMar>
-            <w:vAlign w:val="center"/>
-          </w:tcPr>
-          <w:p>
-            <w:pPr>
-              <w:spacing w:after="0"/>
-            </w:pPr>
-            <w:r>
-              <w:rPr>
-                <w:b/>
-                <w:bCs/>
-                <w:sz w:val="20"/>
-                <w:szCs w:val="20"/>
-              </w:rPr>
-              <w:t xml:space="preserve">Significancia</w:t>
-            </w:r>
-          </w:p>
-        </w:tc>
-        <w:tc>
-          <w:tcPr>
-            <w:tcW w:type="dxa" w:w="7254"/>
-            <w:shd w:fill="F2F5F8" w:color="auto" w:val="clear"/>
-            <w:tcMar>
-              <w:top w:type="dxa" w:w="80"/>
-              <w:left w:type="dxa" w:w="130"/>
-              <w:bottom w:type="dxa" w:w="80"/>
-              <w:right w:type="dxa" w:w="130"/>
-            </w:tcMar>
-            <w:vAlign w:val="center"/>
-          </w:tcPr>
-          <w:p>
-            <w:pPr>
-              <w:spacing w:after="0"/>
-            </w:pPr>
-            <w:r>
-              <w:rPr>
-                <w:b w:val="false"/>
-                <w:bCs w:val="false"/>
-                <w:sz w:val="20"/>
-                <w:szCs w:val="20"/>
-              </w:rPr>
-              <w:t xml:space="preserve">Que un resultado supere el ruido estadístico; sin ella, no es un resultado.</w:t>
+              <w:t xml:space="preserve">Repositorio central que copia datos crudos de muchas fuentes para análisis. SysData no es uno: lo consumiría.</w:t>
             </w:r>
           </w:p>
         </w:tc>

</xml_diff>

<commit_message>
docs(v2.1): trazabilidad = completitud de datos; sacar stack/deployment
- Reformulado el dolor de 'trazabilidad': contactos de HubSpot vacíos porque los asesores
  cargan en prospectos/Binary; cruzando las fuentes por persona se completan -> mucho mayor
  % de datos completos para segmentar/analizar. Sumado también como payoff del cruce.
- Eliminada la sección de Stack técnico y los detalles de deployment (los define dev).
</commit_message>
<xml_diff>
--- a/SysData-Documentacion.docx
+++ b/SysData-Documentacion.docx
@@ -43,7 +43,7 @@
           <w:sz w:val="26"/>
           <w:szCs w:val="26"/>
         </w:rPr>
-        <w:t xml:space="preserve">Documentación de producto y arquitectura</w:t>
+        <w:t xml:space="preserve">Documentación de producto</w:t>
       </w:r>
     </w:p>
     <w:p>
@@ -85,7 +85,7 @@
         <w:rPr>
           <w:color w:val="5B6B7F"/>
         </w:rPr>
-        <w:t xml:space="preserve">Versión 2.0 · 22 de junio de 2026</w:t>
+        <w:t xml:space="preserve">Versión 2.1 · 22 de junio de 2026</w:t>
       </w:r>
     </w:p>
     <w:p>
@@ -179,7 +179,7 @@
         <w:spacing w:after="36"/>
       </w:pPr>
       <w:r>
-        <w:t xml:space="preserve">10. Stack técnico</w:t>
+        <w:t xml:space="preserve">10. La dependencia clave: el cruce visita → cápita</w:t>
       </w:r>
     </w:p>
     <w:p>
@@ -187,7 +187,7 @@
         <w:spacing w:after="36"/>
       </w:pPr>
       <w:r>
-        <w:t xml:space="preserve">11. La dependencia clave: el cruce visita → cápita</w:t>
+        <w:t xml:space="preserve">11. Estado actual y roadmap</w:t>
       </w:r>
     </w:p>
     <w:p>
@@ -195,7 +195,7 @@
         <w:spacing w:after="36"/>
       </w:pPr>
       <w:r>
-        <w:t xml:space="preserve">12. Estado actual y roadmap</w:t>
+        <w:t xml:space="preserve">12. Principios y restricciones</w:t>
       </w:r>
     </w:p>
     <w:p>
@@ -203,15 +203,7 @@
         <w:spacing w:after="36"/>
       </w:pPr>
       <w:r>
-        <w:t xml:space="preserve">13. Principios, seguridad y restricciones</w:t>
-      </w:r>
-    </w:p>
-    <w:p>
-      <w:pPr>
-        <w:spacing w:after="36"/>
-      </w:pPr>
-      <w:r>
-        <w:t xml:space="preserve">14. Glosario</w:t>
+        <w:t xml:space="preserve">13. Glosario</w:t>
       </w:r>
     </w:p>
     <w:p>
@@ -243,7 +235,7 @@
         <w:jc w:val="both"/>
       </w:pPr>
       <w:r>
-        <w:t xml:space="preserve">El objetivo, en concreto: que el equipo sepa en minutos qué está mal, qué mejorar primero (priorizado por plata, no por intuición), por qué lo dice (con la evidencia y los supuestos a la vista) y si lo que probó funcionó (con rigor estadístico). Cada experimento que se cierra queda registrado y vuelve al motor como aprendizaje: es mejora continua, no un dashboard estático.</w:t>
+        <w:t xml:space="preserve">El objetivo, en concreto: que el equipo sepa en minutos qué está mal, qué mejorar primero (priorizado por plata, no por intuición), por qué lo dice (con la evidencia y los supuestos a la vista) y si lo que probó funcionó (con rigor estadístico). Cada experimento que se cierra vuelve al motor como aprendizaje: es mejora continua, no un dashboard estático.</w:t>
       </w:r>
     </w:p>
     <w:p>
@@ -260,7 +252,7 @@
           <w:iCs/>
           <w:color w:val="0E2E52"/>
         </w:rPr>
-        <w:t xml:space="preserve">En una línea: convierte datos dispersos en decisiones de growth priorizadas por plata, con la evidencia, la trazabilidad y la honestidad a la vista.</w:t>
+        <w:t xml:space="preserve">En una línea: convierte datos dispersos en decisiones de growth priorizadas por plata, con la evidencia y la honestidad a la vista.</w:t>
       </w:r>
     </w:p>
     <w:p>
@@ -278,7 +270,7 @@
         <w:jc w:val="both"/>
       </w:pPr>
       <w:r>
-        <w:t xml:space="preserve">Hoy los datos que importan para crecer viven en sistemas que no se hablan entre sí, y las decisiones se toman por opinión y sin registro. SysData ataca eso de frente:</w:t>
+        <w:t xml:space="preserve">Hoy los datos que importan para crecer viven en sistemas que no se hablan entre sí, están incompletos y las decisiones se toman por opinión. SysData ataca eso de frente:</w:t>
       </w:r>
     </w:p>
     <w:tbl>
@@ -386,7 +378,7 @@
                 <w:sz w:val="20"/>
                 <w:szCs w:val="20"/>
               </w:rPr>
-              <w:t xml:space="preserve">Datos en silos (Mixpanel, HubSpot, PELG, Binary no se cruzan)</w:t>
+              <w:t xml:space="preserve">Datos en silos: Mixpanel, HubSpot, PELG y Binary no se cruzan.</w:t>
             </w:r>
           </w:p>
         </w:tc>
@@ -412,7 +404,7 @@
                 <w:sz w:val="20"/>
                 <w:szCs w:val="20"/>
               </w:rPr>
-              <w:t xml:space="preserve">Una sola capa que los une y los traduce en decisiones; nadie tiene que abrir cuatro herramientas y reconciliarlas a mano.</w:t>
+              <w:t xml:space="preserve">Una sola capa los une y los traduce en decisiones; nadie tiene que abrir cuatro herramientas y reconciliarlas a mano.</w:t>
             </w:r>
           </w:p>
         </w:tc>
@@ -444,7 +436,7 @@
                 <w:sz w:val="20"/>
                 <w:szCs w:val="20"/>
               </w:rPr>
-              <w:t xml:space="preserve">Se prioriza por opinión o por el % de fuga más grande</w:t>
+              <w:t xml:space="preserve">Datos incompletos: muchos contactos de HubSpot están vacíos, porque los asesores cargan la info en prospectos o en Binary.</w:t>
             </w:r>
           </w:p>
         </w:tc>
@@ -471,7 +463,7 @@
                 <w:sz w:val="20"/>
                 <w:szCs w:val="20"/>
               </w:rPr>
-              <w:t xml:space="preserve">Ranking por plata en juego (margen), no por intuición ni por porcentaje: lo primero es lo que más mueve el negocio.</w:t>
+              <w:t xml:space="preserve">Al cruzar las fuentes por persona (trazar al mismo socio entre HubSpot, prospectos y Binary), esos contactos se completan con lo que ya existe en las otras bases → sube fuerte el % de datos completos, y con eso mejoran la segmentación y el análisis.</w:t>
             </w:r>
           </w:p>
         </w:tc>
@@ -502,7 +494,7 @@
                 <w:sz w:val="20"/>
                 <w:szCs w:val="20"/>
               </w:rPr>
-              <w:t xml:space="preserve">Falta de trazabilidad: las decisiones y pruebas no quedan registradas</w:t>
+              <w:t xml:space="preserve">Se prioriza por opinión o por el % de fuga más grande.</w:t>
             </w:r>
           </w:p>
         </w:tc>
@@ -528,7 +520,7 @@
                 <w:sz w:val="20"/>
                 <w:szCs w:val="20"/>
               </w:rPr>
-              <w:t xml:space="preserve">Trazabilidad constante: cada oportunidad → experimento → medición → aprendizaje queda enlazada y auditable. Nada se pierde, todo se puede reconstruir.</w:t>
+              <w:t xml:space="preserve">Ranking por plata en juego (margen): primero lo que más mueve el negocio, no lo que parece urgente.</w:t>
             </w:r>
           </w:p>
         </w:tc>
@@ -560,7 +552,7 @@
                 <w:sz w:val="20"/>
                 <w:szCs w:val="20"/>
               </w:rPr>
-              <w:t xml:space="preserve">No se sabe si una mejora funcionó (o fue casualidad)</w:t>
+              <w:t xml:space="preserve">No se sabe si una mejora funcionó (o fue casualidad).</w:t>
             </w:r>
           </w:p>
         </w:tc>
@@ -618,7 +610,7 @@
                 <w:sz w:val="20"/>
                 <w:szCs w:val="20"/>
               </w:rPr>
-              <w:t xml:space="preserve">Números sin respaldo, imposibles de discutir</w:t>
+              <w:t xml:space="preserve">Números sin respaldo, imposibles de discutir.</w:t>
             </w:r>
           </w:p>
         </w:tc>
@@ -676,7 +668,7 @@
                 <w:sz w:val="20"/>
                 <w:szCs w:val="20"/>
               </w:rPr>
-              <w:t xml:space="preserve">La memoria del equipo se pierde con la rotación</w:t>
+              <w:t xml:space="preserve">La memoria del equipo se pierde con la rotación.</w:t>
             </w:r>
           </w:p>
         </w:tc>
@@ -703,7 +695,7 @@
                 <w:sz w:val="20"/>
                 <w:szCs w:val="20"/>
               </w:rPr>
-              <w:t xml:space="preserve">El Playbook y los priors guardan lo aprendido y lo reusan: el motor mejora con cada experimento.</w:t>
+              <w:t xml:space="preserve">El Playbook y los priors guardan lo aprendido y lo reutilizan: el motor mejora con cada experimento.</w:t>
             </w:r>
           </w:p>
         </w:tc>
@@ -740,7 +732,7 @@
         <w:t xml:space="preserve">Es la capa de decisión</w:t>
       </w:r>
       <w:r>
-        <w:t xml:space="preserve"> del stack de growth: “¿qué hacemos con los datos?”, no “¿dónde los miro?”.</w:t>
+        <w:t xml:space="preserve"> de growth: “¿qué hacemos con los datos?”, no “¿dónde los miro?”.</w:t>
       </w:r>
     </w:p>
     <w:p>
@@ -838,7 +830,7 @@
         <w:jc w:val="both"/>
       </w:pPr>
       <w:r>
-        <w:t xml:space="preserve">La app es un ciclo cerrado de cinco pasos. La clave: en cada paso la herramienta deja registro, así que el camino completo —de un problema a un aprendizaje— queda trazado de punta a punta.</w:t>
+        <w:t xml:space="preserve">La app es un ciclo cerrado de cinco pasos. En cada uno la herramienta deja registro, así que el camino completo —de un problema a un aprendizaje— queda enlazado de punta a punta.</w:t>
       </w:r>
     </w:p>
     <w:p>
@@ -1010,7 +1002,7 @@
         <w:t xml:space="preserve">Paso 3 · Entender (el detalle de la oportunidad). </w:t>
       </w:r>
       <w:r>
-        <w:t xml:space="preserve">Con un clic se abre la lógica completa: la ecuación, el cálculo paso a paso, la fuente de cada número y los supuestos. Es la sección 6 de este documento.</w:t>
+        <w:t xml:space="preserve">Con un clic se abre la lógica completa: la ecuación, el cálculo paso a paso, la fuente de cada número y los supuestos (ver sección 6).</w:t>
       </w:r>
     </w:p>
     <w:p>
@@ -1184,7 +1176,7 @@
         <w:jc w:val="both"/>
       </w:pPr>
       <w:r>
-        <w:t xml:space="preserve">SysData no genera datos: orquesta cuatro fuentes que ya existen en Medicus, todas en solo lectura. Binary —la base de socios— es la pieza que vuelve “reales” a los unit economics y la que ayuda a cerrar el cruce de punta a punta.</w:t>
+        <w:t xml:space="preserve">SysData no genera datos: orquesta cuatro fuentes que ya existen en Medicus, todas en solo lectura. Binary —la base de socios— es la pieza que vuelve “reales” a los unit economics y la que ayuda a completar y cerrar los datos de punta a punta.</w:t>
       </w:r>
     </w:p>
     <w:tbl>
@@ -1649,10 +1641,26 @@
           <w:b/>
           <w:bCs/>
         </w:rPr>
+        <w:t xml:space="preserve">Un beneficio inmediato de cruzar las fuentes: </w:t>
+      </w:r>
+      <w:r>
+        <w:t xml:space="preserve">hoy muchos contactos de HubSpot están a medias porque el asesor carga los datos en prospectos o en Binary. Reconciliando al mismo socio entre las fuentes, SysData completa esos contactos con lo que ya existe → un % mucho mayor de datos utilizables para segmentar y analizar.</w:t>
+      </w:r>
+    </w:p>
+    <w:p>
+      <w:pPr>
+        <w:spacing w:after="110"/>
+        <w:jc w:val="both"/>
+      </w:pPr>
+      <w:r>
+        <w:rPr>
+          <w:b/>
+          <w:bCs/>
+        </w:rPr>
         <w:t xml:space="preserve">¿Esto es un data warehouse? No. </w:t>
       </w:r>
       <w:r>
-        <w:t xml:space="preserve">Un data warehouse (ej. BigQuery/Snowflake) copia y consolida datos crudos de muchas fuentes para análisis a escala. SysData solo guarda métricas derivadas (la foto diaria de KPIs y recos) como su memoria. Un DWH real —donde convivan Mixpanel, HubSpot y Binary— lo arma el equipo de Data, y SysData lo consumiría (es la base de la “Opción B” del cruce).</w:t>
+        <w:t xml:space="preserve">Un data warehouse (ej. BigQuery/Snowflake) copia y consolida datos crudos de muchas fuentes para análisis a escala. SysData solo guarda métricas derivadas (la foto diaria de KPIs y recos) como su memoria. Un DWH real —donde convivan Mixpanel, HubSpot y Binary— sería del equipo de Data, y SysData lo consumiría (es la base de la “Opción B” del cruce).</w:t>
       </w:r>
     </w:p>
     <w:p>
@@ -1842,7 +1850,7 @@
         <w:jc w:val="both"/>
       </w:pPr>
       <w:r>
-        <w:t xml:space="preserve">El detalle de cada oportunidad expone esta lógica completa: la fórmula, el cálculo paso a paso, la fuente de cada número (Mixpanel, HubSpot, PELG/Binary) y los supuestos detrás.</w:t>
+        <w:t xml:space="preserve">El detalle de cada oportunidad expone esta lógica completa: la fórmula, el cálculo paso a paso, la fuente de cada número y los supuestos detrás.</w:t>
       </w:r>
     </w:p>
     <w:p>
@@ -2327,7 +2335,7 @@
                 <w:sz w:val="20"/>
                 <w:szCs w:val="20"/>
               </w:rPr>
-              <w:t xml:space="preserve">Estado compartido (Supabase), no Excel personal</w:t>
+              <w:t xml:space="preserve">Estado compartido de equipo, no Excel personal</w:t>
             </w:r>
           </w:p>
         </w:tc>
@@ -2659,7 +2667,7 @@
                 <w:sz w:val="20"/>
                 <w:szCs w:val="20"/>
               </w:rPr>
-              <w:t xml:space="preserve">Un proceso diario (cron) barre los datos y guarda la foto del día.</w:t>
+              <w:t xml:space="preserve">Un barrido diario de los datos guarda la foto del día.</w:t>
             </w:r>
           </w:p>
         </w:tc>
@@ -3055,7 +3063,82 @@
         <w:spacing w:after="120" w:before="280"/>
       </w:pPr>
       <w:r>
-        <w:t xml:space="preserve">10. Stack técnico</w:t>
+        <w:t xml:space="preserve">10. La dependencia clave: el cruce visita → cápita</w:t>
+      </w:r>
+    </w:p>
+    <w:p>
+      <w:pPr>
+        <w:spacing w:after="110"/>
+        <w:jc w:val="both"/>
+      </w:pPr>
+      <w:r>
+        <w:t xml:space="preserve">Para medir de punta a punta “qué visita termina siendo socio” falta estampar el mismo identificador (prospecto_id) en el alta de socio. Hoy el lead (Mixpanel/HubSpot) y el socio (Binary) son registros separados que no se pueden unir.</w:t>
+      </w:r>
+    </w:p>
+    <w:p>
+      <w:pPr>
+        <w:spacing w:after="110"/>
+        <w:jc w:val="both"/>
+      </w:pPr>
+      <w:r>
+        <w:rPr>
+          <w:b/>
+          <w:bCs/>
+        </w:rPr>
+        <w:t xml:space="preserve">Qué significa: </w:t>
+      </w:r>
+      <w:r>
+        <w:t xml:space="preserve">mientras no se cierre, la conversión visita→cápita es supuesta (hoy 6%), no medida. Por eso el motor la marca como supuesto.</w:t>
+      </w:r>
+    </w:p>
+    <w:p>
+      <w:pPr>
+        <w:spacing w:after="110"/>
+        <w:jc w:val="both"/>
+      </w:pPr>
+      <w:r>
+        <w:rPr>
+          <w:b/>
+          <w:bCs/>
+        </w:rPr>
+        <w:t xml:space="preserve">De quién depende: </w:t>
+      </w:r>
+      <w:r>
+        <w:t xml:space="preserve">NO es trabajo de SysData, sino instrumentación upstream (Data/Dev). Caminos: (A) estampar el prospecto_id en el alta; (B) cruzar las fuentes uniendo el comportamiento con la base de socios de Binary; (C) en HubSpot, asociar el deal ganado al contacto de origen.</w:t>
+      </w:r>
+    </w:p>
+    <w:p>
+      <w:pPr>
+        <w:spacing w:after="110"/>
+        <w:jc w:val="both"/>
+      </w:pPr>
+      <w:r>
+        <w:rPr>
+          <w:b/>
+          <w:bCs/>
+        </w:rPr>
+        <w:t xml:space="preserve">El payoff: </w:t>
+      </w:r>
+      <w:r>
+        <w:t xml:space="preserve">datos más completos (se llenan los contactos vacíos de HubSpot con lo cargado en prospectos/Binary), tasa lead→cápita real por canal y segmento, ripple a cápita medido, y priorización por margen real. SysData ya detecta solo cuándo queda resuelto.</w:t>
+      </w:r>
+    </w:p>
+    <w:p>
+      <w:pPr>
+        <w:pStyle w:val="Heading1"/>
+        <w:spacing w:after="120" w:before="280"/>
+      </w:pPr>
+      <w:r>
+        <w:t xml:space="preserve">11. Estado actual y roadmap</w:t>
+      </w:r>
+    </w:p>
+    <w:p>
+      <w:pPr>
+        <w:pStyle w:val="Heading2"/>
+        <w:spacing w:after="70" w:before="160"/>
+      </w:pPr>
+      <w:r>
+        <w:t xml:space="preserve">Funcionando hoy</w:t>
       </w:r>
     </w:p>
     <w:p>
@@ -3068,14 +3151,7 @@
         <w:spacing w:after="50"/>
       </w:pPr>
       <w:r>
-        <w:rPr>
-          <w:b/>
-          <w:bCs/>
-        </w:rPr>
-        <w:t xml:space="preserve">App</w:t>
-      </w:r>
-      <w:r>
-        <w:t xml:space="preserve">: Next.js 16 + React 19 + TypeScript.</w:t>
+        <w:t xml:space="preserve">El loop completo (Resumen, Oportunidades, Experimentos, Aprendizajes) con datos en vivo de Mixpanel + HubSpot.</w:t>
       </w:r>
     </w:p>
     <w:p>
@@ -3088,14 +3164,16 @@
         <w:spacing w:after="50"/>
       </w:pPr>
       <w:r>
-        <w:rPr>
-          <w:b/>
-          <w:bCs/>
-        </w:rPr>
-        <w:t xml:space="preserve">Estado del equipo</w:t>
-      </w:r>
-      <w:r>
-        <w:t xml:space="preserve">: Supabase (login + datos compartidos: experimentos, estados, aprendizajes, snapshots, priors) con Row Level Security.</w:t>
+        <w:t xml:space="preserve">Las 4 capas del motor: memoria diaria, detección, score con rango y priors que se afinan con cada experimento.</w:t>
+      </w:r>
+    </w:p>
+    <w:p>
+      <w:pPr>
+        <w:pStyle w:val="Heading2"/>
+        <w:spacing w:after="70" w:before="160"/>
+      </w:pPr>
+      <w:r>
+        <w:t xml:space="preserve">Pendiente</w:t>
       </w:r>
     </w:p>
     <w:p>
@@ -3108,14 +3186,7 @@
         <w:spacing w:after="50"/>
       </w:pPr>
       <w:r>
-        <w:rPr>
-          <w:b/>
-          <w:bCs/>
-        </w:rPr>
-        <w:t xml:space="preserve">Hosting</w:t>
-      </w:r>
-      <w:r>
-        <w:t xml:space="preserve">: Vercel; el barrido diario corre como Vercel Cron.</w:t>
+        <w:t xml:space="preserve">Integrar Binary para unit economics reales (LTV/churn), completar los contactos y cerrar el cruce visita→cápita.</w:t>
       </w:r>
     </w:p>
     <w:p>
@@ -3128,14 +3199,16 @@
         <w:spacing w:after="50"/>
       </w:pPr>
       <w:r>
-        <w:rPr>
-          <w:b/>
-          <w:bCs/>
-        </w:rPr>
-        <w:t xml:space="preserve">Fuentes (solo lectura)</w:t>
-      </w:r>
-      <w:r>
-        <w:t xml:space="preserve">: Mixpanel y HubSpot (APIs), PELG (inversión/CAC) y Binary (unit economics reales + cápita confirmada).</w:t>
+        <w:t xml:space="preserve">Cerrar el cruce prospecto_id (trabajo de Data/Dev).</w:t>
+      </w:r>
+    </w:p>
+    <w:p>
+      <w:pPr>
+        <w:pStyle w:val="Heading2"/>
+        <w:spacing w:after="70" w:before="160"/>
+      </w:pPr>
+      <w:r>
+        <w:t xml:space="preserve">Próximo (ideas)</w:t>
       </w:r>
     </w:p>
     <w:p>
@@ -3148,14 +3221,16 @@
         <w:spacing w:after="50"/>
       </w:pPr>
       <w:r>
-        <w:rPr>
-          <w:b/>
-          <w:bCs/>
-        </w:rPr>
-        <w:t xml:space="preserve">IA acotada</w:t>
-      </w:r>
-      <w:r>
-        <w:t xml:space="preserve">: Gemini, solo para lenguaje (redactar, agrupar), nunca para producir números.</w:t>
+        <w:t xml:space="preserve">Brief automático del “Lunes de growth”; “Value of Information” (cuánto vale en pesos cerrar cada supuesto); tarjeta de impacto multi-moneda.</w:t>
+      </w:r>
+    </w:p>
+    <w:p>
+      <w:pPr>
+        <w:pStyle w:val="Heading1"/>
+        <w:spacing w:after="120" w:before="280"/>
+      </w:pPr>
+      <w:r>
+        <w:t xml:space="preserve">12. Principios y restricciones</w:t>
       </w:r>
     </w:p>
     <w:p>
@@ -3172,94 +3247,10 @@
           <w:b/>
           <w:bCs/>
         </w:rPr>
-        <w:t xml:space="preserve">Seguridad</w:t>
-      </w:r>
-      <w:r>
-        <w:t xml:space="preserve">: tokens server-side; rutas protegidas por login de dominio @medicus.com.ar.</w:t>
-      </w:r>
-    </w:p>
-    <w:p>
-      <w:pPr>
-        <w:pStyle w:val="Heading1"/>
-        <w:spacing w:after="120" w:before="280"/>
-      </w:pPr>
-      <w:r>
-        <w:t xml:space="preserve">11. La dependencia clave: el cruce visita → cápita</w:t>
-      </w:r>
-    </w:p>
-    <w:p>
-      <w:pPr>
-        <w:spacing w:after="110"/>
-        <w:jc w:val="both"/>
-      </w:pPr>
-      <w:r>
-        <w:t xml:space="preserve">Para medir de punta a punta “qué visita termina siendo socio” falta estampar el mismo identificador (prospecto_id) en el alta de socio. Hoy el lead (Mixpanel/HubSpot) y el socio (Binary) son registros separados que no se pueden unir.</w:t>
-      </w:r>
-    </w:p>
-    <w:p>
-      <w:pPr>
-        <w:spacing w:after="110"/>
-        <w:jc w:val="both"/>
-      </w:pPr>
-      <w:r>
-        <w:rPr>
-          <w:b/>
-          <w:bCs/>
-        </w:rPr>
-        <w:t xml:space="preserve">Qué significa: </w:t>
-      </w:r>
-      <w:r>
-        <w:t xml:space="preserve">mientras no se cierre, la conversión visita→cápita es supuesta (hoy 6%), no medida. Por eso el motor la marca como supuesto.</w:t>
-      </w:r>
-    </w:p>
-    <w:p>
-      <w:pPr>
-        <w:spacing w:after="110"/>
-        <w:jc w:val="both"/>
-      </w:pPr>
-      <w:r>
-        <w:rPr>
-          <w:b/>
-          <w:bCs/>
-        </w:rPr>
-        <w:t xml:space="preserve">De quién depende: </w:t>
-      </w:r>
-      <w:r>
-        <w:t xml:space="preserve">NO es trabajo de SysData, sino instrumentación upstream (Data/Dev). Caminos: (A) estampar el prospecto_id en el alta; (B) cruzar en el data warehouse uniendo comportamiento con la base de socios de Binary; (C) en HubSpot, asociar el deal ganado al contacto de origen.</w:t>
-      </w:r>
-    </w:p>
-    <w:p>
-      <w:pPr>
-        <w:spacing w:after="110"/>
-        <w:jc w:val="both"/>
-      </w:pPr>
-      <w:r>
-        <w:rPr>
-          <w:b/>
-          <w:bCs/>
-        </w:rPr>
-        <w:t xml:space="preserve">El payoff: </w:t>
-      </w:r>
-      <w:r>
-        <w:t xml:space="preserve">tasa lead→cápita real por canal y segmento, ripple a cápita medido, y priorización por margen real. SysData ya detecta solo cuándo queda resuelto.</w:t>
-      </w:r>
-    </w:p>
-    <w:p>
-      <w:pPr>
-        <w:pStyle w:val="Heading1"/>
-        <w:spacing w:after="120" w:before="280"/>
-      </w:pPr>
-      <w:r>
-        <w:t xml:space="preserve">12. Estado actual y roadmap</w:t>
-      </w:r>
-    </w:p>
-    <w:p>
-      <w:pPr>
-        <w:pStyle w:val="Heading2"/>
-        <w:spacing w:after="70" w:before="160"/>
-      </w:pPr>
-      <w:r>
-        <w:t xml:space="preserve">Funcionando hoy</w:t>
+        <w:t xml:space="preserve">Solo lectura</w:t>
+      </w:r>
+      <w:r>
+        <w:t xml:space="preserve"> sobre los sistemas productivos (Mixpanel, HubSpot, Binary): nunca crear, editar ni borrar nada.</w:t>
       </w:r>
     </w:p>
     <w:p>
@@ -3272,7 +3263,14 @@
         <w:spacing w:after="50"/>
       </w:pPr>
       <w:r>
-        <w:t xml:space="preserve">El loop completo (Resumen, Oportunidades, Experimentos, Aprendizajes) con datos en vivo de Mixpanel + HubSpot.</w:t>
+        <w:rPr>
+          <w:b/>
+          <w:bCs/>
+        </w:rPr>
+        <w:t xml:space="preserve">Honestidad</w:t>
+      </w:r>
+      <w:r>
+        <w:t xml:space="preserve">: medido vs supuesto siempre explícito; cada número muestra su fuente.</w:t>
       </w:r>
     </w:p>
     <w:p>
@@ -3285,125 +3283,6 @@
         <w:spacing w:after="50"/>
       </w:pPr>
       <w:r>
-        <w:t xml:space="preserve">Las 4 capas del motor: memoria diaria, detección, score con rango y priors que se afinan con cada experimento.</w:t>
-      </w:r>
-    </w:p>
-    <w:p>
-      <w:pPr>
-        <w:pStyle w:val="Heading2"/>
-        <w:spacing w:after="70" w:before="160"/>
-      </w:pPr>
-      <w:r>
-        <w:t xml:space="preserve">Pendiente</w:t>
-      </w:r>
-    </w:p>
-    <w:p>
-      <w:pPr>
-        <w:pStyle w:val="ListParagraph"/>
-        <w:numPr>
-          <w:ilvl w:val="0"/>
-          <w:numId w:val="1"/>
-        </w:numPr>
-        <w:spacing w:after="50"/>
-      </w:pPr>
-      <w:r>
-        <w:t xml:space="preserve">Integrar Binary para unit economics reales (LTV/churn) y como fuente de la cápita confirmada.</w:t>
-      </w:r>
-    </w:p>
-    <w:p>
-      <w:pPr>
-        <w:pStyle w:val="ListParagraph"/>
-        <w:numPr>
-          <w:ilvl w:val="0"/>
-          <w:numId w:val="1"/>
-        </w:numPr>
-        <w:spacing w:after="50"/>
-      </w:pPr>
-      <w:r>
-        <w:t xml:space="preserve">Encender el proceso diario en producción y cerrar el cruce prospecto_id (upstream).</w:t>
-      </w:r>
-    </w:p>
-    <w:p>
-      <w:pPr>
-        <w:pStyle w:val="Heading2"/>
-        <w:spacing w:after="70" w:before="160"/>
-      </w:pPr>
-      <w:r>
-        <w:t xml:space="preserve">Próximo (ideas)</w:t>
-      </w:r>
-    </w:p>
-    <w:p>
-      <w:pPr>
-        <w:pStyle w:val="ListParagraph"/>
-        <w:numPr>
-          <w:ilvl w:val="0"/>
-          <w:numId w:val="1"/>
-        </w:numPr>
-        <w:spacing w:after="50"/>
-      </w:pPr>
-      <w:r>
-        <w:t xml:space="preserve">Brief automático del “Lunes de growth”; “Value of Information” (cuánto vale en pesos cerrar cada supuesto); tarjeta de impacto multi-moneda.</w:t>
-      </w:r>
-    </w:p>
-    <w:p>
-      <w:pPr>
-        <w:pStyle w:val="Heading1"/>
-        <w:spacing w:after="120" w:before="280"/>
-      </w:pPr>
-      <w:r>
-        <w:t xml:space="preserve">13. Principios, seguridad y restricciones</w:t>
-      </w:r>
-    </w:p>
-    <w:p>
-      <w:pPr>
-        <w:pStyle w:val="ListParagraph"/>
-        <w:numPr>
-          <w:ilvl w:val="0"/>
-          <w:numId w:val="1"/>
-        </w:numPr>
-        <w:spacing w:after="50"/>
-      </w:pPr>
-      <w:r>
-        <w:rPr>
-          <w:b/>
-          <w:bCs/>
-        </w:rPr>
-        <w:t xml:space="preserve">Solo lectura</w:t>
-      </w:r>
-      <w:r>
-        <w:t xml:space="preserve"> sobre sistemas productivos (Mixpanel, HubSpot, Binary).</w:t>
-      </w:r>
-    </w:p>
-    <w:p>
-      <w:pPr>
-        <w:pStyle w:val="ListParagraph"/>
-        <w:numPr>
-          <w:ilvl w:val="0"/>
-          <w:numId w:val="1"/>
-        </w:numPr>
-        <w:spacing w:after="50"/>
-      </w:pPr>
-      <w:r>
-        <w:rPr>
-          <w:b/>
-          <w:bCs/>
-        </w:rPr>
-        <w:t xml:space="preserve">Honestidad</w:t>
-      </w:r>
-      <w:r>
-        <w:t xml:space="preserve">: medido vs supuesto siempre explícito.</w:t>
-      </w:r>
-    </w:p>
-    <w:p>
-      <w:pPr>
-        <w:pStyle w:val="ListParagraph"/>
-        <w:numPr>
-          <w:ilvl w:val="0"/>
-          <w:numId w:val="1"/>
-        </w:numPr>
-        <w:spacing w:after="50"/>
-      </w:pPr>
-      <w:r>
         <w:rPr>
           <w:b/>
           <w:bCs/>
@@ -3411,27 +3290,7 @@
         <w:t xml:space="preserve">Herramienta de equipo</w:t>
       </w:r>
       <w:r>
-        <w:t xml:space="preserve">: estado compartido y persistente.</w:t>
-      </w:r>
-    </w:p>
-    <w:p>
-      <w:pPr>
-        <w:pStyle w:val="ListParagraph"/>
-        <w:numPr>
-          <w:ilvl w:val="0"/>
-          <w:numId w:val="1"/>
-        </w:numPr>
-        <w:spacing w:after="50"/>
-      </w:pPr>
-      <w:r>
-        <w:rPr>
-          <w:b/>
-          <w:bCs/>
-        </w:rPr>
-        <w:t xml:space="preserve">Seguridad</w:t>
-      </w:r>
-      <w:r>
-        <w:t xml:space="preserve">: tokens server-side, acceso por login de dominio Medicus.</w:t>
+        <w:t xml:space="preserve">: estado compartido y persistente, no un archivo personal.</w:t>
       </w:r>
     </w:p>
     <w:p>
@@ -3440,7 +3299,7 @@
         <w:spacing w:after="120" w:before="280"/>
       </w:pPr>
       <w:r>
-        <w:t xml:space="preserve">14. Glosario</w:t>
+        <w:t xml:space="preserve">13. Glosario</w:t>
       </w:r>
     </w:p>
     <w:tbl>
@@ -3780,7 +3639,7 @@
                 <w:sz w:val="20"/>
                 <w:szCs w:val="20"/>
               </w:rPr>
-              <w:t xml:space="preserve">Trazabilidad</w:t>
+              <w:t xml:space="preserve">Win rate</w:t>
             </w:r>
           </w:p>
         </w:tc>
@@ -3806,7 +3665,7 @@
                 <w:sz w:val="20"/>
                 <w:szCs w:val="20"/>
               </w:rPr>
-              <w:t xml:space="preserve">Que cada decisión quede enlazada de punta a punta: oportunidad → experimento → medición → aprendizaje.</w:t>
+              <w:t xml:space="preserve">Porcentaje de deals comerciales que se cierran (en HubSpot).</w:t>
             </w:r>
           </w:p>
         </w:tc>
@@ -3838,7 +3697,7 @@
                 <w:sz w:val="20"/>
                 <w:szCs w:val="20"/>
               </w:rPr>
-              <w:t xml:space="preserve">Win rate</w:t>
+              <w:t xml:space="preserve">LTV</w:t>
             </w:r>
           </w:p>
         </w:tc>
@@ -3865,7 +3724,7 @@
                 <w:sz w:val="20"/>
                 <w:szCs w:val="20"/>
               </w:rPr>
-              <w:t xml:space="preserve">Porcentaje de deals comerciales que se cierran (en HubSpot).</w:t>
+              <w:t xml:space="preserve">Valor de contribución de una cápita en su permanencia (ARPU × meses × margen). Hoy supuesto; con Binary, real.</w:t>
             </w:r>
           </w:p>
         </w:tc>
@@ -3896,7 +3755,7 @@
                 <w:sz w:val="20"/>
                 <w:szCs w:val="20"/>
               </w:rPr>
-              <w:t xml:space="preserve">LTV</w:t>
+              <w:t xml:space="preserve">CAC</w:t>
             </w:r>
           </w:p>
         </w:tc>
@@ -3922,7 +3781,7 @@
                 <w:sz w:val="20"/>
                 <w:szCs w:val="20"/>
               </w:rPr>
-              <w:t xml:space="preserve">Valor de contribución de una cápita en su permanencia (ARPU × meses × margen). Hoy supuesto; con Binary, real.</w:t>
+              <w:t xml:space="preserve">Costo de adquirir una cápita (del PELG).</w:t>
             </w:r>
           </w:p>
         </w:tc>
@@ -3954,7 +3813,7 @@
                 <w:sz w:val="20"/>
                 <w:szCs w:val="20"/>
               </w:rPr>
-              <w:t xml:space="preserve">CAC</w:t>
+              <w:t xml:space="preserve">prospecto_id</w:t>
             </w:r>
           </w:p>
         </w:tc>
@@ -3981,7 +3840,7 @@
                 <w:sz w:val="20"/>
                 <w:szCs w:val="20"/>
               </w:rPr>
-              <w:t xml:space="preserve">Costo de adquirir una cápita (del PELG).</w:t>
+              <w:t xml:space="preserve">El identificador que uniría el comportamiento (Mixpanel) con la cápita (HubSpot/Binary).</w:t>
             </w:r>
           </w:p>
         </w:tc>
@@ -4012,7 +3871,7 @@
                 <w:sz w:val="20"/>
                 <w:szCs w:val="20"/>
               </w:rPr>
-              <w:t xml:space="preserve">prospecto_id</w:t>
+              <w:t xml:space="preserve">Prior</w:t>
             </w:r>
           </w:p>
         </w:tc>
@@ -4038,7 +3897,7 @@
                 <w:sz w:val="20"/>
                 <w:szCs w:val="20"/>
               </w:rPr>
-              <w:t xml:space="preserve">El identificador que uniría el comportamiento (Mixpanel) con la cápita (HubSpot/Binary).</w:t>
+              <w:t xml:space="preserve">Lo aprendido de experimentos pasados; el motor lo usa para estimar mejor.</w:t>
             </w:r>
           </w:p>
         </w:tc>
@@ -4070,7 +3929,7 @@
                 <w:sz w:val="20"/>
                 <w:szCs w:val="20"/>
               </w:rPr>
-              <w:t xml:space="preserve">Prior</w:t>
+              <w:t xml:space="preserve">Significancia</w:t>
             </w:r>
           </w:p>
         </w:tc>
@@ -4097,7 +3956,7 @@
                 <w:sz w:val="20"/>
                 <w:szCs w:val="20"/>
               </w:rPr>
-              <w:t xml:space="preserve">Lo aprendido de experimentos pasados; el motor lo usa para estimar mejor.</w:t>
+              <w:t xml:space="preserve">Que un resultado supere el ruido estadístico; sin ella, no es resultado.</w:t>
             </w:r>
           </w:p>
         </w:tc>
@@ -4128,72 +3987,13 @@
                 <w:sz w:val="20"/>
                 <w:szCs w:val="20"/>
               </w:rPr>
-              <w:t xml:space="preserve">Significancia</w:t>
+              <w:t xml:space="preserve">Data warehouse</w:t>
             </w:r>
           </w:p>
         </w:tc>
         <w:tc>
           <w:tcPr>
             <w:tcW w:type="dxa" w:w="7254"/>
-            <w:tcMar>
-              <w:top w:type="dxa" w:w="70"/>
-              <w:left w:type="dxa" w:w="130"/>
-              <w:bottom w:type="dxa" w:w="70"/>
-              <w:right w:type="dxa" w:w="130"/>
-            </w:tcMar>
-            <w:vAlign w:val="center"/>
-          </w:tcPr>
-          <w:p>
-            <w:pPr>
-              <w:spacing w:after="0"/>
-            </w:pPr>
-            <w:r>
-              <w:rPr>
-                <w:b w:val="false"/>
-                <w:bCs w:val="false"/>
-                <w:sz w:val="20"/>
-                <w:szCs w:val="20"/>
-              </w:rPr>
-              <w:t xml:space="preserve">Que un resultado supere el ruido estadístico; sin ella, no es resultado.</w:t>
-            </w:r>
-          </w:p>
-        </w:tc>
-      </w:tr>
-      <w:tr>
-        <w:trPr>
-          <w:cantSplit/>
-        </w:trPr>
-        <w:tc>
-          <w:tcPr>
-            <w:tcW w:type="dxa" w:w="2046"/>
-            <w:shd w:fill="F2F5F8" w:color="auto" w:val="clear"/>
-            <w:tcMar>
-              <w:top w:type="dxa" w:w="70"/>
-              <w:left w:type="dxa" w:w="130"/>
-              <w:bottom w:type="dxa" w:w="70"/>
-              <w:right w:type="dxa" w:w="130"/>
-            </w:tcMar>
-            <w:vAlign w:val="center"/>
-          </w:tcPr>
-          <w:p>
-            <w:pPr>
-              <w:spacing w:after="0"/>
-            </w:pPr>
-            <w:r>
-              <w:rPr>
-                <w:b/>
-                <w:bCs/>
-                <w:sz w:val="20"/>
-                <w:szCs w:val="20"/>
-              </w:rPr>
-              <w:t xml:space="preserve">Data warehouse</w:t>
-            </w:r>
-          </w:p>
-        </w:tc>
-        <w:tc>
-          <w:tcPr>
-            <w:tcW w:type="dxa" w:w="7254"/>
-            <w:shd w:fill="F2F5F8" w:color="auto" w:val="clear"/>
             <w:tcMar>
               <w:top w:type="dxa" w:w="70"/>
               <w:left w:type="dxa" w:w="130"/>

</xml_diff>

<commit_message>
docs(v2.2): sumar el valor de venta (segmentacion + a quien apuntar y cuando)
Con datos completos y cruzados, segmentacion real del usuario objetivo: a quien apuntar,
con que plan y cuando -> insumo de venta directo. Agregado como dolor/valor en la tabla,
como callout en la seccion de fuentes y en el resumen ejecutivo.
</commit_message>
<xml_diff>
--- a/SysData-Documentacion.docx
+++ b/SysData-Documentacion.docx
@@ -252,7 +252,7 @@
           <w:iCs/>
           <w:color w:val="0E2E52"/>
         </w:rPr>
-        <w:t xml:space="preserve">En una línea: convierte datos dispersos en decisiones de growth priorizadas por plata, con la evidencia y la honestidad a la vista.</w:t>
+        <w:t xml:space="preserve">En una línea: convierte datos dispersos en decisiones de growth priorizadas por plata —y, con los datos cruzados y completos, en saber a quién apuntar y cuándo—. Todo con la evidencia y la honestidad a la vista.</w:t>
       </w:r>
     </w:p>
     <w:p>
@@ -494,7 +494,7 @@
                 <w:sz w:val="20"/>
                 <w:szCs w:val="20"/>
               </w:rPr>
-              <w:t xml:space="preserve">Se prioriza por opinión o por el % de fuga más grande.</w:t>
+              <w:t xml:space="preserve">No sabemos con precisión a quién apuntar ni cuándo.</w:t>
             </w:r>
           </w:p>
         </w:tc>
@@ -520,7 +520,7 @@
                 <w:sz w:val="20"/>
                 <w:szCs w:val="20"/>
               </w:rPr>
-              <w:t xml:space="preserve">Ranking por plata en juego (margen): primero lo que más mueve el negocio, no lo que parece urgente.</w:t>
+              <w:t xml:space="preserve">Con los datos completos y cruzados se segmenta al usuario objetivo de verdad: a quién apuntar, con qué plan y en qué momento. Es un insumo de venta directo, no solo de growth.</w:t>
             </w:r>
           </w:p>
         </w:tc>
@@ -552,7 +552,7 @@
                 <w:sz w:val="20"/>
                 <w:szCs w:val="20"/>
               </w:rPr>
-              <w:t xml:space="preserve">No se sabe si una mejora funcionó (o fue casualidad).</w:t>
+              <w:t xml:space="preserve">Se prioriza por opinión o por el % de fuga más grande.</w:t>
             </w:r>
           </w:p>
         </w:tc>
@@ -579,7 +579,7 @@
                 <w:sz w:val="20"/>
                 <w:szCs w:val="20"/>
               </w:rPr>
-              <w:t xml:space="preserve">Medición con significancia estadística (señal vs ruido) + guardrails (que no rompa otra cosa).</w:t>
+              <w:t xml:space="preserve">Ranking por plata en juego (margen): primero lo que más mueve el negocio, no lo que parece urgente.</w:t>
             </w:r>
           </w:p>
         </w:tc>
@@ -610,7 +610,7 @@
                 <w:sz w:val="20"/>
                 <w:szCs w:val="20"/>
               </w:rPr>
-              <w:t xml:space="preserve">Números sin respaldo, imposibles de discutir.</w:t>
+              <w:t xml:space="preserve">No se sabe si una mejora funcionó (o fue casualidad).</w:t>
             </w:r>
           </w:p>
         </w:tc>
@@ -636,7 +636,7 @@
                 <w:sz w:val="20"/>
                 <w:szCs w:val="20"/>
               </w:rPr>
-              <w:t xml:space="preserve">Honestidad: cada cifra muestra su fuente y marca explícitamente lo que es supuesto.</w:t>
+              <w:t xml:space="preserve">Medición con significancia estadística (señal vs ruido) + guardrails (que no rompa otra cosa).</w:t>
             </w:r>
           </w:p>
         </w:tc>
@@ -668,7 +668,7 @@
                 <w:sz w:val="20"/>
                 <w:szCs w:val="20"/>
               </w:rPr>
-              <w:t xml:space="preserve">La memoria del equipo se pierde con la rotación.</w:t>
+              <w:t xml:space="preserve">Números sin respaldo, imposibles de discutir.</w:t>
             </w:r>
           </w:p>
         </w:tc>
@@ -676,6 +676,63 @@
           <w:tcPr>
             <w:tcW w:type="dxa" w:w="5580"/>
             <w:shd w:fill="F2F5F8" w:color="auto" w:val="clear"/>
+            <w:tcMar>
+              <w:top w:type="dxa" w:w="70"/>
+              <w:left w:type="dxa" w:w="130"/>
+              <w:bottom w:type="dxa" w:w="70"/>
+              <w:right w:type="dxa" w:w="130"/>
+            </w:tcMar>
+            <w:vAlign w:val="center"/>
+          </w:tcPr>
+          <w:p>
+            <w:pPr>
+              <w:spacing w:after="0"/>
+            </w:pPr>
+            <w:r>
+              <w:rPr>
+                <w:b w:val="false"/>
+                <w:bCs w:val="false"/>
+                <w:sz w:val="20"/>
+                <w:szCs w:val="20"/>
+              </w:rPr>
+              <w:t xml:space="preserve">Honestidad: cada cifra muestra su fuente y marca explícitamente lo que es supuesto.</w:t>
+            </w:r>
+          </w:p>
+        </w:tc>
+      </w:tr>
+      <w:tr>
+        <w:trPr>
+          <w:cantSplit/>
+        </w:trPr>
+        <w:tc>
+          <w:tcPr>
+            <w:tcW w:type="dxa" w:w="3720"/>
+            <w:tcMar>
+              <w:top w:type="dxa" w:w="70"/>
+              <w:left w:type="dxa" w:w="130"/>
+              <w:bottom w:type="dxa" w:w="70"/>
+              <w:right w:type="dxa" w:w="130"/>
+            </w:tcMar>
+            <w:vAlign w:val="center"/>
+          </w:tcPr>
+          <w:p>
+            <w:pPr>
+              <w:spacing w:after="0"/>
+            </w:pPr>
+            <w:r>
+              <w:rPr>
+                <w:b/>
+                <w:bCs/>
+                <w:sz w:val="20"/>
+                <w:szCs w:val="20"/>
+              </w:rPr>
+              <w:t xml:space="preserve">La memoria del equipo se pierde con la rotación.</w:t>
+            </w:r>
+          </w:p>
+        </w:tc>
+        <w:tc>
+          <w:tcPr>
+            <w:tcW w:type="dxa" w:w="5580"/>
             <w:tcMar>
               <w:top w:type="dxa" w:w="70"/>
               <w:left w:type="dxa" w:w="130"/>
@@ -1645,6 +1702,23 @@
       </w:r>
       <w:r>
         <w:t xml:space="preserve">hoy muchos contactos de HubSpot están a medias porque el asesor carga los datos en prospectos o en Binary. Reconciliando al mismo socio entre las fuentes, SysData completa esos contactos con lo que ya existe → un % mucho mayor de datos utilizables para segmentar y analizar.</w:t>
+      </w:r>
+    </w:p>
+    <w:p>
+      <w:pPr>
+        <w:pBdr>
+          <w:left w:val="single" w:color="1689C4" w:sz="18" w:space="12"/>
+        </w:pBdr>
+        <w:spacing w:after="140" w:before="60"/>
+        <w:ind w:left="320"/>
+      </w:pPr>
+      <w:r>
+        <w:rPr>
+          <w:i/>
+          <w:iCs/>
+          <w:color w:val="0E2E52"/>
+        </w:rPr>
+        <w:t xml:space="preserve">Dato clave de venta: con los datos completos y cruzados podemos segmentar al usuario objetivo de verdad —a quién apuntar, con qué plan y en qué momento—. Deja de ser intuición y pasa a ser un insumo accionable para el equipo comercial.</w:t>
       </w:r>
     </w:p>
     <w:p>

</xml_diff>

<commit_message>
docs(v2.3): glosario completo, ejemplos reales y el 'cuando'
- Glosario: define PELG, medicard, ARPU y funnel (PELG/medicard a confirmar por el equipo).
- Nueva seccion 'Que ya nos dijo el motor': 3 hallazgos reales (canal display sin retorno,
  seguimiento como #1 de detraccion NPS, gap de win rate) para hacerlo tangible.
- Desarrollado el 'cuando': timing = comportamiento (Mixpanel) + ciclo de vida del socio
  (Binary) + deteccion de quiebres.
</commit_message>
<xml_diff>
--- a/SysData-Documentacion.docx
+++ b/SysData-Documentacion.docx
@@ -85,7 +85,7 @@
         <w:rPr>
           <w:color w:val="5B6B7F"/>
         </w:rPr>
-        <w:t xml:space="preserve">Versión 2.1 · 22 de junio de 2026</w:t>
+        <w:t xml:space="preserve">Versión 2.3 · 22 de junio de 2026</w:t>
       </w:r>
     </w:p>
     <w:p>
@@ -155,7 +155,7 @@
         <w:spacing w:after="36"/>
       </w:pPr>
       <w:r>
-        <w:t xml:space="preserve">7. Decisiones de producto y su porqué</w:t>
+        <w:t xml:space="preserve">7. Qué ya nos dijo el motor (ejemplos reales)</w:t>
       </w:r>
     </w:p>
     <w:p>
@@ -163,7 +163,7 @@
         <w:spacing w:after="36"/>
       </w:pPr>
       <w:r>
-        <w:t xml:space="preserve">8. Arquitectura del motor: las 4 capas</w:t>
+        <w:t xml:space="preserve">8. Decisiones de producto y su porqué</w:t>
       </w:r>
     </w:p>
     <w:p>
@@ -171,7 +171,7 @@
         <w:spacing w:after="36"/>
       </w:pPr>
       <w:r>
-        <w:t xml:space="preserve">9. Rigor de medición de experimentos</w:t>
+        <w:t xml:space="preserve">9. Arquitectura del motor: las 4 capas</w:t>
       </w:r>
     </w:p>
     <w:p>
@@ -179,7 +179,7 @@
         <w:spacing w:after="36"/>
       </w:pPr>
       <w:r>
-        <w:t xml:space="preserve">10. La dependencia clave: el cruce visita → cápita</w:t>
+        <w:t xml:space="preserve">10. Rigor de medición de experimentos</w:t>
       </w:r>
     </w:p>
     <w:p>
@@ -187,7 +187,7 @@
         <w:spacing w:after="36"/>
       </w:pPr>
       <w:r>
-        <w:t xml:space="preserve">11. Estado actual y roadmap</w:t>
+        <w:t xml:space="preserve">11. La dependencia clave: el cruce visita → cápita</w:t>
       </w:r>
     </w:p>
     <w:p>
@@ -195,7 +195,7 @@
         <w:spacing w:after="36"/>
       </w:pPr>
       <w:r>
-        <w:t xml:space="preserve">12. Principios y restricciones</w:t>
+        <w:t xml:space="preserve">12. Estado actual y roadmap</w:t>
       </w:r>
     </w:p>
     <w:p>
@@ -203,7 +203,15 @@
         <w:spacing w:after="36"/>
       </w:pPr>
       <w:r>
-        <w:t xml:space="preserve">13. Glosario</w:t>
+        <w:t xml:space="preserve">13. Principios y restricciones</w:t>
+      </w:r>
+    </w:p>
+    <w:p>
+      <w:pPr>
+        <w:spacing w:after="36"/>
+      </w:pPr>
+      <w:r>
+        <w:t xml:space="preserve">14. Glosario</w:t>
       </w:r>
     </w:p>
     <w:p>
@@ -1731,6 +1739,22 @@
           <w:b/>
           <w:bCs/>
         </w:rPr>
+        <w:t xml:space="preserve">¿De dónde sale el “cuándo”? </w:t>
+      </w:r>
+      <w:r>
+        <w:t xml:space="preserve">del cruce de tres señales: la intención en el comportamiento (Mixpanel), el ciclo de vida del socio en Binary (altas, vencimientos, renovaciones) y la detección de quiebres del motor. No es solo a quién apuntar, sino en qué momento está más receptivo o en riesgo.</w:t>
+      </w:r>
+    </w:p>
+    <w:p>
+      <w:pPr>
+        <w:spacing w:after="110"/>
+        <w:jc w:val="both"/>
+      </w:pPr>
+      <w:r>
+        <w:rPr>
+          <w:b/>
+          <w:bCs/>
+        </w:rPr>
         <w:t xml:space="preserve">¿Esto es un data warehouse? No. </w:t>
       </w:r>
       <w:r>
@@ -2011,7 +2035,85 @@
         <w:spacing w:after="120" w:before="280"/>
       </w:pPr>
       <w:r>
-        <w:t xml:space="preserve">7. Decisiones de producto y su porqué</w:t>
+        <w:t xml:space="preserve">7. Qué ya nos dijo el motor (ejemplos reales)</w:t>
+      </w:r>
+    </w:p>
+    <w:p>
+      <w:pPr>
+        <w:spacing w:after="110"/>
+        <w:jc w:val="both"/>
+      </w:pPr>
+      <w:r>
+        <w:t xml:space="preserve">El motor ya corre sobre datos reales. Tres ejemplos de lo que salió, para hacerlo tangible:</w:t>
+      </w:r>
+    </w:p>
+    <w:p>
+      <w:pPr>
+        <w:pStyle w:val="ListParagraph"/>
+        <w:numPr>
+          <w:ilvl w:val="0"/>
+          <w:numId w:val="1"/>
+        </w:numPr>
+        <w:spacing w:after="50"/>
+      </w:pPr>
+      <w:r>
+        <w:rPr>
+          <w:b/>
+          <w:bCs/>
+        </w:rPr>
+        <w:t xml:space="preserve">Un canal que quema plata</w:t>
+      </w:r>
+      <w:r>
+        <w:t xml:space="preserve">: “display” trae ~23% del tráfico del cotizador y convierte ~0% a datos — inversión de programática casi sin retorno. Candidato claro a pausar o reasignar.</w:t>
+      </w:r>
+    </w:p>
+    <w:p>
+      <w:pPr>
+        <w:pStyle w:val="ListParagraph"/>
+        <w:numPr>
+          <w:ilvl w:val="0"/>
+          <w:numId w:val="1"/>
+        </w:numPr>
+        <w:spacing w:after="50"/>
+      </w:pPr>
+      <w:r>
+        <w:rPr>
+          <w:b/>
+          <w:bCs/>
+        </w:rPr>
+        <w:t xml:space="preserve">El #1 de la insatisfacción es el seguimiento</w:t>
+      </w:r>
+      <w:r>
+        <w:t xml:space="preserve">: el motivo más repetido entre los detractores del NPS es el asesor que no responde o responde tarde, y es sistémico (aparece en todos los canales). Explica los deals frenados en “Propuesta Enviada”: es un problema de proceso comercial (un SLA de respuesta), no de producto.</w:t>
+      </w:r>
+    </w:p>
+    <w:p>
+      <w:pPr>
+        <w:pStyle w:val="ListParagraph"/>
+        <w:numPr>
+          <w:ilvl w:val="0"/>
+          <w:numId w:val="1"/>
+        </w:numPr>
+        <w:spacing w:after="50"/>
+      </w:pPr>
+      <w:r>
+        <w:rPr>
+          <w:b/>
+          <w:bCs/>
+        </w:rPr>
+        <w:t xml:space="preserve">Win rate con margen de mejora</w:t>
+      </w:r>
+      <w:r>
+        <w:t xml:space="preserve">: el pipeline cierra ~38% vs una meta de 45%. Cerrar ese gap es palanca directa de cápitas, y el motor lo dimensiona en plata.</w:t>
+      </w:r>
+    </w:p>
+    <w:p>
+      <w:pPr>
+        <w:pStyle w:val="Heading1"/>
+        <w:spacing w:after="120" w:before="280"/>
+      </w:pPr>
+      <w:r>
+        <w:t xml:space="preserve">8. Decisiones de producto y su porqué</w:t>
       </w:r>
     </w:p>
     <w:tbl>
@@ -2569,7 +2671,7 @@
         <w:spacing w:after="120" w:before="280"/>
       </w:pPr>
       <w:r>
-        <w:t xml:space="preserve">8. Arquitectura del motor: las 4 capas</w:t>
+        <w:t xml:space="preserve">9. Arquitectura del motor: las 4 capas</w:t>
       </w:r>
     </w:p>
     <w:p>
@@ -3039,7 +3141,7 @@
         <w:spacing w:after="120" w:before="280"/>
       </w:pPr>
       <w:r>
-        <w:t xml:space="preserve">9. Rigor de medición de experimentos</w:t>
+        <w:t xml:space="preserve">10. Rigor de medición de experimentos</w:t>
       </w:r>
     </w:p>
     <w:p>
@@ -3137,7 +3239,7 @@
         <w:spacing w:after="120" w:before="280"/>
       </w:pPr>
       <w:r>
-        <w:t xml:space="preserve">10. La dependencia clave: el cruce visita → cápita</w:t>
+        <w:t xml:space="preserve">11. La dependencia clave: el cruce visita → cápita</w:t>
       </w:r>
     </w:p>
     <w:p>
@@ -3203,7 +3305,7 @@
         <w:spacing w:after="120" w:before="280"/>
       </w:pPr>
       <w:r>
-        <w:t xml:space="preserve">11. Estado actual y roadmap</w:t>
+        <w:t xml:space="preserve">12. Estado actual y roadmap</w:t>
       </w:r>
     </w:p>
     <w:p>
@@ -3304,7 +3406,7 @@
         <w:spacing w:after="120" w:before="280"/>
       </w:pPr>
       <w:r>
-        <w:t xml:space="preserve">12. Principios y restricciones</w:t>
+        <w:t xml:space="preserve">13. Principios y restricciones</w:t>
       </w:r>
     </w:p>
     <w:p>
@@ -3373,7 +3475,7 @@
         <w:spacing w:after="120" w:before="280"/>
       </w:pPr>
       <w:r>
-        <w:t xml:space="preserve">13. Glosario</w:t>
+        <w:t xml:space="preserve">14. Glosario</w:t>
       </w:r>
     </w:p>
     <w:tbl>
@@ -3539,7 +3641,7 @@
                 <w:sz w:val="20"/>
                 <w:szCs w:val="20"/>
               </w:rPr>
-              <w:t xml:space="preserve">Cápita</w:t>
+              <w:t xml:space="preserve">Medicard</w:t>
             </w:r>
           </w:p>
         </w:tc>
@@ -3566,7 +3668,7 @@
                 <w:sz w:val="20"/>
                 <w:szCs w:val="20"/>
               </w:rPr>
-              <w:t xml:space="preserve">Un socio activo. El resultado de negocio que SysData busca aumentar.</w:t>
+              <w:t xml:space="preserve">El producto de cobertura de Medicus que tiene el socio; su detalle (plan, vigencia) vive en Binary.</w:t>
             </w:r>
           </w:p>
         </w:tc>
@@ -3597,7 +3699,7 @@
                 <w:sz w:val="20"/>
                 <w:szCs w:val="20"/>
               </w:rPr>
-              <w:t xml:space="preserve">Dato</w:t>
+              <w:t xml:space="preserve">Cápita</w:t>
             </w:r>
           </w:p>
         </w:tc>
@@ -3623,7 +3725,7 @@
                 <w:sz w:val="20"/>
                 <w:szCs w:val="20"/>
               </w:rPr>
-              <w:t xml:space="preserve">Un lead que dejó sus datos en el cotizador.</w:t>
+              <w:t xml:space="preserve">Un socio activo. El resultado de negocio que SysData busca aumentar.</w:t>
             </w:r>
           </w:p>
         </w:tc>
@@ -3655,7 +3757,7 @@
                 <w:sz w:val="20"/>
                 <w:szCs w:val="20"/>
               </w:rPr>
-              <w:t xml:space="preserve">Fuga (leak)</w:t>
+              <w:t xml:space="preserve">Dato</w:t>
             </w:r>
           </w:p>
         </w:tc>
@@ -3682,7 +3784,7 @@
                 <w:sz w:val="20"/>
                 <w:szCs w:val="20"/>
               </w:rPr>
-              <w:t xml:space="preserve">El paso donde más gente se cae; SysData la mide en personas y en plata.</w:t>
+              <w:t xml:space="preserve">Un lead que dejó sus datos en el cotizador.</w:t>
             </w:r>
           </w:p>
         </w:tc>
@@ -3713,7 +3815,7 @@
                 <w:sz w:val="20"/>
                 <w:szCs w:val="20"/>
               </w:rPr>
-              <w:t xml:space="preserve">Win rate</w:t>
+              <w:t xml:space="preserve">Funnel / embudo</w:t>
             </w:r>
           </w:p>
         </w:tc>
@@ -3739,7 +3841,7 @@
                 <w:sz w:val="20"/>
                 <w:szCs w:val="20"/>
               </w:rPr>
-              <w:t xml:space="preserve">Porcentaje de deals comerciales que se cierran (en HubSpot).</w:t>
+              <w:t xml:space="preserve">La secuencia de pasos que recorre un usuario (visita → datos → cotización → alta).</w:t>
             </w:r>
           </w:p>
         </w:tc>
@@ -3771,7 +3873,7 @@
                 <w:sz w:val="20"/>
                 <w:szCs w:val="20"/>
               </w:rPr>
-              <w:t xml:space="preserve">LTV</w:t>
+              <w:t xml:space="preserve">Fuga (leak)</w:t>
             </w:r>
           </w:p>
         </w:tc>
@@ -3798,7 +3900,7 @@
                 <w:sz w:val="20"/>
                 <w:szCs w:val="20"/>
               </w:rPr>
-              <w:t xml:space="preserve">Valor de contribución de una cápita en su permanencia (ARPU × meses × margen). Hoy supuesto; con Binary, real.</w:t>
+              <w:t xml:space="preserve">El paso donde más gente se cae; SysData la mide en personas y en plata.</w:t>
             </w:r>
           </w:p>
         </w:tc>
@@ -3829,7 +3931,7 @@
                 <w:sz w:val="20"/>
                 <w:szCs w:val="20"/>
               </w:rPr>
-              <w:t xml:space="preserve">CAC</w:t>
+              <w:t xml:space="preserve">Win rate</w:t>
             </w:r>
           </w:p>
         </w:tc>
@@ -3855,7 +3957,239 @@
                 <w:sz w:val="20"/>
                 <w:szCs w:val="20"/>
               </w:rPr>
+              <w:t xml:space="preserve">Porcentaje de deals comerciales que se cierran (en HubSpot).</w:t>
+            </w:r>
+          </w:p>
+        </w:tc>
+      </w:tr>
+      <w:tr>
+        <w:trPr>
+          <w:cantSplit/>
+        </w:trPr>
+        <w:tc>
+          <w:tcPr>
+            <w:tcW w:type="dxa" w:w="2046"/>
+            <w:shd w:fill="F2F5F8" w:color="auto" w:val="clear"/>
+            <w:tcMar>
+              <w:top w:type="dxa" w:w="70"/>
+              <w:left w:type="dxa" w:w="130"/>
+              <w:bottom w:type="dxa" w:w="70"/>
+              <w:right w:type="dxa" w:w="130"/>
+            </w:tcMar>
+            <w:vAlign w:val="center"/>
+          </w:tcPr>
+          <w:p>
+            <w:pPr>
+              <w:spacing w:after="0"/>
+            </w:pPr>
+            <w:r>
+              <w:rPr>
+                <w:b/>
+                <w:bCs/>
+                <w:sz w:val="20"/>
+                <w:szCs w:val="20"/>
+              </w:rPr>
+              <w:t xml:space="preserve">LTV</w:t>
+            </w:r>
+          </w:p>
+        </w:tc>
+        <w:tc>
+          <w:tcPr>
+            <w:tcW w:type="dxa" w:w="7254"/>
+            <w:shd w:fill="F2F5F8" w:color="auto" w:val="clear"/>
+            <w:tcMar>
+              <w:top w:type="dxa" w:w="70"/>
+              <w:left w:type="dxa" w:w="130"/>
+              <w:bottom w:type="dxa" w:w="70"/>
+              <w:right w:type="dxa" w:w="130"/>
+            </w:tcMar>
+            <w:vAlign w:val="center"/>
+          </w:tcPr>
+          <w:p>
+            <w:pPr>
+              <w:spacing w:after="0"/>
+            </w:pPr>
+            <w:r>
+              <w:rPr>
+                <w:b w:val="false"/>
+                <w:bCs w:val="false"/>
+                <w:sz w:val="20"/>
+                <w:szCs w:val="20"/>
+              </w:rPr>
+              <w:t xml:space="preserve">Valor de contribución de una cápita en su permanencia (ARPU × meses × margen). Hoy supuesto; con Binary, real.</w:t>
+            </w:r>
+          </w:p>
+        </w:tc>
+      </w:tr>
+      <w:tr>
+        <w:trPr>
+          <w:cantSplit/>
+        </w:trPr>
+        <w:tc>
+          <w:tcPr>
+            <w:tcW w:type="dxa" w:w="2046"/>
+            <w:tcMar>
+              <w:top w:type="dxa" w:w="70"/>
+              <w:left w:type="dxa" w:w="130"/>
+              <w:bottom w:type="dxa" w:w="70"/>
+              <w:right w:type="dxa" w:w="130"/>
+            </w:tcMar>
+            <w:vAlign w:val="center"/>
+          </w:tcPr>
+          <w:p>
+            <w:pPr>
+              <w:spacing w:after="0"/>
+            </w:pPr>
+            <w:r>
+              <w:rPr>
+                <w:b/>
+                <w:bCs/>
+                <w:sz w:val="20"/>
+                <w:szCs w:val="20"/>
+              </w:rPr>
+              <w:t xml:space="preserve">CAC</w:t>
+            </w:r>
+          </w:p>
+        </w:tc>
+        <w:tc>
+          <w:tcPr>
+            <w:tcW w:type="dxa" w:w="7254"/>
+            <w:tcMar>
+              <w:top w:type="dxa" w:w="70"/>
+              <w:left w:type="dxa" w:w="130"/>
+              <w:bottom w:type="dxa" w:w="70"/>
+              <w:right w:type="dxa" w:w="130"/>
+            </w:tcMar>
+            <w:vAlign w:val="center"/>
+          </w:tcPr>
+          <w:p>
+            <w:pPr>
+              <w:spacing w:after="0"/>
+            </w:pPr>
+            <w:r>
+              <w:rPr>
+                <w:b w:val="false"/>
+                <w:bCs w:val="false"/>
+                <w:sz w:val="20"/>
+                <w:szCs w:val="20"/>
+              </w:rPr>
               <w:t xml:space="preserve">Costo de adquirir una cápita (del PELG).</w:t>
+            </w:r>
+          </w:p>
+        </w:tc>
+      </w:tr>
+      <w:tr>
+        <w:trPr>
+          <w:cantSplit/>
+        </w:trPr>
+        <w:tc>
+          <w:tcPr>
+            <w:tcW w:type="dxa" w:w="2046"/>
+            <w:shd w:fill="F2F5F8" w:color="auto" w:val="clear"/>
+            <w:tcMar>
+              <w:top w:type="dxa" w:w="70"/>
+              <w:left w:type="dxa" w:w="130"/>
+              <w:bottom w:type="dxa" w:w="70"/>
+              <w:right w:type="dxa" w:w="130"/>
+            </w:tcMar>
+            <w:vAlign w:val="center"/>
+          </w:tcPr>
+          <w:p>
+            <w:pPr>
+              <w:spacing w:after="0"/>
+            </w:pPr>
+            <w:r>
+              <w:rPr>
+                <w:b/>
+                <w:bCs/>
+                <w:sz w:val="20"/>
+                <w:szCs w:val="20"/>
+              </w:rPr>
+              <w:t xml:space="preserve">ARPU</w:t>
+            </w:r>
+          </w:p>
+        </w:tc>
+        <w:tc>
+          <w:tcPr>
+            <w:tcW w:type="dxa" w:w="7254"/>
+            <w:shd w:fill="F2F5F8" w:color="auto" w:val="clear"/>
+            <w:tcMar>
+              <w:top w:type="dxa" w:w="70"/>
+              <w:left w:type="dxa" w:w="130"/>
+              <w:bottom w:type="dxa" w:w="70"/>
+              <w:right w:type="dxa" w:w="130"/>
+            </w:tcMar>
+            <w:vAlign w:val="center"/>
+          </w:tcPr>
+          <w:p>
+            <w:pPr>
+              <w:spacing w:after="0"/>
+            </w:pPr>
+            <w:r>
+              <w:rPr>
+                <w:b w:val="false"/>
+                <w:bCs w:val="false"/>
+                <w:sz w:val="20"/>
+                <w:szCs w:val="20"/>
+              </w:rPr>
+              <w:t xml:space="preserve">Ingreso promedio mensual por socio; entra en el cálculo del LTV.</w:t>
+            </w:r>
+          </w:p>
+        </w:tc>
+      </w:tr>
+      <w:tr>
+        <w:trPr>
+          <w:cantSplit/>
+        </w:trPr>
+        <w:tc>
+          <w:tcPr>
+            <w:tcW w:type="dxa" w:w="2046"/>
+            <w:tcMar>
+              <w:top w:type="dxa" w:w="70"/>
+              <w:left w:type="dxa" w:w="130"/>
+              <w:bottom w:type="dxa" w:w="70"/>
+              <w:right w:type="dxa" w:w="130"/>
+            </w:tcMar>
+            <w:vAlign w:val="center"/>
+          </w:tcPr>
+          <w:p>
+            <w:pPr>
+              <w:spacing w:after="0"/>
+            </w:pPr>
+            <w:r>
+              <w:rPr>
+                <w:b/>
+                <w:bCs/>
+                <w:sz w:val="20"/>
+                <w:szCs w:val="20"/>
+              </w:rPr>
+              <w:t xml:space="preserve">PELG</w:t>
+            </w:r>
+          </w:p>
+        </w:tc>
+        <w:tc>
+          <w:tcPr>
+            <w:tcW w:type="dxa" w:w="7254"/>
+            <w:tcMar>
+              <w:top w:type="dxa" w:w="70"/>
+              <w:left w:type="dxa" w:w="130"/>
+              <w:bottom w:type="dxa" w:w="70"/>
+              <w:right w:type="dxa" w:w="130"/>
+            </w:tcMar>
+            <w:vAlign w:val="center"/>
+          </w:tcPr>
+          <w:p>
+            <w:pPr>
+              <w:spacing w:after="0"/>
+            </w:pPr>
+            <w:r>
+              <w:rPr>
+                <w:b w:val="false"/>
+                <w:bCs w:val="false"/>
+                <w:sz w:val="20"/>
+                <w:szCs w:val="20"/>
+              </w:rPr>
+              <w:t xml:space="preserve">Fuente interna de unit economics de Medicus: inversión y gasto por canal, CAC y leads.</w:t>
             </w:r>
           </w:p>
         </w:tc>

</xml_diff>

<commit_message>
docs(v2.4): cruce real por CUIL/Salesforce y economia con datos de Binary
- Seccion 11 (el cruce): la llave es el CUIL, no prospecto_id (no esta en Binary;
  los prospectos viven en Salesforce SF_OPORTUNIDAD). Cascada de identidad
  CUIL->email->hubspot_id->webid->DNI; churn por CUIL, no por AFI_ID.
- Economia: ARPU y permanencia pasan a reales (Binary); el margen (siniestralidad)
  queda como unico supuesto.
- Glosario: prospecto_id corregido; sumados CUIL y Salesforce. Roadmap actualizado.
</commit_message>
<xml_diff>
--- a/SysData-Documentacion.docx
+++ b/SysData-Documentacion.docx
@@ -85,7 +85,7 @@
         <w:rPr>
           <w:color w:val="5B6B7F"/>
         </w:rPr>
-        <w:t xml:space="preserve">Versión 2.3 · 22 de junio de 2026</w:t>
+        <w:t xml:space="preserve">Versión 2.4 · 23 de junio de 2026</w:t>
       </w:r>
     </w:p>
     <w:p>
@@ -1864,7 +1864,7 @@
         <w:jc w:val="both"/>
       </w:pPr>
       <w:r>
-        <w:t xml:space="preserve">El LTV hoy se modela con supuestos (permanencia, margen); con Binary pasa a medirse con datos reales de socios, y todo el ranking se recalibra.</w:t>
+        <w:t xml:space="preserve">El LTV hoy se modela con supuestos; con Binary, la permanencia (ciclo de altas/bajas por CUIL) y el ARPU real por plan ya dejan de ser supuestos —el único que queda es el margen de contribución (siniestralidad)—, y todo el ranking se recalibra.</w:t>
       </w:r>
     </w:p>
     <w:p>
@@ -3248,7 +3248,7 @@
         <w:jc w:val="both"/>
       </w:pPr>
       <w:r>
-        <w:t xml:space="preserve">Para medir de punta a punta “qué visita termina siendo socio” falta estampar el mismo identificador (prospecto_id) en el alta de socio. Hoy el lead (Mixpanel/HubSpot) y el socio (Binary) son registros separados que no se pueden unir.</w:t>
+        <w:t xml:space="preserve">Para medir de punta a punta “qué visita termina siendo socio” hay que unir tres mundos que hoy viven separados: el comportamiento (Mixpanel), lo comercial (HubSpot/Salesforce) y la base de socios (Binary). El relevamiento de Binary aclaró cómo se cierra ese cruce.</w:t>
       </w:r>
     </w:p>
     <w:p>
@@ -3261,10 +3261,10 @@
           <w:b/>
           <w:bCs/>
         </w:rPr>
-        <w:t xml:space="preserve">Qué significa: </w:t>
-      </w:r>
-      <w:r>
-        <w:t xml:space="preserve">mientras no se cierre, la conversión visita→cápita es supuesta (hoy 6%), no medida. Por eso el motor la marca como supuesto.</w:t>
+        <w:t xml:space="preserve">La llave es el CUIL, no un solo id: </w:t>
+      </w:r>
+      <w:r>
+        <w:t xml:space="preserve">Binary no guarda prospecto_id (los prospectos viven en Salesforce) y el AFI_ID del socio no es estable (cambia en cada re-alta). El identificador estable por persona es el CUIL. Como ninguna llave sola cubre a todos, el cruce se arma por cascada: CUIL → email → hubspot_id → webid → DNI; la cobertura es la unión de todas.</w:t>
       </w:r>
     </w:p>
     <w:p>
@@ -3277,10 +3277,10 @@
           <w:b/>
           <w:bCs/>
         </w:rPr>
-        <w:t xml:space="preserve">De quién depende: </w:t>
-      </w:r>
-      <w:r>
-        <w:t xml:space="preserve">NO es trabajo de SysData, sino instrumentación upstream (Data/Dev). Caminos: (A) estampar el prospecto_id en el alta; (B) cruzar las fuentes uniendo el comportamiento con la base de socios de Binary; (C) en HubSpot, asociar el deal ganado al contacto de origen.</w:t>
+        <w:t xml:space="preserve">Qué significa hoy: </w:t>
+      </w:r>
+      <w:r>
+        <w:t xml:space="preserve">mientras el cruce no esté armado, la conversión visita→cápita es supuesta (hoy 6%), no medida. Por eso el motor la marca como supuesto.</w:t>
       </w:r>
     </w:p>
     <w:p>
@@ -3293,10 +3293,42 @@
           <w:b/>
           <w:bCs/>
         </w:rPr>
+        <w:t xml:space="preserve">De quién depende: </w:t>
+      </w:r>
+      <w:r>
+        <w:t xml:space="preserve">NO es trabajo de SysData, sino instrumentación y datos upstream (Data/Dev): construir la tabla puente que resuelve identidad por CUIL/email, y verificar si Salesforce (SF_OPORTUNIDAD) ya linkea la oportunidad ganada con el socio —en ese caso el puente prospecto↔socio ya existe—.</w:t>
+      </w:r>
+    </w:p>
+    <w:p>
+      <w:pPr>
+        <w:spacing w:after="110"/>
+        <w:jc w:val="both"/>
+      </w:pPr>
+      <w:r>
+        <w:rPr>
+          <w:b/>
+          <w:bCs/>
+        </w:rPr>
+        <w:t xml:space="preserve">Un detalle clave para el churn: </w:t>
+      </w:r>
+      <w:r>
+        <w:t xml:space="preserve">la permanencia se calcula por CUIL, no por AFI_ID; si no, las re-altas (baja→alta) inflan el churn y subestiman la vida del socio.</w:t>
+      </w:r>
+    </w:p>
+    <w:p>
+      <w:pPr>
+        <w:spacing w:after="110"/>
+        <w:jc w:val="both"/>
+      </w:pPr>
+      <w:r>
+        <w:rPr>
+          <w:b/>
+          <w:bCs/>
+        </w:rPr>
         <w:t xml:space="preserve">El payoff: </w:t>
       </w:r>
       <w:r>
-        <w:t xml:space="preserve">datos más completos (se llenan los contactos vacíos de HubSpot con lo cargado en prospectos/Binary), tasa lead→cápita real por canal y segmento, ripple a cápita medido, y priorización por margen real. SysData ya detecta solo cuándo queda resuelto.</w:t>
+        <w:t xml:space="preserve">datos más completos (se llenan los contactos vacíos de HubSpot con lo que ya existe en Binary/Salesforce), tasa lead→cápita real por canal y segmento, ripple a cápita medido, y priorización por margen real. SysData ya detecta solo cuándo queda resuelto.</w:t>
       </w:r>
     </w:p>
     <w:p>
@@ -3362,7 +3394,7 @@
         <w:spacing w:after="50"/>
       </w:pPr>
       <w:r>
-        <w:t xml:space="preserve">Integrar Binary para unit economics reales (LTV/churn), completar los contactos y cerrar el cruce visita→cápita.</w:t>
+        <w:t xml:space="preserve">Integrar Binary para unit economics reales (LTV/churn por plan), completar los contactos y cerrar el cruce visita→cápita.</w:t>
       </w:r>
     </w:p>
     <w:p>
@@ -3375,7 +3407,7 @@
         <w:spacing w:after="50"/>
       </w:pPr>
       <w:r>
-        <w:t xml:space="preserve">Cerrar el cruce prospecto_id (trabajo de Data/Dev).</w:t>
+        <w:t xml:space="preserve">Armar la tabla puente de identidad (CUIL/email; verificar el link en Salesforce) — trabajo de Data/Dev.</w:t>
       </w:r>
     </w:p>
     <w:p>
@@ -4016,7 +4048,7 @@
                 <w:sz w:val="20"/>
                 <w:szCs w:val="20"/>
               </w:rPr>
-              <w:t xml:space="preserve">Valor de contribución de una cápita en su permanencia (ARPU × meses × margen). Hoy supuesto; con Binary, real.</w:t>
+              <w:t xml:space="preserve">Valor de contribución de una cápita en su permanencia (ARPU × meses × margen). Con Binary, ARPU y permanencia son reales; el margen es el supuesto que queda.</w:t>
             </w:r>
           </w:p>
         </w:tc>
@@ -4248,7 +4280,123 @@
                 <w:sz w:val="20"/>
                 <w:szCs w:val="20"/>
               </w:rPr>
-              <w:t xml:space="preserve">El identificador que uniría el comportamiento (Mixpanel) con la cápita (HubSpot/Binary).</w:t>
+              <w:t xml:space="preserve">Id que une comportamiento (Mixpanel) con lo comercial (HubSpot). NO existe en Binary: del lado del socio la llave es el CUIL.</w:t>
+            </w:r>
+          </w:p>
+        </w:tc>
+      </w:tr>
+      <w:tr>
+        <w:trPr>
+          <w:cantSplit/>
+        </w:trPr>
+        <w:tc>
+          <w:tcPr>
+            <w:tcW w:type="dxa" w:w="2046"/>
+            <w:tcMar>
+              <w:top w:type="dxa" w:w="70"/>
+              <w:left w:type="dxa" w:w="130"/>
+              <w:bottom w:type="dxa" w:w="70"/>
+              <w:right w:type="dxa" w:w="130"/>
+            </w:tcMar>
+            <w:vAlign w:val="center"/>
+          </w:tcPr>
+          <w:p>
+            <w:pPr>
+              <w:spacing w:after="0"/>
+            </w:pPr>
+            <w:r>
+              <w:rPr>
+                <w:b/>
+                <w:bCs/>
+                <w:sz w:val="20"/>
+                <w:szCs w:val="20"/>
+              </w:rPr>
+              <w:t xml:space="preserve">CUIL</w:t>
+            </w:r>
+          </w:p>
+        </w:tc>
+        <w:tc>
+          <w:tcPr>
+            <w:tcW w:type="dxa" w:w="7254"/>
+            <w:tcMar>
+              <w:top w:type="dxa" w:w="70"/>
+              <w:left w:type="dxa" w:w="130"/>
+              <w:bottom w:type="dxa" w:w="70"/>
+              <w:right w:type="dxa" w:w="130"/>
+            </w:tcMar>
+            <w:vAlign w:val="center"/>
+          </w:tcPr>
+          <w:p>
+            <w:pPr>
+              <w:spacing w:after="0"/>
+            </w:pPr>
+            <w:r>
+              <w:rPr>
+                <w:b w:val="false"/>
+                <w:bCs w:val="false"/>
+                <w:sz w:val="20"/>
+                <w:szCs w:val="20"/>
+              </w:rPr>
+              <w:t xml:space="preserve">El identificador estable por persona; la llave para cruzar Binary con HubSpot/Salesforce (el AFI_ID del socio no es estable).</w:t>
+            </w:r>
+          </w:p>
+        </w:tc>
+      </w:tr>
+      <w:tr>
+        <w:trPr>
+          <w:cantSplit/>
+        </w:trPr>
+        <w:tc>
+          <w:tcPr>
+            <w:tcW w:type="dxa" w:w="2046"/>
+            <w:shd w:fill="F2F5F8" w:color="auto" w:val="clear"/>
+            <w:tcMar>
+              <w:top w:type="dxa" w:w="70"/>
+              <w:left w:type="dxa" w:w="130"/>
+              <w:bottom w:type="dxa" w:w="70"/>
+              <w:right w:type="dxa" w:w="130"/>
+            </w:tcMar>
+            <w:vAlign w:val="center"/>
+          </w:tcPr>
+          <w:p>
+            <w:pPr>
+              <w:spacing w:after="0"/>
+            </w:pPr>
+            <w:r>
+              <w:rPr>
+                <w:b/>
+                <w:bCs/>
+                <w:sz w:val="20"/>
+                <w:szCs w:val="20"/>
+              </w:rPr>
+              <w:t xml:space="preserve">Salesforce</w:t>
+            </w:r>
+          </w:p>
+        </w:tc>
+        <w:tc>
+          <w:tcPr>
+            <w:tcW w:type="dxa" w:w="7254"/>
+            <w:shd w:fill="F2F5F8" w:color="auto" w:val="clear"/>
+            <w:tcMar>
+              <w:top w:type="dxa" w:w="70"/>
+              <w:left w:type="dxa" w:w="130"/>
+              <w:bottom w:type="dxa" w:w="70"/>
+              <w:right w:type="dxa" w:w="130"/>
+            </w:tcMar>
+            <w:vAlign w:val="center"/>
+          </w:tcPr>
+          <w:p>
+            <w:pPr>
+              <w:spacing w:after="0"/>
+            </w:pPr>
+            <w:r>
+              <w:rPr>
+                <w:b w:val="false"/>
+                <w:bCs w:val="false"/>
+                <w:sz w:val="20"/>
+                <w:szCs w:val="20"/>
+              </w:rPr>
+              <w:t xml:space="preserve">Donde viven los prospectos/oportunidades de Medicus (SF_OPORTUNIDAD), separado de Binary.</w:t>
             </w:r>
           </w:p>
         </w:tc>

</xml_diff>